<commit_message>
Include EK2 in 1005 single-file export
</commit_message>
<xml_diff>
--- a/docs/OpenNutri_1005_Application_Filled_Template.docx
+++ b/docs/OpenNutri_1005_Application_Filled_Template.docx
@@ -14592,6 +14592,3113 @@
           <w:szCs w:val="18"/>
         </w:rPr>
         <w:t>EK-2: BÜTÇE VE GEREKÇESİ</w:t>
+      </w:r>
+    </w:p>
+    <w:p>
+      <w:pPr>
+        <w:spacing w:after="60" w:before="0" w:line="240" w:lineRule="auto"/>
+      </w:pPr>
+      <w:r>
+        <w:rPr>
+          <w:rFonts w:ascii="Arial" w:hAnsi="Arial" w:eastAsia="Arial"/>
+          <w:b/>
+          <w:i/>
+          <w:sz w:val="17"/>
+        </w:rPr>
+        <w:t>Bu bir çalışma taslağıdır.</w:t>
+      </w:r>
+      <w:r>
+        <w:rPr>
+          <w:rFonts w:ascii="Arial" w:hAnsi="Arial" w:eastAsia="Arial"/>
+          <w:i/>
+          <w:sz w:val="17"/>
+        </w:rPr>
+        <w:t xml:space="preserve"> Tutarlar planlama amaçlıdır; donanım fiyatları</w:t>
+      </w:r>
+    </w:p>
+    <w:p>
+      <w:pPr>
+        <w:spacing w:after="60" w:before="0" w:line="240" w:lineRule="auto"/>
+      </w:pPr>
+      <w:r>
+        <w:rPr>
+          <w:rFonts w:ascii="Arial" w:hAnsi="Arial" w:eastAsia="Arial"/>
+          <w:i/>
+          <w:sz w:val="17"/>
+        </w:rPr>
+        <w:t>ekip tarafından güncel tekliflerle değiştirilecektir. Nihai rakamlar PBS</w:t>
+      </w:r>
+    </w:p>
+    <w:p>
+      <w:pPr>
+        <w:spacing w:after="60" w:before="0" w:line="240" w:lineRule="auto"/>
+      </w:pPr>
+      <w:r>
+        <w:rPr>
+          <w:rFonts w:ascii="Arial" w:hAnsi="Arial" w:eastAsia="Arial"/>
+          <w:i/>
+          <w:sz w:val="17"/>
+        </w:rPr>
+        <w:t>sistemine girilirken doğrulanmalıdır. Teyit edilecek varsayımlar belgenin</w:t>
+      </w:r>
+    </w:p>
+    <w:p>
+      <w:pPr>
+        <w:spacing w:after="60" w:before="0" w:line="240" w:lineRule="auto"/>
+      </w:pPr>
+      <w:r>
+        <w:rPr>
+          <w:rFonts w:ascii="Arial" w:hAnsi="Arial" w:eastAsia="Arial"/>
+          <w:i/>
+          <w:sz w:val="17"/>
+        </w:rPr>
+        <w:t>sonundaki listede toplanmıştır.</w:t>
+      </w:r>
+    </w:p>
+    <w:p>
+      <w:pPr>
+        <w:spacing w:after="60" w:before="0" w:line="240" w:lineRule="auto"/>
+      </w:pPr>
+      <w:r>
+        <w:rPr>
+          <w:rFonts w:ascii="Arial" w:hAnsi="Arial" w:eastAsia="Arial"/>
+          <w:b/>
+          <w:sz w:val="19"/>
+        </w:rPr>
+        <w:t>Çerçeve (1005 — 1 Şubat 2026 itibarıyla)</w:t>
+      </w:r>
+    </w:p>
+    <w:p>
+      <w:pPr>
+        <w:spacing w:after="60" w:before="0" w:line="240" w:lineRule="auto"/>
+        <w:ind w:left="198" w:hanging="113"/>
+      </w:pPr>
+      <w:r>
+        <w:rPr>
+          <w:rFonts w:ascii="Arial" w:hAnsi="Arial" w:eastAsia="Arial"/>
+          <w:sz w:val="18"/>
+        </w:rPr>
+        <w:t xml:space="preserve">• </w:t>
+      </w:r>
+      <w:r>
+        <w:rPr>
+          <w:rFonts w:ascii="Arial" w:hAnsi="Arial" w:eastAsia="Arial"/>
+          <w:b/>
+          <w:sz w:val="18"/>
+        </w:rPr>
+        <w:t>Proje destek üst limiti:</w:t>
+      </w:r>
+      <w:r>
+        <w:rPr>
+          <w:rFonts w:ascii="Arial" w:hAnsi="Arial" w:eastAsia="Arial"/>
+          <w:sz w:val="18"/>
+        </w:rPr>
+        <w:t xml:space="preserve"> 1.200.000 TL — </w:t>
+      </w:r>
+      <w:r>
+        <w:rPr>
+          <w:rFonts w:ascii="Arial" w:hAnsi="Arial" w:eastAsia="Arial"/>
+          <w:i/>
+          <w:sz w:val="18"/>
+        </w:rPr>
+        <w:t>burslar dahil; Proje Teşvik İkramiyesi (PTİ) ve kurum hissesi hariç.</w:t>
+      </w:r>
+    </w:p>
+    <w:p>
+      <w:pPr>
+        <w:spacing w:after="60" w:before="0" w:line="240" w:lineRule="auto"/>
+        <w:ind w:left="198" w:hanging="113"/>
+      </w:pPr>
+      <w:r>
+        <w:rPr>
+          <w:rFonts w:ascii="Arial" w:hAnsi="Arial" w:eastAsia="Arial"/>
+          <w:sz w:val="18"/>
+        </w:rPr>
+        <w:t xml:space="preserve">• </w:t>
+      </w:r>
+      <w:r>
+        <w:rPr>
+          <w:rFonts w:ascii="Arial" w:hAnsi="Arial" w:eastAsia="Arial"/>
+          <w:b/>
+          <w:sz w:val="18"/>
+        </w:rPr>
+        <w:t>Proje süresi:</w:t>
+      </w:r>
+      <w:r>
+        <w:rPr>
+          <w:rFonts w:ascii="Arial" w:hAnsi="Arial" w:eastAsia="Arial"/>
+          <w:sz w:val="18"/>
+        </w:rPr>
+        <w:t xml:space="preserve"> 18 ay.</w:t>
+      </w:r>
+    </w:p>
+    <w:p>
+      <w:pPr>
+        <w:spacing w:after="60" w:before="0" w:line="240" w:lineRule="auto"/>
+        <w:ind w:left="198" w:hanging="113"/>
+      </w:pPr>
+      <w:r>
+        <w:rPr>
+          <w:rFonts w:ascii="Arial" w:hAnsi="Arial" w:eastAsia="Arial"/>
+          <w:sz w:val="18"/>
+        </w:rPr>
+        <w:t xml:space="preserve">• </w:t>
+      </w:r>
+      <w:r>
+        <w:rPr>
+          <w:rFonts w:ascii="Arial" w:hAnsi="Arial" w:eastAsia="Arial"/>
+          <w:b/>
+          <w:sz w:val="18"/>
+        </w:rPr>
+        <w:t>2026 burs aylık üst limitleri:</w:t>
+      </w:r>
+      <w:r>
+        <w:rPr>
+          <w:rFonts w:ascii="Arial" w:hAnsi="Arial" w:eastAsia="Arial"/>
+          <w:sz w:val="18"/>
+        </w:rPr>
+        <w:t xml:space="preserve"> Lisans 6.000 TL; Yüksek Lisans 22.500 TL (çalışmayan); Doktora 32.500 TL.</w:t>
+      </w:r>
+    </w:p>
+    <w:p>
+      <w:pPr>
+        <w:spacing w:after="60" w:before="0" w:line="240" w:lineRule="auto"/>
+        <w:ind w:left="198" w:hanging="113"/>
+      </w:pPr>
+      <w:r>
+        <w:rPr>
+          <w:rFonts w:ascii="Arial" w:hAnsi="Arial" w:eastAsia="Arial"/>
+          <w:sz w:val="18"/>
+        </w:rPr>
+        <w:t xml:space="preserve">• </w:t>
+      </w:r>
+      <w:r>
+        <w:rPr>
+          <w:rFonts w:ascii="Arial" w:hAnsi="Arial" w:eastAsia="Arial"/>
+          <w:b/>
+          <w:sz w:val="18"/>
+        </w:rPr>
+        <w:t>Kural:</w:t>
+      </w:r>
+      <w:r>
+        <w:rPr>
+          <w:rFonts w:ascii="Arial" w:hAnsi="Arial" w:eastAsia="Arial"/>
+          <w:sz w:val="18"/>
+        </w:rPr>
+        <w:t xml:space="preserve"> "Makine-teçhizat taleplerinin toplam bütçe ile dengeli olması gözetilir." Bu nedenle bütçe, ağırlıklı olarak araştırmacı emeği (burs) ve sınırlı, gerekçeli donanım üzerine kuruludur; ağır hesaplama için TRUBA tahsisi öncelikli başvuru kanalı, proje GPU'su ise PEFT ölçeğinde yerel yürütme ve B planıdır.</w:t>
+      </w:r>
+    </w:p>
+    <w:p>
+      <w:pPr>
+        <w:spacing w:after="60" w:before="0" w:line="240" w:lineRule="auto"/>
+      </w:pPr>
+      <w:r>
+        <w:rPr>
+          <w:rFonts w:ascii="Arial" w:hAnsi="Arial" w:eastAsia="Arial"/>
+          <w:b/>
+          <w:sz w:val="19"/>
+        </w:rPr>
+        <w:t>1. Özet Bütçe</w:t>
+      </w:r>
+    </w:p>
+    <w:tbl>
+      <w:tblPr>
+        <w:tblStyle w:val="TableGrid"/>
+        <w:tblW w:type="auto" w:w="0"/>
+        <w:tblLook w:firstColumn="1" w:firstRow="1" w:lastColumn="0" w:lastRow="0" w:noHBand="0" w:noVBand="1" w:val="04A0"/>
+        <w:jc w:val="center"/>
+        <w:tblBorders>
+          <w:top w:val="single" w:sz="4" w:space="0" w:color="000000"/>
+          <w:left w:val="single" w:sz="4" w:space="0" w:color="000000"/>
+          <w:bottom w:val="single" w:sz="4" w:space="0" w:color="000000"/>
+          <w:right w:val="single" w:sz="4" w:space="0" w:color="000000"/>
+          <w:insideH w:val="single" w:sz="4" w:space="0" w:color="000000"/>
+          <w:insideV w:val="single" w:sz="4" w:space="0" w:color="000000"/>
+        </w:tblBorders>
+      </w:tblPr>
+      <w:tblGrid>
+        <w:gridCol w:w="2880"/>
+        <w:gridCol w:w="2880"/>
+        <w:gridCol w:w="2880"/>
+      </w:tblGrid>
+      <w:tr>
+        <w:tc>
+          <w:tcPr>
+            <w:tcW w:type="dxa" w:w="2880"/>
+            <w:vAlign w:val="top"/>
+          </w:tcPr>
+          <w:p>
+            <w:pPr>
+              <w:spacing w:after="40" w:before="0" w:line="240" w:lineRule="auto"/>
+            </w:pPr>
+          </w:p>
+          <w:p>
+            <w:pPr>
+              <w:spacing w:after="40" w:before="0" w:line="240" w:lineRule="auto"/>
+            </w:pPr>
+            <w:r>
+              <w:rPr>
+                <w:rFonts w:ascii="Arial" w:hAnsi="Arial" w:eastAsia="Arial"/>
+                <w:b/>
+                <w:sz w:val="15"/>
+              </w:rPr>
+              <w:t>Bütçe Kalemi</w:t>
+            </w:r>
+          </w:p>
+        </w:tc>
+        <w:tc>
+          <w:tcPr>
+            <w:tcW w:type="dxa" w:w="2880"/>
+            <w:vAlign w:val="top"/>
+          </w:tcPr>
+          <w:p>
+            <w:pPr>
+              <w:spacing w:after="40" w:before="0" w:line="240" w:lineRule="auto"/>
+            </w:pPr>
+          </w:p>
+          <w:p>
+            <w:pPr>
+              <w:spacing w:after="40" w:before="0" w:line="240" w:lineRule="auto"/>
+            </w:pPr>
+            <w:r>
+              <w:rPr>
+                <w:rFonts w:ascii="Arial" w:hAnsi="Arial" w:eastAsia="Arial"/>
+                <w:b/>
+                <w:sz w:val="15"/>
+              </w:rPr>
+              <w:t>Tutar (TL)</w:t>
+            </w:r>
+          </w:p>
+        </w:tc>
+        <w:tc>
+          <w:tcPr>
+            <w:tcW w:type="dxa" w:w="2880"/>
+            <w:vAlign w:val="top"/>
+          </w:tcPr>
+          <w:p>
+            <w:pPr>
+              <w:spacing w:after="40" w:before="0" w:line="240" w:lineRule="auto"/>
+            </w:pPr>
+          </w:p>
+          <w:p>
+            <w:pPr>
+              <w:spacing w:after="40" w:before="0" w:line="240" w:lineRule="auto"/>
+            </w:pPr>
+            <w:r>
+              <w:rPr>
+                <w:rFonts w:ascii="Arial" w:hAnsi="Arial" w:eastAsia="Arial"/>
+                <w:b/>
+                <w:sz w:val="15"/>
+              </w:rPr>
+              <w:t>Pay</w:t>
+            </w:r>
+          </w:p>
+        </w:tc>
+      </w:tr>
+      <w:tr>
+        <w:tc>
+          <w:tcPr>
+            <w:tcW w:type="dxa" w:w="2880"/>
+            <w:vAlign w:val="top"/>
+          </w:tcPr>
+          <w:p>
+            <w:pPr>
+              <w:spacing w:after="40" w:before="0" w:line="240" w:lineRule="auto"/>
+            </w:pPr>
+          </w:p>
+          <w:p>
+            <w:pPr>
+              <w:spacing w:after="40" w:before="0" w:line="240" w:lineRule="auto"/>
+            </w:pPr>
+            <w:r>
+              <w:rPr>
+                <w:rFonts w:ascii="Arial" w:hAnsi="Arial" w:eastAsia="Arial"/>
+                <w:sz w:val="15"/>
+              </w:rPr>
+              <w:t>Burs (Bursiyer)</w:t>
+            </w:r>
+          </w:p>
+        </w:tc>
+        <w:tc>
+          <w:tcPr>
+            <w:tcW w:type="dxa" w:w="2880"/>
+            <w:vAlign w:val="top"/>
+          </w:tcPr>
+          <w:p>
+            <w:pPr>
+              <w:spacing w:after="40" w:before="0" w:line="240" w:lineRule="auto"/>
+            </w:pPr>
+          </w:p>
+          <w:p>
+            <w:pPr>
+              <w:spacing w:after="40" w:before="0" w:line="240" w:lineRule="auto"/>
+            </w:pPr>
+            <w:r>
+              <w:rPr>
+                <w:rFonts w:ascii="Arial" w:hAnsi="Arial" w:eastAsia="Arial"/>
+                <w:sz w:val="15"/>
+              </w:rPr>
+              <w:t>828.000</w:t>
+            </w:r>
+          </w:p>
+        </w:tc>
+        <w:tc>
+          <w:tcPr>
+            <w:tcW w:type="dxa" w:w="2880"/>
+            <w:vAlign w:val="top"/>
+          </w:tcPr>
+          <w:p>
+            <w:pPr>
+              <w:spacing w:after="40" w:before="0" w:line="240" w:lineRule="auto"/>
+            </w:pPr>
+          </w:p>
+          <w:p>
+            <w:pPr>
+              <w:spacing w:after="40" w:before="0" w:line="240" w:lineRule="auto"/>
+            </w:pPr>
+            <w:r>
+              <w:rPr>
+                <w:rFonts w:ascii="Arial" w:hAnsi="Arial" w:eastAsia="Arial"/>
+                <w:sz w:val="15"/>
+              </w:rPr>
+              <w:t>%69,0</w:t>
+            </w:r>
+          </w:p>
+        </w:tc>
+      </w:tr>
+      <w:tr>
+        <w:tc>
+          <w:tcPr>
+            <w:tcW w:type="dxa" w:w="2880"/>
+            <w:vAlign w:val="top"/>
+          </w:tcPr>
+          <w:p>
+            <w:pPr>
+              <w:spacing w:after="40" w:before="0" w:line="240" w:lineRule="auto"/>
+            </w:pPr>
+          </w:p>
+          <w:p>
+            <w:pPr>
+              <w:spacing w:after="40" w:before="0" w:line="240" w:lineRule="auto"/>
+            </w:pPr>
+            <w:r>
+              <w:rPr>
+                <w:rFonts w:ascii="Arial" w:hAnsi="Arial" w:eastAsia="Arial"/>
+                <w:sz w:val="15"/>
+              </w:rPr>
+              <w:t>Makine-Teçhizat</w:t>
+            </w:r>
+          </w:p>
+        </w:tc>
+        <w:tc>
+          <w:tcPr>
+            <w:tcW w:type="dxa" w:w="2880"/>
+            <w:vAlign w:val="top"/>
+          </w:tcPr>
+          <w:p>
+            <w:pPr>
+              <w:spacing w:after="40" w:before="0" w:line="240" w:lineRule="auto"/>
+            </w:pPr>
+          </w:p>
+          <w:p>
+            <w:pPr>
+              <w:spacing w:after="40" w:before="0" w:line="240" w:lineRule="auto"/>
+            </w:pPr>
+            <w:r>
+              <w:rPr>
+                <w:rFonts w:ascii="Arial" w:hAnsi="Arial" w:eastAsia="Arial"/>
+                <w:sz w:val="15"/>
+              </w:rPr>
+              <w:t>242.000</w:t>
+            </w:r>
+          </w:p>
+        </w:tc>
+        <w:tc>
+          <w:tcPr>
+            <w:tcW w:type="dxa" w:w="2880"/>
+            <w:vAlign w:val="top"/>
+          </w:tcPr>
+          <w:p>
+            <w:pPr>
+              <w:spacing w:after="40" w:before="0" w:line="240" w:lineRule="auto"/>
+            </w:pPr>
+          </w:p>
+          <w:p>
+            <w:pPr>
+              <w:spacing w:after="40" w:before="0" w:line="240" w:lineRule="auto"/>
+            </w:pPr>
+            <w:r>
+              <w:rPr>
+                <w:rFonts w:ascii="Arial" w:hAnsi="Arial" w:eastAsia="Arial"/>
+                <w:sz w:val="15"/>
+              </w:rPr>
+              <w:t>%20,2</w:t>
+            </w:r>
+          </w:p>
+        </w:tc>
+      </w:tr>
+      <w:tr>
+        <w:tc>
+          <w:tcPr>
+            <w:tcW w:type="dxa" w:w="2880"/>
+            <w:vAlign w:val="top"/>
+          </w:tcPr>
+          <w:p>
+            <w:pPr>
+              <w:spacing w:after="40" w:before="0" w:line="240" w:lineRule="auto"/>
+            </w:pPr>
+          </w:p>
+          <w:p>
+            <w:pPr>
+              <w:spacing w:after="40" w:before="0" w:line="240" w:lineRule="auto"/>
+            </w:pPr>
+            <w:r>
+              <w:rPr>
+                <w:rFonts w:ascii="Arial" w:hAnsi="Arial" w:eastAsia="Arial"/>
+                <w:sz w:val="15"/>
+              </w:rPr>
+              <w:t>Hizmet Alımı</w:t>
+            </w:r>
+          </w:p>
+        </w:tc>
+        <w:tc>
+          <w:tcPr>
+            <w:tcW w:type="dxa" w:w="2880"/>
+            <w:vAlign w:val="top"/>
+          </w:tcPr>
+          <w:p>
+            <w:pPr>
+              <w:spacing w:after="40" w:before="0" w:line="240" w:lineRule="auto"/>
+            </w:pPr>
+          </w:p>
+          <w:p>
+            <w:pPr>
+              <w:spacing w:after="40" w:before="0" w:line="240" w:lineRule="auto"/>
+            </w:pPr>
+            <w:r>
+              <w:rPr>
+                <w:rFonts w:ascii="Arial" w:hAnsi="Arial" w:eastAsia="Arial"/>
+                <w:sz w:val="15"/>
+              </w:rPr>
+              <w:t>60.000</w:t>
+            </w:r>
+          </w:p>
+        </w:tc>
+        <w:tc>
+          <w:tcPr>
+            <w:tcW w:type="dxa" w:w="2880"/>
+            <w:vAlign w:val="top"/>
+          </w:tcPr>
+          <w:p>
+            <w:pPr>
+              <w:spacing w:after="40" w:before="0" w:line="240" w:lineRule="auto"/>
+            </w:pPr>
+          </w:p>
+          <w:p>
+            <w:pPr>
+              <w:spacing w:after="40" w:before="0" w:line="240" w:lineRule="auto"/>
+            </w:pPr>
+            <w:r>
+              <w:rPr>
+                <w:rFonts w:ascii="Arial" w:hAnsi="Arial" w:eastAsia="Arial"/>
+                <w:sz w:val="15"/>
+              </w:rPr>
+              <w:t>%5,0</w:t>
+            </w:r>
+          </w:p>
+        </w:tc>
+      </w:tr>
+      <w:tr>
+        <w:tc>
+          <w:tcPr>
+            <w:tcW w:type="dxa" w:w="2880"/>
+            <w:vAlign w:val="top"/>
+          </w:tcPr>
+          <w:p>
+            <w:pPr>
+              <w:spacing w:after="40" w:before="0" w:line="240" w:lineRule="auto"/>
+            </w:pPr>
+          </w:p>
+          <w:p>
+            <w:pPr>
+              <w:spacing w:after="40" w:before="0" w:line="240" w:lineRule="auto"/>
+            </w:pPr>
+            <w:r>
+              <w:rPr>
+                <w:rFonts w:ascii="Arial" w:hAnsi="Arial" w:eastAsia="Arial"/>
+                <w:sz w:val="15"/>
+              </w:rPr>
+              <w:t>Sarf Malzemesi</w:t>
+            </w:r>
+          </w:p>
+        </w:tc>
+        <w:tc>
+          <w:tcPr>
+            <w:tcW w:type="dxa" w:w="2880"/>
+            <w:vAlign w:val="top"/>
+          </w:tcPr>
+          <w:p>
+            <w:pPr>
+              <w:spacing w:after="40" w:before="0" w:line="240" w:lineRule="auto"/>
+            </w:pPr>
+          </w:p>
+          <w:p>
+            <w:pPr>
+              <w:spacing w:after="40" w:before="0" w:line="240" w:lineRule="auto"/>
+            </w:pPr>
+            <w:r>
+              <w:rPr>
+                <w:rFonts w:ascii="Arial" w:hAnsi="Arial" w:eastAsia="Arial"/>
+                <w:sz w:val="15"/>
+              </w:rPr>
+              <w:t>25.000</w:t>
+            </w:r>
+          </w:p>
+        </w:tc>
+        <w:tc>
+          <w:tcPr>
+            <w:tcW w:type="dxa" w:w="2880"/>
+            <w:vAlign w:val="top"/>
+          </w:tcPr>
+          <w:p>
+            <w:pPr>
+              <w:spacing w:after="40" w:before="0" w:line="240" w:lineRule="auto"/>
+            </w:pPr>
+          </w:p>
+          <w:p>
+            <w:pPr>
+              <w:spacing w:after="40" w:before="0" w:line="240" w:lineRule="auto"/>
+            </w:pPr>
+            <w:r>
+              <w:rPr>
+                <w:rFonts w:ascii="Arial" w:hAnsi="Arial" w:eastAsia="Arial"/>
+                <w:sz w:val="15"/>
+              </w:rPr>
+              <w:t>%2,1</w:t>
+            </w:r>
+          </w:p>
+        </w:tc>
+      </w:tr>
+      <w:tr>
+        <w:tc>
+          <w:tcPr>
+            <w:tcW w:type="dxa" w:w="2880"/>
+            <w:vAlign w:val="top"/>
+          </w:tcPr>
+          <w:p>
+            <w:pPr>
+              <w:spacing w:after="40" w:before="0" w:line="240" w:lineRule="auto"/>
+            </w:pPr>
+          </w:p>
+          <w:p>
+            <w:pPr>
+              <w:spacing w:after="40" w:before="0" w:line="240" w:lineRule="auto"/>
+            </w:pPr>
+            <w:r>
+              <w:rPr>
+                <w:rFonts w:ascii="Arial" w:hAnsi="Arial" w:eastAsia="Arial"/>
+                <w:sz w:val="15"/>
+              </w:rPr>
+              <w:t>Seyahat</w:t>
+            </w:r>
+          </w:p>
+        </w:tc>
+        <w:tc>
+          <w:tcPr>
+            <w:tcW w:type="dxa" w:w="2880"/>
+            <w:vAlign w:val="top"/>
+          </w:tcPr>
+          <w:p>
+            <w:pPr>
+              <w:spacing w:after="40" w:before="0" w:line="240" w:lineRule="auto"/>
+            </w:pPr>
+          </w:p>
+          <w:p>
+            <w:pPr>
+              <w:spacing w:after="40" w:before="0" w:line="240" w:lineRule="auto"/>
+            </w:pPr>
+            <w:r>
+              <w:rPr>
+                <w:rFonts w:ascii="Arial" w:hAnsi="Arial" w:eastAsia="Arial"/>
+                <w:sz w:val="15"/>
+              </w:rPr>
+              <w:t>45.000</w:t>
+            </w:r>
+          </w:p>
+        </w:tc>
+        <w:tc>
+          <w:tcPr>
+            <w:tcW w:type="dxa" w:w="2880"/>
+            <w:vAlign w:val="top"/>
+          </w:tcPr>
+          <w:p>
+            <w:pPr>
+              <w:spacing w:after="40" w:before="0" w:line="240" w:lineRule="auto"/>
+            </w:pPr>
+          </w:p>
+          <w:p>
+            <w:pPr>
+              <w:spacing w:after="40" w:before="0" w:line="240" w:lineRule="auto"/>
+            </w:pPr>
+            <w:r>
+              <w:rPr>
+                <w:rFonts w:ascii="Arial" w:hAnsi="Arial" w:eastAsia="Arial"/>
+                <w:sz w:val="15"/>
+              </w:rPr>
+              <w:t>%3,7</w:t>
+            </w:r>
+          </w:p>
+        </w:tc>
+      </w:tr>
+      <w:tr>
+        <w:tc>
+          <w:tcPr>
+            <w:tcW w:type="dxa" w:w="2880"/>
+            <w:vAlign w:val="top"/>
+          </w:tcPr>
+          <w:p>
+            <w:pPr>
+              <w:spacing w:after="40" w:before="0" w:line="240" w:lineRule="auto"/>
+            </w:pPr>
+          </w:p>
+          <w:p>
+            <w:pPr>
+              <w:spacing w:after="40" w:before="0" w:line="240" w:lineRule="auto"/>
+            </w:pPr>
+            <w:r>
+              <w:rPr>
+                <w:rFonts w:ascii="Arial" w:hAnsi="Arial" w:eastAsia="Arial"/>
+                <w:b/>
+                <w:sz w:val="15"/>
+              </w:rPr>
+              <w:t>TOPLAM (üst limit dahilinde)</w:t>
+            </w:r>
+          </w:p>
+        </w:tc>
+        <w:tc>
+          <w:tcPr>
+            <w:tcW w:type="dxa" w:w="2880"/>
+            <w:vAlign w:val="top"/>
+          </w:tcPr>
+          <w:p>
+            <w:pPr>
+              <w:spacing w:after="40" w:before="0" w:line="240" w:lineRule="auto"/>
+            </w:pPr>
+          </w:p>
+          <w:p>
+            <w:pPr>
+              <w:spacing w:after="40" w:before="0" w:line="240" w:lineRule="auto"/>
+            </w:pPr>
+            <w:r>
+              <w:rPr>
+                <w:rFonts w:ascii="Arial" w:hAnsi="Arial" w:eastAsia="Arial"/>
+                <w:b/>
+                <w:sz w:val="15"/>
+              </w:rPr>
+              <w:t>1.200.000</w:t>
+            </w:r>
+          </w:p>
+        </w:tc>
+        <w:tc>
+          <w:tcPr>
+            <w:tcW w:type="dxa" w:w="2880"/>
+            <w:vAlign w:val="top"/>
+          </w:tcPr>
+          <w:p>
+            <w:pPr>
+              <w:spacing w:after="40" w:before="0" w:line="240" w:lineRule="auto"/>
+            </w:pPr>
+          </w:p>
+          <w:p>
+            <w:pPr>
+              <w:spacing w:after="40" w:before="0" w:line="240" w:lineRule="auto"/>
+            </w:pPr>
+            <w:r>
+              <w:rPr>
+                <w:rFonts w:ascii="Arial" w:hAnsi="Arial" w:eastAsia="Arial"/>
+                <w:sz w:val="15"/>
+              </w:rPr>
+              <w:t>%100</w:t>
+            </w:r>
+          </w:p>
+        </w:tc>
+      </w:tr>
+    </w:tbl>
+    <w:p/>
+    <w:p>
+      <w:pPr>
+        <w:spacing w:after="60" w:before="0" w:line="240" w:lineRule="auto"/>
+      </w:pPr>
+      <w:r>
+        <w:rPr>
+          <w:rFonts w:ascii="Arial" w:hAnsi="Arial" w:eastAsia="Arial"/>
+          <w:i/>
+          <w:sz w:val="18"/>
+        </w:rPr>
+        <w:t>PTİ ve kurum hissesi üst limit dışındadır ve TÜBİTAK tarafından ayrıca hesaplanır; bu tabloya dahil değildir.</w:t>
+      </w:r>
+    </w:p>
+    <w:p>
+      <w:pPr>
+        <w:spacing w:after="60" w:before="0" w:line="240" w:lineRule="auto"/>
+      </w:pPr>
+      <w:r>
+        <w:rPr>
+          <w:rFonts w:ascii="Arial" w:hAnsi="Arial" w:eastAsia="Arial"/>
+          <w:b/>
+          <w:sz w:val="19"/>
+        </w:rPr>
+        <w:t>2. Burs (Bursiyer Giderleri) — 828.000 TL</w:t>
+      </w:r>
+    </w:p>
+    <w:p>
+      <w:pPr>
+        <w:spacing w:after="60" w:before="0" w:line="240" w:lineRule="auto"/>
+      </w:pPr>
+      <w:r>
+        <w:rPr>
+          <w:rFonts w:ascii="Arial" w:hAnsi="Arial" w:eastAsia="Arial"/>
+          <w:sz w:val="18"/>
+        </w:rPr>
+        <w:t>Ekip 4 bursiyerden oluşur. İki gıda mühendisliği bursiyeri, doğrulama (WP4) ve tez çalışmalarını yürütmek üzere yaklaşık 7. ayda yüksek lisans düzeyine geçer ve bu dönemde çalışmayan (tam zamanlı) yüksek lisans burs oranından desteklenir.</w:t>
+      </w:r>
+    </w:p>
+    <w:tbl>
+      <w:tblPr>
+        <w:tblStyle w:val="TableGrid"/>
+        <w:tblW w:type="auto" w:w="0"/>
+        <w:tblLook w:firstColumn="1" w:firstRow="1" w:lastColumn="0" w:lastRow="0" w:noHBand="0" w:noVBand="1" w:val="04A0"/>
+        <w:jc w:val="center"/>
+        <w:tblBorders>
+          <w:top w:val="single" w:sz="4" w:space="0" w:color="000000"/>
+          <w:left w:val="single" w:sz="4" w:space="0" w:color="000000"/>
+          <w:bottom w:val="single" w:sz="4" w:space="0" w:color="000000"/>
+          <w:right w:val="single" w:sz="4" w:space="0" w:color="000000"/>
+          <w:insideH w:val="single" w:sz="4" w:space="0" w:color="000000"/>
+          <w:insideV w:val="single" w:sz="4" w:space="0" w:color="000000"/>
+        </w:tblBorders>
+      </w:tblPr>
+      <w:tblGrid>
+        <w:gridCol w:w="1728"/>
+        <w:gridCol w:w="1728"/>
+        <w:gridCol w:w="1728"/>
+        <w:gridCol w:w="1728"/>
+        <w:gridCol w:w="1728"/>
+      </w:tblGrid>
+      <w:tr>
+        <w:tc>
+          <w:tcPr>
+            <w:tcW w:type="dxa" w:w="1728"/>
+            <w:vAlign w:val="top"/>
+          </w:tcPr>
+          <w:p>
+            <w:pPr>
+              <w:spacing w:after="40" w:before="0" w:line="240" w:lineRule="auto"/>
+            </w:pPr>
+          </w:p>
+          <w:p>
+            <w:pPr>
+              <w:spacing w:after="40" w:before="0" w:line="240" w:lineRule="auto"/>
+            </w:pPr>
+            <w:r>
+              <w:rPr>
+                <w:rFonts w:ascii="Arial" w:hAnsi="Arial" w:eastAsia="Arial"/>
+                <w:b/>
+                <w:sz w:val="15"/>
+              </w:rPr>
+              <w:t>Bursiyer (rol)</w:t>
+            </w:r>
+          </w:p>
+        </w:tc>
+        <w:tc>
+          <w:tcPr>
+            <w:tcW w:type="dxa" w:w="1728"/>
+            <w:vAlign w:val="top"/>
+          </w:tcPr>
+          <w:p>
+            <w:pPr>
+              <w:spacing w:after="40" w:before="0" w:line="240" w:lineRule="auto"/>
+            </w:pPr>
+          </w:p>
+          <w:p>
+            <w:pPr>
+              <w:spacing w:after="40" w:before="0" w:line="240" w:lineRule="auto"/>
+            </w:pPr>
+            <w:r>
+              <w:rPr>
+                <w:rFonts w:ascii="Arial" w:hAnsi="Arial" w:eastAsia="Arial"/>
+                <w:b/>
+                <w:sz w:val="15"/>
+              </w:rPr>
+              <w:t>Düzey</w:t>
+            </w:r>
+          </w:p>
+        </w:tc>
+        <w:tc>
+          <w:tcPr>
+            <w:tcW w:type="dxa" w:w="1728"/>
+            <w:vAlign w:val="top"/>
+          </w:tcPr>
+          <w:p>
+            <w:pPr>
+              <w:spacing w:after="40" w:before="0" w:line="240" w:lineRule="auto"/>
+            </w:pPr>
+          </w:p>
+          <w:p>
+            <w:pPr>
+              <w:spacing w:after="40" w:before="0" w:line="240" w:lineRule="auto"/>
+            </w:pPr>
+            <w:r>
+              <w:rPr>
+                <w:rFonts w:ascii="Arial" w:hAnsi="Arial" w:eastAsia="Arial"/>
+                <w:b/>
+                <w:sz w:val="15"/>
+              </w:rPr>
+              <w:t>Süre</w:t>
+            </w:r>
+          </w:p>
+        </w:tc>
+        <w:tc>
+          <w:tcPr>
+            <w:tcW w:type="dxa" w:w="1728"/>
+            <w:vAlign w:val="top"/>
+          </w:tcPr>
+          <w:p>
+            <w:pPr>
+              <w:spacing w:after="40" w:before="0" w:line="240" w:lineRule="auto"/>
+            </w:pPr>
+          </w:p>
+          <w:p>
+            <w:pPr>
+              <w:spacing w:after="40" w:before="0" w:line="240" w:lineRule="auto"/>
+            </w:pPr>
+            <w:r>
+              <w:rPr>
+                <w:rFonts w:ascii="Arial" w:hAnsi="Arial" w:eastAsia="Arial"/>
+                <w:b/>
+                <w:sz w:val="15"/>
+              </w:rPr>
+              <w:t>Aylık (TL)</w:t>
+            </w:r>
+          </w:p>
+        </w:tc>
+        <w:tc>
+          <w:tcPr>
+            <w:tcW w:type="dxa" w:w="1728"/>
+            <w:vAlign w:val="top"/>
+          </w:tcPr>
+          <w:p>
+            <w:pPr>
+              <w:spacing w:after="40" w:before="0" w:line="240" w:lineRule="auto"/>
+            </w:pPr>
+          </w:p>
+          <w:p>
+            <w:pPr>
+              <w:spacing w:after="40" w:before="0" w:line="240" w:lineRule="auto"/>
+            </w:pPr>
+            <w:r>
+              <w:rPr>
+                <w:rFonts w:ascii="Arial" w:hAnsi="Arial" w:eastAsia="Arial"/>
+                <w:b/>
+                <w:sz w:val="15"/>
+              </w:rPr>
+              <w:t>Toplam (TL)</w:t>
+            </w:r>
+          </w:p>
+        </w:tc>
+      </w:tr>
+      <w:tr>
+        <w:tc>
+          <w:tcPr>
+            <w:tcW w:type="dxa" w:w="1728"/>
+            <w:vAlign w:val="top"/>
+          </w:tcPr>
+          <w:p>
+            <w:pPr>
+              <w:spacing w:after="40" w:before="0" w:line="240" w:lineRule="auto"/>
+            </w:pPr>
+          </w:p>
+          <w:p>
+            <w:pPr>
+              <w:spacing w:after="40" w:before="0" w:line="240" w:lineRule="auto"/>
+            </w:pPr>
+            <w:r>
+              <w:rPr>
+                <w:rFonts w:ascii="Arial" w:hAnsi="Arial" w:eastAsia="Arial"/>
+                <w:sz w:val="15"/>
+              </w:rPr>
+              <w:t>B1 — Yazılım / Yapay Zekâ</w:t>
+            </w:r>
+          </w:p>
+        </w:tc>
+        <w:tc>
+          <w:tcPr>
+            <w:tcW w:type="dxa" w:w="1728"/>
+            <w:vAlign w:val="top"/>
+          </w:tcPr>
+          <w:p>
+            <w:pPr>
+              <w:spacing w:after="40" w:before="0" w:line="240" w:lineRule="auto"/>
+            </w:pPr>
+          </w:p>
+          <w:p>
+            <w:pPr>
+              <w:spacing w:after="40" w:before="0" w:line="240" w:lineRule="auto"/>
+            </w:pPr>
+            <w:r>
+              <w:rPr>
+                <w:rFonts w:ascii="Arial" w:hAnsi="Arial" w:eastAsia="Arial"/>
+                <w:sz w:val="15"/>
+              </w:rPr>
+              <w:t>Lisans</w:t>
+            </w:r>
+          </w:p>
+        </w:tc>
+        <w:tc>
+          <w:tcPr>
+            <w:tcW w:type="dxa" w:w="1728"/>
+            <w:vAlign w:val="top"/>
+          </w:tcPr>
+          <w:p>
+            <w:pPr>
+              <w:spacing w:after="40" w:before="0" w:line="240" w:lineRule="auto"/>
+            </w:pPr>
+          </w:p>
+          <w:p>
+            <w:pPr>
+              <w:spacing w:after="40" w:before="0" w:line="240" w:lineRule="auto"/>
+            </w:pPr>
+            <w:r>
+              <w:rPr>
+                <w:rFonts w:ascii="Arial" w:hAnsi="Arial" w:eastAsia="Arial"/>
+                <w:sz w:val="15"/>
+              </w:rPr>
+              <w:t>1–18. ay (18 ay)</w:t>
+            </w:r>
+          </w:p>
+        </w:tc>
+        <w:tc>
+          <w:tcPr>
+            <w:tcW w:type="dxa" w:w="1728"/>
+            <w:vAlign w:val="top"/>
+          </w:tcPr>
+          <w:p>
+            <w:pPr>
+              <w:spacing w:after="40" w:before="0" w:line="240" w:lineRule="auto"/>
+            </w:pPr>
+          </w:p>
+          <w:p>
+            <w:pPr>
+              <w:spacing w:after="40" w:before="0" w:line="240" w:lineRule="auto"/>
+            </w:pPr>
+            <w:r>
+              <w:rPr>
+                <w:rFonts w:ascii="Arial" w:hAnsi="Arial" w:eastAsia="Arial"/>
+                <w:sz w:val="15"/>
+              </w:rPr>
+              <w:t>6.000</w:t>
+            </w:r>
+          </w:p>
+        </w:tc>
+        <w:tc>
+          <w:tcPr>
+            <w:tcW w:type="dxa" w:w="1728"/>
+            <w:vAlign w:val="top"/>
+          </w:tcPr>
+          <w:p>
+            <w:pPr>
+              <w:spacing w:after="40" w:before="0" w:line="240" w:lineRule="auto"/>
+            </w:pPr>
+          </w:p>
+          <w:p>
+            <w:pPr>
+              <w:spacing w:after="40" w:before="0" w:line="240" w:lineRule="auto"/>
+            </w:pPr>
+            <w:r>
+              <w:rPr>
+                <w:rFonts w:ascii="Arial" w:hAnsi="Arial" w:eastAsia="Arial"/>
+                <w:sz w:val="15"/>
+              </w:rPr>
+              <w:t>108.000</w:t>
+            </w:r>
+          </w:p>
+        </w:tc>
+      </w:tr>
+      <w:tr>
+        <w:tc>
+          <w:tcPr>
+            <w:tcW w:type="dxa" w:w="1728"/>
+            <w:vAlign w:val="top"/>
+          </w:tcPr>
+          <w:p>
+            <w:pPr>
+              <w:spacing w:after="40" w:before="0" w:line="240" w:lineRule="auto"/>
+            </w:pPr>
+          </w:p>
+          <w:p>
+            <w:pPr>
+              <w:spacing w:after="40" w:before="0" w:line="240" w:lineRule="auto"/>
+            </w:pPr>
+            <w:r>
+              <w:rPr>
+                <w:rFonts w:ascii="Arial" w:hAnsi="Arial" w:eastAsia="Arial"/>
+                <w:sz w:val="15"/>
+              </w:rPr>
+              <w:t>B2 — Yazılım / Yapay Zekâ</w:t>
+            </w:r>
+          </w:p>
+        </w:tc>
+        <w:tc>
+          <w:tcPr>
+            <w:tcW w:type="dxa" w:w="1728"/>
+            <w:vAlign w:val="top"/>
+          </w:tcPr>
+          <w:p>
+            <w:pPr>
+              <w:spacing w:after="40" w:before="0" w:line="240" w:lineRule="auto"/>
+            </w:pPr>
+          </w:p>
+          <w:p>
+            <w:pPr>
+              <w:spacing w:after="40" w:before="0" w:line="240" w:lineRule="auto"/>
+            </w:pPr>
+            <w:r>
+              <w:rPr>
+                <w:rFonts w:ascii="Arial" w:hAnsi="Arial" w:eastAsia="Arial"/>
+                <w:sz w:val="15"/>
+              </w:rPr>
+              <w:t>Lisans</w:t>
+            </w:r>
+          </w:p>
+        </w:tc>
+        <w:tc>
+          <w:tcPr>
+            <w:tcW w:type="dxa" w:w="1728"/>
+            <w:vAlign w:val="top"/>
+          </w:tcPr>
+          <w:p>
+            <w:pPr>
+              <w:spacing w:after="40" w:before="0" w:line="240" w:lineRule="auto"/>
+            </w:pPr>
+          </w:p>
+          <w:p>
+            <w:pPr>
+              <w:spacing w:after="40" w:before="0" w:line="240" w:lineRule="auto"/>
+            </w:pPr>
+            <w:r>
+              <w:rPr>
+                <w:rFonts w:ascii="Arial" w:hAnsi="Arial" w:eastAsia="Arial"/>
+                <w:sz w:val="15"/>
+              </w:rPr>
+              <w:t>1–18. ay (18 ay)</w:t>
+            </w:r>
+          </w:p>
+        </w:tc>
+        <w:tc>
+          <w:tcPr>
+            <w:tcW w:type="dxa" w:w="1728"/>
+            <w:vAlign w:val="top"/>
+          </w:tcPr>
+          <w:p>
+            <w:pPr>
+              <w:spacing w:after="40" w:before="0" w:line="240" w:lineRule="auto"/>
+            </w:pPr>
+          </w:p>
+          <w:p>
+            <w:pPr>
+              <w:spacing w:after="40" w:before="0" w:line="240" w:lineRule="auto"/>
+            </w:pPr>
+            <w:r>
+              <w:rPr>
+                <w:rFonts w:ascii="Arial" w:hAnsi="Arial" w:eastAsia="Arial"/>
+                <w:sz w:val="15"/>
+              </w:rPr>
+              <w:t>6.000</w:t>
+            </w:r>
+          </w:p>
+        </w:tc>
+        <w:tc>
+          <w:tcPr>
+            <w:tcW w:type="dxa" w:w="1728"/>
+            <w:vAlign w:val="top"/>
+          </w:tcPr>
+          <w:p>
+            <w:pPr>
+              <w:spacing w:after="40" w:before="0" w:line="240" w:lineRule="auto"/>
+            </w:pPr>
+          </w:p>
+          <w:p>
+            <w:pPr>
+              <w:spacing w:after="40" w:before="0" w:line="240" w:lineRule="auto"/>
+            </w:pPr>
+            <w:r>
+              <w:rPr>
+                <w:rFonts w:ascii="Arial" w:hAnsi="Arial" w:eastAsia="Arial"/>
+                <w:sz w:val="15"/>
+              </w:rPr>
+              <w:t>108.000</w:t>
+            </w:r>
+          </w:p>
+        </w:tc>
+      </w:tr>
+      <w:tr>
+        <w:tc>
+          <w:tcPr>
+            <w:tcW w:type="dxa" w:w="1728"/>
+            <w:vAlign w:val="top"/>
+          </w:tcPr>
+          <w:p>
+            <w:pPr>
+              <w:spacing w:after="40" w:before="0" w:line="240" w:lineRule="auto"/>
+            </w:pPr>
+          </w:p>
+          <w:p>
+            <w:pPr>
+              <w:spacing w:after="40" w:before="0" w:line="240" w:lineRule="auto"/>
+            </w:pPr>
+            <w:r>
+              <w:rPr>
+                <w:rFonts w:ascii="Arial" w:hAnsi="Arial" w:eastAsia="Arial"/>
+                <w:sz w:val="15"/>
+              </w:rPr>
+              <w:t>B3 — Gıda Mühendisliği</w:t>
+            </w:r>
+          </w:p>
+        </w:tc>
+        <w:tc>
+          <w:tcPr>
+            <w:tcW w:type="dxa" w:w="1728"/>
+            <w:vAlign w:val="top"/>
+          </w:tcPr>
+          <w:p>
+            <w:pPr>
+              <w:spacing w:after="40" w:before="0" w:line="240" w:lineRule="auto"/>
+            </w:pPr>
+          </w:p>
+          <w:p>
+            <w:pPr>
+              <w:spacing w:after="40" w:before="0" w:line="240" w:lineRule="auto"/>
+            </w:pPr>
+            <w:r>
+              <w:rPr>
+                <w:rFonts w:ascii="Arial" w:hAnsi="Arial" w:eastAsia="Arial"/>
+                <w:sz w:val="15"/>
+              </w:rPr>
+              <w:t>Lisans → Yüksek Lisans</w:t>
+            </w:r>
+          </w:p>
+        </w:tc>
+        <w:tc>
+          <w:tcPr>
+            <w:tcW w:type="dxa" w:w="1728"/>
+            <w:vAlign w:val="top"/>
+          </w:tcPr>
+          <w:p>
+            <w:pPr>
+              <w:spacing w:after="40" w:before="0" w:line="240" w:lineRule="auto"/>
+            </w:pPr>
+          </w:p>
+          <w:p>
+            <w:pPr>
+              <w:spacing w:after="40" w:before="0" w:line="240" w:lineRule="auto"/>
+            </w:pPr>
+            <w:r>
+              <w:rPr>
+                <w:rFonts w:ascii="Arial" w:hAnsi="Arial" w:eastAsia="Arial"/>
+                <w:sz w:val="15"/>
+              </w:rPr>
+              <w:t>1–6. ay (Lisans) / 7–18. ay (YL)</w:t>
+            </w:r>
+          </w:p>
+        </w:tc>
+        <w:tc>
+          <w:tcPr>
+            <w:tcW w:type="dxa" w:w="1728"/>
+            <w:vAlign w:val="top"/>
+          </w:tcPr>
+          <w:p>
+            <w:pPr>
+              <w:spacing w:after="40" w:before="0" w:line="240" w:lineRule="auto"/>
+            </w:pPr>
+          </w:p>
+          <w:p>
+            <w:pPr>
+              <w:spacing w:after="40" w:before="0" w:line="240" w:lineRule="auto"/>
+            </w:pPr>
+            <w:r>
+              <w:rPr>
+                <w:rFonts w:ascii="Arial" w:hAnsi="Arial" w:eastAsia="Arial"/>
+                <w:sz w:val="15"/>
+              </w:rPr>
+              <w:t>6.000 / 22.500</w:t>
+            </w:r>
+          </w:p>
+        </w:tc>
+        <w:tc>
+          <w:tcPr>
+            <w:tcW w:type="dxa" w:w="1728"/>
+            <w:vAlign w:val="top"/>
+          </w:tcPr>
+          <w:p>
+            <w:pPr>
+              <w:spacing w:after="40" w:before="0" w:line="240" w:lineRule="auto"/>
+            </w:pPr>
+          </w:p>
+          <w:p>
+            <w:pPr>
+              <w:spacing w:after="40" w:before="0" w:line="240" w:lineRule="auto"/>
+            </w:pPr>
+            <w:r>
+              <w:rPr>
+                <w:rFonts w:ascii="Arial" w:hAnsi="Arial" w:eastAsia="Arial"/>
+                <w:sz w:val="15"/>
+              </w:rPr>
+              <w:t>306.000</w:t>
+            </w:r>
+          </w:p>
+        </w:tc>
+      </w:tr>
+      <w:tr>
+        <w:tc>
+          <w:tcPr>
+            <w:tcW w:type="dxa" w:w="1728"/>
+            <w:vAlign w:val="top"/>
+          </w:tcPr>
+          <w:p>
+            <w:pPr>
+              <w:spacing w:after="40" w:before="0" w:line="240" w:lineRule="auto"/>
+            </w:pPr>
+          </w:p>
+          <w:p>
+            <w:pPr>
+              <w:spacing w:after="40" w:before="0" w:line="240" w:lineRule="auto"/>
+            </w:pPr>
+            <w:r>
+              <w:rPr>
+                <w:rFonts w:ascii="Arial" w:hAnsi="Arial" w:eastAsia="Arial"/>
+                <w:sz w:val="15"/>
+              </w:rPr>
+              <w:t>B4 — Gıda Mühendisliği</w:t>
+            </w:r>
+          </w:p>
+        </w:tc>
+        <w:tc>
+          <w:tcPr>
+            <w:tcW w:type="dxa" w:w="1728"/>
+            <w:vAlign w:val="top"/>
+          </w:tcPr>
+          <w:p>
+            <w:pPr>
+              <w:spacing w:after="40" w:before="0" w:line="240" w:lineRule="auto"/>
+            </w:pPr>
+          </w:p>
+          <w:p>
+            <w:pPr>
+              <w:spacing w:after="40" w:before="0" w:line="240" w:lineRule="auto"/>
+            </w:pPr>
+            <w:r>
+              <w:rPr>
+                <w:rFonts w:ascii="Arial" w:hAnsi="Arial" w:eastAsia="Arial"/>
+                <w:sz w:val="15"/>
+              </w:rPr>
+              <w:t>Lisans → Yüksek Lisans</w:t>
+            </w:r>
+          </w:p>
+        </w:tc>
+        <w:tc>
+          <w:tcPr>
+            <w:tcW w:type="dxa" w:w="1728"/>
+            <w:vAlign w:val="top"/>
+          </w:tcPr>
+          <w:p>
+            <w:pPr>
+              <w:spacing w:after="40" w:before="0" w:line="240" w:lineRule="auto"/>
+            </w:pPr>
+          </w:p>
+          <w:p>
+            <w:pPr>
+              <w:spacing w:after="40" w:before="0" w:line="240" w:lineRule="auto"/>
+            </w:pPr>
+            <w:r>
+              <w:rPr>
+                <w:rFonts w:ascii="Arial" w:hAnsi="Arial" w:eastAsia="Arial"/>
+                <w:sz w:val="15"/>
+              </w:rPr>
+              <w:t>1–6. ay (Lisans) / 7–18. ay (YL)</w:t>
+            </w:r>
+          </w:p>
+        </w:tc>
+        <w:tc>
+          <w:tcPr>
+            <w:tcW w:type="dxa" w:w="1728"/>
+            <w:vAlign w:val="top"/>
+          </w:tcPr>
+          <w:p>
+            <w:pPr>
+              <w:spacing w:after="40" w:before="0" w:line="240" w:lineRule="auto"/>
+            </w:pPr>
+          </w:p>
+          <w:p>
+            <w:pPr>
+              <w:spacing w:after="40" w:before="0" w:line="240" w:lineRule="auto"/>
+            </w:pPr>
+            <w:r>
+              <w:rPr>
+                <w:rFonts w:ascii="Arial" w:hAnsi="Arial" w:eastAsia="Arial"/>
+                <w:sz w:val="15"/>
+              </w:rPr>
+              <w:t>6.000 / 22.500</w:t>
+            </w:r>
+          </w:p>
+        </w:tc>
+        <w:tc>
+          <w:tcPr>
+            <w:tcW w:type="dxa" w:w="1728"/>
+            <w:vAlign w:val="top"/>
+          </w:tcPr>
+          <w:p>
+            <w:pPr>
+              <w:spacing w:after="40" w:before="0" w:line="240" w:lineRule="auto"/>
+            </w:pPr>
+          </w:p>
+          <w:p>
+            <w:pPr>
+              <w:spacing w:after="40" w:before="0" w:line="240" w:lineRule="auto"/>
+            </w:pPr>
+            <w:r>
+              <w:rPr>
+                <w:rFonts w:ascii="Arial" w:hAnsi="Arial" w:eastAsia="Arial"/>
+                <w:sz w:val="15"/>
+              </w:rPr>
+              <w:t>306.000</w:t>
+            </w:r>
+          </w:p>
+        </w:tc>
+      </w:tr>
+      <w:tr>
+        <w:tc>
+          <w:tcPr>
+            <w:tcW w:type="dxa" w:w="1728"/>
+            <w:vAlign w:val="top"/>
+          </w:tcPr>
+          <w:p>
+            <w:pPr>
+              <w:spacing w:after="40" w:before="0" w:line="240" w:lineRule="auto"/>
+            </w:pPr>
+          </w:p>
+          <w:p>
+            <w:pPr>
+              <w:spacing w:after="40" w:before="0" w:line="240" w:lineRule="auto"/>
+            </w:pPr>
+            <w:r>
+              <w:rPr>
+                <w:rFonts w:ascii="Arial" w:hAnsi="Arial" w:eastAsia="Arial"/>
+                <w:b/>
+                <w:sz w:val="15"/>
+              </w:rPr>
+              <w:t>Toplam</w:t>
+            </w:r>
+          </w:p>
+        </w:tc>
+        <w:tc>
+          <w:tcPr>
+            <w:tcW w:type="dxa" w:w="1728"/>
+            <w:vAlign w:val="top"/>
+          </w:tcPr>
+          <w:p>
+            <w:pPr>
+              <w:spacing w:after="40" w:before="0" w:line="240" w:lineRule="auto"/>
+            </w:pPr>
+          </w:p>
+        </w:tc>
+        <w:tc>
+          <w:tcPr>
+            <w:tcW w:type="dxa" w:w="1728"/>
+            <w:vAlign w:val="top"/>
+          </w:tcPr>
+          <w:p>
+            <w:pPr>
+              <w:spacing w:after="40" w:before="0" w:line="240" w:lineRule="auto"/>
+            </w:pPr>
+          </w:p>
+        </w:tc>
+        <w:tc>
+          <w:tcPr>
+            <w:tcW w:type="dxa" w:w="1728"/>
+            <w:vAlign w:val="top"/>
+          </w:tcPr>
+          <w:p>
+            <w:pPr>
+              <w:spacing w:after="40" w:before="0" w:line="240" w:lineRule="auto"/>
+            </w:pPr>
+          </w:p>
+        </w:tc>
+        <w:tc>
+          <w:tcPr>
+            <w:tcW w:type="dxa" w:w="1728"/>
+            <w:vAlign w:val="top"/>
+          </w:tcPr>
+          <w:p>
+            <w:pPr>
+              <w:spacing w:after="40" w:before="0" w:line="240" w:lineRule="auto"/>
+            </w:pPr>
+          </w:p>
+          <w:p>
+            <w:pPr>
+              <w:spacing w:after="40" w:before="0" w:line="240" w:lineRule="auto"/>
+            </w:pPr>
+            <w:r>
+              <w:rPr>
+                <w:rFonts w:ascii="Arial" w:hAnsi="Arial" w:eastAsia="Arial"/>
+                <w:b/>
+                <w:sz w:val="15"/>
+              </w:rPr>
+              <w:t>828.000</w:t>
+            </w:r>
+          </w:p>
+        </w:tc>
+      </w:tr>
+    </w:tbl>
+    <w:p/>
+    <w:p>
+      <w:pPr>
+        <w:spacing w:after="60" w:before="0" w:line="240" w:lineRule="auto"/>
+      </w:pPr>
+      <w:r>
+        <w:rPr>
+          <w:rFonts w:ascii="Arial" w:hAnsi="Arial" w:eastAsia="Arial"/>
+          <w:b/>
+          <w:sz w:val="18"/>
+        </w:rPr>
+        <w:t>Gerekçe:</w:t>
+      </w:r>
+      <w:r>
+        <w:rPr>
+          <w:rFonts w:ascii="Arial" w:hAnsi="Arial" w:eastAsia="Arial"/>
+          <w:sz w:val="18"/>
+        </w:rPr>
+        <w:t xml:space="preserve"> Bursiyer emeği projenin temel araştırma girdisidir; mevcut prototip üzerine eksik araştırma bileşenleri (ağırlıkları açık modellere geçiş, gıda bilimi doğrulama kural motoru, Öğrenilmiş Yönlendirici, katmanlar arası öğrenme döngüsü) bursiyerler tarafından geliştirilir. İki gıda mühendisliği bursiyerinin yüksek lisansa geçişi, WP4 uzman doğrulamasının Prof. Dr. Şumnu gözetiminde yüksek lisans düzeyinde yürütülmesini ve iki yüksek lisans tezinin (yaygın etki çıktısı) üretilmesini sağlar.</w:t>
+      </w:r>
+    </w:p>
+    <w:p>
+      <w:pPr>
+        <w:spacing w:after="60" w:before="0" w:line="240" w:lineRule="auto"/>
+      </w:pPr>
+      <w:r>
+        <w:rPr>
+          <w:rFonts w:ascii="Arial" w:hAnsi="Arial" w:eastAsia="Arial"/>
+          <w:b/>
+          <w:sz w:val="19"/>
+        </w:rPr>
+        <w:t>3. Makine-Teçhizat — 242.000 TL</w:t>
+      </w:r>
+    </w:p>
+    <w:tbl>
+      <w:tblPr>
+        <w:tblStyle w:val="TableGrid"/>
+        <w:tblW w:type="auto" w:w="0"/>
+        <w:tblLook w:firstColumn="1" w:firstRow="1" w:lastColumn="0" w:lastRow="0" w:noHBand="0" w:noVBand="1" w:val="04A0"/>
+        <w:jc w:val="center"/>
+        <w:tblBorders>
+          <w:top w:val="single" w:sz="4" w:space="0" w:color="000000"/>
+          <w:left w:val="single" w:sz="4" w:space="0" w:color="000000"/>
+          <w:bottom w:val="single" w:sz="4" w:space="0" w:color="000000"/>
+          <w:right w:val="single" w:sz="4" w:space="0" w:color="000000"/>
+          <w:insideH w:val="single" w:sz="4" w:space="0" w:color="000000"/>
+          <w:insideV w:val="single" w:sz="4" w:space="0" w:color="000000"/>
+        </w:tblBorders>
+      </w:tblPr>
+      <w:tblGrid>
+        <w:gridCol w:w="1728"/>
+        <w:gridCol w:w="1728"/>
+        <w:gridCol w:w="1728"/>
+        <w:gridCol w:w="1728"/>
+        <w:gridCol w:w="1728"/>
+      </w:tblGrid>
+      <w:tr>
+        <w:tc>
+          <w:tcPr>
+            <w:tcW w:type="dxa" w:w="1728"/>
+            <w:vAlign w:val="top"/>
+          </w:tcPr>
+          <w:p>
+            <w:pPr>
+              <w:spacing w:after="40" w:before="0" w:line="240" w:lineRule="auto"/>
+            </w:pPr>
+          </w:p>
+          <w:p>
+            <w:pPr>
+              <w:spacing w:after="40" w:before="0" w:line="240" w:lineRule="auto"/>
+            </w:pPr>
+            <w:r>
+              <w:rPr>
+                <w:rFonts w:ascii="Arial" w:hAnsi="Arial" w:eastAsia="Arial"/>
+                <w:b/>
+                <w:sz w:val="15"/>
+              </w:rPr>
+              <w:t>Kalem</w:t>
+            </w:r>
+          </w:p>
+        </w:tc>
+        <w:tc>
+          <w:tcPr>
+            <w:tcW w:type="dxa" w:w="1728"/>
+            <w:vAlign w:val="top"/>
+          </w:tcPr>
+          <w:p>
+            <w:pPr>
+              <w:spacing w:after="40" w:before="0" w:line="240" w:lineRule="auto"/>
+            </w:pPr>
+          </w:p>
+          <w:p>
+            <w:pPr>
+              <w:spacing w:after="40" w:before="0" w:line="240" w:lineRule="auto"/>
+            </w:pPr>
+            <w:r>
+              <w:rPr>
+                <w:rFonts w:ascii="Arial" w:hAnsi="Arial" w:eastAsia="Arial"/>
+                <w:b/>
+                <w:sz w:val="15"/>
+              </w:rPr>
+              <w:t>Adet</w:t>
+            </w:r>
+          </w:p>
+        </w:tc>
+        <w:tc>
+          <w:tcPr>
+            <w:tcW w:type="dxa" w:w="1728"/>
+            <w:vAlign w:val="top"/>
+          </w:tcPr>
+          <w:p>
+            <w:pPr>
+              <w:spacing w:after="40" w:before="0" w:line="240" w:lineRule="auto"/>
+            </w:pPr>
+          </w:p>
+          <w:p>
+            <w:pPr>
+              <w:spacing w:after="40" w:before="0" w:line="240" w:lineRule="auto"/>
+            </w:pPr>
+            <w:r>
+              <w:rPr>
+                <w:rFonts w:ascii="Arial" w:hAnsi="Arial" w:eastAsia="Arial"/>
+                <w:b/>
+                <w:sz w:val="15"/>
+              </w:rPr>
+              <w:t>Birim (tahmini, TL)</w:t>
+            </w:r>
+          </w:p>
+        </w:tc>
+        <w:tc>
+          <w:tcPr>
+            <w:tcW w:type="dxa" w:w="1728"/>
+            <w:vAlign w:val="top"/>
+          </w:tcPr>
+          <w:p>
+            <w:pPr>
+              <w:spacing w:after="40" w:before="0" w:line="240" w:lineRule="auto"/>
+            </w:pPr>
+          </w:p>
+          <w:p>
+            <w:pPr>
+              <w:spacing w:after="40" w:before="0" w:line="240" w:lineRule="auto"/>
+            </w:pPr>
+            <w:r>
+              <w:rPr>
+                <w:rFonts w:ascii="Arial" w:hAnsi="Arial" w:eastAsia="Arial"/>
+                <w:b/>
+                <w:sz w:val="15"/>
+              </w:rPr>
+              <w:t>Toplam (TL)</w:t>
+            </w:r>
+          </w:p>
+        </w:tc>
+        <w:tc>
+          <w:tcPr>
+            <w:tcW w:type="dxa" w:w="1728"/>
+            <w:vAlign w:val="top"/>
+          </w:tcPr>
+          <w:p>
+            <w:pPr>
+              <w:spacing w:after="40" w:before="0" w:line="240" w:lineRule="auto"/>
+            </w:pPr>
+          </w:p>
+          <w:p>
+            <w:pPr>
+              <w:spacing w:after="40" w:before="0" w:line="240" w:lineRule="auto"/>
+            </w:pPr>
+            <w:r>
+              <w:rPr>
+                <w:rFonts w:ascii="Arial" w:hAnsi="Arial" w:eastAsia="Arial"/>
+                <w:b/>
+                <w:sz w:val="15"/>
+              </w:rPr>
+              <w:t>Gerekçe</w:t>
+            </w:r>
+          </w:p>
+        </w:tc>
+      </w:tr>
+      <w:tr>
+        <w:tc>
+          <w:tcPr>
+            <w:tcW w:type="dxa" w:w="1728"/>
+            <w:vAlign w:val="top"/>
+          </w:tcPr>
+          <w:p>
+            <w:pPr>
+              <w:spacing w:after="40" w:before="0" w:line="240" w:lineRule="auto"/>
+            </w:pPr>
+          </w:p>
+          <w:p>
+            <w:pPr>
+              <w:spacing w:after="40" w:before="0" w:line="240" w:lineRule="auto"/>
+            </w:pPr>
+            <w:r>
+              <w:rPr>
+                <w:rFonts w:ascii="Arial" w:hAnsi="Arial" w:eastAsia="Arial"/>
+                <w:sz w:val="15"/>
+              </w:rPr>
+              <w:t>GPU iş istasyonu (tek GPU, 16–24 GB VRAM sınıfı; çok çekirdekli CPU; 64–128 GB RAM; 1–2 TB NVMe)</w:t>
+            </w:r>
+          </w:p>
+        </w:tc>
+        <w:tc>
+          <w:tcPr>
+            <w:tcW w:type="dxa" w:w="1728"/>
+            <w:vAlign w:val="top"/>
+          </w:tcPr>
+          <w:p>
+            <w:pPr>
+              <w:spacing w:after="40" w:before="0" w:line="240" w:lineRule="auto"/>
+            </w:pPr>
+          </w:p>
+          <w:p>
+            <w:pPr>
+              <w:spacing w:after="40" w:before="0" w:line="240" w:lineRule="auto"/>
+            </w:pPr>
+            <w:r>
+              <w:rPr>
+                <w:rFonts w:ascii="Arial" w:hAnsi="Arial" w:eastAsia="Arial"/>
+                <w:sz w:val="15"/>
+              </w:rPr>
+              <w:t>1</w:t>
+            </w:r>
+          </w:p>
+        </w:tc>
+        <w:tc>
+          <w:tcPr>
+            <w:tcW w:type="dxa" w:w="1728"/>
+            <w:vAlign w:val="top"/>
+          </w:tcPr>
+          <w:p>
+            <w:pPr>
+              <w:spacing w:after="40" w:before="0" w:line="240" w:lineRule="auto"/>
+            </w:pPr>
+          </w:p>
+          <w:p>
+            <w:pPr>
+              <w:spacing w:after="40" w:before="0" w:line="240" w:lineRule="auto"/>
+            </w:pPr>
+            <w:r>
+              <w:rPr>
+                <w:rFonts w:ascii="Arial" w:hAnsi="Arial" w:eastAsia="Arial"/>
+                <w:sz w:val="15"/>
+              </w:rPr>
+              <w:t>170.000</w:t>
+            </w:r>
+          </w:p>
+        </w:tc>
+        <w:tc>
+          <w:tcPr>
+            <w:tcW w:type="dxa" w:w="1728"/>
+            <w:vAlign w:val="top"/>
+          </w:tcPr>
+          <w:p>
+            <w:pPr>
+              <w:spacing w:after="40" w:before="0" w:line="240" w:lineRule="auto"/>
+            </w:pPr>
+          </w:p>
+          <w:p>
+            <w:pPr>
+              <w:spacing w:after="40" w:before="0" w:line="240" w:lineRule="auto"/>
+            </w:pPr>
+            <w:r>
+              <w:rPr>
+                <w:rFonts w:ascii="Arial" w:hAnsi="Arial" w:eastAsia="Arial"/>
+                <w:sz w:val="15"/>
+              </w:rPr>
+              <w:t>170.000</w:t>
+            </w:r>
+          </w:p>
+        </w:tc>
+        <w:tc>
+          <w:tcPr>
+            <w:tcW w:type="dxa" w:w="1728"/>
+            <w:vAlign w:val="top"/>
+          </w:tcPr>
+          <w:p>
+            <w:pPr>
+              <w:spacing w:after="40" w:before="0" w:line="240" w:lineRule="auto"/>
+            </w:pPr>
+          </w:p>
+          <w:p>
+            <w:pPr>
+              <w:spacing w:after="40" w:before="0" w:line="240" w:lineRule="auto"/>
+            </w:pPr>
+            <w:r>
+              <w:rPr>
+                <w:rFonts w:ascii="Arial" w:hAnsi="Arial" w:eastAsia="Arial"/>
+                <w:sz w:val="15"/>
+              </w:rPr>
+              <w:t>L3 ağırlıkları açık modellerin geliştirme/testi, çıkarım servisleri, Öğrenilmiş Yönlendirici eğitimi ve PEFT/LoRA-QLoRA ölçeğinde yerel ince ayar. Büyük ölçekli ince ayar ve kapsamlı kıyaslama için TRUBA tahsisine başvurulur; tahsis gecikirse kapsam PEFT ölçeğinde tutulur ve gerekirse kısa süreli bulut GPU ile desteklenir.</w:t>
+            </w:r>
+          </w:p>
+        </w:tc>
+      </w:tr>
+      <w:tr>
+        <w:tc>
+          <w:tcPr>
+            <w:tcW w:type="dxa" w:w="1728"/>
+            <w:vAlign w:val="top"/>
+          </w:tcPr>
+          <w:p>
+            <w:pPr>
+              <w:spacing w:after="40" w:before="0" w:line="240" w:lineRule="auto"/>
+            </w:pPr>
+          </w:p>
+          <w:p>
+            <w:pPr>
+              <w:spacing w:after="40" w:before="0" w:line="240" w:lineRule="auto"/>
+            </w:pPr>
+            <w:r>
+              <w:rPr>
+                <w:rFonts w:ascii="Arial" w:hAnsi="Arial" w:eastAsia="Arial"/>
+                <w:sz w:val="15"/>
+              </w:rPr>
+              <w:t>NAS depolama + diskler (yedekli, ~8–12 TB ham)</w:t>
+            </w:r>
+          </w:p>
+        </w:tc>
+        <w:tc>
+          <w:tcPr>
+            <w:tcW w:type="dxa" w:w="1728"/>
+            <w:vAlign w:val="top"/>
+          </w:tcPr>
+          <w:p>
+            <w:pPr>
+              <w:spacing w:after="40" w:before="0" w:line="240" w:lineRule="auto"/>
+            </w:pPr>
+          </w:p>
+          <w:p>
+            <w:pPr>
+              <w:spacing w:after="40" w:before="0" w:line="240" w:lineRule="auto"/>
+            </w:pPr>
+            <w:r>
+              <w:rPr>
+                <w:rFonts w:ascii="Arial" w:hAnsi="Arial" w:eastAsia="Arial"/>
+                <w:sz w:val="15"/>
+              </w:rPr>
+              <w:t>1</w:t>
+            </w:r>
+          </w:p>
+        </w:tc>
+        <w:tc>
+          <w:tcPr>
+            <w:tcW w:type="dxa" w:w="1728"/>
+            <w:vAlign w:val="top"/>
+          </w:tcPr>
+          <w:p>
+            <w:pPr>
+              <w:spacing w:after="40" w:before="0" w:line="240" w:lineRule="auto"/>
+            </w:pPr>
+          </w:p>
+          <w:p>
+            <w:pPr>
+              <w:spacing w:after="40" w:before="0" w:line="240" w:lineRule="auto"/>
+            </w:pPr>
+            <w:r>
+              <w:rPr>
+                <w:rFonts w:ascii="Arial" w:hAnsi="Arial" w:eastAsia="Arial"/>
+                <w:sz w:val="15"/>
+              </w:rPr>
+              <w:t>55.000</w:t>
+            </w:r>
+          </w:p>
+        </w:tc>
+        <w:tc>
+          <w:tcPr>
+            <w:tcW w:type="dxa" w:w="1728"/>
+            <w:vAlign w:val="top"/>
+          </w:tcPr>
+          <w:p>
+            <w:pPr>
+              <w:spacing w:after="40" w:before="0" w:line="240" w:lineRule="auto"/>
+            </w:pPr>
+          </w:p>
+          <w:p>
+            <w:pPr>
+              <w:spacing w:after="40" w:before="0" w:line="240" w:lineRule="auto"/>
+            </w:pPr>
+            <w:r>
+              <w:rPr>
+                <w:rFonts w:ascii="Arial" w:hAnsi="Arial" w:eastAsia="Arial"/>
+                <w:sz w:val="15"/>
+              </w:rPr>
+              <w:t>55.000</w:t>
+            </w:r>
+          </w:p>
+        </w:tc>
+        <w:tc>
+          <w:tcPr>
+            <w:tcW w:type="dxa" w:w="1728"/>
+            <w:vAlign w:val="top"/>
+          </w:tcPr>
+          <w:p>
+            <w:pPr>
+              <w:spacing w:after="40" w:before="0" w:line="240" w:lineRule="auto"/>
+            </w:pPr>
+          </w:p>
+          <w:p>
+            <w:pPr>
+              <w:spacing w:after="40" w:before="0" w:line="240" w:lineRule="auto"/>
+            </w:pPr>
+            <w:r>
+              <w:rPr>
+                <w:rFonts w:ascii="Arial" w:hAnsi="Arial" w:eastAsia="Arial"/>
+                <w:sz w:val="15"/>
+              </w:rPr>
+              <w:t>Birincil veri tabanı, PDF/tam metin önbelleği, model kontrol noktaları ve yedekleme.</w:t>
+            </w:r>
+          </w:p>
+        </w:tc>
+      </w:tr>
+      <w:tr>
+        <w:tc>
+          <w:tcPr>
+            <w:tcW w:type="dxa" w:w="1728"/>
+            <w:vAlign w:val="top"/>
+          </w:tcPr>
+          <w:p>
+            <w:pPr>
+              <w:spacing w:after="40" w:before="0" w:line="240" w:lineRule="auto"/>
+            </w:pPr>
+          </w:p>
+          <w:p>
+            <w:pPr>
+              <w:spacing w:after="40" w:before="0" w:line="240" w:lineRule="auto"/>
+            </w:pPr>
+            <w:r>
+              <w:rPr>
+                <w:rFonts w:ascii="Arial" w:hAnsi="Arial" w:eastAsia="Arial"/>
+                <w:sz w:val="15"/>
+              </w:rPr>
+              <w:t>Kesintisiz güç kaynağı (KGK) + ağ donanımı</w:t>
+            </w:r>
+          </w:p>
+        </w:tc>
+        <w:tc>
+          <w:tcPr>
+            <w:tcW w:type="dxa" w:w="1728"/>
+            <w:vAlign w:val="top"/>
+          </w:tcPr>
+          <w:p>
+            <w:pPr>
+              <w:spacing w:after="40" w:before="0" w:line="240" w:lineRule="auto"/>
+            </w:pPr>
+          </w:p>
+          <w:p>
+            <w:pPr>
+              <w:spacing w:after="40" w:before="0" w:line="240" w:lineRule="auto"/>
+            </w:pPr>
+            <w:r>
+              <w:rPr>
+                <w:rFonts w:ascii="Arial" w:hAnsi="Arial" w:eastAsia="Arial"/>
+                <w:sz w:val="15"/>
+              </w:rPr>
+              <w:t>1</w:t>
+            </w:r>
+          </w:p>
+        </w:tc>
+        <w:tc>
+          <w:tcPr>
+            <w:tcW w:type="dxa" w:w="1728"/>
+            <w:vAlign w:val="top"/>
+          </w:tcPr>
+          <w:p>
+            <w:pPr>
+              <w:spacing w:after="40" w:before="0" w:line="240" w:lineRule="auto"/>
+            </w:pPr>
+          </w:p>
+          <w:p>
+            <w:pPr>
+              <w:spacing w:after="40" w:before="0" w:line="240" w:lineRule="auto"/>
+            </w:pPr>
+            <w:r>
+              <w:rPr>
+                <w:rFonts w:ascii="Arial" w:hAnsi="Arial" w:eastAsia="Arial"/>
+                <w:sz w:val="15"/>
+              </w:rPr>
+              <w:t>17.000</w:t>
+            </w:r>
+          </w:p>
+        </w:tc>
+        <w:tc>
+          <w:tcPr>
+            <w:tcW w:type="dxa" w:w="1728"/>
+            <w:vAlign w:val="top"/>
+          </w:tcPr>
+          <w:p>
+            <w:pPr>
+              <w:spacing w:after="40" w:before="0" w:line="240" w:lineRule="auto"/>
+            </w:pPr>
+          </w:p>
+          <w:p>
+            <w:pPr>
+              <w:spacing w:after="40" w:before="0" w:line="240" w:lineRule="auto"/>
+            </w:pPr>
+            <w:r>
+              <w:rPr>
+                <w:rFonts w:ascii="Arial" w:hAnsi="Arial" w:eastAsia="Arial"/>
+                <w:sz w:val="15"/>
+              </w:rPr>
+              <w:t>17.000</w:t>
+            </w:r>
+          </w:p>
+        </w:tc>
+        <w:tc>
+          <w:tcPr>
+            <w:tcW w:type="dxa" w:w="1728"/>
+            <w:vAlign w:val="top"/>
+          </w:tcPr>
+          <w:p>
+            <w:pPr>
+              <w:spacing w:after="40" w:before="0" w:line="240" w:lineRule="auto"/>
+            </w:pPr>
+          </w:p>
+          <w:p>
+            <w:pPr>
+              <w:spacing w:after="40" w:before="0" w:line="240" w:lineRule="auto"/>
+            </w:pPr>
+            <w:r>
+              <w:rPr>
+                <w:rFonts w:ascii="Arial" w:hAnsi="Arial" w:eastAsia="Arial"/>
+                <w:sz w:val="15"/>
+              </w:rPr>
+              <w:t>Kesintisiz operasyon ve veri bütünlüğü.</w:t>
+            </w:r>
+          </w:p>
+        </w:tc>
+      </w:tr>
+      <w:tr>
+        <w:tc>
+          <w:tcPr>
+            <w:tcW w:type="dxa" w:w="1728"/>
+            <w:vAlign w:val="top"/>
+          </w:tcPr>
+          <w:p>
+            <w:pPr>
+              <w:spacing w:after="40" w:before="0" w:line="240" w:lineRule="auto"/>
+            </w:pPr>
+          </w:p>
+          <w:p>
+            <w:pPr>
+              <w:spacing w:after="40" w:before="0" w:line="240" w:lineRule="auto"/>
+            </w:pPr>
+            <w:r>
+              <w:rPr>
+                <w:rFonts w:ascii="Arial" w:hAnsi="Arial" w:eastAsia="Arial"/>
+                <w:b/>
+                <w:sz w:val="15"/>
+              </w:rPr>
+              <w:t>Ara toplam</w:t>
+            </w:r>
+          </w:p>
+        </w:tc>
+        <w:tc>
+          <w:tcPr>
+            <w:tcW w:type="dxa" w:w="1728"/>
+            <w:vAlign w:val="top"/>
+          </w:tcPr>
+          <w:p>
+            <w:pPr>
+              <w:spacing w:after="40" w:before="0" w:line="240" w:lineRule="auto"/>
+            </w:pPr>
+          </w:p>
+        </w:tc>
+        <w:tc>
+          <w:tcPr>
+            <w:tcW w:type="dxa" w:w="1728"/>
+            <w:vAlign w:val="top"/>
+          </w:tcPr>
+          <w:p>
+            <w:pPr>
+              <w:spacing w:after="40" w:before="0" w:line="240" w:lineRule="auto"/>
+            </w:pPr>
+          </w:p>
+        </w:tc>
+        <w:tc>
+          <w:tcPr>
+            <w:tcW w:type="dxa" w:w="1728"/>
+            <w:vAlign w:val="top"/>
+          </w:tcPr>
+          <w:p>
+            <w:pPr>
+              <w:spacing w:after="40" w:before="0" w:line="240" w:lineRule="auto"/>
+            </w:pPr>
+          </w:p>
+          <w:p>
+            <w:pPr>
+              <w:spacing w:after="40" w:before="0" w:line="240" w:lineRule="auto"/>
+            </w:pPr>
+            <w:r>
+              <w:rPr>
+                <w:rFonts w:ascii="Arial" w:hAnsi="Arial" w:eastAsia="Arial"/>
+                <w:b/>
+                <w:sz w:val="15"/>
+              </w:rPr>
+              <w:t>242.000</w:t>
+            </w:r>
+          </w:p>
+        </w:tc>
+        <w:tc>
+          <w:tcPr>
+            <w:tcW w:type="dxa" w:w="1728"/>
+            <w:vAlign w:val="top"/>
+          </w:tcPr>
+          <w:p>
+            <w:pPr>
+              <w:spacing w:after="40" w:before="0" w:line="240" w:lineRule="auto"/>
+            </w:pPr>
+          </w:p>
+        </w:tc>
+      </w:tr>
+    </w:tbl>
+    <w:p/>
+    <w:p>
+      <w:pPr>
+        <w:spacing w:after="60" w:before="0" w:line="240" w:lineRule="auto"/>
+      </w:pPr>
+      <w:r>
+        <w:rPr>
+          <w:rFonts w:ascii="Arial" w:hAnsi="Arial" w:eastAsia="Arial"/>
+          <w:b/>
+          <w:sz w:val="18"/>
+        </w:rPr>
+        <w:t>Gerekçe:</w:t>
+      </w:r>
+      <w:r>
+        <w:rPr>
+          <w:rFonts w:ascii="Arial" w:hAnsi="Arial" w:eastAsia="Arial"/>
+          <w:sz w:val="18"/>
+        </w:rPr>
+        <w:t xml:space="preserve"> "Yeni ürün/yöntem" odaklı bu projede donanım, mevcut prototipi tamamlayacak ölçüde sınırlı tutulmuştur. Hesaplama yoğun eğitim işleri için proje kabulünden sonra TRUBA (TÜBİTAK ULAKBİM) uygunluk ve kaynak tahsisi başvurusu yapılacak; satın alınacak GPU iş istasyonu ise geliştirme, çıkarım servisi, PEFT ölçeğinde ince ayar ve TRUBA tahsisinin gecikmesi durumunda yerel olarak yürütülebilecek işler için B planı olarak kullanılacaktır. Bu yaklaşım, makine-teçhizatın toplam bütçeyle dengeli olması kuralıyla doğrudan uyumludur.</w:t>
+      </w:r>
+    </w:p>
+    <w:p>
+      <w:pPr>
+        <w:spacing w:after="60" w:before="0" w:line="240" w:lineRule="auto"/>
+      </w:pPr>
+      <w:r>
+        <w:rPr>
+          <w:rFonts w:ascii="Arial" w:hAnsi="Arial" w:eastAsia="Arial"/>
+          <w:b/>
+          <w:sz w:val="19"/>
+        </w:rPr>
+        <w:t>4. Hizmet Alımı — 60.000 TL</w:t>
+      </w:r>
+    </w:p>
+    <w:tbl>
+      <w:tblPr>
+        <w:tblStyle w:val="TableGrid"/>
+        <w:tblW w:type="auto" w:w="0"/>
+        <w:tblLook w:firstColumn="1" w:firstRow="1" w:lastColumn="0" w:lastRow="0" w:noHBand="0" w:noVBand="1" w:val="04A0"/>
+        <w:jc w:val="center"/>
+        <w:tblBorders>
+          <w:top w:val="single" w:sz="4" w:space="0" w:color="000000"/>
+          <w:left w:val="single" w:sz="4" w:space="0" w:color="000000"/>
+          <w:bottom w:val="single" w:sz="4" w:space="0" w:color="000000"/>
+          <w:right w:val="single" w:sz="4" w:space="0" w:color="000000"/>
+          <w:insideH w:val="single" w:sz="4" w:space="0" w:color="000000"/>
+          <w:insideV w:val="single" w:sz="4" w:space="0" w:color="000000"/>
+        </w:tblBorders>
+      </w:tblPr>
+      <w:tblGrid>
+        <w:gridCol w:w="2880"/>
+        <w:gridCol w:w="2880"/>
+        <w:gridCol w:w="2880"/>
+      </w:tblGrid>
+      <w:tr>
+        <w:tc>
+          <w:tcPr>
+            <w:tcW w:type="dxa" w:w="2880"/>
+            <w:vAlign w:val="top"/>
+          </w:tcPr>
+          <w:p>
+            <w:pPr>
+              <w:spacing w:after="40" w:before="0" w:line="240" w:lineRule="auto"/>
+            </w:pPr>
+          </w:p>
+          <w:p>
+            <w:pPr>
+              <w:spacing w:after="40" w:before="0" w:line="240" w:lineRule="auto"/>
+            </w:pPr>
+            <w:r>
+              <w:rPr>
+                <w:rFonts w:ascii="Arial" w:hAnsi="Arial" w:eastAsia="Arial"/>
+                <w:b/>
+                <w:sz w:val="15"/>
+              </w:rPr>
+              <w:t>Kalem</w:t>
+            </w:r>
+          </w:p>
+        </w:tc>
+        <w:tc>
+          <w:tcPr>
+            <w:tcW w:type="dxa" w:w="2880"/>
+            <w:vAlign w:val="top"/>
+          </w:tcPr>
+          <w:p>
+            <w:pPr>
+              <w:spacing w:after="40" w:before="0" w:line="240" w:lineRule="auto"/>
+            </w:pPr>
+          </w:p>
+          <w:p>
+            <w:pPr>
+              <w:spacing w:after="40" w:before="0" w:line="240" w:lineRule="auto"/>
+            </w:pPr>
+            <w:r>
+              <w:rPr>
+                <w:rFonts w:ascii="Arial" w:hAnsi="Arial" w:eastAsia="Arial"/>
+                <w:b/>
+                <w:sz w:val="15"/>
+              </w:rPr>
+              <w:t>Tutar (TL)</w:t>
+            </w:r>
+          </w:p>
+        </w:tc>
+        <w:tc>
+          <w:tcPr>
+            <w:tcW w:type="dxa" w:w="2880"/>
+            <w:vAlign w:val="top"/>
+          </w:tcPr>
+          <w:p>
+            <w:pPr>
+              <w:spacing w:after="40" w:before="0" w:line="240" w:lineRule="auto"/>
+            </w:pPr>
+          </w:p>
+          <w:p>
+            <w:pPr>
+              <w:spacing w:after="40" w:before="0" w:line="240" w:lineRule="auto"/>
+            </w:pPr>
+            <w:r>
+              <w:rPr>
+                <w:rFonts w:ascii="Arial" w:hAnsi="Arial" w:eastAsia="Arial"/>
+                <w:b/>
+                <w:sz w:val="15"/>
+              </w:rPr>
+              <w:t>Gerekçe</w:t>
+            </w:r>
+          </w:p>
+        </w:tc>
+      </w:tr>
+      <w:tr>
+        <w:tc>
+          <w:tcPr>
+            <w:tcW w:type="dxa" w:w="2880"/>
+            <w:vAlign w:val="top"/>
+          </w:tcPr>
+          <w:p>
+            <w:pPr>
+              <w:spacing w:after="40" w:before="0" w:line="240" w:lineRule="auto"/>
+            </w:pPr>
+          </w:p>
+          <w:p>
+            <w:pPr>
+              <w:spacing w:after="40" w:before="0" w:line="240" w:lineRule="auto"/>
+            </w:pPr>
+            <w:r>
+              <w:rPr>
+                <w:rFonts w:ascii="Arial" w:hAnsi="Arial" w:eastAsia="Arial"/>
+                <w:sz w:val="15"/>
+              </w:rPr>
+              <w:t>Ticari LLM API kullanımı (L4 yükseltme + kıyaslama)</w:t>
+            </w:r>
+          </w:p>
+        </w:tc>
+        <w:tc>
+          <w:tcPr>
+            <w:tcW w:type="dxa" w:w="2880"/>
+            <w:vAlign w:val="top"/>
+          </w:tcPr>
+          <w:p>
+            <w:pPr>
+              <w:spacing w:after="40" w:before="0" w:line="240" w:lineRule="auto"/>
+            </w:pPr>
+          </w:p>
+          <w:p>
+            <w:pPr>
+              <w:spacing w:after="40" w:before="0" w:line="240" w:lineRule="auto"/>
+            </w:pPr>
+            <w:r>
+              <w:rPr>
+                <w:rFonts w:ascii="Arial" w:hAnsi="Arial" w:eastAsia="Arial"/>
+                <w:sz w:val="15"/>
+              </w:rPr>
+              <w:t>35.000</w:t>
+            </w:r>
+          </w:p>
+        </w:tc>
+        <w:tc>
+          <w:tcPr>
+            <w:tcW w:type="dxa" w:w="2880"/>
+            <w:vAlign w:val="top"/>
+          </w:tcPr>
+          <w:p>
+            <w:pPr>
+              <w:spacing w:after="40" w:before="0" w:line="240" w:lineRule="auto"/>
+            </w:pPr>
+          </w:p>
+          <w:p>
+            <w:pPr>
+              <w:spacing w:after="40" w:before="0" w:line="240" w:lineRule="auto"/>
+            </w:pPr>
+            <w:r>
+              <w:rPr>
+                <w:rFonts w:ascii="Arial" w:hAnsi="Arial" w:eastAsia="Arial"/>
+                <w:sz w:val="15"/>
+              </w:rPr>
+              <w:t>Maliyet-kalite kıyaslaması ve yalnızca başarısız alt görevlerde L4 katmanı için sınırlı ticari API çağrıları.</w:t>
+            </w:r>
+          </w:p>
+        </w:tc>
+      </w:tr>
+      <w:tr>
+        <w:tc>
+          <w:tcPr>
+            <w:tcW w:type="dxa" w:w="2880"/>
+            <w:vAlign w:val="top"/>
+          </w:tcPr>
+          <w:p>
+            <w:pPr>
+              <w:spacing w:after="40" w:before="0" w:line="240" w:lineRule="auto"/>
+            </w:pPr>
+          </w:p>
+          <w:p>
+            <w:pPr>
+              <w:spacing w:after="40" w:before="0" w:line="240" w:lineRule="auto"/>
+            </w:pPr>
+            <w:r>
+              <w:rPr>
+                <w:rFonts w:ascii="Arial" w:hAnsi="Arial" w:eastAsia="Arial"/>
+                <w:sz w:val="15"/>
+              </w:rPr>
+              <w:t>Bulut yedekleme / dağıtım</w:t>
+            </w:r>
+          </w:p>
+        </w:tc>
+        <w:tc>
+          <w:tcPr>
+            <w:tcW w:type="dxa" w:w="2880"/>
+            <w:vAlign w:val="top"/>
+          </w:tcPr>
+          <w:p>
+            <w:pPr>
+              <w:spacing w:after="40" w:before="0" w:line="240" w:lineRule="auto"/>
+            </w:pPr>
+          </w:p>
+          <w:p>
+            <w:pPr>
+              <w:spacing w:after="40" w:before="0" w:line="240" w:lineRule="auto"/>
+            </w:pPr>
+            <w:r>
+              <w:rPr>
+                <w:rFonts w:ascii="Arial" w:hAnsi="Arial" w:eastAsia="Arial"/>
+                <w:sz w:val="15"/>
+              </w:rPr>
+              <w:t>10.000</w:t>
+            </w:r>
+          </w:p>
+        </w:tc>
+        <w:tc>
+          <w:tcPr>
+            <w:tcW w:type="dxa" w:w="2880"/>
+            <w:vAlign w:val="top"/>
+          </w:tcPr>
+          <w:p>
+            <w:pPr>
+              <w:spacing w:after="40" w:before="0" w:line="240" w:lineRule="auto"/>
+            </w:pPr>
+          </w:p>
+          <w:p>
+            <w:pPr>
+              <w:spacing w:after="40" w:before="0" w:line="240" w:lineRule="auto"/>
+            </w:pPr>
+            <w:r>
+              <w:rPr>
+                <w:rFonts w:ascii="Arial" w:hAnsi="Arial" w:eastAsia="Arial"/>
+                <w:sz w:val="15"/>
+              </w:rPr>
+              <w:t>Felaket kurtarma, yedekleme ve API dağıtım esnekliği.</w:t>
+            </w:r>
+          </w:p>
+        </w:tc>
+      </w:tr>
+      <w:tr>
+        <w:tc>
+          <w:tcPr>
+            <w:tcW w:type="dxa" w:w="2880"/>
+            <w:vAlign w:val="top"/>
+          </w:tcPr>
+          <w:p>
+            <w:pPr>
+              <w:spacing w:after="40" w:before="0" w:line="240" w:lineRule="auto"/>
+            </w:pPr>
+          </w:p>
+          <w:p>
+            <w:pPr>
+              <w:spacing w:after="40" w:before="0" w:line="240" w:lineRule="auto"/>
+            </w:pPr>
+            <w:r>
+              <w:rPr>
+                <w:rFonts w:ascii="Arial" w:hAnsi="Arial" w:eastAsia="Arial"/>
+                <w:sz w:val="15"/>
+              </w:rPr>
+              <w:t>TTO patent taraması güncelleme + akademik redaksiyon/çeviri</w:t>
+            </w:r>
+          </w:p>
+        </w:tc>
+        <w:tc>
+          <w:tcPr>
+            <w:tcW w:type="dxa" w:w="2880"/>
+            <w:vAlign w:val="top"/>
+          </w:tcPr>
+          <w:p>
+            <w:pPr>
+              <w:spacing w:after="40" w:before="0" w:line="240" w:lineRule="auto"/>
+            </w:pPr>
+          </w:p>
+          <w:p>
+            <w:pPr>
+              <w:spacing w:after="40" w:before="0" w:line="240" w:lineRule="auto"/>
+            </w:pPr>
+            <w:r>
+              <w:rPr>
+                <w:rFonts w:ascii="Arial" w:hAnsi="Arial" w:eastAsia="Arial"/>
+                <w:sz w:val="15"/>
+              </w:rPr>
+              <w:t>15.000</w:t>
+            </w:r>
+          </w:p>
+        </w:tc>
+        <w:tc>
+          <w:tcPr>
+            <w:tcW w:type="dxa" w:w="2880"/>
+            <w:vAlign w:val="top"/>
+          </w:tcPr>
+          <w:p>
+            <w:pPr>
+              <w:spacing w:after="40" w:before="0" w:line="240" w:lineRule="auto"/>
+            </w:pPr>
+          </w:p>
+          <w:p>
+            <w:pPr>
+              <w:spacing w:after="40" w:before="0" w:line="240" w:lineRule="auto"/>
+            </w:pPr>
+            <w:r>
+              <w:rPr>
+                <w:rFonts w:ascii="Arial" w:hAnsi="Arial" w:eastAsia="Arial"/>
+                <w:sz w:val="15"/>
+              </w:rPr>
+              <w:t>Patent ön taramasının ürünleşme aşamasında güncellenmesi ve yayın redaksiyonu.</w:t>
+            </w:r>
+          </w:p>
+        </w:tc>
+      </w:tr>
+      <w:tr>
+        <w:tc>
+          <w:tcPr>
+            <w:tcW w:type="dxa" w:w="2880"/>
+            <w:vAlign w:val="top"/>
+          </w:tcPr>
+          <w:p>
+            <w:pPr>
+              <w:spacing w:after="40" w:before="0" w:line="240" w:lineRule="auto"/>
+            </w:pPr>
+          </w:p>
+          <w:p>
+            <w:pPr>
+              <w:spacing w:after="40" w:before="0" w:line="240" w:lineRule="auto"/>
+            </w:pPr>
+            <w:r>
+              <w:rPr>
+                <w:rFonts w:ascii="Arial" w:hAnsi="Arial" w:eastAsia="Arial"/>
+                <w:b/>
+                <w:sz w:val="15"/>
+              </w:rPr>
+              <w:t>Ara toplam</w:t>
+            </w:r>
+          </w:p>
+        </w:tc>
+        <w:tc>
+          <w:tcPr>
+            <w:tcW w:type="dxa" w:w="2880"/>
+            <w:vAlign w:val="top"/>
+          </w:tcPr>
+          <w:p>
+            <w:pPr>
+              <w:spacing w:after="40" w:before="0" w:line="240" w:lineRule="auto"/>
+            </w:pPr>
+          </w:p>
+          <w:p>
+            <w:pPr>
+              <w:spacing w:after="40" w:before="0" w:line="240" w:lineRule="auto"/>
+            </w:pPr>
+            <w:r>
+              <w:rPr>
+                <w:rFonts w:ascii="Arial" w:hAnsi="Arial" w:eastAsia="Arial"/>
+                <w:b/>
+                <w:sz w:val="15"/>
+              </w:rPr>
+              <w:t>60.000</w:t>
+            </w:r>
+          </w:p>
+        </w:tc>
+        <w:tc>
+          <w:tcPr>
+            <w:tcW w:type="dxa" w:w="2880"/>
+            <w:vAlign w:val="top"/>
+          </w:tcPr>
+          <w:p>
+            <w:pPr>
+              <w:spacing w:after="40" w:before="0" w:line="240" w:lineRule="auto"/>
+            </w:pPr>
+          </w:p>
+        </w:tc>
+      </w:tr>
+    </w:tbl>
+    <w:p/>
+    <w:p>
+      <w:pPr>
+        <w:spacing w:after="60" w:before="0" w:line="240" w:lineRule="auto"/>
+      </w:pPr>
+      <w:r>
+        <w:rPr>
+          <w:rFonts w:ascii="Arial" w:hAnsi="Arial" w:eastAsia="Arial"/>
+          <w:b/>
+          <w:sz w:val="19"/>
+        </w:rPr>
+        <w:t>5. Sarf Malzemesi — 25.000 TL</w:t>
+      </w:r>
+    </w:p>
+    <w:tbl>
+      <w:tblPr>
+        <w:tblStyle w:val="TableGrid"/>
+        <w:tblW w:type="auto" w:w="0"/>
+        <w:tblLook w:firstColumn="1" w:firstRow="1" w:lastColumn="0" w:lastRow="0" w:noHBand="0" w:noVBand="1" w:val="04A0"/>
+        <w:jc w:val="center"/>
+        <w:tblBorders>
+          <w:top w:val="single" w:sz="4" w:space="0" w:color="000000"/>
+          <w:left w:val="single" w:sz="4" w:space="0" w:color="000000"/>
+          <w:bottom w:val="single" w:sz="4" w:space="0" w:color="000000"/>
+          <w:right w:val="single" w:sz="4" w:space="0" w:color="000000"/>
+          <w:insideH w:val="single" w:sz="4" w:space="0" w:color="000000"/>
+          <w:insideV w:val="single" w:sz="4" w:space="0" w:color="000000"/>
+        </w:tblBorders>
+      </w:tblPr>
+      <w:tblGrid>
+        <w:gridCol w:w="2880"/>
+        <w:gridCol w:w="2880"/>
+        <w:gridCol w:w="2880"/>
+      </w:tblGrid>
+      <w:tr>
+        <w:tc>
+          <w:tcPr>
+            <w:tcW w:type="dxa" w:w="2880"/>
+            <w:vAlign w:val="top"/>
+          </w:tcPr>
+          <w:p>
+            <w:pPr>
+              <w:spacing w:after="40" w:before="0" w:line="240" w:lineRule="auto"/>
+            </w:pPr>
+          </w:p>
+          <w:p>
+            <w:pPr>
+              <w:spacing w:after="40" w:before="0" w:line="240" w:lineRule="auto"/>
+            </w:pPr>
+            <w:r>
+              <w:rPr>
+                <w:rFonts w:ascii="Arial" w:hAnsi="Arial" w:eastAsia="Arial"/>
+                <w:b/>
+                <w:sz w:val="15"/>
+              </w:rPr>
+              <w:t>Kalem</w:t>
+            </w:r>
+          </w:p>
+        </w:tc>
+        <w:tc>
+          <w:tcPr>
+            <w:tcW w:type="dxa" w:w="2880"/>
+            <w:vAlign w:val="top"/>
+          </w:tcPr>
+          <w:p>
+            <w:pPr>
+              <w:spacing w:after="40" w:before="0" w:line="240" w:lineRule="auto"/>
+            </w:pPr>
+          </w:p>
+          <w:p>
+            <w:pPr>
+              <w:spacing w:after="40" w:before="0" w:line="240" w:lineRule="auto"/>
+            </w:pPr>
+            <w:r>
+              <w:rPr>
+                <w:rFonts w:ascii="Arial" w:hAnsi="Arial" w:eastAsia="Arial"/>
+                <w:b/>
+                <w:sz w:val="15"/>
+              </w:rPr>
+              <w:t>Tutar (TL)</w:t>
+            </w:r>
+          </w:p>
+        </w:tc>
+        <w:tc>
+          <w:tcPr>
+            <w:tcW w:type="dxa" w:w="2880"/>
+            <w:vAlign w:val="top"/>
+          </w:tcPr>
+          <w:p>
+            <w:pPr>
+              <w:spacing w:after="40" w:before="0" w:line="240" w:lineRule="auto"/>
+            </w:pPr>
+          </w:p>
+          <w:p>
+            <w:pPr>
+              <w:spacing w:after="40" w:before="0" w:line="240" w:lineRule="auto"/>
+            </w:pPr>
+            <w:r>
+              <w:rPr>
+                <w:rFonts w:ascii="Arial" w:hAnsi="Arial" w:eastAsia="Arial"/>
+                <w:b/>
+                <w:sz w:val="15"/>
+              </w:rPr>
+              <w:t>Gerekçe</w:t>
+            </w:r>
+          </w:p>
+        </w:tc>
+      </w:tr>
+      <w:tr>
+        <w:tc>
+          <w:tcPr>
+            <w:tcW w:type="dxa" w:w="2880"/>
+            <w:vAlign w:val="top"/>
+          </w:tcPr>
+          <w:p>
+            <w:pPr>
+              <w:spacing w:after="40" w:before="0" w:line="240" w:lineRule="auto"/>
+            </w:pPr>
+          </w:p>
+          <w:p>
+            <w:pPr>
+              <w:spacing w:after="40" w:before="0" w:line="240" w:lineRule="auto"/>
+            </w:pPr>
+            <w:r>
+              <w:rPr>
+                <w:rFonts w:ascii="Arial" w:hAnsi="Arial" w:eastAsia="Arial"/>
+                <w:sz w:val="15"/>
+              </w:rPr>
+              <w:t>SSD/HDD yedekleri, bileşenler, kablolar ve küçük donanım</w:t>
+            </w:r>
+          </w:p>
+        </w:tc>
+        <w:tc>
+          <w:tcPr>
+            <w:tcW w:type="dxa" w:w="2880"/>
+            <w:vAlign w:val="top"/>
+          </w:tcPr>
+          <w:p>
+            <w:pPr>
+              <w:spacing w:after="40" w:before="0" w:line="240" w:lineRule="auto"/>
+            </w:pPr>
+          </w:p>
+          <w:p>
+            <w:pPr>
+              <w:spacing w:after="40" w:before="0" w:line="240" w:lineRule="auto"/>
+            </w:pPr>
+            <w:r>
+              <w:rPr>
+                <w:rFonts w:ascii="Arial" w:hAnsi="Arial" w:eastAsia="Arial"/>
+                <w:sz w:val="15"/>
+              </w:rPr>
+              <w:t>25.000</w:t>
+            </w:r>
+          </w:p>
+        </w:tc>
+        <w:tc>
+          <w:tcPr>
+            <w:tcW w:type="dxa" w:w="2880"/>
+            <w:vAlign w:val="top"/>
+          </w:tcPr>
+          <w:p>
+            <w:pPr>
+              <w:spacing w:after="40" w:before="0" w:line="240" w:lineRule="auto"/>
+            </w:pPr>
+          </w:p>
+          <w:p>
+            <w:pPr>
+              <w:spacing w:after="40" w:before="0" w:line="240" w:lineRule="auto"/>
+            </w:pPr>
+            <w:r>
+              <w:rPr>
+                <w:rFonts w:ascii="Arial" w:hAnsi="Arial" w:eastAsia="Arial"/>
+                <w:sz w:val="15"/>
+              </w:rPr>
+              <w:t>Depolama genişletme, yedek parça ve laboratuvar sarf ihtiyaçları.</w:t>
+            </w:r>
+          </w:p>
+        </w:tc>
+      </w:tr>
+    </w:tbl>
+    <w:p/>
+    <w:p>
+      <w:pPr>
+        <w:spacing w:after="60" w:before="0" w:line="240" w:lineRule="auto"/>
+      </w:pPr>
+      <w:r>
+        <w:rPr>
+          <w:rFonts w:ascii="Arial" w:hAnsi="Arial" w:eastAsia="Arial"/>
+          <w:b/>
+          <w:sz w:val="19"/>
+        </w:rPr>
+        <w:t>6. Seyahat — 45.000 TL</w:t>
+      </w:r>
+    </w:p>
+    <w:tbl>
+      <w:tblPr>
+        <w:tblStyle w:val="TableGrid"/>
+        <w:tblW w:type="auto" w:w="0"/>
+        <w:tblLook w:firstColumn="1" w:firstRow="1" w:lastColumn="0" w:lastRow="0" w:noHBand="0" w:noVBand="1" w:val="04A0"/>
+        <w:jc w:val="center"/>
+        <w:tblBorders>
+          <w:top w:val="single" w:sz="4" w:space="0" w:color="000000"/>
+          <w:left w:val="single" w:sz="4" w:space="0" w:color="000000"/>
+          <w:bottom w:val="single" w:sz="4" w:space="0" w:color="000000"/>
+          <w:right w:val="single" w:sz="4" w:space="0" w:color="000000"/>
+          <w:insideH w:val="single" w:sz="4" w:space="0" w:color="000000"/>
+          <w:insideV w:val="single" w:sz="4" w:space="0" w:color="000000"/>
+        </w:tblBorders>
+      </w:tblPr>
+      <w:tblGrid>
+        <w:gridCol w:w="2880"/>
+        <w:gridCol w:w="2880"/>
+        <w:gridCol w:w="2880"/>
+      </w:tblGrid>
+      <w:tr>
+        <w:tc>
+          <w:tcPr>
+            <w:tcW w:type="dxa" w:w="2880"/>
+            <w:vAlign w:val="top"/>
+          </w:tcPr>
+          <w:p>
+            <w:pPr>
+              <w:spacing w:after="40" w:before="0" w:line="240" w:lineRule="auto"/>
+            </w:pPr>
+          </w:p>
+          <w:p>
+            <w:pPr>
+              <w:spacing w:after="40" w:before="0" w:line="240" w:lineRule="auto"/>
+            </w:pPr>
+            <w:r>
+              <w:rPr>
+                <w:rFonts w:ascii="Arial" w:hAnsi="Arial" w:eastAsia="Arial"/>
+                <w:b/>
+                <w:sz w:val="15"/>
+              </w:rPr>
+              <w:t>Kalem</w:t>
+            </w:r>
+          </w:p>
+        </w:tc>
+        <w:tc>
+          <w:tcPr>
+            <w:tcW w:type="dxa" w:w="2880"/>
+            <w:vAlign w:val="top"/>
+          </w:tcPr>
+          <w:p>
+            <w:pPr>
+              <w:spacing w:after="40" w:before="0" w:line="240" w:lineRule="auto"/>
+            </w:pPr>
+          </w:p>
+          <w:p>
+            <w:pPr>
+              <w:spacing w:after="40" w:before="0" w:line="240" w:lineRule="auto"/>
+            </w:pPr>
+            <w:r>
+              <w:rPr>
+                <w:rFonts w:ascii="Arial" w:hAnsi="Arial" w:eastAsia="Arial"/>
+                <w:b/>
+                <w:sz w:val="15"/>
+              </w:rPr>
+              <w:t>Tutar (TL)</w:t>
+            </w:r>
+          </w:p>
+        </w:tc>
+        <w:tc>
+          <w:tcPr>
+            <w:tcW w:type="dxa" w:w="2880"/>
+            <w:vAlign w:val="top"/>
+          </w:tcPr>
+          <w:p>
+            <w:pPr>
+              <w:spacing w:after="40" w:before="0" w:line="240" w:lineRule="auto"/>
+            </w:pPr>
+          </w:p>
+          <w:p>
+            <w:pPr>
+              <w:spacing w:after="40" w:before="0" w:line="240" w:lineRule="auto"/>
+            </w:pPr>
+            <w:r>
+              <w:rPr>
+                <w:rFonts w:ascii="Arial" w:hAnsi="Arial" w:eastAsia="Arial"/>
+                <w:b/>
+                <w:sz w:val="15"/>
+              </w:rPr>
+              <w:t>Gerekçe</w:t>
+            </w:r>
+          </w:p>
+        </w:tc>
+      </w:tr>
+      <w:tr>
+        <w:tc>
+          <w:tcPr>
+            <w:tcW w:type="dxa" w:w="2880"/>
+            <w:vAlign w:val="top"/>
+          </w:tcPr>
+          <w:p>
+            <w:pPr>
+              <w:spacing w:after="40" w:before="0" w:line="240" w:lineRule="auto"/>
+            </w:pPr>
+          </w:p>
+          <w:p>
+            <w:pPr>
+              <w:spacing w:after="40" w:before="0" w:line="240" w:lineRule="auto"/>
+            </w:pPr>
+            <w:r>
+              <w:rPr>
+                <w:rFonts w:ascii="Arial" w:hAnsi="Arial" w:eastAsia="Arial"/>
+                <w:sz w:val="15"/>
+              </w:rPr>
+              <w:t>2–3 bilimsel konferans sunumu (yurt içi + 1 yurt dışı)</w:t>
+            </w:r>
+          </w:p>
+        </w:tc>
+        <w:tc>
+          <w:tcPr>
+            <w:tcW w:type="dxa" w:w="2880"/>
+            <w:vAlign w:val="top"/>
+          </w:tcPr>
+          <w:p>
+            <w:pPr>
+              <w:spacing w:after="40" w:before="0" w:line="240" w:lineRule="auto"/>
+            </w:pPr>
+          </w:p>
+          <w:p>
+            <w:pPr>
+              <w:spacing w:after="40" w:before="0" w:line="240" w:lineRule="auto"/>
+            </w:pPr>
+            <w:r>
+              <w:rPr>
+                <w:rFonts w:ascii="Arial" w:hAnsi="Arial" w:eastAsia="Arial"/>
+                <w:sz w:val="15"/>
+              </w:rPr>
+              <w:t>45.000</w:t>
+            </w:r>
+          </w:p>
+        </w:tc>
+        <w:tc>
+          <w:tcPr>
+            <w:tcW w:type="dxa" w:w="2880"/>
+            <w:vAlign w:val="top"/>
+          </w:tcPr>
+          <w:p>
+            <w:pPr>
+              <w:spacing w:after="40" w:before="0" w:line="240" w:lineRule="auto"/>
+            </w:pPr>
+          </w:p>
+          <w:p>
+            <w:pPr>
+              <w:spacing w:after="40" w:before="0" w:line="240" w:lineRule="auto"/>
+            </w:pPr>
+            <w:r>
+              <w:rPr>
+                <w:rFonts w:ascii="Arial" w:hAnsi="Arial" w:eastAsia="Arial"/>
+                <w:sz w:val="15"/>
+              </w:rPr>
+              <w:t>En az 3 hakemli yayının ve açık kıyaslama sonuçlarının bilimsel yayılımı (WP5).</w:t>
+            </w:r>
+          </w:p>
+        </w:tc>
+      </w:tr>
+    </w:tbl>
+    <w:p/>
+    <w:p>
+      <w:pPr>
+        <w:spacing w:after="60" w:before="0" w:line="240" w:lineRule="auto"/>
+      </w:pPr>
+      <w:r>
+        <w:rPr>
+          <w:rFonts w:ascii="Arial" w:hAnsi="Arial" w:eastAsia="Arial"/>
+          <w:b/>
+          <w:sz w:val="19"/>
+        </w:rPr>
+        <w:t>7. Üst Limit Dışı Kalemler (bilgi amaçlı)</w:t>
+      </w:r>
+    </w:p>
+    <w:p>
+      <w:pPr>
+        <w:spacing w:after="60" w:before="0" w:line="240" w:lineRule="auto"/>
+        <w:ind w:left="198" w:hanging="113"/>
+      </w:pPr>
+      <w:r>
+        <w:rPr>
+          <w:rFonts w:ascii="Arial" w:hAnsi="Arial" w:eastAsia="Arial"/>
+          <w:sz w:val="18"/>
+        </w:rPr>
+        <w:t xml:space="preserve">• </w:t>
+      </w:r>
+      <w:r>
+        <w:rPr>
+          <w:rFonts w:ascii="Arial" w:hAnsi="Arial" w:eastAsia="Arial"/>
+          <w:b/>
+          <w:sz w:val="18"/>
+        </w:rPr>
+        <w:t>Proje Teşvik İkramiyesi (PTİ):</w:t>
+      </w:r>
+      <w:r>
+        <w:rPr>
+          <w:rFonts w:ascii="Arial" w:hAnsi="Arial" w:eastAsia="Arial"/>
+          <w:sz w:val="18"/>
+        </w:rPr>
+        <w:t xml:space="preserve"> Yürütücü ve araştırmacılara TÜBİTAK mevzuatına göre ayrıca ödenir; 1.200.000 TL üst limitine dahil değildir.</w:t>
+      </w:r>
+    </w:p>
+    <w:p>
+      <w:pPr>
+        <w:spacing w:after="60" w:before="0" w:line="240" w:lineRule="auto"/>
+        <w:ind w:left="198" w:hanging="113"/>
+      </w:pPr>
+      <w:r>
+        <w:rPr>
+          <w:rFonts w:ascii="Arial" w:hAnsi="Arial" w:eastAsia="Arial"/>
+          <w:sz w:val="18"/>
+        </w:rPr>
+        <w:t xml:space="preserve">• </w:t>
+      </w:r>
+      <w:r>
+        <w:rPr>
+          <w:rFonts w:ascii="Arial" w:hAnsi="Arial" w:eastAsia="Arial"/>
+          <w:b/>
+          <w:sz w:val="18"/>
+        </w:rPr>
+        <w:t>Kurum Hissesi:</w:t>
+      </w:r>
+      <w:r>
+        <w:rPr>
+          <w:rFonts w:ascii="Arial" w:hAnsi="Arial" w:eastAsia="Arial"/>
+          <w:sz w:val="18"/>
+        </w:rPr>
+        <w:t xml:space="preserve"> Ev sahibi kuruma genel gider olarak TÜBİTAK tarafından ayrıca eklenir; üst limite dahil değildir.</w:t>
+      </w:r>
+    </w:p>
+    <w:p>
+      <w:pPr>
+        <w:spacing w:after="60" w:before="0" w:line="240" w:lineRule="auto"/>
+      </w:pPr>
+      <w:r>
+        <w:rPr>
+          <w:rFonts w:ascii="Arial" w:hAnsi="Arial" w:eastAsia="Arial"/>
+          <w:b/>
+          <w:sz w:val="19"/>
+        </w:rPr>
+        <w:t>8. Teyit Edilecek Varsayımlar</w:t>
+      </w:r>
+    </w:p>
+    <w:p>
+      <w:pPr>
+        <w:spacing w:after="60" w:before="0" w:line="240" w:lineRule="auto"/>
+        <w:ind w:left="198" w:hanging="113"/>
+      </w:pPr>
+      <w:r>
+        <w:rPr>
+          <w:rFonts w:ascii="Arial" w:hAnsi="Arial" w:eastAsia="Arial"/>
+          <w:sz w:val="18"/>
+        </w:rPr>
+        <w:t xml:space="preserve">1. </w:t>
+      </w:r>
+      <w:r>
+        <w:rPr>
+          <w:rFonts w:ascii="Arial" w:hAnsi="Arial" w:eastAsia="Arial"/>
+          <w:b/>
+          <w:sz w:val="18"/>
+        </w:rPr>
+        <w:t>Burs durumu:</w:t>
+      </w:r>
+      <w:r>
+        <w:rPr>
+          <w:rFonts w:ascii="Arial" w:hAnsi="Arial" w:eastAsia="Arial"/>
+          <w:sz w:val="18"/>
+        </w:rPr>
+        <w:t xml:space="preserve"> İki yüksek lisans bursiyeri, 22.500 TL oranının uygulanabilmesi için yüksek lisans döneminde </w:t>
+      </w:r>
+      <w:r>
+        <w:rPr>
+          <w:rFonts w:ascii="Arial" w:hAnsi="Arial" w:eastAsia="Arial"/>
+          <w:i/>
+          <w:sz w:val="18"/>
+        </w:rPr>
+        <w:t>çalışmayan</w:t>
+      </w:r>
+      <w:r>
+        <w:rPr>
+          <w:rFonts w:ascii="Arial" w:hAnsi="Arial" w:eastAsia="Arial"/>
+          <w:sz w:val="18"/>
+        </w:rPr>
+        <w:t xml:space="preserve"> (başka bir işte sigortalı olmayan, tam zamanlı) statüde olmalıdır. Çalışan statüsünde oran 6.000 TL'ye düşer ve bütçe yeniden hesaplanır.</w:t>
+      </w:r>
+    </w:p>
+    <w:p>
+      <w:pPr>
+        <w:spacing w:after="60" w:before="0" w:line="240" w:lineRule="auto"/>
+        <w:ind w:left="198" w:hanging="113"/>
+      </w:pPr>
+      <w:r>
+        <w:rPr>
+          <w:rFonts w:ascii="Arial" w:hAnsi="Arial" w:eastAsia="Arial"/>
+          <w:sz w:val="18"/>
+        </w:rPr>
+        <w:t xml:space="preserve">2. </w:t>
+      </w:r>
+      <w:r>
+        <w:rPr>
+          <w:rFonts w:ascii="Arial" w:hAnsi="Arial" w:eastAsia="Arial"/>
+          <w:b/>
+          <w:sz w:val="18"/>
+        </w:rPr>
+        <w:t>Yüksek lisansa geçiş ayı:</w:t>
+      </w:r>
+      <w:r>
+        <w:rPr>
+          <w:rFonts w:ascii="Arial" w:hAnsi="Arial" w:eastAsia="Arial"/>
+          <w:sz w:val="18"/>
+        </w:rPr>
+        <w:t xml:space="preserve"> ~7. ay varsayılmıştır; gerçek kayıt takvimi WP4 doğrulama penceresiyle (4–16. ay) uyumlu olacak şekilde teyit edilmelidir.</w:t>
+      </w:r>
+    </w:p>
+    <w:p>
+      <w:pPr>
+        <w:spacing w:after="60" w:before="0" w:line="240" w:lineRule="auto"/>
+        <w:ind w:left="198" w:hanging="113"/>
+      </w:pPr>
+      <w:r>
+        <w:rPr>
+          <w:rFonts w:ascii="Arial" w:hAnsi="Arial" w:eastAsia="Arial"/>
+          <w:sz w:val="18"/>
+        </w:rPr>
+        <w:t xml:space="preserve">3. </w:t>
+      </w:r>
+      <w:r>
+        <w:rPr>
+          <w:rFonts w:ascii="Arial" w:hAnsi="Arial" w:eastAsia="Arial"/>
+          <w:b/>
+          <w:sz w:val="18"/>
+        </w:rPr>
+        <w:t>Donanım fiyatları:</w:t>
+      </w:r>
+      <w:r>
+        <w:rPr>
+          <w:rFonts w:ascii="Arial" w:hAnsi="Arial" w:eastAsia="Arial"/>
+          <w:sz w:val="18"/>
+        </w:rPr>
+        <w:t xml:space="preserve"> GPU iş istasyonu, NAS ve KGK tutarları tahminîdir; güncel piyasa teklifleriyle (döviz/ithalat etkisi dahil) güncellenecektir. Tek GPU'lu iş istasyonunun kesin modeli, 16–24 GB VRAM sınıfında kalacak biçimde teklif aşamasında belirlenecektir; daha büyük eğitim işleri TRUBA veya gerekirse kısa süreli bulut GPU ile yürütülecektir.</w:t>
+      </w:r>
+    </w:p>
+    <w:p>
+      <w:pPr>
+        <w:spacing w:after="60" w:before="0" w:line="240" w:lineRule="auto"/>
+        <w:ind w:left="198" w:hanging="113"/>
+      </w:pPr>
+      <w:r>
+        <w:rPr>
+          <w:rFonts w:ascii="Arial" w:hAnsi="Arial" w:eastAsia="Arial"/>
+          <w:sz w:val="18"/>
+        </w:rPr>
+        <w:t xml:space="preserve">4. </w:t>
+      </w:r>
+      <w:r>
+        <w:rPr>
+          <w:rFonts w:ascii="Arial" w:hAnsi="Arial" w:eastAsia="Arial"/>
+          <w:b/>
+          <w:sz w:val="18"/>
+        </w:rPr>
+        <w:t>TRUBA tahsisi:</w:t>
+      </w:r>
+      <w:r>
+        <w:rPr>
+          <w:rFonts w:ascii="Arial" w:hAnsi="Arial" w:eastAsia="Arial"/>
+          <w:sz w:val="18"/>
+        </w:rPr>
+        <w:t xml:space="preserve"> Ağır ince ayar iş yükü için proje kabulü sonrası TRUBA uygunluk/kaynak tahsisi başvurusu yapılacaktır; tahsisin gecikmesi/düşüklüğü riski ve B planı ana belgenin Risk Yönetimi bölümünde (WP3/WP4 satırı) ele alınmıştır.</w:t>
+      </w:r>
+    </w:p>
+    <w:p>
+      <w:pPr>
+        <w:spacing w:after="60" w:before="0" w:line="240" w:lineRule="auto"/>
+        <w:ind w:left="198" w:hanging="113"/>
+      </w:pPr>
+      <w:r>
+        <w:rPr>
+          <w:rFonts w:ascii="Arial" w:hAnsi="Arial" w:eastAsia="Arial"/>
+          <w:sz w:val="18"/>
+        </w:rPr>
+        <w:t xml:space="preserve">5. </w:t>
+      </w:r>
+      <w:r>
+        <w:rPr>
+          <w:rFonts w:ascii="Arial" w:hAnsi="Arial" w:eastAsia="Arial"/>
+          <w:b/>
+          <w:sz w:val="18"/>
+        </w:rPr>
+        <w:t>Bursiyer-ad eşleştirmesi:</w:t>
+      </w:r>
+      <w:r>
+        <w:rPr>
+          <w:rFonts w:ascii="Arial" w:hAnsi="Arial" w:eastAsia="Arial"/>
+          <w:sz w:val="18"/>
+        </w:rPr>
+        <w:t xml:space="preserve"> B1–B4 rolleri ana belgedeki iş paketi görev dağılımıyla eşleştirilecektir; iki gıda mühendisliği bursiyeri yüksek lisansa geçen bursiyerlerdir.</w:t>
+      </w:r>
+    </w:p>
+    <w:p>
+      <w:pPr>
+        <w:spacing w:after="60" w:before="0" w:line="240" w:lineRule="auto"/>
+        <w:ind w:left="198" w:hanging="113"/>
+      </w:pPr>
+      <w:r>
+        <w:rPr>
+          <w:rFonts w:ascii="Arial" w:hAnsi="Arial" w:eastAsia="Arial"/>
+          <w:sz w:val="18"/>
+        </w:rPr>
+        <w:t xml:space="preserve">6. </w:t>
+      </w:r>
+      <w:r>
+        <w:rPr>
+          <w:rFonts w:ascii="Arial" w:hAnsi="Arial" w:eastAsia="Arial"/>
+          <w:b/>
+          <w:sz w:val="18"/>
+        </w:rPr>
+        <w:t>Kalem sınıflandırması:</w:t>
+      </w:r>
+      <w:r>
+        <w:rPr>
+          <w:rFonts w:ascii="Arial" w:hAnsi="Arial" w:eastAsia="Arial"/>
+          <w:sz w:val="18"/>
+        </w:rPr>
+        <w:t xml:space="preserve"> Ticari API/bulut giderlerinin "Hizmet Alımı" altında sınıflandırılması PBS kalem tanımlarına göre teyit edilecektir.</w:t>
       </w:r>
     </w:p>
     <w:p>

</xml_diff>

<commit_message>
Export 1005 form and annexes separately
</commit_message>
<xml_diff>
--- a/docs/OpenNutri_1005_Application_Filled_Template.docx
+++ b/docs/OpenNutri_1005_Application_Filled_Template.docx
@@ -12995,1581 +12995,6 @@
     </w:p>
     <w:p>
       <w:pPr>
-        <w:spacing w:after="60" w:before="0" w:line="240" w:lineRule="auto"/>
-        <w:ind w:left="198" w:hanging="113"/>
-      </w:pPr>
-      <w:r>
-        <w:rPr>
-          <w:rFonts w:ascii="Arial" w:hAnsi="Arial" w:eastAsia="Arial"/>
-          <w:sz w:val="18"/>
-        </w:rPr>
-        <w:t xml:space="preserve">• </w:t>
-      </w:r>
-      <w:r>
-        <w:rPr>
-          <w:rFonts w:ascii="Arial" w:hAnsi="Arial" w:eastAsia="Arial"/>
-          <w:sz w:val="18"/>
-        </w:rPr>
-        <w:t xml:space="preserve">Agarwal, A., et al. (2014). Taming the monster: A fast and simple algorithm for contextual bandits. </w:t>
-      </w:r>
-      <w:r>
-        <w:rPr>
-          <w:rFonts w:ascii="Arial" w:hAnsi="Arial" w:eastAsia="Arial"/>
-          <w:i/>
-          <w:sz w:val="18"/>
-        </w:rPr>
-        <w:t>ICML</w:t>
-      </w:r>
-      <w:r>
-        <w:rPr>
-          <w:rFonts w:ascii="Arial" w:hAnsi="Arial" w:eastAsia="Arial"/>
-          <w:sz w:val="18"/>
-        </w:rPr>
-        <w:t>, 1638–1646.</w:t>
-      </w:r>
-    </w:p>
-    <w:p>
-      <w:pPr>
-        <w:spacing w:after="60" w:before="0" w:line="240" w:lineRule="auto"/>
-        <w:ind w:left="198" w:hanging="113"/>
-      </w:pPr>
-      <w:r>
-        <w:rPr>
-          <w:rFonts w:ascii="Arial" w:hAnsi="Arial" w:eastAsia="Arial"/>
-          <w:sz w:val="18"/>
-        </w:rPr>
-        <w:t xml:space="preserve">• </w:t>
-      </w:r>
-      <w:r>
-        <w:rPr>
-          <w:rFonts w:ascii="Arial" w:hAnsi="Arial" w:eastAsia="Arial"/>
-          <w:sz w:val="18"/>
-        </w:rPr>
-        <w:t xml:space="preserve">Cenikj, G., Strojnik, L., Angelski, R., Ogrinc, N., Koroušić Seljak, B., &amp; Eftimov, T. (2023). From language models to large-scale food and biomedical knowledge graphs. </w:t>
-      </w:r>
-      <w:r>
-        <w:rPr>
-          <w:rFonts w:ascii="Arial" w:hAnsi="Arial" w:eastAsia="Arial"/>
-          <w:i/>
-          <w:sz w:val="18"/>
-        </w:rPr>
-        <w:t>Scientific Reports</w:t>
-      </w:r>
-      <w:r>
-        <w:rPr>
-          <w:rFonts w:ascii="Arial" w:hAnsi="Arial" w:eastAsia="Arial"/>
-          <w:sz w:val="18"/>
-        </w:rPr>
-        <w:t>, 13, 7815. https://doi.org/10.1038/s41598-023-34981-4</w:t>
-      </w:r>
-    </w:p>
-    <w:p>
-      <w:pPr>
-        <w:spacing w:after="60" w:before="0" w:line="240" w:lineRule="auto"/>
-        <w:ind w:left="198" w:hanging="113"/>
-      </w:pPr>
-      <w:r>
-        <w:rPr>
-          <w:rFonts w:ascii="Arial" w:hAnsi="Arial" w:eastAsia="Arial"/>
-          <w:sz w:val="18"/>
-        </w:rPr>
-        <w:t xml:space="preserve">• </w:t>
-      </w:r>
-      <w:r>
-        <w:rPr>
-          <w:rFonts w:ascii="Arial" w:hAnsi="Arial" w:eastAsia="Arial"/>
-          <w:sz w:val="18"/>
-        </w:rPr>
-        <w:t xml:space="preserve">Chapelle, O., &amp; Li, L. (2011). An empirical evaluation of Thompson sampling. </w:t>
-      </w:r>
-      <w:r>
-        <w:rPr>
-          <w:rFonts w:ascii="Arial" w:hAnsi="Arial" w:eastAsia="Arial"/>
-          <w:i/>
-          <w:sz w:val="18"/>
-        </w:rPr>
-        <w:t>NeurIPS</w:t>
-      </w:r>
-      <w:r>
-        <w:rPr>
-          <w:rFonts w:ascii="Arial" w:hAnsi="Arial" w:eastAsia="Arial"/>
-          <w:sz w:val="18"/>
-        </w:rPr>
-        <w:t>, 24.</w:t>
-      </w:r>
-    </w:p>
-    <w:p>
-      <w:pPr>
-        <w:spacing w:after="60" w:before="0" w:line="240" w:lineRule="auto"/>
-        <w:ind w:left="198" w:hanging="113"/>
-      </w:pPr>
-      <w:r>
-        <w:rPr>
-          <w:rFonts w:ascii="Arial" w:hAnsi="Arial" w:eastAsia="Arial"/>
-          <w:sz w:val="18"/>
-        </w:rPr>
-        <w:t xml:space="preserve">• </w:t>
-      </w:r>
-      <w:r>
-        <w:rPr>
-          <w:rFonts w:ascii="Arial" w:hAnsi="Arial" w:eastAsia="Arial"/>
-          <w:sz w:val="18"/>
-        </w:rPr>
-        <w:t xml:space="preserve">Chen, L., et al. (2023). FrugalGPT: How to use large language models while reducing cost and improving performance. </w:t>
-      </w:r>
-      <w:r>
-        <w:rPr>
-          <w:rFonts w:ascii="Arial" w:hAnsi="Arial" w:eastAsia="Arial"/>
-          <w:i/>
-          <w:sz w:val="18"/>
-        </w:rPr>
-        <w:t>arXiv:2305.05176</w:t>
-      </w:r>
-      <w:r>
-        <w:rPr>
-          <w:rFonts w:ascii="Arial" w:hAnsi="Arial" w:eastAsia="Arial"/>
-          <w:sz w:val="18"/>
-        </w:rPr>
-        <w:t>. https://doi.org/10.48550/arXiv.2305.05176</w:t>
-      </w:r>
-    </w:p>
-    <w:p>
-      <w:pPr>
-        <w:spacing w:after="60" w:before="0" w:line="240" w:lineRule="auto"/>
-        <w:ind w:left="198" w:hanging="113"/>
-      </w:pPr>
-      <w:r>
-        <w:rPr>
-          <w:rFonts w:ascii="Arial" w:hAnsi="Arial" w:eastAsia="Arial"/>
-          <w:sz w:val="18"/>
-        </w:rPr>
-        <w:t xml:space="preserve">• </w:t>
-      </w:r>
-      <w:r>
-        <w:rPr>
-          <w:rFonts w:ascii="Arial" w:hAnsi="Arial" w:eastAsia="Arial"/>
-          <w:sz w:val="18"/>
-        </w:rPr>
-        <w:t xml:space="preserve">Chen, M., Xu, Z., Weinberger, K. Q., Chapelle, O., &amp; Kedem, D. (2012). Classifier cascade for minimizing feature evaluation cost. </w:t>
-      </w:r>
-      <w:r>
-        <w:rPr>
-          <w:rFonts w:ascii="Arial" w:hAnsi="Arial" w:eastAsia="Arial"/>
-          <w:i/>
-          <w:sz w:val="18"/>
-        </w:rPr>
-        <w:t>AISTATS (PMLR)</w:t>
-      </w:r>
-      <w:r>
-        <w:rPr>
-          <w:rFonts w:ascii="Arial" w:hAnsi="Arial" w:eastAsia="Arial"/>
-          <w:sz w:val="18"/>
-        </w:rPr>
-        <w:t>, 218–226. https://proceedings.mlr.press/v22/chen12c.html</w:t>
-      </w:r>
-    </w:p>
-    <w:p>
-      <w:pPr>
-        <w:spacing w:after="60" w:before="0" w:line="240" w:lineRule="auto"/>
-        <w:ind w:left="198" w:hanging="113"/>
-      </w:pPr>
-      <w:r>
-        <w:rPr>
-          <w:rFonts w:ascii="Arial" w:hAnsi="Arial" w:eastAsia="Arial"/>
-          <w:sz w:val="18"/>
-        </w:rPr>
-        <w:t xml:space="preserve">• </w:t>
-      </w:r>
-      <w:r>
-        <w:rPr>
-          <w:rFonts w:ascii="Arial" w:hAnsi="Arial" w:eastAsia="Arial"/>
-          <w:sz w:val="18"/>
-        </w:rPr>
-        <w:t xml:space="preserve">Dagdelen, J., Dunn, A., Lee, S., Walker, N., Rosen, A. S., Ceder, G., Persson, K. A., &amp; Jain, A. (2024). Structured information extraction from scientific text with large language models. </w:t>
-      </w:r>
-      <w:r>
-        <w:rPr>
-          <w:rFonts w:ascii="Arial" w:hAnsi="Arial" w:eastAsia="Arial"/>
-          <w:i/>
-          <w:sz w:val="18"/>
-        </w:rPr>
-        <w:t>Nature Communications</w:t>
-      </w:r>
-      <w:r>
-        <w:rPr>
-          <w:rFonts w:ascii="Arial" w:hAnsi="Arial" w:eastAsia="Arial"/>
-          <w:sz w:val="18"/>
-        </w:rPr>
-        <w:t>, 15, 1418. https://doi.org/10.1038/s41467-024-45563-x</w:t>
-      </w:r>
-    </w:p>
-    <w:p>
-      <w:pPr>
-        <w:spacing w:after="60" w:before="0" w:line="240" w:lineRule="auto"/>
-        <w:ind w:left="198" w:hanging="113"/>
-      </w:pPr>
-      <w:r>
-        <w:rPr>
-          <w:rFonts w:ascii="Arial" w:hAnsi="Arial" w:eastAsia="Arial"/>
-          <w:sz w:val="18"/>
-        </w:rPr>
-        <w:t xml:space="preserve">• </w:t>
-      </w:r>
-      <w:r>
-        <w:rPr>
-          <w:rFonts w:ascii="Arial" w:hAnsi="Arial" w:eastAsia="Arial"/>
-          <w:sz w:val="18"/>
-        </w:rPr>
-        <w:t xml:space="preserve">Dettmers, T., et al. (2023). QLoRA: Efficient finetuning of quantized language models. </w:t>
-      </w:r>
-      <w:r>
-        <w:rPr>
-          <w:rFonts w:ascii="Arial" w:hAnsi="Arial" w:eastAsia="Arial"/>
-          <w:i/>
-          <w:sz w:val="18"/>
-        </w:rPr>
-        <w:t>NeurIPS</w:t>
-      </w:r>
-      <w:r>
-        <w:rPr>
-          <w:rFonts w:ascii="Arial" w:hAnsi="Arial" w:eastAsia="Arial"/>
-          <w:sz w:val="18"/>
-        </w:rPr>
-        <w:t>, 36. https://doi.org/10.48550/arXiv.2305.14314</w:t>
-      </w:r>
-    </w:p>
-    <w:p>
-      <w:pPr>
-        <w:spacing w:after="60" w:before="0" w:line="240" w:lineRule="auto"/>
-        <w:ind w:left="198" w:hanging="113"/>
-      </w:pPr>
-      <w:r>
-        <w:rPr>
-          <w:rFonts w:ascii="Arial" w:hAnsi="Arial" w:eastAsia="Arial"/>
-          <w:sz w:val="18"/>
-        </w:rPr>
-        <w:t xml:space="preserve">• </w:t>
-      </w:r>
-      <w:r>
-        <w:rPr>
-          <w:rFonts w:ascii="Arial" w:hAnsi="Arial" w:eastAsia="Arial"/>
-          <w:sz w:val="18"/>
-        </w:rPr>
-        <w:t xml:space="preserve">Dooley, D.M., et al. (2018). FoodOn: A harmonized food ontology to increase global food traceability. </w:t>
-      </w:r>
-      <w:r>
-        <w:rPr>
-          <w:rFonts w:ascii="Arial" w:hAnsi="Arial" w:eastAsia="Arial"/>
-          <w:i/>
-          <w:sz w:val="18"/>
-        </w:rPr>
-        <w:t>npj Science of Food</w:t>
-      </w:r>
-      <w:r>
-        <w:rPr>
-          <w:rFonts w:ascii="Arial" w:hAnsi="Arial" w:eastAsia="Arial"/>
-          <w:sz w:val="18"/>
-        </w:rPr>
-        <w:t>, 2(1), 1-10. https://doi.org/10.1038/s41538-018-0032-6</w:t>
-      </w:r>
-    </w:p>
-    <w:p>
-      <w:pPr>
-        <w:spacing w:after="60" w:before="0" w:line="240" w:lineRule="auto"/>
-        <w:ind w:left="198" w:hanging="113"/>
-      </w:pPr>
-      <w:r>
-        <w:rPr>
-          <w:rFonts w:ascii="Arial" w:hAnsi="Arial" w:eastAsia="Arial"/>
-          <w:sz w:val="18"/>
-        </w:rPr>
-        <w:t xml:space="preserve">• </w:t>
-      </w:r>
-      <w:r>
-        <w:rPr>
-          <w:rFonts w:ascii="Arial" w:hAnsi="Arial" w:eastAsia="Arial"/>
-          <w:sz w:val="18"/>
-        </w:rPr>
-        <w:t xml:space="preserve">EFSA (2015). The food classification and description system FoodEx2 (revision 2). </w:t>
-      </w:r>
-      <w:r>
-        <w:rPr>
-          <w:rFonts w:ascii="Arial" w:hAnsi="Arial" w:eastAsia="Arial"/>
-          <w:i/>
-          <w:sz w:val="18"/>
-        </w:rPr>
-        <w:t>EFSA Supporting Publications</w:t>
-      </w:r>
-      <w:r>
-        <w:rPr>
-          <w:rFonts w:ascii="Arial" w:hAnsi="Arial" w:eastAsia="Arial"/>
-          <w:sz w:val="18"/>
-        </w:rPr>
-        <w:t>, 12(5), EN-804. https://doi.org/10.2903/sp.efsa.2015.EN-804</w:t>
-      </w:r>
-    </w:p>
-    <w:p>
-      <w:pPr>
-        <w:spacing w:after="60" w:before="0" w:line="240" w:lineRule="auto"/>
-        <w:ind w:left="198" w:hanging="113"/>
-      </w:pPr>
-      <w:r>
-        <w:rPr>
-          <w:rFonts w:ascii="Arial" w:hAnsi="Arial" w:eastAsia="Arial"/>
-          <w:sz w:val="18"/>
-        </w:rPr>
-        <w:t xml:space="preserve">• </w:t>
-      </w:r>
-      <w:r>
-        <w:rPr>
-          <w:rFonts w:ascii="Arial" w:hAnsi="Arial" w:eastAsia="Arial"/>
-          <w:sz w:val="18"/>
-        </w:rPr>
-        <w:t xml:space="preserve">Efron, B., &amp; Tibshirani, R.J. (1993). </w:t>
-      </w:r>
-      <w:r>
-        <w:rPr>
-          <w:rFonts w:ascii="Arial" w:hAnsi="Arial" w:eastAsia="Arial"/>
-          <w:i/>
-          <w:sz w:val="18"/>
-        </w:rPr>
-        <w:t>An Introduction to the Bootstrap</w:t>
-      </w:r>
-      <w:r>
-        <w:rPr>
-          <w:rFonts w:ascii="Arial" w:hAnsi="Arial" w:eastAsia="Arial"/>
-          <w:sz w:val="18"/>
-        </w:rPr>
-        <w:t>. Chapman &amp; Hall/CRC. https://doi.org/10.1201/9780429246593</w:t>
-      </w:r>
-    </w:p>
-    <w:p>
-      <w:pPr>
-        <w:spacing w:after="60" w:before="0" w:line="240" w:lineRule="auto"/>
-        <w:ind w:left="198" w:hanging="113"/>
-      </w:pPr>
-      <w:r>
-        <w:rPr>
-          <w:rFonts w:ascii="Arial" w:hAnsi="Arial" w:eastAsia="Arial"/>
-          <w:sz w:val="18"/>
-        </w:rPr>
-        <w:t xml:space="preserve">• </w:t>
-      </w:r>
-      <w:r>
-        <w:rPr>
-          <w:rFonts w:ascii="Arial" w:hAnsi="Arial" w:eastAsia="Arial"/>
-          <w:sz w:val="18"/>
-        </w:rPr>
-        <w:t xml:space="preserve">EuroFIR AISBL. (2024). </w:t>
-      </w:r>
-      <w:r>
-        <w:rPr>
-          <w:rFonts w:ascii="Arial" w:hAnsi="Arial" w:eastAsia="Arial"/>
-          <w:i/>
-          <w:sz w:val="18"/>
-        </w:rPr>
-        <w:t>European Food Information Resource (EuroFIR) food composition platform</w:t>
-      </w:r>
-      <w:r>
-        <w:rPr>
-          <w:rFonts w:ascii="Arial" w:hAnsi="Arial" w:eastAsia="Arial"/>
-          <w:sz w:val="18"/>
-        </w:rPr>
-        <w:t>. https://www.eurofir.org</w:t>
-      </w:r>
-    </w:p>
-    <w:p>
-      <w:pPr>
-        <w:spacing w:after="60" w:before="0" w:line="240" w:lineRule="auto"/>
-        <w:ind w:left="198" w:hanging="113"/>
-      </w:pPr>
-      <w:r>
-        <w:rPr>
-          <w:rFonts w:ascii="Arial" w:hAnsi="Arial" w:eastAsia="Arial"/>
-          <w:sz w:val="18"/>
-        </w:rPr>
-        <w:t xml:space="preserve">• </w:t>
-      </w:r>
-      <w:r>
-        <w:rPr>
-          <w:rFonts w:ascii="Arial" w:hAnsi="Arial" w:eastAsia="Arial"/>
-          <w:sz w:val="18"/>
-        </w:rPr>
-        <w:t xml:space="preserve">European Parliament and Council. (2011). </w:t>
-      </w:r>
-      <w:r>
-        <w:rPr>
-          <w:rFonts w:ascii="Arial" w:hAnsi="Arial" w:eastAsia="Arial"/>
-          <w:i/>
-          <w:sz w:val="18"/>
-        </w:rPr>
-        <w:t>Regulation (EU) No 1169/2011 on the provision of food information to consumers</w:t>
-      </w:r>
-      <w:r>
-        <w:rPr>
-          <w:rFonts w:ascii="Arial" w:hAnsi="Arial" w:eastAsia="Arial"/>
-          <w:sz w:val="18"/>
-        </w:rPr>
-        <w:t>. EUR-Lex. https://eur-lex.europa.eu/eli/reg/2011/1169/oj</w:t>
-      </w:r>
-    </w:p>
-    <w:p>
-      <w:pPr>
-        <w:spacing w:after="60" w:before="0" w:line="240" w:lineRule="auto"/>
-        <w:ind w:left="198" w:hanging="113"/>
-      </w:pPr>
-      <w:r>
-        <w:rPr>
-          <w:rFonts w:ascii="Arial" w:hAnsi="Arial" w:eastAsia="Arial"/>
-          <w:sz w:val="18"/>
-        </w:rPr>
-        <w:t xml:space="preserve">• </w:t>
-      </w:r>
-      <w:r>
-        <w:rPr>
-          <w:rFonts w:ascii="Arial" w:hAnsi="Arial" w:eastAsia="Arial"/>
-          <w:sz w:val="18"/>
-        </w:rPr>
-        <w:t xml:space="preserve">FAO/INFOODS (2012). </w:t>
-      </w:r>
-      <w:r>
-        <w:rPr>
-          <w:rFonts w:ascii="Arial" w:hAnsi="Arial" w:eastAsia="Arial"/>
-          <w:i/>
-          <w:sz w:val="18"/>
-        </w:rPr>
-        <w:t>FAO/INFOODS Guidelines for Food Matching</w:t>
-      </w:r>
-      <w:r>
-        <w:rPr>
-          <w:rFonts w:ascii="Arial" w:hAnsi="Arial" w:eastAsia="Arial"/>
-          <w:sz w:val="18"/>
-        </w:rPr>
-        <w:t>. Rome: FAO.</w:t>
-      </w:r>
-    </w:p>
-    <w:p>
-      <w:pPr>
-        <w:spacing w:after="60" w:before="0" w:line="240" w:lineRule="auto"/>
-        <w:ind w:left="198" w:hanging="113"/>
-      </w:pPr>
-      <w:r>
-        <w:rPr>
-          <w:rFonts w:ascii="Arial" w:hAnsi="Arial" w:eastAsia="Arial"/>
-          <w:sz w:val="18"/>
-        </w:rPr>
-        <w:t xml:space="preserve">• </w:t>
-      </w:r>
-      <w:r>
-        <w:rPr>
-          <w:rFonts w:ascii="Arial" w:hAnsi="Arial" w:eastAsia="Arial"/>
-          <w:sz w:val="18"/>
-        </w:rPr>
-        <w:t xml:space="preserve">Fedus, W., et al. (2022). Switch Transformers: Scaling to trillion parameter models. </w:t>
-      </w:r>
-      <w:r>
-        <w:rPr>
-          <w:rFonts w:ascii="Arial" w:hAnsi="Arial" w:eastAsia="Arial"/>
-          <w:i/>
-          <w:sz w:val="18"/>
-        </w:rPr>
-        <w:t>JMLR</w:t>
-      </w:r>
-      <w:r>
-        <w:rPr>
-          <w:rFonts w:ascii="Arial" w:hAnsi="Arial" w:eastAsia="Arial"/>
-          <w:sz w:val="18"/>
-        </w:rPr>
-        <w:t>, 23(120), 1–39.</w:t>
-      </w:r>
-    </w:p>
-    <w:p>
-      <w:pPr>
-        <w:spacing w:after="60" w:before="0" w:line="240" w:lineRule="auto"/>
-        <w:ind w:left="198" w:hanging="113"/>
-      </w:pPr>
-      <w:r>
-        <w:rPr>
-          <w:rFonts w:ascii="Arial" w:hAnsi="Arial" w:eastAsia="Arial"/>
-          <w:sz w:val="18"/>
-        </w:rPr>
-        <w:t xml:space="preserve">• </w:t>
-      </w:r>
-      <w:r>
-        <w:rPr>
-          <w:rFonts w:ascii="Arial" w:hAnsi="Arial" w:eastAsia="Arial"/>
-          <w:sz w:val="18"/>
-        </w:rPr>
-        <w:t xml:space="preserve">Greenfield, H., &amp; Southgate, D.A.T. (2003). </w:t>
-      </w:r>
-      <w:r>
-        <w:rPr>
-          <w:rFonts w:ascii="Arial" w:hAnsi="Arial" w:eastAsia="Arial"/>
-          <w:i/>
-          <w:sz w:val="18"/>
-        </w:rPr>
-        <w:t>Food Composition Data: Production, Management and Use</w:t>
-      </w:r>
-      <w:r>
-        <w:rPr>
-          <w:rFonts w:ascii="Arial" w:hAnsi="Arial" w:eastAsia="Arial"/>
-          <w:sz w:val="18"/>
-        </w:rPr>
-        <w:t xml:space="preserve"> (2nd ed.). Rome: FAO.</w:t>
-      </w:r>
-    </w:p>
-    <w:p>
-      <w:pPr>
-        <w:spacing w:after="60" w:before="0" w:line="240" w:lineRule="auto"/>
-        <w:ind w:left="198" w:hanging="113"/>
-      </w:pPr>
-      <w:r>
-        <w:rPr>
-          <w:rFonts w:ascii="Arial" w:hAnsi="Arial" w:eastAsia="Arial"/>
-          <w:sz w:val="18"/>
-        </w:rPr>
-        <w:t xml:space="preserve">• </w:t>
-      </w:r>
-      <w:r>
-        <w:rPr>
-          <w:rFonts w:ascii="Arial" w:hAnsi="Arial" w:eastAsia="Arial"/>
-          <w:sz w:val="18"/>
-        </w:rPr>
-        <w:t xml:space="preserve">Hestness, J., et al. (2017). Deep learning scaling is predictable, empirically. </w:t>
-      </w:r>
-      <w:r>
-        <w:rPr>
-          <w:rFonts w:ascii="Arial" w:hAnsi="Arial" w:eastAsia="Arial"/>
-          <w:i/>
-          <w:sz w:val="18"/>
-        </w:rPr>
-        <w:t>arXiv:1712.00409</w:t>
-      </w:r>
-      <w:r>
-        <w:rPr>
-          <w:rFonts w:ascii="Arial" w:hAnsi="Arial" w:eastAsia="Arial"/>
-          <w:sz w:val="18"/>
-        </w:rPr>
-        <w:t>. https://doi.org/10.48550/arXiv.1712.00409</w:t>
-      </w:r>
-    </w:p>
-    <w:p>
-      <w:pPr>
-        <w:spacing w:after="60" w:before="0" w:line="240" w:lineRule="auto"/>
-        <w:ind w:left="198" w:hanging="113"/>
-      </w:pPr>
-      <w:r>
-        <w:rPr>
-          <w:rFonts w:ascii="Arial" w:hAnsi="Arial" w:eastAsia="Arial"/>
-          <w:sz w:val="18"/>
-        </w:rPr>
-        <w:t xml:space="preserve">• </w:t>
-      </w:r>
-      <w:r>
-        <w:rPr>
-          <w:rFonts w:ascii="Arial" w:hAnsi="Arial" w:eastAsia="Arial"/>
-          <w:sz w:val="18"/>
-        </w:rPr>
-        <w:t xml:space="preserve">Hooton, F., Menichetti, G., &amp; Barabási, A.-L. (2020). Exploring food contents in scientific literature with FoodMine. </w:t>
-      </w:r>
-      <w:r>
-        <w:rPr>
-          <w:rFonts w:ascii="Arial" w:hAnsi="Arial" w:eastAsia="Arial"/>
-          <w:i/>
-          <w:sz w:val="18"/>
-        </w:rPr>
-        <w:t>Scientific Reports</w:t>
-      </w:r>
-      <w:r>
-        <w:rPr>
-          <w:rFonts w:ascii="Arial" w:hAnsi="Arial" w:eastAsia="Arial"/>
-          <w:sz w:val="18"/>
-        </w:rPr>
-        <w:t>, 10, 16191. https://doi.org/10.1038/s41598-020-73105-0</w:t>
-      </w:r>
-    </w:p>
-    <w:p>
-      <w:pPr>
-        <w:spacing w:after="60" w:before="0" w:line="240" w:lineRule="auto"/>
-        <w:ind w:left="198" w:hanging="113"/>
-      </w:pPr>
-      <w:r>
-        <w:rPr>
-          <w:rFonts w:ascii="Arial" w:hAnsi="Arial" w:eastAsia="Arial"/>
-          <w:sz w:val="18"/>
-        </w:rPr>
-        <w:t xml:space="preserve">• </w:t>
-      </w:r>
-      <w:r>
-        <w:rPr>
-          <w:rFonts w:ascii="Arial" w:hAnsi="Arial" w:eastAsia="Arial"/>
-          <w:sz w:val="18"/>
-        </w:rPr>
-        <w:t xml:space="preserve">Hu, E.J., et al. (2022). LoRA: Low-rank adaptation of large language models. </w:t>
-      </w:r>
-      <w:r>
-        <w:rPr>
-          <w:rFonts w:ascii="Arial" w:hAnsi="Arial" w:eastAsia="Arial"/>
-          <w:i/>
-          <w:sz w:val="18"/>
-        </w:rPr>
-        <w:t>ICLR</w:t>
-      </w:r>
-      <w:r>
-        <w:rPr>
-          <w:rFonts w:ascii="Arial" w:hAnsi="Arial" w:eastAsia="Arial"/>
-          <w:sz w:val="18"/>
-        </w:rPr>
-        <w:t>. https://doi.org/10.48550/arXiv.2106.09685</w:t>
-      </w:r>
-    </w:p>
-    <w:p>
-      <w:pPr>
-        <w:spacing w:after="60" w:before="0" w:line="240" w:lineRule="auto"/>
-        <w:ind w:left="198" w:hanging="113"/>
-      </w:pPr>
-      <w:r>
-        <w:rPr>
-          <w:rFonts w:ascii="Arial" w:hAnsi="Arial" w:eastAsia="Arial"/>
-          <w:sz w:val="18"/>
-        </w:rPr>
-        <w:t xml:space="preserve">• </w:t>
-      </w:r>
-      <w:r>
-        <w:rPr>
-          <w:rFonts w:ascii="Arial" w:hAnsi="Arial" w:eastAsia="Arial"/>
-          <w:sz w:val="18"/>
-        </w:rPr>
-        <w:t xml:space="preserve">Ispirova, G., Eftimov, T., &amp; Koroušić Seljak, B. (2020). P-NUT: Predicting NUTrient content from short text descriptions. </w:t>
-      </w:r>
-      <w:r>
-        <w:rPr>
-          <w:rFonts w:ascii="Arial" w:hAnsi="Arial" w:eastAsia="Arial"/>
-          <w:i/>
-          <w:sz w:val="18"/>
-        </w:rPr>
-        <w:t>Mathematics</w:t>
-      </w:r>
-      <w:r>
-        <w:rPr>
-          <w:rFonts w:ascii="Arial" w:hAnsi="Arial" w:eastAsia="Arial"/>
-          <w:sz w:val="18"/>
-        </w:rPr>
-        <w:t>, 8(10), 1811. https://doi.org/10.3390/math8101811</w:t>
-      </w:r>
-    </w:p>
-    <w:p>
-      <w:pPr>
-        <w:spacing w:after="60" w:before="0" w:line="240" w:lineRule="auto"/>
-        <w:ind w:left="198" w:hanging="113"/>
-      </w:pPr>
-      <w:r>
-        <w:rPr>
-          <w:rFonts w:ascii="Arial" w:hAnsi="Arial" w:eastAsia="Arial"/>
-          <w:sz w:val="18"/>
-        </w:rPr>
-        <w:t xml:space="preserve">• </w:t>
-      </w:r>
-      <w:r>
-        <w:rPr>
-          <w:rFonts w:ascii="Arial" w:hAnsi="Arial" w:eastAsia="Arial"/>
-          <w:sz w:val="18"/>
-        </w:rPr>
-        <w:t xml:space="preserve">Jankelow, A., Godneva, A., Rein, M., Samocha-Bonet, D., Weissglas-Volkov, D., Zohar, S., Shor, T., &amp; Segal, E. (2026). NutriMatch: harmonizing food composition databases with large language models for enhanced nutritional prediction. </w:t>
-      </w:r>
-      <w:r>
-        <w:rPr>
-          <w:rFonts w:ascii="Arial" w:hAnsi="Arial" w:eastAsia="Arial"/>
-          <w:i/>
-          <w:sz w:val="18"/>
-        </w:rPr>
-        <w:t>npj Digital Public Health</w:t>
-      </w:r>
-      <w:r>
-        <w:rPr>
-          <w:rFonts w:ascii="Arial" w:hAnsi="Arial" w:eastAsia="Arial"/>
-          <w:sz w:val="18"/>
-        </w:rPr>
-        <w:t>, 1, 1. https://doi.org/10.1038/s44482-025-00001-7</w:t>
-      </w:r>
-    </w:p>
-    <w:p>
-      <w:pPr>
-        <w:spacing w:after="60" w:before="0" w:line="240" w:lineRule="auto"/>
-        <w:ind w:left="198" w:hanging="113"/>
-      </w:pPr>
-      <w:r>
-        <w:rPr>
-          <w:rFonts w:ascii="Arial" w:hAnsi="Arial" w:eastAsia="Arial"/>
-          <w:sz w:val="18"/>
-        </w:rPr>
-        <w:t xml:space="preserve">• </w:t>
-      </w:r>
-      <w:r>
-        <w:rPr>
-          <w:rFonts w:ascii="Arial" w:hAnsi="Arial" w:eastAsia="Arial"/>
-          <w:sz w:val="18"/>
-        </w:rPr>
-        <w:t xml:space="preserve">Klensin, J.C., et al. (1989). </w:t>
-      </w:r>
-      <w:r>
-        <w:rPr>
-          <w:rFonts w:ascii="Arial" w:hAnsi="Arial" w:eastAsia="Arial"/>
-          <w:i/>
-          <w:sz w:val="18"/>
-        </w:rPr>
-        <w:t>Identification of Food Components for INFOODS Data Interchange</w:t>
-      </w:r>
-      <w:r>
-        <w:rPr>
-          <w:rFonts w:ascii="Arial" w:hAnsi="Arial" w:eastAsia="Arial"/>
-          <w:sz w:val="18"/>
-        </w:rPr>
-        <w:t>. Tokyo: UNU Press.</w:t>
-      </w:r>
-    </w:p>
-    <w:p>
-      <w:pPr>
-        <w:spacing w:after="60" w:before="0" w:line="240" w:lineRule="auto"/>
-        <w:ind w:left="198" w:hanging="113"/>
-      </w:pPr>
-      <w:r>
-        <w:rPr>
-          <w:rFonts w:ascii="Arial" w:hAnsi="Arial" w:eastAsia="Arial"/>
-          <w:sz w:val="18"/>
-        </w:rPr>
-        <w:t xml:space="preserve">• </w:t>
-      </w:r>
-      <w:r>
-        <w:rPr>
-          <w:rFonts w:ascii="Arial" w:hAnsi="Arial" w:eastAsia="Arial"/>
-          <w:sz w:val="18"/>
-        </w:rPr>
-        <w:t xml:space="preserve">Lattimore, T., &amp; Szepesvári, C. (2020). </w:t>
-      </w:r>
-      <w:r>
-        <w:rPr>
-          <w:rFonts w:ascii="Arial" w:hAnsi="Arial" w:eastAsia="Arial"/>
-          <w:i/>
-          <w:sz w:val="18"/>
-        </w:rPr>
-        <w:t>Bandit Algorithms</w:t>
-      </w:r>
-      <w:r>
-        <w:rPr>
-          <w:rFonts w:ascii="Arial" w:hAnsi="Arial" w:eastAsia="Arial"/>
-          <w:sz w:val="18"/>
-        </w:rPr>
-        <w:t>. Cambridge University Press. https://doi.org/10.1017/9781108571401</w:t>
-      </w:r>
-    </w:p>
-    <w:p>
-      <w:pPr>
-        <w:spacing w:after="60" w:before="0" w:line="240" w:lineRule="auto"/>
-        <w:ind w:left="198" w:hanging="113"/>
-      </w:pPr>
-      <w:r>
-        <w:rPr>
-          <w:rFonts w:ascii="Arial" w:hAnsi="Arial" w:eastAsia="Arial"/>
-          <w:sz w:val="18"/>
-        </w:rPr>
-        <w:t xml:space="preserve">• </w:t>
-      </w:r>
-      <w:r>
-        <w:rPr>
-          <w:rFonts w:ascii="Arial" w:hAnsi="Arial" w:eastAsia="Arial"/>
-          <w:sz w:val="18"/>
-        </w:rPr>
-        <w:t xml:space="preserve">Lewis, P., et al. (2020). Retrieval-augmented generation for knowledge-intensive NLP tasks. </w:t>
-      </w:r>
-      <w:r>
-        <w:rPr>
-          <w:rFonts w:ascii="Arial" w:hAnsi="Arial" w:eastAsia="Arial"/>
-          <w:i/>
-          <w:sz w:val="18"/>
-        </w:rPr>
-        <w:t>NeurIPS</w:t>
-      </w:r>
-      <w:r>
-        <w:rPr>
-          <w:rFonts w:ascii="Arial" w:hAnsi="Arial" w:eastAsia="Arial"/>
-          <w:sz w:val="18"/>
-        </w:rPr>
-        <w:t>, 33, 9459–9474. https://doi.org/10.48550/arXiv.2005.11401</w:t>
-      </w:r>
-    </w:p>
-    <w:p>
-      <w:pPr>
-        <w:spacing w:after="60" w:before="0" w:line="240" w:lineRule="auto"/>
-        <w:ind w:left="198" w:hanging="113"/>
-      </w:pPr>
-      <w:r>
-        <w:rPr>
-          <w:rFonts w:ascii="Arial" w:hAnsi="Arial" w:eastAsia="Arial"/>
-          <w:sz w:val="18"/>
-        </w:rPr>
-        <w:t xml:space="preserve">• </w:t>
-      </w:r>
-      <w:r>
-        <w:rPr>
-          <w:rFonts w:ascii="Arial" w:hAnsi="Arial" w:eastAsia="Arial"/>
-          <w:sz w:val="18"/>
-        </w:rPr>
-        <w:t xml:space="preserve">Li, L., et al. (2010). A contextual-bandit approach to personalized news article recommendation. </w:t>
-      </w:r>
-      <w:r>
-        <w:rPr>
-          <w:rFonts w:ascii="Arial" w:hAnsi="Arial" w:eastAsia="Arial"/>
-          <w:i/>
-          <w:sz w:val="18"/>
-        </w:rPr>
-        <w:t>WWW</w:t>
-      </w:r>
-      <w:r>
-        <w:rPr>
-          <w:rFonts w:ascii="Arial" w:hAnsi="Arial" w:eastAsia="Arial"/>
-          <w:sz w:val="18"/>
-        </w:rPr>
-        <w:t>, 661–670. https://doi.org/10.1145/1772690.1772758</w:t>
-      </w:r>
-    </w:p>
-    <w:p>
-      <w:pPr>
-        <w:spacing w:after="60" w:before="0" w:line="240" w:lineRule="auto"/>
-        <w:ind w:left="198" w:hanging="113"/>
-      </w:pPr>
-      <w:r>
-        <w:rPr>
-          <w:rFonts w:ascii="Arial" w:hAnsi="Arial" w:eastAsia="Arial"/>
-          <w:sz w:val="18"/>
-        </w:rPr>
-        <w:t xml:space="preserve">• </w:t>
-      </w:r>
-      <w:r>
-        <w:rPr>
-          <w:rFonts w:ascii="Arial" w:hAnsi="Arial" w:eastAsia="Arial"/>
-          <w:sz w:val="18"/>
-        </w:rPr>
-        <w:t xml:space="preserve">Lin, T.-Y., et al. (2017). Focal loss for dense object detection. </w:t>
-      </w:r>
-      <w:r>
-        <w:rPr>
-          <w:rFonts w:ascii="Arial" w:hAnsi="Arial" w:eastAsia="Arial"/>
-          <w:i/>
-          <w:sz w:val="18"/>
-        </w:rPr>
-        <w:t>ICCV</w:t>
-      </w:r>
-      <w:r>
-        <w:rPr>
-          <w:rFonts w:ascii="Arial" w:hAnsi="Arial" w:eastAsia="Arial"/>
-          <w:sz w:val="18"/>
-        </w:rPr>
-        <w:t>, 2980–2988. https://doi.org/10.1109/ICCV.2017.324</w:t>
-      </w:r>
-    </w:p>
-    <w:p>
-      <w:pPr>
-        <w:spacing w:after="60" w:before="0" w:line="240" w:lineRule="auto"/>
-        <w:ind w:left="198" w:hanging="113"/>
-      </w:pPr>
-      <w:r>
-        <w:rPr>
-          <w:rFonts w:ascii="Arial" w:hAnsi="Arial" w:eastAsia="Arial"/>
-          <w:sz w:val="18"/>
-        </w:rPr>
-        <w:t xml:space="preserve">• </w:t>
-      </w:r>
-      <w:r>
-        <w:rPr>
-          <w:rFonts w:ascii="Arial" w:hAnsi="Arial" w:eastAsia="Arial"/>
-          <w:sz w:val="18"/>
-        </w:rPr>
-        <w:t xml:space="preserve">MarketsandMarkets. (2025). </w:t>
-      </w:r>
-      <w:r>
-        <w:rPr>
-          <w:rFonts w:ascii="Arial" w:hAnsi="Arial" w:eastAsia="Arial"/>
-          <w:i/>
-          <w:sz w:val="18"/>
-        </w:rPr>
-        <w:t>Personalized Nutrition Market — Global Forecast to 2030</w:t>
-      </w:r>
-      <w:r>
-        <w:rPr>
-          <w:rFonts w:ascii="Arial" w:hAnsi="Arial" w:eastAsia="Arial"/>
-          <w:sz w:val="18"/>
-        </w:rPr>
-        <w:t>. https://www.marketsandmarkets.com/PressReleases/personalized-nutrition.asp</w:t>
-      </w:r>
-    </w:p>
-    <w:p>
-      <w:pPr>
-        <w:spacing w:after="60" w:before="0" w:line="240" w:lineRule="auto"/>
-        <w:ind w:left="198" w:hanging="113"/>
-      </w:pPr>
-      <w:r>
-        <w:rPr>
-          <w:rFonts w:ascii="Arial" w:hAnsi="Arial" w:eastAsia="Arial"/>
-          <w:sz w:val="18"/>
-        </w:rPr>
-        <w:t xml:space="preserve">• </w:t>
-      </w:r>
-      <w:r>
-        <w:rPr>
-          <w:rFonts w:ascii="Arial" w:hAnsi="Arial" w:eastAsia="Arial"/>
-          <w:sz w:val="18"/>
-        </w:rPr>
-        <w:t xml:space="preserve">McHugh, M.L. (2012). Interrater reliability: The kappa statistic. </w:t>
-      </w:r>
-      <w:r>
-        <w:rPr>
-          <w:rFonts w:ascii="Arial" w:hAnsi="Arial" w:eastAsia="Arial"/>
-          <w:i/>
-          <w:sz w:val="18"/>
-        </w:rPr>
-        <w:t>Biochemia Medica</w:t>
-      </w:r>
-      <w:r>
-        <w:rPr>
-          <w:rFonts w:ascii="Arial" w:hAnsi="Arial" w:eastAsia="Arial"/>
-          <w:sz w:val="18"/>
-        </w:rPr>
-        <w:t>, 22(3), 276-282. https://doi.org/10.11613/BM.2012.031</w:t>
-      </w:r>
-    </w:p>
-    <w:p>
-      <w:pPr>
-        <w:spacing w:after="60" w:before="0" w:line="240" w:lineRule="auto"/>
-        <w:ind w:left="198" w:hanging="113"/>
-      </w:pPr>
-      <w:r>
-        <w:rPr>
-          <w:rFonts w:ascii="Arial" w:hAnsi="Arial" w:eastAsia="Arial"/>
-          <w:sz w:val="18"/>
-        </w:rPr>
-        <w:t xml:space="preserve">• </w:t>
-      </w:r>
-      <w:r>
-        <w:rPr>
-          <w:rFonts w:ascii="Arial" w:hAnsi="Arial" w:eastAsia="Arial"/>
-          <w:sz w:val="18"/>
-        </w:rPr>
-        <w:t xml:space="preserve">Monarch, R.M. (2021). </w:t>
-      </w:r>
-      <w:r>
-        <w:rPr>
-          <w:rFonts w:ascii="Arial" w:hAnsi="Arial" w:eastAsia="Arial"/>
-          <w:i/>
-          <w:sz w:val="18"/>
-        </w:rPr>
-        <w:t>Human-in-the-Loop Machine Learning</w:t>
-      </w:r>
-      <w:r>
-        <w:rPr>
-          <w:rFonts w:ascii="Arial" w:hAnsi="Arial" w:eastAsia="Arial"/>
-          <w:sz w:val="18"/>
-        </w:rPr>
-        <w:t>. Manning Publications.</w:t>
-      </w:r>
-    </w:p>
-    <w:p>
-      <w:pPr>
-        <w:spacing w:after="60" w:before="0" w:line="240" w:lineRule="auto"/>
-        <w:ind w:left="198" w:hanging="113"/>
-      </w:pPr>
-      <w:r>
-        <w:rPr>
-          <w:rFonts w:ascii="Arial" w:hAnsi="Arial" w:eastAsia="Arial"/>
-          <w:sz w:val="18"/>
-        </w:rPr>
-        <w:t xml:space="preserve">• </w:t>
-      </w:r>
-      <w:r>
-        <w:rPr>
-          <w:rFonts w:ascii="Arial" w:hAnsi="Arial" w:eastAsia="Arial"/>
-          <w:sz w:val="18"/>
-        </w:rPr>
-        <w:t xml:space="preserve">Møller, A., et al. (2008). LanguaL 2006 – the LanguaL thesaurus. </w:t>
-      </w:r>
-      <w:r>
-        <w:rPr>
-          <w:rFonts w:ascii="Arial" w:hAnsi="Arial" w:eastAsia="Arial"/>
-          <w:i/>
-          <w:sz w:val="18"/>
-        </w:rPr>
-        <w:t>European Journal of Clinical Nutrition</w:t>
-      </w:r>
-      <w:r>
-        <w:rPr>
-          <w:rFonts w:ascii="Arial" w:hAnsi="Arial" w:eastAsia="Arial"/>
-          <w:sz w:val="18"/>
-        </w:rPr>
-        <w:t>, 62, S272–S275. https://doi.org/10.1038/ejcn.2008.50</w:t>
-      </w:r>
-    </w:p>
-    <w:p>
-      <w:pPr>
-        <w:spacing w:after="60" w:before="0" w:line="240" w:lineRule="auto"/>
-        <w:ind w:left="198" w:hanging="113"/>
-      </w:pPr>
-      <w:r>
-        <w:rPr>
-          <w:rFonts w:ascii="Arial" w:hAnsi="Arial" w:eastAsia="Arial"/>
-          <w:sz w:val="18"/>
-        </w:rPr>
-        <w:t xml:space="preserve">• </w:t>
-      </w:r>
-      <w:r>
-        <w:rPr>
-          <w:rFonts w:ascii="Arial" w:hAnsi="Arial" w:eastAsia="Arial"/>
-          <w:sz w:val="18"/>
-        </w:rPr>
-        <w:t xml:space="preserve">Mordor Intelligence. (2025). </w:t>
-      </w:r>
-      <w:r>
-        <w:rPr>
-          <w:rFonts w:ascii="Arial" w:hAnsi="Arial" w:eastAsia="Arial"/>
-          <w:i/>
-          <w:sz w:val="18"/>
-        </w:rPr>
-        <w:t>Diet and Nutrition Apps Market — Size, Share &amp; Growth Trends</w:t>
-      </w:r>
-      <w:r>
-        <w:rPr>
-          <w:rFonts w:ascii="Arial" w:hAnsi="Arial" w:eastAsia="Arial"/>
-          <w:sz w:val="18"/>
-        </w:rPr>
-        <w:t>. https://www.mordorintelligence.com/industry-reports/diet-and-nutrition-apps-market</w:t>
-      </w:r>
-    </w:p>
-    <w:p>
-      <w:pPr>
-        <w:spacing w:after="60" w:before="0" w:line="240" w:lineRule="auto"/>
-        <w:ind w:left="198" w:hanging="113"/>
-      </w:pPr>
-      <w:r>
-        <w:rPr>
-          <w:rFonts w:ascii="Arial" w:hAnsi="Arial" w:eastAsia="Arial"/>
-          <w:sz w:val="18"/>
-        </w:rPr>
-        <w:t xml:space="preserve">• </w:t>
-      </w:r>
-      <w:r>
-        <w:rPr>
-          <w:rFonts w:ascii="Arial" w:hAnsi="Arial" w:eastAsia="Arial"/>
-          <w:sz w:val="18"/>
-        </w:rPr>
-        <w:t xml:space="preserve">Ouyang, L., et al. (2022). Training language models to follow instructions with human feedback. </w:t>
-      </w:r>
-      <w:r>
-        <w:rPr>
-          <w:rFonts w:ascii="Arial" w:hAnsi="Arial" w:eastAsia="Arial"/>
-          <w:i/>
-          <w:sz w:val="18"/>
-        </w:rPr>
-        <w:t>NeurIPS</w:t>
-      </w:r>
-      <w:r>
-        <w:rPr>
-          <w:rFonts w:ascii="Arial" w:hAnsi="Arial" w:eastAsia="Arial"/>
-          <w:sz w:val="18"/>
-        </w:rPr>
-        <w:t>, 35, 27730–27744. https://doi.org/10.48550/arXiv.2203.02155</w:t>
-      </w:r>
-    </w:p>
-    <w:p>
-      <w:pPr>
-        <w:spacing w:after="60" w:before="0" w:line="240" w:lineRule="auto"/>
-        <w:ind w:left="198" w:hanging="113"/>
-      </w:pPr>
-      <w:r>
-        <w:rPr>
-          <w:rFonts w:ascii="Arial" w:hAnsi="Arial" w:eastAsia="Arial"/>
-          <w:sz w:val="18"/>
-        </w:rPr>
-        <w:t xml:space="preserve">• </w:t>
-      </w:r>
-      <w:r>
-        <w:rPr>
-          <w:rFonts w:ascii="Arial" w:hAnsi="Arial" w:eastAsia="Arial"/>
-          <w:sz w:val="18"/>
-        </w:rPr>
-        <w:t xml:space="preserve">Sanh, V., et al. (2019). DistilBERT: Smaller, faster, cheaper and lighter. </w:t>
-      </w:r>
-      <w:r>
-        <w:rPr>
-          <w:rFonts w:ascii="Arial" w:hAnsi="Arial" w:eastAsia="Arial"/>
-          <w:i/>
-          <w:sz w:val="18"/>
-        </w:rPr>
-        <w:t>arXiv:1910.01108</w:t>
-      </w:r>
-      <w:r>
-        <w:rPr>
-          <w:rFonts w:ascii="Arial" w:hAnsi="Arial" w:eastAsia="Arial"/>
-          <w:sz w:val="18"/>
-        </w:rPr>
-        <w:t>. https://doi.org/10.48550/arXiv.1910.01108</w:t>
-      </w:r>
-    </w:p>
-    <w:p>
-      <w:pPr>
-        <w:spacing w:after="60" w:before="0" w:line="240" w:lineRule="auto"/>
-        <w:ind w:left="198" w:hanging="113"/>
-      </w:pPr>
-      <w:r>
-        <w:rPr>
-          <w:rFonts w:ascii="Arial" w:hAnsi="Arial" w:eastAsia="Arial"/>
-          <w:sz w:val="18"/>
-        </w:rPr>
-        <w:t xml:space="preserve">• </w:t>
-      </w:r>
-      <w:r>
-        <w:rPr>
-          <w:rFonts w:ascii="Arial" w:hAnsi="Arial" w:eastAsia="Arial"/>
-          <w:sz w:val="18"/>
-        </w:rPr>
-        <w:t xml:space="preserve">Schakel, S.F., Sievert, Y.A., &amp; Buzzard, I.M. (1988). Sources of data for developing and maintaining a nutrient database. </w:t>
-      </w:r>
-      <w:r>
-        <w:rPr>
-          <w:rFonts w:ascii="Arial" w:hAnsi="Arial" w:eastAsia="Arial"/>
-          <w:i/>
-          <w:sz w:val="18"/>
-        </w:rPr>
-        <w:t>Journal of the American Dietetic Association</w:t>
-      </w:r>
-      <w:r>
-        <w:rPr>
-          <w:rFonts w:ascii="Arial" w:hAnsi="Arial" w:eastAsia="Arial"/>
-          <w:sz w:val="18"/>
-        </w:rPr>
-        <w:t>, 88(10), 1268–1271. https://doi.org/10.1016/S0002-8223(21)07997-9</w:t>
-      </w:r>
-    </w:p>
-    <w:p>
-      <w:pPr>
-        <w:spacing w:after="60" w:before="0" w:line="240" w:lineRule="auto"/>
-        <w:ind w:left="198" w:hanging="113"/>
-      </w:pPr>
-      <w:r>
-        <w:rPr>
-          <w:rFonts w:ascii="Arial" w:hAnsi="Arial" w:eastAsia="Arial"/>
-          <w:sz w:val="18"/>
-        </w:rPr>
-        <w:t xml:space="preserve">• </w:t>
-      </w:r>
-      <w:r>
-        <w:rPr>
-          <w:rFonts w:ascii="Arial" w:hAnsi="Arial" w:eastAsia="Arial"/>
-          <w:sz w:val="18"/>
-        </w:rPr>
-        <w:t xml:space="preserve">Semantic Scholar. (2026). </w:t>
-      </w:r>
-      <w:r>
-        <w:rPr>
-          <w:rFonts w:ascii="Arial" w:hAnsi="Arial" w:eastAsia="Arial"/>
-          <w:i/>
-          <w:sz w:val="18"/>
-        </w:rPr>
-        <w:t>Semantic Scholar Academic Graph API</w:t>
-      </w:r>
-      <w:r>
-        <w:rPr>
-          <w:rFonts w:ascii="Arial" w:hAnsi="Arial" w:eastAsia="Arial"/>
-          <w:sz w:val="18"/>
-        </w:rPr>
-        <w:t>. https://www.semanticscholar.org/product/api</w:t>
-      </w:r>
-    </w:p>
-    <w:p>
-      <w:pPr>
-        <w:spacing w:after="60" w:before="0" w:line="240" w:lineRule="auto"/>
-        <w:ind w:left="198" w:hanging="113"/>
-      </w:pPr>
-      <w:r>
-        <w:rPr>
-          <w:rFonts w:ascii="Arial" w:hAnsi="Arial" w:eastAsia="Arial"/>
-          <w:sz w:val="18"/>
-        </w:rPr>
-        <w:t xml:space="preserve">• </w:t>
-      </w:r>
-      <w:r>
-        <w:rPr>
-          <w:rFonts w:ascii="Arial" w:hAnsi="Arial" w:eastAsia="Arial"/>
-          <w:sz w:val="18"/>
-        </w:rPr>
-        <w:t xml:space="preserve">Settles, B. (2012). </w:t>
-      </w:r>
-      <w:r>
-        <w:rPr>
-          <w:rFonts w:ascii="Arial" w:hAnsi="Arial" w:eastAsia="Arial"/>
-          <w:i/>
-          <w:sz w:val="18"/>
-        </w:rPr>
-        <w:t>Active Learning</w:t>
-      </w:r>
-      <w:r>
-        <w:rPr>
-          <w:rFonts w:ascii="Arial" w:hAnsi="Arial" w:eastAsia="Arial"/>
-          <w:sz w:val="18"/>
-        </w:rPr>
-        <w:t>. Morgan &amp; Claypool Publishers. https://doi.org/10.2200/S00429ED1V01Y201207AIM018</w:t>
-      </w:r>
-    </w:p>
-    <w:p>
-      <w:pPr>
-        <w:spacing w:after="60" w:before="0" w:line="240" w:lineRule="auto"/>
-        <w:ind w:left="198" w:hanging="113"/>
-      </w:pPr>
-      <w:r>
-        <w:rPr>
-          <w:rFonts w:ascii="Arial" w:hAnsi="Arial" w:eastAsia="Arial"/>
-          <w:sz w:val="18"/>
-        </w:rPr>
-        <w:t xml:space="preserve">• </w:t>
-      </w:r>
-      <w:r>
-        <w:rPr>
-          <w:rFonts w:ascii="Arial" w:hAnsi="Arial" w:eastAsia="Arial"/>
-          <w:sz w:val="18"/>
-        </w:rPr>
-        <w:t xml:space="preserve">Seung, H.S., et al. (1992). Query by committee. </w:t>
-      </w:r>
-      <w:r>
-        <w:rPr>
-          <w:rFonts w:ascii="Arial" w:hAnsi="Arial" w:eastAsia="Arial"/>
-          <w:i/>
-          <w:sz w:val="18"/>
-        </w:rPr>
-        <w:t>COLT</w:t>
-      </w:r>
-      <w:r>
-        <w:rPr>
-          <w:rFonts w:ascii="Arial" w:hAnsi="Arial" w:eastAsia="Arial"/>
-          <w:sz w:val="18"/>
-        </w:rPr>
-        <w:t>, 287–294. https://doi.org/10.1145/130385.130417</w:t>
-      </w:r>
-    </w:p>
-    <w:p>
-      <w:pPr>
-        <w:spacing w:after="60" w:before="0" w:line="240" w:lineRule="auto"/>
-        <w:ind w:left="198" w:hanging="113"/>
-      </w:pPr>
-      <w:r>
-        <w:rPr>
-          <w:rFonts w:ascii="Arial" w:hAnsi="Arial" w:eastAsia="Arial"/>
-          <w:sz w:val="18"/>
-        </w:rPr>
-        <w:t xml:space="preserve">• </w:t>
-      </w:r>
-      <w:r>
-        <w:rPr>
-          <w:rFonts w:ascii="Arial" w:hAnsi="Arial" w:eastAsia="Arial"/>
-          <w:sz w:val="18"/>
-        </w:rPr>
-        <w:t xml:space="preserve">Shazeer, N., et al. (2017). Outrageously large neural networks: The sparsely-gated MoE layer. </w:t>
-      </w:r>
-      <w:r>
-        <w:rPr>
-          <w:rFonts w:ascii="Arial" w:hAnsi="Arial" w:eastAsia="Arial"/>
-          <w:i/>
-          <w:sz w:val="18"/>
-        </w:rPr>
-        <w:t>ICLR</w:t>
-      </w:r>
-      <w:r>
-        <w:rPr>
-          <w:rFonts w:ascii="Arial" w:hAnsi="Arial" w:eastAsia="Arial"/>
-          <w:sz w:val="18"/>
-        </w:rPr>
-        <w:t>. https://doi.org/10.48550/arXiv.1701.06538</w:t>
-      </w:r>
-    </w:p>
-    <w:p>
-      <w:pPr>
-        <w:spacing w:after="60" w:before="0" w:line="240" w:lineRule="auto"/>
-        <w:ind w:left="198" w:hanging="113"/>
-      </w:pPr>
-      <w:r>
-        <w:rPr>
-          <w:rFonts w:ascii="Arial" w:hAnsi="Arial" w:eastAsia="Arial"/>
-          <w:sz w:val="18"/>
-        </w:rPr>
-        <w:t xml:space="preserve">• </w:t>
-      </w:r>
-      <w:r>
-        <w:rPr>
-          <w:rFonts w:ascii="Arial" w:hAnsi="Arial" w:eastAsia="Arial"/>
-          <w:sz w:val="18"/>
-        </w:rPr>
-        <w:t xml:space="preserve">Shrout, P.E., &amp; Fleiss, J.L. (1979). Intraclass correlations: Uses in assessing rater reliability. </w:t>
-      </w:r>
-      <w:r>
-        <w:rPr>
-          <w:rFonts w:ascii="Arial" w:hAnsi="Arial" w:eastAsia="Arial"/>
-          <w:i/>
-          <w:sz w:val="18"/>
-        </w:rPr>
-        <w:t>Psychological Bulletin</w:t>
-      </w:r>
-      <w:r>
-        <w:rPr>
-          <w:rFonts w:ascii="Arial" w:hAnsi="Arial" w:eastAsia="Arial"/>
-          <w:sz w:val="18"/>
-        </w:rPr>
-        <w:t>, 86(2), 420–428. https://doi.org/10.1037/0033-2909.86.2.420</w:t>
-      </w:r>
-    </w:p>
-    <w:p>
-      <w:pPr>
-        <w:spacing w:after="60" w:before="0" w:line="240" w:lineRule="auto"/>
-        <w:ind w:left="198" w:hanging="113"/>
-      </w:pPr>
-      <w:r>
-        <w:rPr>
-          <w:rFonts w:ascii="Arial" w:hAnsi="Arial" w:eastAsia="Arial"/>
-          <w:sz w:val="18"/>
-        </w:rPr>
-        <w:t xml:space="preserve">• </w:t>
-      </w:r>
-      <w:r>
-        <w:rPr>
-          <w:rFonts w:ascii="Arial" w:hAnsi="Arial" w:eastAsia="Arial"/>
-          <w:sz w:val="18"/>
-        </w:rPr>
-        <w:t xml:space="preserve">Smock, B., et al. (2022). PubTables-1M: Towards comprehensive table extraction. </w:t>
-      </w:r>
-      <w:r>
-        <w:rPr>
-          <w:rFonts w:ascii="Arial" w:hAnsi="Arial" w:eastAsia="Arial"/>
-          <w:i/>
-          <w:sz w:val="18"/>
-        </w:rPr>
-        <w:t>CVPR</w:t>
-      </w:r>
-      <w:r>
-        <w:rPr>
-          <w:rFonts w:ascii="Arial" w:hAnsi="Arial" w:eastAsia="Arial"/>
-          <w:sz w:val="18"/>
-        </w:rPr>
-        <w:t>, 4634–4642. https://doi.org/10.1109/CVPR52688.2022.00459</w:t>
-      </w:r>
-    </w:p>
-    <w:p>
-      <w:pPr>
-        <w:spacing w:after="60" w:before="0" w:line="240" w:lineRule="auto"/>
-        <w:ind w:left="198" w:hanging="113"/>
-      </w:pPr>
-      <w:r>
-        <w:rPr>
-          <w:rFonts w:ascii="Arial" w:hAnsi="Arial" w:eastAsia="Arial"/>
-          <w:sz w:val="18"/>
-        </w:rPr>
-        <w:t xml:space="preserve">• </w:t>
-      </w:r>
-      <w:r>
-        <w:rPr>
-          <w:rFonts w:ascii="Arial" w:hAnsi="Arial" w:eastAsia="Arial"/>
-          <w:sz w:val="18"/>
-        </w:rPr>
-        <w:t xml:space="preserve">Turc, I., et al. (2019). Well-read students learn better: On the importance of pre-training compact models. </w:t>
-      </w:r>
-      <w:r>
-        <w:rPr>
-          <w:rFonts w:ascii="Arial" w:hAnsi="Arial" w:eastAsia="Arial"/>
-          <w:i/>
-          <w:sz w:val="18"/>
-        </w:rPr>
-        <w:t>arXiv:1908.08962</w:t>
-      </w:r>
-      <w:r>
-        <w:rPr>
-          <w:rFonts w:ascii="Arial" w:hAnsi="Arial" w:eastAsia="Arial"/>
-          <w:sz w:val="18"/>
-        </w:rPr>
-        <w:t>. https://doi.org/10.48550/arXiv.1908.08962</w:t>
-      </w:r>
-    </w:p>
-    <w:p>
-      <w:pPr>
-        <w:spacing w:after="60" w:before="0" w:line="240" w:lineRule="auto"/>
-        <w:ind w:left="198" w:hanging="113"/>
-      </w:pPr>
-      <w:r>
-        <w:rPr>
-          <w:rFonts w:ascii="Arial" w:hAnsi="Arial" w:eastAsia="Arial"/>
-          <w:sz w:val="18"/>
-        </w:rPr>
-        <w:t xml:space="preserve">• </w:t>
-      </w:r>
-      <w:r>
-        <w:rPr>
-          <w:rFonts w:ascii="Arial" w:hAnsi="Arial" w:eastAsia="Arial"/>
-          <w:sz w:val="18"/>
-        </w:rPr>
-        <w:t xml:space="preserve">TÜBİTAK MAM Gıda Enstitüsü (2014). </w:t>
-      </w:r>
-      <w:r>
-        <w:rPr>
-          <w:rFonts w:ascii="Arial" w:hAnsi="Arial" w:eastAsia="Arial"/>
-          <w:i/>
-          <w:sz w:val="18"/>
-        </w:rPr>
-        <w:t>Türkiye'nin Ulusal Gıda Kompozisyon Veri Tabanı (TürKomp)</w:t>
-      </w:r>
-      <w:r>
-        <w:rPr>
-          <w:rFonts w:ascii="Arial" w:hAnsi="Arial" w:eastAsia="Arial"/>
-          <w:sz w:val="18"/>
-        </w:rPr>
-        <w:t>. TÜBİTAK Marmara Araştırma Merkezi. https://mam.tubitak.gov.tr/turkiyenin-ulusal-gida-kompozisyon-veri-tabani/</w:t>
-      </w:r>
-    </w:p>
-    <w:p>
-      <w:pPr>
-        <w:spacing w:after="60" w:before="0" w:line="240" w:lineRule="auto"/>
-        <w:ind w:left="198" w:hanging="113"/>
-      </w:pPr>
-      <w:r>
-        <w:rPr>
-          <w:rFonts w:ascii="Arial" w:hAnsi="Arial" w:eastAsia="Arial"/>
-          <w:sz w:val="18"/>
-        </w:rPr>
-        <w:t xml:space="preserve">• </w:t>
-      </w:r>
-      <w:r>
-        <w:rPr>
-          <w:rFonts w:ascii="Arial" w:hAnsi="Arial" w:eastAsia="Arial"/>
-          <w:sz w:val="18"/>
-        </w:rPr>
-        <w:t xml:space="preserve">TÜBİTAK ULAKBİM. (2026). </w:t>
-      </w:r>
-      <w:r>
-        <w:rPr>
-          <w:rFonts w:ascii="Arial" w:hAnsi="Arial" w:eastAsia="Arial"/>
-          <w:i/>
-          <w:sz w:val="18"/>
-        </w:rPr>
-        <w:t>TRUBA Başvuru ve yüksek başarımlı hesaplama altyapısı</w:t>
-      </w:r>
-      <w:r>
-        <w:rPr>
-          <w:rFonts w:ascii="Arial" w:hAnsi="Arial" w:eastAsia="Arial"/>
-          <w:sz w:val="18"/>
-        </w:rPr>
-        <w:t>. https://www.truba.gov.tr/</w:t>
-      </w:r>
-    </w:p>
-    <w:p>
-      <w:pPr>
-        <w:spacing w:after="60" w:before="0" w:line="240" w:lineRule="auto"/>
-        <w:ind w:left="198" w:hanging="113"/>
-      </w:pPr>
-      <w:r>
-        <w:rPr>
-          <w:rFonts w:ascii="Arial" w:hAnsi="Arial" w:eastAsia="Arial"/>
-          <w:sz w:val="18"/>
-        </w:rPr>
-        <w:t xml:space="preserve">• </w:t>
-      </w:r>
-      <w:r>
-        <w:rPr>
-          <w:rFonts w:ascii="Arial" w:hAnsi="Arial" w:eastAsia="Arial"/>
-          <w:sz w:val="18"/>
-        </w:rPr>
-        <w:t xml:space="preserve">Viola, P., &amp; Jones, M. (2001). Rapid object detection using a boosted cascade. </w:t>
-      </w:r>
-      <w:r>
-        <w:rPr>
-          <w:rFonts w:ascii="Arial" w:hAnsi="Arial" w:eastAsia="Arial"/>
-          <w:i/>
-          <w:sz w:val="18"/>
-        </w:rPr>
-        <w:t>CVPR</w:t>
-      </w:r>
-      <w:r>
-        <w:rPr>
-          <w:rFonts w:ascii="Arial" w:hAnsi="Arial" w:eastAsia="Arial"/>
-          <w:sz w:val="18"/>
-        </w:rPr>
-        <w:t>, 1, 511–518. https://doi.org/10.1109/CVPR.2001.990517</w:t>
-      </w:r>
-    </w:p>
-    <w:p>
-      <w:pPr>
-        <w:spacing w:after="60" w:before="0" w:line="240" w:lineRule="auto"/>
-        <w:ind w:left="198" w:hanging="113"/>
-      </w:pPr>
-      <w:r>
-        <w:rPr>
-          <w:rFonts w:ascii="Arial" w:hAnsi="Arial" w:eastAsia="Arial"/>
-          <w:sz w:val="18"/>
-        </w:rPr>
-        <w:t xml:space="preserve">• </w:t>
-      </w:r>
-      <w:r>
-        <w:rPr>
-          <w:rFonts w:ascii="Arial" w:hAnsi="Arial" w:eastAsia="Arial"/>
-          <w:sz w:val="18"/>
-        </w:rPr>
-        <w:t xml:space="preserve">Youn, J., Li, F., Simmons, G., Kim, S., &amp; Tagkopoulos, I. (2024). FoodAtlas: Automated knowledge extraction of food and chemicals from literature. </w:t>
-      </w:r>
-      <w:r>
-        <w:rPr>
-          <w:rFonts w:ascii="Arial" w:hAnsi="Arial" w:eastAsia="Arial"/>
-          <w:i/>
-          <w:sz w:val="18"/>
-        </w:rPr>
-        <w:t>Computers in Biology and Medicine</w:t>
-      </w:r>
-      <w:r>
-        <w:rPr>
-          <w:rFonts w:ascii="Arial" w:hAnsi="Arial" w:eastAsia="Arial"/>
-          <w:sz w:val="18"/>
-        </w:rPr>
-        <w:t>, 109072. https://doi.org/10.1016/j.compbiomed.2024.109072</w:t>
-      </w:r>
-    </w:p>
-    <w:p>
-      <w:pPr>
-        <w:spacing w:after="60" w:before="0" w:line="240" w:lineRule="auto"/>
-        <w:ind w:left="198" w:hanging="113"/>
-      </w:pPr>
-      <w:r>
-        <w:rPr>
-          <w:rFonts w:ascii="Arial" w:hAnsi="Arial" w:eastAsia="Arial"/>
-          <w:sz w:val="18"/>
-        </w:rPr>
-        <w:t xml:space="preserve">• </w:t>
-      </w:r>
-      <w:r>
-        <w:rPr>
-          <w:rFonts w:ascii="Arial" w:hAnsi="Arial" w:eastAsia="Arial"/>
-          <w:sz w:val="18"/>
-        </w:rPr>
-        <w:t xml:space="preserve">Yue, M., et al. (2024). Large language model cascades with mixture of thought representations for cost-efficient reasoning. </w:t>
-      </w:r>
-      <w:r>
-        <w:rPr>
-          <w:rFonts w:ascii="Arial" w:hAnsi="Arial" w:eastAsia="Arial"/>
-          <w:i/>
-          <w:sz w:val="18"/>
-        </w:rPr>
-        <w:t>ICLR</w:t>
-      </w:r>
-      <w:r>
-        <w:rPr>
-          <w:rFonts w:ascii="Arial" w:hAnsi="Arial" w:eastAsia="Arial"/>
-          <w:sz w:val="18"/>
-        </w:rPr>
-        <w:t>. https://doi.org/10.48550/arXiv.2310.03094</w:t>
-      </w:r>
-    </w:p>
-    <w:p>
-      <w:pPr>
         <w:pStyle w:val="WWNormalWeb1"/>
         <w:spacing w:before="0" w:after="0"/>
         <w:contextualSpacing/>
@@ -14592,3113 +13017,6 @@
           <w:szCs w:val="18"/>
         </w:rPr>
         <w:t>EK-2: BÜTÇE VE GEREKÇESİ</w:t>
-      </w:r>
-    </w:p>
-    <w:p>
-      <w:pPr>
-        <w:spacing w:after="60" w:before="0" w:line="240" w:lineRule="auto"/>
-      </w:pPr>
-      <w:r>
-        <w:rPr>
-          <w:rFonts w:ascii="Arial" w:hAnsi="Arial" w:eastAsia="Arial"/>
-          <w:b/>
-          <w:i/>
-          <w:sz w:val="17"/>
-        </w:rPr>
-        <w:t>Bu bir çalışma taslağıdır.</w:t>
-      </w:r>
-      <w:r>
-        <w:rPr>
-          <w:rFonts w:ascii="Arial" w:hAnsi="Arial" w:eastAsia="Arial"/>
-          <w:i/>
-          <w:sz w:val="17"/>
-        </w:rPr>
-        <w:t xml:space="preserve"> Tutarlar planlama amaçlıdır; donanım fiyatları</w:t>
-      </w:r>
-    </w:p>
-    <w:p>
-      <w:pPr>
-        <w:spacing w:after="60" w:before="0" w:line="240" w:lineRule="auto"/>
-      </w:pPr>
-      <w:r>
-        <w:rPr>
-          <w:rFonts w:ascii="Arial" w:hAnsi="Arial" w:eastAsia="Arial"/>
-          <w:i/>
-          <w:sz w:val="17"/>
-        </w:rPr>
-        <w:t>ekip tarafından güncel tekliflerle değiştirilecektir. Nihai rakamlar PBS</w:t>
-      </w:r>
-    </w:p>
-    <w:p>
-      <w:pPr>
-        <w:spacing w:after="60" w:before="0" w:line="240" w:lineRule="auto"/>
-      </w:pPr>
-      <w:r>
-        <w:rPr>
-          <w:rFonts w:ascii="Arial" w:hAnsi="Arial" w:eastAsia="Arial"/>
-          <w:i/>
-          <w:sz w:val="17"/>
-        </w:rPr>
-        <w:t>sistemine girilirken doğrulanmalıdır. Teyit edilecek varsayımlar belgenin</w:t>
-      </w:r>
-    </w:p>
-    <w:p>
-      <w:pPr>
-        <w:spacing w:after="60" w:before="0" w:line="240" w:lineRule="auto"/>
-      </w:pPr>
-      <w:r>
-        <w:rPr>
-          <w:rFonts w:ascii="Arial" w:hAnsi="Arial" w:eastAsia="Arial"/>
-          <w:i/>
-          <w:sz w:val="17"/>
-        </w:rPr>
-        <w:t>sonundaki listede toplanmıştır.</w:t>
-      </w:r>
-    </w:p>
-    <w:p>
-      <w:pPr>
-        <w:spacing w:after="60" w:before="0" w:line="240" w:lineRule="auto"/>
-      </w:pPr>
-      <w:r>
-        <w:rPr>
-          <w:rFonts w:ascii="Arial" w:hAnsi="Arial" w:eastAsia="Arial"/>
-          <w:b/>
-          <w:sz w:val="19"/>
-        </w:rPr>
-        <w:t>Çerçeve (1005 — 1 Şubat 2026 itibarıyla)</w:t>
-      </w:r>
-    </w:p>
-    <w:p>
-      <w:pPr>
-        <w:spacing w:after="60" w:before="0" w:line="240" w:lineRule="auto"/>
-        <w:ind w:left="198" w:hanging="113"/>
-      </w:pPr>
-      <w:r>
-        <w:rPr>
-          <w:rFonts w:ascii="Arial" w:hAnsi="Arial" w:eastAsia="Arial"/>
-          <w:sz w:val="18"/>
-        </w:rPr>
-        <w:t xml:space="preserve">• </w:t>
-      </w:r>
-      <w:r>
-        <w:rPr>
-          <w:rFonts w:ascii="Arial" w:hAnsi="Arial" w:eastAsia="Arial"/>
-          <w:b/>
-          <w:sz w:val="18"/>
-        </w:rPr>
-        <w:t>Proje destek üst limiti:</w:t>
-      </w:r>
-      <w:r>
-        <w:rPr>
-          <w:rFonts w:ascii="Arial" w:hAnsi="Arial" w:eastAsia="Arial"/>
-          <w:sz w:val="18"/>
-        </w:rPr>
-        <w:t xml:space="preserve"> 1.200.000 TL — </w:t>
-      </w:r>
-      <w:r>
-        <w:rPr>
-          <w:rFonts w:ascii="Arial" w:hAnsi="Arial" w:eastAsia="Arial"/>
-          <w:i/>
-          <w:sz w:val="18"/>
-        </w:rPr>
-        <w:t>burslar dahil; Proje Teşvik İkramiyesi (PTİ) ve kurum hissesi hariç.</w:t>
-      </w:r>
-    </w:p>
-    <w:p>
-      <w:pPr>
-        <w:spacing w:after="60" w:before="0" w:line="240" w:lineRule="auto"/>
-        <w:ind w:left="198" w:hanging="113"/>
-      </w:pPr>
-      <w:r>
-        <w:rPr>
-          <w:rFonts w:ascii="Arial" w:hAnsi="Arial" w:eastAsia="Arial"/>
-          <w:sz w:val="18"/>
-        </w:rPr>
-        <w:t xml:space="preserve">• </w:t>
-      </w:r>
-      <w:r>
-        <w:rPr>
-          <w:rFonts w:ascii="Arial" w:hAnsi="Arial" w:eastAsia="Arial"/>
-          <w:b/>
-          <w:sz w:val="18"/>
-        </w:rPr>
-        <w:t>Proje süresi:</w:t>
-      </w:r>
-      <w:r>
-        <w:rPr>
-          <w:rFonts w:ascii="Arial" w:hAnsi="Arial" w:eastAsia="Arial"/>
-          <w:sz w:val="18"/>
-        </w:rPr>
-        <w:t xml:space="preserve"> 18 ay.</w:t>
-      </w:r>
-    </w:p>
-    <w:p>
-      <w:pPr>
-        <w:spacing w:after="60" w:before="0" w:line="240" w:lineRule="auto"/>
-        <w:ind w:left="198" w:hanging="113"/>
-      </w:pPr>
-      <w:r>
-        <w:rPr>
-          <w:rFonts w:ascii="Arial" w:hAnsi="Arial" w:eastAsia="Arial"/>
-          <w:sz w:val="18"/>
-        </w:rPr>
-        <w:t xml:space="preserve">• </w:t>
-      </w:r>
-      <w:r>
-        <w:rPr>
-          <w:rFonts w:ascii="Arial" w:hAnsi="Arial" w:eastAsia="Arial"/>
-          <w:b/>
-          <w:sz w:val="18"/>
-        </w:rPr>
-        <w:t>2026 burs aylık üst limitleri:</w:t>
-      </w:r>
-      <w:r>
-        <w:rPr>
-          <w:rFonts w:ascii="Arial" w:hAnsi="Arial" w:eastAsia="Arial"/>
-          <w:sz w:val="18"/>
-        </w:rPr>
-        <w:t xml:space="preserve"> Lisans 6.000 TL; Yüksek Lisans 22.500 TL (çalışmayan); Doktora 32.500 TL.</w:t>
-      </w:r>
-    </w:p>
-    <w:p>
-      <w:pPr>
-        <w:spacing w:after="60" w:before="0" w:line="240" w:lineRule="auto"/>
-        <w:ind w:left="198" w:hanging="113"/>
-      </w:pPr>
-      <w:r>
-        <w:rPr>
-          <w:rFonts w:ascii="Arial" w:hAnsi="Arial" w:eastAsia="Arial"/>
-          <w:sz w:val="18"/>
-        </w:rPr>
-        <w:t xml:space="preserve">• </w:t>
-      </w:r>
-      <w:r>
-        <w:rPr>
-          <w:rFonts w:ascii="Arial" w:hAnsi="Arial" w:eastAsia="Arial"/>
-          <w:b/>
-          <w:sz w:val="18"/>
-        </w:rPr>
-        <w:t>Kural:</w:t>
-      </w:r>
-      <w:r>
-        <w:rPr>
-          <w:rFonts w:ascii="Arial" w:hAnsi="Arial" w:eastAsia="Arial"/>
-          <w:sz w:val="18"/>
-        </w:rPr>
-        <w:t xml:space="preserve"> "Makine-teçhizat taleplerinin toplam bütçe ile dengeli olması gözetilir." Bu nedenle bütçe, ağırlıklı olarak araştırmacı emeği (burs) ve sınırlı, gerekçeli donanım üzerine kuruludur; ağır hesaplama için TRUBA tahsisi öncelikli başvuru kanalı, proje GPU'su ise PEFT ölçeğinde yerel yürütme ve B planıdır.</w:t>
-      </w:r>
-    </w:p>
-    <w:p>
-      <w:pPr>
-        <w:spacing w:after="60" w:before="0" w:line="240" w:lineRule="auto"/>
-      </w:pPr>
-      <w:r>
-        <w:rPr>
-          <w:rFonts w:ascii="Arial" w:hAnsi="Arial" w:eastAsia="Arial"/>
-          <w:b/>
-          <w:sz w:val="19"/>
-        </w:rPr>
-        <w:t>1. Özet Bütçe</w:t>
-      </w:r>
-    </w:p>
-    <w:tbl>
-      <w:tblPr>
-        <w:tblStyle w:val="TableGrid"/>
-        <w:tblW w:type="auto" w:w="0"/>
-        <w:tblLook w:firstColumn="1" w:firstRow="1" w:lastColumn="0" w:lastRow="0" w:noHBand="0" w:noVBand="1" w:val="04A0"/>
-        <w:jc w:val="center"/>
-        <w:tblBorders>
-          <w:top w:val="single" w:sz="4" w:space="0" w:color="000000"/>
-          <w:left w:val="single" w:sz="4" w:space="0" w:color="000000"/>
-          <w:bottom w:val="single" w:sz="4" w:space="0" w:color="000000"/>
-          <w:right w:val="single" w:sz="4" w:space="0" w:color="000000"/>
-          <w:insideH w:val="single" w:sz="4" w:space="0" w:color="000000"/>
-          <w:insideV w:val="single" w:sz="4" w:space="0" w:color="000000"/>
-        </w:tblBorders>
-      </w:tblPr>
-      <w:tblGrid>
-        <w:gridCol w:w="2880"/>
-        <w:gridCol w:w="2880"/>
-        <w:gridCol w:w="2880"/>
-      </w:tblGrid>
-      <w:tr>
-        <w:tc>
-          <w:tcPr>
-            <w:tcW w:type="dxa" w:w="2880"/>
-            <w:vAlign w:val="top"/>
-          </w:tcPr>
-          <w:p>
-            <w:pPr>
-              <w:spacing w:after="40" w:before="0" w:line="240" w:lineRule="auto"/>
-            </w:pPr>
-          </w:p>
-          <w:p>
-            <w:pPr>
-              <w:spacing w:after="40" w:before="0" w:line="240" w:lineRule="auto"/>
-            </w:pPr>
-            <w:r>
-              <w:rPr>
-                <w:rFonts w:ascii="Arial" w:hAnsi="Arial" w:eastAsia="Arial"/>
-                <w:b/>
-                <w:sz w:val="15"/>
-              </w:rPr>
-              <w:t>Bütçe Kalemi</w:t>
-            </w:r>
-          </w:p>
-        </w:tc>
-        <w:tc>
-          <w:tcPr>
-            <w:tcW w:type="dxa" w:w="2880"/>
-            <w:vAlign w:val="top"/>
-          </w:tcPr>
-          <w:p>
-            <w:pPr>
-              <w:spacing w:after="40" w:before="0" w:line="240" w:lineRule="auto"/>
-            </w:pPr>
-          </w:p>
-          <w:p>
-            <w:pPr>
-              <w:spacing w:after="40" w:before="0" w:line="240" w:lineRule="auto"/>
-            </w:pPr>
-            <w:r>
-              <w:rPr>
-                <w:rFonts w:ascii="Arial" w:hAnsi="Arial" w:eastAsia="Arial"/>
-                <w:b/>
-                <w:sz w:val="15"/>
-              </w:rPr>
-              <w:t>Tutar (TL)</w:t>
-            </w:r>
-          </w:p>
-        </w:tc>
-        <w:tc>
-          <w:tcPr>
-            <w:tcW w:type="dxa" w:w="2880"/>
-            <w:vAlign w:val="top"/>
-          </w:tcPr>
-          <w:p>
-            <w:pPr>
-              <w:spacing w:after="40" w:before="0" w:line="240" w:lineRule="auto"/>
-            </w:pPr>
-          </w:p>
-          <w:p>
-            <w:pPr>
-              <w:spacing w:after="40" w:before="0" w:line="240" w:lineRule="auto"/>
-            </w:pPr>
-            <w:r>
-              <w:rPr>
-                <w:rFonts w:ascii="Arial" w:hAnsi="Arial" w:eastAsia="Arial"/>
-                <w:b/>
-                <w:sz w:val="15"/>
-              </w:rPr>
-              <w:t>Pay</w:t>
-            </w:r>
-          </w:p>
-        </w:tc>
-      </w:tr>
-      <w:tr>
-        <w:tc>
-          <w:tcPr>
-            <w:tcW w:type="dxa" w:w="2880"/>
-            <w:vAlign w:val="top"/>
-          </w:tcPr>
-          <w:p>
-            <w:pPr>
-              <w:spacing w:after="40" w:before="0" w:line="240" w:lineRule="auto"/>
-            </w:pPr>
-          </w:p>
-          <w:p>
-            <w:pPr>
-              <w:spacing w:after="40" w:before="0" w:line="240" w:lineRule="auto"/>
-            </w:pPr>
-            <w:r>
-              <w:rPr>
-                <w:rFonts w:ascii="Arial" w:hAnsi="Arial" w:eastAsia="Arial"/>
-                <w:sz w:val="15"/>
-              </w:rPr>
-              <w:t>Burs (Bursiyer)</w:t>
-            </w:r>
-          </w:p>
-        </w:tc>
-        <w:tc>
-          <w:tcPr>
-            <w:tcW w:type="dxa" w:w="2880"/>
-            <w:vAlign w:val="top"/>
-          </w:tcPr>
-          <w:p>
-            <w:pPr>
-              <w:spacing w:after="40" w:before="0" w:line="240" w:lineRule="auto"/>
-            </w:pPr>
-          </w:p>
-          <w:p>
-            <w:pPr>
-              <w:spacing w:after="40" w:before="0" w:line="240" w:lineRule="auto"/>
-            </w:pPr>
-            <w:r>
-              <w:rPr>
-                <w:rFonts w:ascii="Arial" w:hAnsi="Arial" w:eastAsia="Arial"/>
-                <w:sz w:val="15"/>
-              </w:rPr>
-              <w:t>828.000</w:t>
-            </w:r>
-          </w:p>
-        </w:tc>
-        <w:tc>
-          <w:tcPr>
-            <w:tcW w:type="dxa" w:w="2880"/>
-            <w:vAlign w:val="top"/>
-          </w:tcPr>
-          <w:p>
-            <w:pPr>
-              <w:spacing w:after="40" w:before="0" w:line="240" w:lineRule="auto"/>
-            </w:pPr>
-          </w:p>
-          <w:p>
-            <w:pPr>
-              <w:spacing w:after="40" w:before="0" w:line="240" w:lineRule="auto"/>
-            </w:pPr>
-            <w:r>
-              <w:rPr>
-                <w:rFonts w:ascii="Arial" w:hAnsi="Arial" w:eastAsia="Arial"/>
-                <w:sz w:val="15"/>
-              </w:rPr>
-              <w:t>%69,0</w:t>
-            </w:r>
-          </w:p>
-        </w:tc>
-      </w:tr>
-      <w:tr>
-        <w:tc>
-          <w:tcPr>
-            <w:tcW w:type="dxa" w:w="2880"/>
-            <w:vAlign w:val="top"/>
-          </w:tcPr>
-          <w:p>
-            <w:pPr>
-              <w:spacing w:after="40" w:before="0" w:line="240" w:lineRule="auto"/>
-            </w:pPr>
-          </w:p>
-          <w:p>
-            <w:pPr>
-              <w:spacing w:after="40" w:before="0" w:line="240" w:lineRule="auto"/>
-            </w:pPr>
-            <w:r>
-              <w:rPr>
-                <w:rFonts w:ascii="Arial" w:hAnsi="Arial" w:eastAsia="Arial"/>
-                <w:sz w:val="15"/>
-              </w:rPr>
-              <w:t>Makine-Teçhizat</w:t>
-            </w:r>
-          </w:p>
-        </w:tc>
-        <w:tc>
-          <w:tcPr>
-            <w:tcW w:type="dxa" w:w="2880"/>
-            <w:vAlign w:val="top"/>
-          </w:tcPr>
-          <w:p>
-            <w:pPr>
-              <w:spacing w:after="40" w:before="0" w:line="240" w:lineRule="auto"/>
-            </w:pPr>
-          </w:p>
-          <w:p>
-            <w:pPr>
-              <w:spacing w:after="40" w:before="0" w:line="240" w:lineRule="auto"/>
-            </w:pPr>
-            <w:r>
-              <w:rPr>
-                <w:rFonts w:ascii="Arial" w:hAnsi="Arial" w:eastAsia="Arial"/>
-                <w:sz w:val="15"/>
-              </w:rPr>
-              <w:t>242.000</w:t>
-            </w:r>
-          </w:p>
-        </w:tc>
-        <w:tc>
-          <w:tcPr>
-            <w:tcW w:type="dxa" w:w="2880"/>
-            <w:vAlign w:val="top"/>
-          </w:tcPr>
-          <w:p>
-            <w:pPr>
-              <w:spacing w:after="40" w:before="0" w:line="240" w:lineRule="auto"/>
-            </w:pPr>
-          </w:p>
-          <w:p>
-            <w:pPr>
-              <w:spacing w:after="40" w:before="0" w:line="240" w:lineRule="auto"/>
-            </w:pPr>
-            <w:r>
-              <w:rPr>
-                <w:rFonts w:ascii="Arial" w:hAnsi="Arial" w:eastAsia="Arial"/>
-                <w:sz w:val="15"/>
-              </w:rPr>
-              <w:t>%20,2</w:t>
-            </w:r>
-          </w:p>
-        </w:tc>
-      </w:tr>
-      <w:tr>
-        <w:tc>
-          <w:tcPr>
-            <w:tcW w:type="dxa" w:w="2880"/>
-            <w:vAlign w:val="top"/>
-          </w:tcPr>
-          <w:p>
-            <w:pPr>
-              <w:spacing w:after="40" w:before="0" w:line="240" w:lineRule="auto"/>
-            </w:pPr>
-          </w:p>
-          <w:p>
-            <w:pPr>
-              <w:spacing w:after="40" w:before="0" w:line="240" w:lineRule="auto"/>
-            </w:pPr>
-            <w:r>
-              <w:rPr>
-                <w:rFonts w:ascii="Arial" w:hAnsi="Arial" w:eastAsia="Arial"/>
-                <w:sz w:val="15"/>
-              </w:rPr>
-              <w:t>Hizmet Alımı</w:t>
-            </w:r>
-          </w:p>
-        </w:tc>
-        <w:tc>
-          <w:tcPr>
-            <w:tcW w:type="dxa" w:w="2880"/>
-            <w:vAlign w:val="top"/>
-          </w:tcPr>
-          <w:p>
-            <w:pPr>
-              <w:spacing w:after="40" w:before="0" w:line="240" w:lineRule="auto"/>
-            </w:pPr>
-          </w:p>
-          <w:p>
-            <w:pPr>
-              <w:spacing w:after="40" w:before="0" w:line="240" w:lineRule="auto"/>
-            </w:pPr>
-            <w:r>
-              <w:rPr>
-                <w:rFonts w:ascii="Arial" w:hAnsi="Arial" w:eastAsia="Arial"/>
-                <w:sz w:val="15"/>
-              </w:rPr>
-              <w:t>60.000</w:t>
-            </w:r>
-          </w:p>
-        </w:tc>
-        <w:tc>
-          <w:tcPr>
-            <w:tcW w:type="dxa" w:w="2880"/>
-            <w:vAlign w:val="top"/>
-          </w:tcPr>
-          <w:p>
-            <w:pPr>
-              <w:spacing w:after="40" w:before="0" w:line="240" w:lineRule="auto"/>
-            </w:pPr>
-          </w:p>
-          <w:p>
-            <w:pPr>
-              <w:spacing w:after="40" w:before="0" w:line="240" w:lineRule="auto"/>
-            </w:pPr>
-            <w:r>
-              <w:rPr>
-                <w:rFonts w:ascii="Arial" w:hAnsi="Arial" w:eastAsia="Arial"/>
-                <w:sz w:val="15"/>
-              </w:rPr>
-              <w:t>%5,0</w:t>
-            </w:r>
-          </w:p>
-        </w:tc>
-      </w:tr>
-      <w:tr>
-        <w:tc>
-          <w:tcPr>
-            <w:tcW w:type="dxa" w:w="2880"/>
-            <w:vAlign w:val="top"/>
-          </w:tcPr>
-          <w:p>
-            <w:pPr>
-              <w:spacing w:after="40" w:before="0" w:line="240" w:lineRule="auto"/>
-            </w:pPr>
-          </w:p>
-          <w:p>
-            <w:pPr>
-              <w:spacing w:after="40" w:before="0" w:line="240" w:lineRule="auto"/>
-            </w:pPr>
-            <w:r>
-              <w:rPr>
-                <w:rFonts w:ascii="Arial" w:hAnsi="Arial" w:eastAsia="Arial"/>
-                <w:sz w:val="15"/>
-              </w:rPr>
-              <w:t>Sarf Malzemesi</w:t>
-            </w:r>
-          </w:p>
-        </w:tc>
-        <w:tc>
-          <w:tcPr>
-            <w:tcW w:type="dxa" w:w="2880"/>
-            <w:vAlign w:val="top"/>
-          </w:tcPr>
-          <w:p>
-            <w:pPr>
-              <w:spacing w:after="40" w:before="0" w:line="240" w:lineRule="auto"/>
-            </w:pPr>
-          </w:p>
-          <w:p>
-            <w:pPr>
-              <w:spacing w:after="40" w:before="0" w:line="240" w:lineRule="auto"/>
-            </w:pPr>
-            <w:r>
-              <w:rPr>
-                <w:rFonts w:ascii="Arial" w:hAnsi="Arial" w:eastAsia="Arial"/>
-                <w:sz w:val="15"/>
-              </w:rPr>
-              <w:t>25.000</w:t>
-            </w:r>
-          </w:p>
-        </w:tc>
-        <w:tc>
-          <w:tcPr>
-            <w:tcW w:type="dxa" w:w="2880"/>
-            <w:vAlign w:val="top"/>
-          </w:tcPr>
-          <w:p>
-            <w:pPr>
-              <w:spacing w:after="40" w:before="0" w:line="240" w:lineRule="auto"/>
-            </w:pPr>
-          </w:p>
-          <w:p>
-            <w:pPr>
-              <w:spacing w:after="40" w:before="0" w:line="240" w:lineRule="auto"/>
-            </w:pPr>
-            <w:r>
-              <w:rPr>
-                <w:rFonts w:ascii="Arial" w:hAnsi="Arial" w:eastAsia="Arial"/>
-                <w:sz w:val="15"/>
-              </w:rPr>
-              <w:t>%2,1</w:t>
-            </w:r>
-          </w:p>
-        </w:tc>
-      </w:tr>
-      <w:tr>
-        <w:tc>
-          <w:tcPr>
-            <w:tcW w:type="dxa" w:w="2880"/>
-            <w:vAlign w:val="top"/>
-          </w:tcPr>
-          <w:p>
-            <w:pPr>
-              <w:spacing w:after="40" w:before="0" w:line="240" w:lineRule="auto"/>
-            </w:pPr>
-          </w:p>
-          <w:p>
-            <w:pPr>
-              <w:spacing w:after="40" w:before="0" w:line="240" w:lineRule="auto"/>
-            </w:pPr>
-            <w:r>
-              <w:rPr>
-                <w:rFonts w:ascii="Arial" w:hAnsi="Arial" w:eastAsia="Arial"/>
-                <w:sz w:val="15"/>
-              </w:rPr>
-              <w:t>Seyahat</w:t>
-            </w:r>
-          </w:p>
-        </w:tc>
-        <w:tc>
-          <w:tcPr>
-            <w:tcW w:type="dxa" w:w="2880"/>
-            <w:vAlign w:val="top"/>
-          </w:tcPr>
-          <w:p>
-            <w:pPr>
-              <w:spacing w:after="40" w:before="0" w:line="240" w:lineRule="auto"/>
-            </w:pPr>
-          </w:p>
-          <w:p>
-            <w:pPr>
-              <w:spacing w:after="40" w:before="0" w:line="240" w:lineRule="auto"/>
-            </w:pPr>
-            <w:r>
-              <w:rPr>
-                <w:rFonts w:ascii="Arial" w:hAnsi="Arial" w:eastAsia="Arial"/>
-                <w:sz w:val="15"/>
-              </w:rPr>
-              <w:t>45.000</w:t>
-            </w:r>
-          </w:p>
-        </w:tc>
-        <w:tc>
-          <w:tcPr>
-            <w:tcW w:type="dxa" w:w="2880"/>
-            <w:vAlign w:val="top"/>
-          </w:tcPr>
-          <w:p>
-            <w:pPr>
-              <w:spacing w:after="40" w:before="0" w:line="240" w:lineRule="auto"/>
-            </w:pPr>
-          </w:p>
-          <w:p>
-            <w:pPr>
-              <w:spacing w:after="40" w:before="0" w:line="240" w:lineRule="auto"/>
-            </w:pPr>
-            <w:r>
-              <w:rPr>
-                <w:rFonts w:ascii="Arial" w:hAnsi="Arial" w:eastAsia="Arial"/>
-                <w:sz w:val="15"/>
-              </w:rPr>
-              <w:t>%3,7</w:t>
-            </w:r>
-          </w:p>
-        </w:tc>
-      </w:tr>
-      <w:tr>
-        <w:tc>
-          <w:tcPr>
-            <w:tcW w:type="dxa" w:w="2880"/>
-            <w:vAlign w:val="top"/>
-          </w:tcPr>
-          <w:p>
-            <w:pPr>
-              <w:spacing w:after="40" w:before="0" w:line="240" w:lineRule="auto"/>
-            </w:pPr>
-          </w:p>
-          <w:p>
-            <w:pPr>
-              <w:spacing w:after="40" w:before="0" w:line="240" w:lineRule="auto"/>
-            </w:pPr>
-            <w:r>
-              <w:rPr>
-                <w:rFonts w:ascii="Arial" w:hAnsi="Arial" w:eastAsia="Arial"/>
-                <w:b/>
-                <w:sz w:val="15"/>
-              </w:rPr>
-              <w:t>TOPLAM (üst limit dahilinde)</w:t>
-            </w:r>
-          </w:p>
-        </w:tc>
-        <w:tc>
-          <w:tcPr>
-            <w:tcW w:type="dxa" w:w="2880"/>
-            <w:vAlign w:val="top"/>
-          </w:tcPr>
-          <w:p>
-            <w:pPr>
-              <w:spacing w:after="40" w:before="0" w:line="240" w:lineRule="auto"/>
-            </w:pPr>
-          </w:p>
-          <w:p>
-            <w:pPr>
-              <w:spacing w:after="40" w:before="0" w:line="240" w:lineRule="auto"/>
-            </w:pPr>
-            <w:r>
-              <w:rPr>
-                <w:rFonts w:ascii="Arial" w:hAnsi="Arial" w:eastAsia="Arial"/>
-                <w:b/>
-                <w:sz w:val="15"/>
-              </w:rPr>
-              <w:t>1.200.000</w:t>
-            </w:r>
-          </w:p>
-        </w:tc>
-        <w:tc>
-          <w:tcPr>
-            <w:tcW w:type="dxa" w:w="2880"/>
-            <w:vAlign w:val="top"/>
-          </w:tcPr>
-          <w:p>
-            <w:pPr>
-              <w:spacing w:after="40" w:before="0" w:line="240" w:lineRule="auto"/>
-            </w:pPr>
-          </w:p>
-          <w:p>
-            <w:pPr>
-              <w:spacing w:after="40" w:before="0" w:line="240" w:lineRule="auto"/>
-            </w:pPr>
-            <w:r>
-              <w:rPr>
-                <w:rFonts w:ascii="Arial" w:hAnsi="Arial" w:eastAsia="Arial"/>
-                <w:sz w:val="15"/>
-              </w:rPr>
-              <w:t>%100</w:t>
-            </w:r>
-          </w:p>
-        </w:tc>
-      </w:tr>
-    </w:tbl>
-    <w:p/>
-    <w:p>
-      <w:pPr>
-        <w:spacing w:after="60" w:before="0" w:line="240" w:lineRule="auto"/>
-      </w:pPr>
-      <w:r>
-        <w:rPr>
-          <w:rFonts w:ascii="Arial" w:hAnsi="Arial" w:eastAsia="Arial"/>
-          <w:i/>
-          <w:sz w:val="18"/>
-        </w:rPr>
-        <w:t>PTİ ve kurum hissesi üst limit dışındadır ve TÜBİTAK tarafından ayrıca hesaplanır; bu tabloya dahil değildir.</w:t>
-      </w:r>
-    </w:p>
-    <w:p>
-      <w:pPr>
-        <w:spacing w:after="60" w:before="0" w:line="240" w:lineRule="auto"/>
-      </w:pPr>
-      <w:r>
-        <w:rPr>
-          <w:rFonts w:ascii="Arial" w:hAnsi="Arial" w:eastAsia="Arial"/>
-          <w:b/>
-          <w:sz w:val="19"/>
-        </w:rPr>
-        <w:t>2. Burs (Bursiyer Giderleri) — 828.000 TL</w:t>
-      </w:r>
-    </w:p>
-    <w:p>
-      <w:pPr>
-        <w:spacing w:after="60" w:before="0" w:line="240" w:lineRule="auto"/>
-      </w:pPr>
-      <w:r>
-        <w:rPr>
-          <w:rFonts w:ascii="Arial" w:hAnsi="Arial" w:eastAsia="Arial"/>
-          <w:sz w:val="18"/>
-        </w:rPr>
-        <w:t>Ekip 4 bursiyerden oluşur. İki gıda mühendisliği bursiyeri, doğrulama (WP4) ve tez çalışmalarını yürütmek üzere yaklaşık 7. ayda yüksek lisans düzeyine geçer ve bu dönemde çalışmayan (tam zamanlı) yüksek lisans burs oranından desteklenir.</w:t>
-      </w:r>
-    </w:p>
-    <w:tbl>
-      <w:tblPr>
-        <w:tblStyle w:val="TableGrid"/>
-        <w:tblW w:type="auto" w:w="0"/>
-        <w:tblLook w:firstColumn="1" w:firstRow="1" w:lastColumn="0" w:lastRow="0" w:noHBand="0" w:noVBand="1" w:val="04A0"/>
-        <w:jc w:val="center"/>
-        <w:tblBorders>
-          <w:top w:val="single" w:sz="4" w:space="0" w:color="000000"/>
-          <w:left w:val="single" w:sz="4" w:space="0" w:color="000000"/>
-          <w:bottom w:val="single" w:sz="4" w:space="0" w:color="000000"/>
-          <w:right w:val="single" w:sz="4" w:space="0" w:color="000000"/>
-          <w:insideH w:val="single" w:sz="4" w:space="0" w:color="000000"/>
-          <w:insideV w:val="single" w:sz="4" w:space="0" w:color="000000"/>
-        </w:tblBorders>
-      </w:tblPr>
-      <w:tblGrid>
-        <w:gridCol w:w="1728"/>
-        <w:gridCol w:w="1728"/>
-        <w:gridCol w:w="1728"/>
-        <w:gridCol w:w="1728"/>
-        <w:gridCol w:w="1728"/>
-      </w:tblGrid>
-      <w:tr>
-        <w:tc>
-          <w:tcPr>
-            <w:tcW w:type="dxa" w:w="1728"/>
-            <w:vAlign w:val="top"/>
-          </w:tcPr>
-          <w:p>
-            <w:pPr>
-              <w:spacing w:after="40" w:before="0" w:line="240" w:lineRule="auto"/>
-            </w:pPr>
-          </w:p>
-          <w:p>
-            <w:pPr>
-              <w:spacing w:after="40" w:before="0" w:line="240" w:lineRule="auto"/>
-            </w:pPr>
-            <w:r>
-              <w:rPr>
-                <w:rFonts w:ascii="Arial" w:hAnsi="Arial" w:eastAsia="Arial"/>
-                <w:b/>
-                <w:sz w:val="15"/>
-              </w:rPr>
-              <w:t>Bursiyer (rol)</w:t>
-            </w:r>
-          </w:p>
-        </w:tc>
-        <w:tc>
-          <w:tcPr>
-            <w:tcW w:type="dxa" w:w="1728"/>
-            <w:vAlign w:val="top"/>
-          </w:tcPr>
-          <w:p>
-            <w:pPr>
-              <w:spacing w:after="40" w:before="0" w:line="240" w:lineRule="auto"/>
-            </w:pPr>
-          </w:p>
-          <w:p>
-            <w:pPr>
-              <w:spacing w:after="40" w:before="0" w:line="240" w:lineRule="auto"/>
-            </w:pPr>
-            <w:r>
-              <w:rPr>
-                <w:rFonts w:ascii="Arial" w:hAnsi="Arial" w:eastAsia="Arial"/>
-                <w:b/>
-                <w:sz w:val="15"/>
-              </w:rPr>
-              <w:t>Düzey</w:t>
-            </w:r>
-          </w:p>
-        </w:tc>
-        <w:tc>
-          <w:tcPr>
-            <w:tcW w:type="dxa" w:w="1728"/>
-            <w:vAlign w:val="top"/>
-          </w:tcPr>
-          <w:p>
-            <w:pPr>
-              <w:spacing w:after="40" w:before="0" w:line="240" w:lineRule="auto"/>
-            </w:pPr>
-          </w:p>
-          <w:p>
-            <w:pPr>
-              <w:spacing w:after="40" w:before="0" w:line="240" w:lineRule="auto"/>
-            </w:pPr>
-            <w:r>
-              <w:rPr>
-                <w:rFonts w:ascii="Arial" w:hAnsi="Arial" w:eastAsia="Arial"/>
-                <w:b/>
-                <w:sz w:val="15"/>
-              </w:rPr>
-              <w:t>Süre</w:t>
-            </w:r>
-          </w:p>
-        </w:tc>
-        <w:tc>
-          <w:tcPr>
-            <w:tcW w:type="dxa" w:w="1728"/>
-            <w:vAlign w:val="top"/>
-          </w:tcPr>
-          <w:p>
-            <w:pPr>
-              <w:spacing w:after="40" w:before="0" w:line="240" w:lineRule="auto"/>
-            </w:pPr>
-          </w:p>
-          <w:p>
-            <w:pPr>
-              <w:spacing w:after="40" w:before="0" w:line="240" w:lineRule="auto"/>
-            </w:pPr>
-            <w:r>
-              <w:rPr>
-                <w:rFonts w:ascii="Arial" w:hAnsi="Arial" w:eastAsia="Arial"/>
-                <w:b/>
-                <w:sz w:val="15"/>
-              </w:rPr>
-              <w:t>Aylık (TL)</w:t>
-            </w:r>
-          </w:p>
-        </w:tc>
-        <w:tc>
-          <w:tcPr>
-            <w:tcW w:type="dxa" w:w="1728"/>
-            <w:vAlign w:val="top"/>
-          </w:tcPr>
-          <w:p>
-            <w:pPr>
-              <w:spacing w:after="40" w:before="0" w:line="240" w:lineRule="auto"/>
-            </w:pPr>
-          </w:p>
-          <w:p>
-            <w:pPr>
-              <w:spacing w:after="40" w:before="0" w:line="240" w:lineRule="auto"/>
-            </w:pPr>
-            <w:r>
-              <w:rPr>
-                <w:rFonts w:ascii="Arial" w:hAnsi="Arial" w:eastAsia="Arial"/>
-                <w:b/>
-                <w:sz w:val="15"/>
-              </w:rPr>
-              <w:t>Toplam (TL)</w:t>
-            </w:r>
-          </w:p>
-        </w:tc>
-      </w:tr>
-      <w:tr>
-        <w:tc>
-          <w:tcPr>
-            <w:tcW w:type="dxa" w:w="1728"/>
-            <w:vAlign w:val="top"/>
-          </w:tcPr>
-          <w:p>
-            <w:pPr>
-              <w:spacing w:after="40" w:before="0" w:line="240" w:lineRule="auto"/>
-            </w:pPr>
-          </w:p>
-          <w:p>
-            <w:pPr>
-              <w:spacing w:after="40" w:before="0" w:line="240" w:lineRule="auto"/>
-            </w:pPr>
-            <w:r>
-              <w:rPr>
-                <w:rFonts w:ascii="Arial" w:hAnsi="Arial" w:eastAsia="Arial"/>
-                <w:sz w:val="15"/>
-              </w:rPr>
-              <w:t>B1 — Yazılım / Yapay Zekâ</w:t>
-            </w:r>
-          </w:p>
-        </w:tc>
-        <w:tc>
-          <w:tcPr>
-            <w:tcW w:type="dxa" w:w="1728"/>
-            <w:vAlign w:val="top"/>
-          </w:tcPr>
-          <w:p>
-            <w:pPr>
-              <w:spacing w:after="40" w:before="0" w:line="240" w:lineRule="auto"/>
-            </w:pPr>
-          </w:p>
-          <w:p>
-            <w:pPr>
-              <w:spacing w:after="40" w:before="0" w:line="240" w:lineRule="auto"/>
-            </w:pPr>
-            <w:r>
-              <w:rPr>
-                <w:rFonts w:ascii="Arial" w:hAnsi="Arial" w:eastAsia="Arial"/>
-                <w:sz w:val="15"/>
-              </w:rPr>
-              <w:t>Lisans</w:t>
-            </w:r>
-          </w:p>
-        </w:tc>
-        <w:tc>
-          <w:tcPr>
-            <w:tcW w:type="dxa" w:w="1728"/>
-            <w:vAlign w:val="top"/>
-          </w:tcPr>
-          <w:p>
-            <w:pPr>
-              <w:spacing w:after="40" w:before="0" w:line="240" w:lineRule="auto"/>
-            </w:pPr>
-          </w:p>
-          <w:p>
-            <w:pPr>
-              <w:spacing w:after="40" w:before="0" w:line="240" w:lineRule="auto"/>
-            </w:pPr>
-            <w:r>
-              <w:rPr>
-                <w:rFonts w:ascii="Arial" w:hAnsi="Arial" w:eastAsia="Arial"/>
-                <w:sz w:val="15"/>
-              </w:rPr>
-              <w:t>1–18. ay (18 ay)</w:t>
-            </w:r>
-          </w:p>
-        </w:tc>
-        <w:tc>
-          <w:tcPr>
-            <w:tcW w:type="dxa" w:w="1728"/>
-            <w:vAlign w:val="top"/>
-          </w:tcPr>
-          <w:p>
-            <w:pPr>
-              <w:spacing w:after="40" w:before="0" w:line="240" w:lineRule="auto"/>
-            </w:pPr>
-          </w:p>
-          <w:p>
-            <w:pPr>
-              <w:spacing w:after="40" w:before="0" w:line="240" w:lineRule="auto"/>
-            </w:pPr>
-            <w:r>
-              <w:rPr>
-                <w:rFonts w:ascii="Arial" w:hAnsi="Arial" w:eastAsia="Arial"/>
-                <w:sz w:val="15"/>
-              </w:rPr>
-              <w:t>6.000</w:t>
-            </w:r>
-          </w:p>
-        </w:tc>
-        <w:tc>
-          <w:tcPr>
-            <w:tcW w:type="dxa" w:w="1728"/>
-            <w:vAlign w:val="top"/>
-          </w:tcPr>
-          <w:p>
-            <w:pPr>
-              <w:spacing w:after="40" w:before="0" w:line="240" w:lineRule="auto"/>
-            </w:pPr>
-          </w:p>
-          <w:p>
-            <w:pPr>
-              <w:spacing w:after="40" w:before="0" w:line="240" w:lineRule="auto"/>
-            </w:pPr>
-            <w:r>
-              <w:rPr>
-                <w:rFonts w:ascii="Arial" w:hAnsi="Arial" w:eastAsia="Arial"/>
-                <w:sz w:val="15"/>
-              </w:rPr>
-              <w:t>108.000</w:t>
-            </w:r>
-          </w:p>
-        </w:tc>
-      </w:tr>
-      <w:tr>
-        <w:tc>
-          <w:tcPr>
-            <w:tcW w:type="dxa" w:w="1728"/>
-            <w:vAlign w:val="top"/>
-          </w:tcPr>
-          <w:p>
-            <w:pPr>
-              <w:spacing w:after="40" w:before="0" w:line="240" w:lineRule="auto"/>
-            </w:pPr>
-          </w:p>
-          <w:p>
-            <w:pPr>
-              <w:spacing w:after="40" w:before="0" w:line="240" w:lineRule="auto"/>
-            </w:pPr>
-            <w:r>
-              <w:rPr>
-                <w:rFonts w:ascii="Arial" w:hAnsi="Arial" w:eastAsia="Arial"/>
-                <w:sz w:val="15"/>
-              </w:rPr>
-              <w:t>B2 — Yazılım / Yapay Zekâ</w:t>
-            </w:r>
-          </w:p>
-        </w:tc>
-        <w:tc>
-          <w:tcPr>
-            <w:tcW w:type="dxa" w:w="1728"/>
-            <w:vAlign w:val="top"/>
-          </w:tcPr>
-          <w:p>
-            <w:pPr>
-              <w:spacing w:after="40" w:before="0" w:line="240" w:lineRule="auto"/>
-            </w:pPr>
-          </w:p>
-          <w:p>
-            <w:pPr>
-              <w:spacing w:after="40" w:before="0" w:line="240" w:lineRule="auto"/>
-            </w:pPr>
-            <w:r>
-              <w:rPr>
-                <w:rFonts w:ascii="Arial" w:hAnsi="Arial" w:eastAsia="Arial"/>
-                <w:sz w:val="15"/>
-              </w:rPr>
-              <w:t>Lisans</w:t>
-            </w:r>
-          </w:p>
-        </w:tc>
-        <w:tc>
-          <w:tcPr>
-            <w:tcW w:type="dxa" w:w="1728"/>
-            <w:vAlign w:val="top"/>
-          </w:tcPr>
-          <w:p>
-            <w:pPr>
-              <w:spacing w:after="40" w:before="0" w:line="240" w:lineRule="auto"/>
-            </w:pPr>
-          </w:p>
-          <w:p>
-            <w:pPr>
-              <w:spacing w:after="40" w:before="0" w:line="240" w:lineRule="auto"/>
-            </w:pPr>
-            <w:r>
-              <w:rPr>
-                <w:rFonts w:ascii="Arial" w:hAnsi="Arial" w:eastAsia="Arial"/>
-                <w:sz w:val="15"/>
-              </w:rPr>
-              <w:t>1–18. ay (18 ay)</w:t>
-            </w:r>
-          </w:p>
-        </w:tc>
-        <w:tc>
-          <w:tcPr>
-            <w:tcW w:type="dxa" w:w="1728"/>
-            <w:vAlign w:val="top"/>
-          </w:tcPr>
-          <w:p>
-            <w:pPr>
-              <w:spacing w:after="40" w:before="0" w:line="240" w:lineRule="auto"/>
-            </w:pPr>
-          </w:p>
-          <w:p>
-            <w:pPr>
-              <w:spacing w:after="40" w:before="0" w:line="240" w:lineRule="auto"/>
-            </w:pPr>
-            <w:r>
-              <w:rPr>
-                <w:rFonts w:ascii="Arial" w:hAnsi="Arial" w:eastAsia="Arial"/>
-                <w:sz w:val="15"/>
-              </w:rPr>
-              <w:t>6.000</w:t>
-            </w:r>
-          </w:p>
-        </w:tc>
-        <w:tc>
-          <w:tcPr>
-            <w:tcW w:type="dxa" w:w="1728"/>
-            <w:vAlign w:val="top"/>
-          </w:tcPr>
-          <w:p>
-            <w:pPr>
-              <w:spacing w:after="40" w:before="0" w:line="240" w:lineRule="auto"/>
-            </w:pPr>
-          </w:p>
-          <w:p>
-            <w:pPr>
-              <w:spacing w:after="40" w:before="0" w:line="240" w:lineRule="auto"/>
-            </w:pPr>
-            <w:r>
-              <w:rPr>
-                <w:rFonts w:ascii="Arial" w:hAnsi="Arial" w:eastAsia="Arial"/>
-                <w:sz w:val="15"/>
-              </w:rPr>
-              <w:t>108.000</w:t>
-            </w:r>
-          </w:p>
-        </w:tc>
-      </w:tr>
-      <w:tr>
-        <w:tc>
-          <w:tcPr>
-            <w:tcW w:type="dxa" w:w="1728"/>
-            <w:vAlign w:val="top"/>
-          </w:tcPr>
-          <w:p>
-            <w:pPr>
-              <w:spacing w:after="40" w:before="0" w:line="240" w:lineRule="auto"/>
-            </w:pPr>
-          </w:p>
-          <w:p>
-            <w:pPr>
-              <w:spacing w:after="40" w:before="0" w:line="240" w:lineRule="auto"/>
-            </w:pPr>
-            <w:r>
-              <w:rPr>
-                <w:rFonts w:ascii="Arial" w:hAnsi="Arial" w:eastAsia="Arial"/>
-                <w:sz w:val="15"/>
-              </w:rPr>
-              <w:t>B3 — Gıda Mühendisliği</w:t>
-            </w:r>
-          </w:p>
-        </w:tc>
-        <w:tc>
-          <w:tcPr>
-            <w:tcW w:type="dxa" w:w="1728"/>
-            <w:vAlign w:val="top"/>
-          </w:tcPr>
-          <w:p>
-            <w:pPr>
-              <w:spacing w:after="40" w:before="0" w:line="240" w:lineRule="auto"/>
-            </w:pPr>
-          </w:p>
-          <w:p>
-            <w:pPr>
-              <w:spacing w:after="40" w:before="0" w:line="240" w:lineRule="auto"/>
-            </w:pPr>
-            <w:r>
-              <w:rPr>
-                <w:rFonts w:ascii="Arial" w:hAnsi="Arial" w:eastAsia="Arial"/>
-                <w:sz w:val="15"/>
-              </w:rPr>
-              <w:t>Lisans → Yüksek Lisans</w:t>
-            </w:r>
-          </w:p>
-        </w:tc>
-        <w:tc>
-          <w:tcPr>
-            <w:tcW w:type="dxa" w:w="1728"/>
-            <w:vAlign w:val="top"/>
-          </w:tcPr>
-          <w:p>
-            <w:pPr>
-              <w:spacing w:after="40" w:before="0" w:line="240" w:lineRule="auto"/>
-            </w:pPr>
-          </w:p>
-          <w:p>
-            <w:pPr>
-              <w:spacing w:after="40" w:before="0" w:line="240" w:lineRule="auto"/>
-            </w:pPr>
-            <w:r>
-              <w:rPr>
-                <w:rFonts w:ascii="Arial" w:hAnsi="Arial" w:eastAsia="Arial"/>
-                <w:sz w:val="15"/>
-              </w:rPr>
-              <w:t>1–6. ay (Lisans) / 7–18. ay (YL)</w:t>
-            </w:r>
-          </w:p>
-        </w:tc>
-        <w:tc>
-          <w:tcPr>
-            <w:tcW w:type="dxa" w:w="1728"/>
-            <w:vAlign w:val="top"/>
-          </w:tcPr>
-          <w:p>
-            <w:pPr>
-              <w:spacing w:after="40" w:before="0" w:line="240" w:lineRule="auto"/>
-            </w:pPr>
-          </w:p>
-          <w:p>
-            <w:pPr>
-              <w:spacing w:after="40" w:before="0" w:line="240" w:lineRule="auto"/>
-            </w:pPr>
-            <w:r>
-              <w:rPr>
-                <w:rFonts w:ascii="Arial" w:hAnsi="Arial" w:eastAsia="Arial"/>
-                <w:sz w:val="15"/>
-              </w:rPr>
-              <w:t>6.000 / 22.500</w:t>
-            </w:r>
-          </w:p>
-        </w:tc>
-        <w:tc>
-          <w:tcPr>
-            <w:tcW w:type="dxa" w:w="1728"/>
-            <w:vAlign w:val="top"/>
-          </w:tcPr>
-          <w:p>
-            <w:pPr>
-              <w:spacing w:after="40" w:before="0" w:line="240" w:lineRule="auto"/>
-            </w:pPr>
-          </w:p>
-          <w:p>
-            <w:pPr>
-              <w:spacing w:after="40" w:before="0" w:line="240" w:lineRule="auto"/>
-            </w:pPr>
-            <w:r>
-              <w:rPr>
-                <w:rFonts w:ascii="Arial" w:hAnsi="Arial" w:eastAsia="Arial"/>
-                <w:sz w:val="15"/>
-              </w:rPr>
-              <w:t>306.000</w:t>
-            </w:r>
-          </w:p>
-        </w:tc>
-      </w:tr>
-      <w:tr>
-        <w:tc>
-          <w:tcPr>
-            <w:tcW w:type="dxa" w:w="1728"/>
-            <w:vAlign w:val="top"/>
-          </w:tcPr>
-          <w:p>
-            <w:pPr>
-              <w:spacing w:after="40" w:before="0" w:line="240" w:lineRule="auto"/>
-            </w:pPr>
-          </w:p>
-          <w:p>
-            <w:pPr>
-              <w:spacing w:after="40" w:before="0" w:line="240" w:lineRule="auto"/>
-            </w:pPr>
-            <w:r>
-              <w:rPr>
-                <w:rFonts w:ascii="Arial" w:hAnsi="Arial" w:eastAsia="Arial"/>
-                <w:sz w:val="15"/>
-              </w:rPr>
-              <w:t>B4 — Gıda Mühendisliği</w:t>
-            </w:r>
-          </w:p>
-        </w:tc>
-        <w:tc>
-          <w:tcPr>
-            <w:tcW w:type="dxa" w:w="1728"/>
-            <w:vAlign w:val="top"/>
-          </w:tcPr>
-          <w:p>
-            <w:pPr>
-              <w:spacing w:after="40" w:before="0" w:line="240" w:lineRule="auto"/>
-            </w:pPr>
-          </w:p>
-          <w:p>
-            <w:pPr>
-              <w:spacing w:after="40" w:before="0" w:line="240" w:lineRule="auto"/>
-            </w:pPr>
-            <w:r>
-              <w:rPr>
-                <w:rFonts w:ascii="Arial" w:hAnsi="Arial" w:eastAsia="Arial"/>
-                <w:sz w:val="15"/>
-              </w:rPr>
-              <w:t>Lisans → Yüksek Lisans</w:t>
-            </w:r>
-          </w:p>
-        </w:tc>
-        <w:tc>
-          <w:tcPr>
-            <w:tcW w:type="dxa" w:w="1728"/>
-            <w:vAlign w:val="top"/>
-          </w:tcPr>
-          <w:p>
-            <w:pPr>
-              <w:spacing w:after="40" w:before="0" w:line="240" w:lineRule="auto"/>
-            </w:pPr>
-          </w:p>
-          <w:p>
-            <w:pPr>
-              <w:spacing w:after="40" w:before="0" w:line="240" w:lineRule="auto"/>
-            </w:pPr>
-            <w:r>
-              <w:rPr>
-                <w:rFonts w:ascii="Arial" w:hAnsi="Arial" w:eastAsia="Arial"/>
-                <w:sz w:val="15"/>
-              </w:rPr>
-              <w:t>1–6. ay (Lisans) / 7–18. ay (YL)</w:t>
-            </w:r>
-          </w:p>
-        </w:tc>
-        <w:tc>
-          <w:tcPr>
-            <w:tcW w:type="dxa" w:w="1728"/>
-            <w:vAlign w:val="top"/>
-          </w:tcPr>
-          <w:p>
-            <w:pPr>
-              <w:spacing w:after="40" w:before="0" w:line="240" w:lineRule="auto"/>
-            </w:pPr>
-          </w:p>
-          <w:p>
-            <w:pPr>
-              <w:spacing w:after="40" w:before="0" w:line="240" w:lineRule="auto"/>
-            </w:pPr>
-            <w:r>
-              <w:rPr>
-                <w:rFonts w:ascii="Arial" w:hAnsi="Arial" w:eastAsia="Arial"/>
-                <w:sz w:val="15"/>
-              </w:rPr>
-              <w:t>6.000 / 22.500</w:t>
-            </w:r>
-          </w:p>
-        </w:tc>
-        <w:tc>
-          <w:tcPr>
-            <w:tcW w:type="dxa" w:w="1728"/>
-            <w:vAlign w:val="top"/>
-          </w:tcPr>
-          <w:p>
-            <w:pPr>
-              <w:spacing w:after="40" w:before="0" w:line="240" w:lineRule="auto"/>
-            </w:pPr>
-          </w:p>
-          <w:p>
-            <w:pPr>
-              <w:spacing w:after="40" w:before="0" w:line="240" w:lineRule="auto"/>
-            </w:pPr>
-            <w:r>
-              <w:rPr>
-                <w:rFonts w:ascii="Arial" w:hAnsi="Arial" w:eastAsia="Arial"/>
-                <w:sz w:val="15"/>
-              </w:rPr>
-              <w:t>306.000</w:t>
-            </w:r>
-          </w:p>
-        </w:tc>
-      </w:tr>
-      <w:tr>
-        <w:tc>
-          <w:tcPr>
-            <w:tcW w:type="dxa" w:w="1728"/>
-            <w:vAlign w:val="top"/>
-          </w:tcPr>
-          <w:p>
-            <w:pPr>
-              <w:spacing w:after="40" w:before="0" w:line="240" w:lineRule="auto"/>
-            </w:pPr>
-          </w:p>
-          <w:p>
-            <w:pPr>
-              <w:spacing w:after="40" w:before="0" w:line="240" w:lineRule="auto"/>
-            </w:pPr>
-            <w:r>
-              <w:rPr>
-                <w:rFonts w:ascii="Arial" w:hAnsi="Arial" w:eastAsia="Arial"/>
-                <w:b/>
-                <w:sz w:val="15"/>
-              </w:rPr>
-              <w:t>Toplam</w:t>
-            </w:r>
-          </w:p>
-        </w:tc>
-        <w:tc>
-          <w:tcPr>
-            <w:tcW w:type="dxa" w:w="1728"/>
-            <w:vAlign w:val="top"/>
-          </w:tcPr>
-          <w:p>
-            <w:pPr>
-              <w:spacing w:after="40" w:before="0" w:line="240" w:lineRule="auto"/>
-            </w:pPr>
-          </w:p>
-        </w:tc>
-        <w:tc>
-          <w:tcPr>
-            <w:tcW w:type="dxa" w:w="1728"/>
-            <w:vAlign w:val="top"/>
-          </w:tcPr>
-          <w:p>
-            <w:pPr>
-              <w:spacing w:after="40" w:before="0" w:line="240" w:lineRule="auto"/>
-            </w:pPr>
-          </w:p>
-        </w:tc>
-        <w:tc>
-          <w:tcPr>
-            <w:tcW w:type="dxa" w:w="1728"/>
-            <w:vAlign w:val="top"/>
-          </w:tcPr>
-          <w:p>
-            <w:pPr>
-              <w:spacing w:after="40" w:before="0" w:line="240" w:lineRule="auto"/>
-            </w:pPr>
-          </w:p>
-        </w:tc>
-        <w:tc>
-          <w:tcPr>
-            <w:tcW w:type="dxa" w:w="1728"/>
-            <w:vAlign w:val="top"/>
-          </w:tcPr>
-          <w:p>
-            <w:pPr>
-              <w:spacing w:after="40" w:before="0" w:line="240" w:lineRule="auto"/>
-            </w:pPr>
-          </w:p>
-          <w:p>
-            <w:pPr>
-              <w:spacing w:after="40" w:before="0" w:line="240" w:lineRule="auto"/>
-            </w:pPr>
-            <w:r>
-              <w:rPr>
-                <w:rFonts w:ascii="Arial" w:hAnsi="Arial" w:eastAsia="Arial"/>
-                <w:b/>
-                <w:sz w:val="15"/>
-              </w:rPr>
-              <w:t>828.000</w:t>
-            </w:r>
-          </w:p>
-        </w:tc>
-      </w:tr>
-    </w:tbl>
-    <w:p/>
-    <w:p>
-      <w:pPr>
-        <w:spacing w:after="60" w:before="0" w:line="240" w:lineRule="auto"/>
-      </w:pPr>
-      <w:r>
-        <w:rPr>
-          <w:rFonts w:ascii="Arial" w:hAnsi="Arial" w:eastAsia="Arial"/>
-          <w:b/>
-          <w:sz w:val="18"/>
-        </w:rPr>
-        <w:t>Gerekçe:</w:t>
-      </w:r>
-      <w:r>
-        <w:rPr>
-          <w:rFonts w:ascii="Arial" w:hAnsi="Arial" w:eastAsia="Arial"/>
-          <w:sz w:val="18"/>
-        </w:rPr>
-        <w:t xml:space="preserve"> Bursiyer emeği projenin temel araştırma girdisidir; mevcut prototip üzerine eksik araştırma bileşenleri (ağırlıkları açık modellere geçiş, gıda bilimi doğrulama kural motoru, Öğrenilmiş Yönlendirici, katmanlar arası öğrenme döngüsü) bursiyerler tarafından geliştirilir. İki gıda mühendisliği bursiyerinin yüksek lisansa geçişi, WP4 uzman doğrulamasının Prof. Dr. Şumnu gözetiminde yüksek lisans düzeyinde yürütülmesini ve iki yüksek lisans tezinin (yaygın etki çıktısı) üretilmesini sağlar.</w:t>
-      </w:r>
-    </w:p>
-    <w:p>
-      <w:pPr>
-        <w:spacing w:after="60" w:before="0" w:line="240" w:lineRule="auto"/>
-      </w:pPr>
-      <w:r>
-        <w:rPr>
-          <w:rFonts w:ascii="Arial" w:hAnsi="Arial" w:eastAsia="Arial"/>
-          <w:b/>
-          <w:sz w:val="19"/>
-        </w:rPr>
-        <w:t>3. Makine-Teçhizat — 242.000 TL</w:t>
-      </w:r>
-    </w:p>
-    <w:tbl>
-      <w:tblPr>
-        <w:tblStyle w:val="TableGrid"/>
-        <w:tblW w:type="auto" w:w="0"/>
-        <w:tblLook w:firstColumn="1" w:firstRow="1" w:lastColumn="0" w:lastRow="0" w:noHBand="0" w:noVBand="1" w:val="04A0"/>
-        <w:jc w:val="center"/>
-        <w:tblBorders>
-          <w:top w:val="single" w:sz="4" w:space="0" w:color="000000"/>
-          <w:left w:val="single" w:sz="4" w:space="0" w:color="000000"/>
-          <w:bottom w:val="single" w:sz="4" w:space="0" w:color="000000"/>
-          <w:right w:val="single" w:sz="4" w:space="0" w:color="000000"/>
-          <w:insideH w:val="single" w:sz="4" w:space="0" w:color="000000"/>
-          <w:insideV w:val="single" w:sz="4" w:space="0" w:color="000000"/>
-        </w:tblBorders>
-      </w:tblPr>
-      <w:tblGrid>
-        <w:gridCol w:w="1728"/>
-        <w:gridCol w:w="1728"/>
-        <w:gridCol w:w="1728"/>
-        <w:gridCol w:w="1728"/>
-        <w:gridCol w:w="1728"/>
-      </w:tblGrid>
-      <w:tr>
-        <w:tc>
-          <w:tcPr>
-            <w:tcW w:type="dxa" w:w="1728"/>
-            <w:vAlign w:val="top"/>
-          </w:tcPr>
-          <w:p>
-            <w:pPr>
-              <w:spacing w:after="40" w:before="0" w:line="240" w:lineRule="auto"/>
-            </w:pPr>
-          </w:p>
-          <w:p>
-            <w:pPr>
-              <w:spacing w:after="40" w:before="0" w:line="240" w:lineRule="auto"/>
-            </w:pPr>
-            <w:r>
-              <w:rPr>
-                <w:rFonts w:ascii="Arial" w:hAnsi="Arial" w:eastAsia="Arial"/>
-                <w:b/>
-                <w:sz w:val="15"/>
-              </w:rPr>
-              <w:t>Kalem</w:t>
-            </w:r>
-          </w:p>
-        </w:tc>
-        <w:tc>
-          <w:tcPr>
-            <w:tcW w:type="dxa" w:w="1728"/>
-            <w:vAlign w:val="top"/>
-          </w:tcPr>
-          <w:p>
-            <w:pPr>
-              <w:spacing w:after="40" w:before="0" w:line="240" w:lineRule="auto"/>
-            </w:pPr>
-          </w:p>
-          <w:p>
-            <w:pPr>
-              <w:spacing w:after="40" w:before="0" w:line="240" w:lineRule="auto"/>
-            </w:pPr>
-            <w:r>
-              <w:rPr>
-                <w:rFonts w:ascii="Arial" w:hAnsi="Arial" w:eastAsia="Arial"/>
-                <w:b/>
-                <w:sz w:val="15"/>
-              </w:rPr>
-              <w:t>Adet</w:t>
-            </w:r>
-          </w:p>
-        </w:tc>
-        <w:tc>
-          <w:tcPr>
-            <w:tcW w:type="dxa" w:w="1728"/>
-            <w:vAlign w:val="top"/>
-          </w:tcPr>
-          <w:p>
-            <w:pPr>
-              <w:spacing w:after="40" w:before="0" w:line="240" w:lineRule="auto"/>
-            </w:pPr>
-          </w:p>
-          <w:p>
-            <w:pPr>
-              <w:spacing w:after="40" w:before="0" w:line="240" w:lineRule="auto"/>
-            </w:pPr>
-            <w:r>
-              <w:rPr>
-                <w:rFonts w:ascii="Arial" w:hAnsi="Arial" w:eastAsia="Arial"/>
-                <w:b/>
-                <w:sz w:val="15"/>
-              </w:rPr>
-              <w:t>Birim (tahmini, TL)</w:t>
-            </w:r>
-          </w:p>
-        </w:tc>
-        <w:tc>
-          <w:tcPr>
-            <w:tcW w:type="dxa" w:w="1728"/>
-            <w:vAlign w:val="top"/>
-          </w:tcPr>
-          <w:p>
-            <w:pPr>
-              <w:spacing w:after="40" w:before="0" w:line="240" w:lineRule="auto"/>
-            </w:pPr>
-          </w:p>
-          <w:p>
-            <w:pPr>
-              <w:spacing w:after="40" w:before="0" w:line="240" w:lineRule="auto"/>
-            </w:pPr>
-            <w:r>
-              <w:rPr>
-                <w:rFonts w:ascii="Arial" w:hAnsi="Arial" w:eastAsia="Arial"/>
-                <w:b/>
-                <w:sz w:val="15"/>
-              </w:rPr>
-              <w:t>Toplam (TL)</w:t>
-            </w:r>
-          </w:p>
-        </w:tc>
-        <w:tc>
-          <w:tcPr>
-            <w:tcW w:type="dxa" w:w="1728"/>
-            <w:vAlign w:val="top"/>
-          </w:tcPr>
-          <w:p>
-            <w:pPr>
-              <w:spacing w:after="40" w:before="0" w:line="240" w:lineRule="auto"/>
-            </w:pPr>
-          </w:p>
-          <w:p>
-            <w:pPr>
-              <w:spacing w:after="40" w:before="0" w:line="240" w:lineRule="auto"/>
-            </w:pPr>
-            <w:r>
-              <w:rPr>
-                <w:rFonts w:ascii="Arial" w:hAnsi="Arial" w:eastAsia="Arial"/>
-                <w:b/>
-                <w:sz w:val="15"/>
-              </w:rPr>
-              <w:t>Gerekçe</w:t>
-            </w:r>
-          </w:p>
-        </w:tc>
-      </w:tr>
-      <w:tr>
-        <w:tc>
-          <w:tcPr>
-            <w:tcW w:type="dxa" w:w="1728"/>
-            <w:vAlign w:val="top"/>
-          </w:tcPr>
-          <w:p>
-            <w:pPr>
-              <w:spacing w:after="40" w:before="0" w:line="240" w:lineRule="auto"/>
-            </w:pPr>
-          </w:p>
-          <w:p>
-            <w:pPr>
-              <w:spacing w:after="40" w:before="0" w:line="240" w:lineRule="auto"/>
-            </w:pPr>
-            <w:r>
-              <w:rPr>
-                <w:rFonts w:ascii="Arial" w:hAnsi="Arial" w:eastAsia="Arial"/>
-                <w:sz w:val="15"/>
-              </w:rPr>
-              <w:t>GPU iş istasyonu (tek GPU, 16–24 GB VRAM sınıfı; çok çekirdekli CPU; 64–128 GB RAM; 1–2 TB NVMe)</w:t>
-            </w:r>
-          </w:p>
-        </w:tc>
-        <w:tc>
-          <w:tcPr>
-            <w:tcW w:type="dxa" w:w="1728"/>
-            <w:vAlign w:val="top"/>
-          </w:tcPr>
-          <w:p>
-            <w:pPr>
-              <w:spacing w:after="40" w:before="0" w:line="240" w:lineRule="auto"/>
-            </w:pPr>
-          </w:p>
-          <w:p>
-            <w:pPr>
-              <w:spacing w:after="40" w:before="0" w:line="240" w:lineRule="auto"/>
-            </w:pPr>
-            <w:r>
-              <w:rPr>
-                <w:rFonts w:ascii="Arial" w:hAnsi="Arial" w:eastAsia="Arial"/>
-                <w:sz w:val="15"/>
-              </w:rPr>
-              <w:t>1</w:t>
-            </w:r>
-          </w:p>
-        </w:tc>
-        <w:tc>
-          <w:tcPr>
-            <w:tcW w:type="dxa" w:w="1728"/>
-            <w:vAlign w:val="top"/>
-          </w:tcPr>
-          <w:p>
-            <w:pPr>
-              <w:spacing w:after="40" w:before="0" w:line="240" w:lineRule="auto"/>
-            </w:pPr>
-          </w:p>
-          <w:p>
-            <w:pPr>
-              <w:spacing w:after="40" w:before="0" w:line="240" w:lineRule="auto"/>
-            </w:pPr>
-            <w:r>
-              <w:rPr>
-                <w:rFonts w:ascii="Arial" w:hAnsi="Arial" w:eastAsia="Arial"/>
-                <w:sz w:val="15"/>
-              </w:rPr>
-              <w:t>170.000</w:t>
-            </w:r>
-          </w:p>
-        </w:tc>
-        <w:tc>
-          <w:tcPr>
-            <w:tcW w:type="dxa" w:w="1728"/>
-            <w:vAlign w:val="top"/>
-          </w:tcPr>
-          <w:p>
-            <w:pPr>
-              <w:spacing w:after="40" w:before="0" w:line="240" w:lineRule="auto"/>
-            </w:pPr>
-          </w:p>
-          <w:p>
-            <w:pPr>
-              <w:spacing w:after="40" w:before="0" w:line="240" w:lineRule="auto"/>
-            </w:pPr>
-            <w:r>
-              <w:rPr>
-                <w:rFonts w:ascii="Arial" w:hAnsi="Arial" w:eastAsia="Arial"/>
-                <w:sz w:val="15"/>
-              </w:rPr>
-              <w:t>170.000</w:t>
-            </w:r>
-          </w:p>
-        </w:tc>
-        <w:tc>
-          <w:tcPr>
-            <w:tcW w:type="dxa" w:w="1728"/>
-            <w:vAlign w:val="top"/>
-          </w:tcPr>
-          <w:p>
-            <w:pPr>
-              <w:spacing w:after="40" w:before="0" w:line="240" w:lineRule="auto"/>
-            </w:pPr>
-          </w:p>
-          <w:p>
-            <w:pPr>
-              <w:spacing w:after="40" w:before="0" w:line="240" w:lineRule="auto"/>
-            </w:pPr>
-            <w:r>
-              <w:rPr>
-                <w:rFonts w:ascii="Arial" w:hAnsi="Arial" w:eastAsia="Arial"/>
-                <w:sz w:val="15"/>
-              </w:rPr>
-              <w:t>L3 ağırlıkları açık modellerin geliştirme/testi, çıkarım servisleri, Öğrenilmiş Yönlendirici eğitimi ve PEFT/LoRA-QLoRA ölçeğinde yerel ince ayar. Büyük ölçekli ince ayar ve kapsamlı kıyaslama için TRUBA tahsisine başvurulur; tahsis gecikirse kapsam PEFT ölçeğinde tutulur ve gerekirse kısa süreli bulut GPU ile desteklenir.</w:t>
-            </w:r>
-          </w:p>
-        </w:tc>
-      </w:tr>
-      <w:tr>
-        <w:tc>
-          <w:tcPr>
-            <w:tcW w:type="dxa" w:w="1728"/>
-            <w:vAlign w:val="top"/>
-          </w:tcPr>
-          <w:p>
-            <w:pPr>
-              <w:spacing w:after="40" w:before="0" w:line="240" w:lineRule="auto"/>
-            </w:pPr>
-          </w:p>
-          <w:p>
-            <w:pPr>
-              <w:spacing w:after="40" w:before="0" w:line="240" w:lineRule="auto"/>
-            </w:pPr>
-            <w:r>
-              <w:rPr>
-                <w:rFonts w:ascii="Arial" w:hAnsi="Arial" w:eastAsia="Arial"/>
-                <w:sz w:val="15"/>
-              </w:rPr>
-              <w:t>NAS depolama + diskler (yedekli, ~8–12 TB ham)</w:t>
-            </w:r>
-          </w:p>
-        </w:tc>
-        <w:tc>
-          <w:tcPr>
-            <w:tcW w:type="dxa" w:w="1728"/>
-            <w:vAlign w:val="top"/>
-          </w:tcPr>
-          <w:p>
-            <w:pPr>
-              <w:spacing w:after="40" w:before="0" w:line="240" w:lineRule="auto"/>
-            </w:pPr>
-          </w:p>
-          <w:p>
-            <w:pPr>
-              <w:spacing w:after="40" w:before="0" w:line="240" w:lineRule="auto"/>
-            </w:pPr>
-            <w:r>
-              <w:rPr>
-                <w:rFonts w:ascii="Arial" w:hAnsi="Arial" w:eastAsia="Arial"/>
-                <w:sz w:val="15"/>
-              </w:rPr>
-              <w:t>1</w:t>
-            </w:r>
-          </w:p>
-        </w:tc>
-        <w:tc>
-          <w:tcPr>
-            <w:tcW w:type="dxa" w:w="1728"/>
-            <w:vAlign w:val="top"/>
-          </w:tcPr>
-          <w:p>
-            <w:pPr>
-              <w:spacing w:after="40" w:before="0" w:line="240" w:lineRule="auto"/>
-            </w:pPr>
-          </w:p>
-          <w:p>
-            <w:pPr>
-              <w:spacing w:after="40" w:before="0" w:line="240" w:lineRule="auto"/>
-            </w:pPr>
-            <w:r>
-              <w:rPr>
-                <w:rFonts w:ascii="Arial" w:hAnsi="Arial" w:eastAsia="Arial"/>
-                <w:sz w:val="15"/>
-              </w:rPr>
-              <w:t>55.000</w:t>
-            </w:r>
-          </w:p>
-        </w:tc>
-        <w:tc>
-          <w:tcPr>
-            <w:tcW w:type="dxa" w:w="1728"/>
-            <w:vAlign w:val="top"/>
-          </w:tcPr>
-          <w:p>
-            <w:pPr>
-              <w:spacing w:after="40" w:before="0" w:line="240" w:lineRule="auto"/>
-            </w:pPr>
-          </w:p>
-          <w:p>
-            <w:pPr>
-              <w:spacing w:after="40" w:before="0" w:line="240" w:lineRule="auto"/>
-            </w:pPr>
-            <w:r>
-              <w:rPr>
-                <w:rFonts w:ascii="Arial" w:hAnsi="Arial" w:eastAsia="Arial"/>
-                <w:sz w:val="15"/>
-              </w:rPr>
-              <w:t>55.000</w:t>
-            </w:r>
-          </w:p>
-        </w:tc>
-        <w:tc>
-          <w:tcPr>
-            <w:tcW w:type="dxa" w:w="1728"/>
-            <w:vAlign w:val="top"/>
-          </w:tcPr>
-          <w:p>
-            <w:pPr>
-              <w:spacing w:after="40" w:before="0" w:line="240" w:lineRule="auto"/>
-            </w:pPr>
-          </w:p>
-          <w:p>
-            <w:pPr>
-              <w:spacing w:after="40" w:before="0" w:line="240" w:lineRule="auto"/>
-            </w:pPr>
-            <w:r>
-              <w:rPr>
-                <w:rFonts w:ascii="Arial" w:hAnsi="Arial" w:eastAsia="Arial"/>
-                <w:sz w:val="15"/>
-              </w:rPr>
-              <w:t>Birincil veri tabanı, PDF/tam metin önbelleği, model kontrol noktaları ve yedekleme.</w:t>
-            </w:r>
-          </w:p>
-        </w:tc>
-      </w:tr>
-      <w:tr>
-        <w:tc>
-          <w:tcPr>
-            <w:tcW w:type="dxa" w:w="1728"/>
-            <w:vAlign w:val="top"/>
-          </w:tcPr>
-          <w:p>
-            <w:pPr>
-              <w:spacing w:after="40" w:before="0" w:line="240" w:lineRule="auto"/>
-            </w:pPr>
-          </w:p>
-          <w:p>
-            <w:pPr>
-              <w:spacing w:after="40" w:before="0" w:line="240" w:lineRule="auto"/>
-            </w:pPr>
-            <w:r>
-              <w:rPr>
-                <w:rFonts w:ascii="Arial" w:hAnsi="Arial" w:eastAsia="Arial"/>
-                <w:sz w:val="15"/>
-              </w:rPr>
-              <w:t>Kesintisiz güç kaynağı (KGK) + ağ donanımı</w:t>
-            </w:r>
-          </w:p>
-        </w:tc>
-        <w:tc>
-          <w:tcPr>
-            <w:tcW w:type="dxa" w:w="1728"/>
-            <w:vAlign w:val="top"/>
-          </w:tcPr>
-          <w:p>
-            <w:pPr>
-              <w:spacing w:after="40" w:before="0" w:line="240" w:lineRule="auto"/>
-            </w:pPr>
-          </w:p>
-          <w:p>
-            <w:pPr>
-              <w:spacing w:after="40" w:before="0" w:line="240" w:lineRule="auto"/>
-            </w:pPr>
-            <w:r>
-              <w:rPr>
-                <w:rFonts w:ascii="Arial" w:hAnsi="Arial" w:eastAsia="Arial"/>
-                <w:sz w:val="15"/>
-              </w:rPr>
-              <w:t>1</w:t>
-            </w:r>
-          </w:p>
-        </w:tc>
-        <w:tc>
-          <w:tcPr>
-            <w:tcW w:type="dxa" w:w="1728"/>
-            <w:vAlign w:val="top"/>
-          </w:tcPr>
-          <w:p>
-            <w:pPr>
-              <w:spacing w:after="40" w:before="0" w:line="240" w:lineRule="auto"/>
-            </w:pPr>
-          </w:p>
-          <w:p>
-            <w:pPr>
-              <w:spacing w:after="40" w:before="0" w:line="240" w:lineRule="auto"/>
-            </w:pPr>
-            <w:r>
-              <w:rPr>
-                <w:rFonts w:ascii="Arial" w:hAnsi="Arial" w:eastAsia="Arial"/>
-                <w:sz w:val="15"/>
-              </w:rPr>
-              <w:t>17.000</w:t>
-            </w:r>
-          </w:p>
-        </w:tc>
-        <w:tc>
-          <w:tcPr>
-            <w:tcW w:type="dxa" w:w="1728"/>
-            <w:vAlign w:val="top"/>
-          </w:tcPr>
-          <w:p>
-            <w:pPr>
-              <w:spacing w:after="40" w:before="0" w:line="240" w:lineRule="auto"/>
-            </w:pPr>
-          </w:p>
-          <w:p>
-            <w:pPr>
-              <w:spacing w:after="40" w:before="0" w:line="240" w:lineRule="auto"/>
-            </w:pPr>
-            <w:r>
-              <w:rPr>
-                <w:rFonts w:ascii="Arial" w:hAnsi="Arial" w:eastAsia="Arial"/>
-                <w:sz w:val="15"/>
-              </w:rPr>
-              <w:t>17.000</w:t>
-            </w:r>
-          </w:p>
-        </w:tc>
-        <w:tc>
-          <w:tcPr>
-            <w:tcW w:type="dxa" w:w="1728"/>
-            <w:vAlign w:val="top"/>
-          </w:tcPr>
-          <w:p>
-            <w:pPr>
-              <w:spacing w:after="40" w:before="0" w:line="240" w:lineRule="auto"/>
-            </w:pPr>
-          </w:p>
-          <w:p>
-            <w:pPr>
-              <w:spacing w:after="40" w:before="0" w:line="240" w:lineRule="auto"/>
-            </w:pPr>
-            <w:r>
-              <w:rPr>
-                <w:rFonts w:ascii="Arial" w:hAnsi="Arial" w:eastAsia="Arial"/>
-                <w:sz w:val="15"/>
-              </w:rPr>
-              <w:t>Kesintisiz operasyon ve veri bütünlüğü.</w:t>
-            </w:r>
-          </w:p>
-        </w:tc>
-      </w:tr>
-      <w:tr>
-        <w:tc>
-          <w:tcPr>
-            <w:tcW w:type="dxa" w:w="1728"/>
-            <w:vAlign w:val="top"/>
-          </w:tcPr>
-          <w:p>
-            <w:pPr>
-              <w:spacing w:after="40" w:before="0" w:line="240" w:lineRule="auto"/>
-            </w:pPr>
-          </w:p>
-          <w:p>
-            <w:pPr>
-              <w:spacing w:after="40" w:before="0" w:line="240" w:lineRule="auto"/>
-            </w:pPr>
-            <w:r>
-              <w:rPr>
-                <w:rFonts w:ascii="Arial" w:hAnsi="Arial" w:eastAsia="Arial"/>
-                <w:b/>
-                <w:sz w:val="15"/>
-              </w:rPr>
-              <w:t>Ara toplam</w:t>
-            </w:r>
-          </w:p>
-        </w:tc>
-        <w:tc>
-          <w:tcPr>
-            <w:tcW w:type="dxa" w:w="1728"/>
-            <w:vAlign w:val="top"/>
-          </w:tcPr>
-          <w:p>
-            <w:pPr>
-              <w:spacing w:after="40" w:before="0" w:line="240" w:lineRule="auto"/>
-            </w:pPr>
-          </w:p>
-        </w:tc>
-        <w:tc>
-          <w:tcPr>
-            <w:tcW w:type="dxa" w:w="1728"/>
-            <w:vAlign w:val="top"/>
-          </w:tcPr>
-          <w:p>
-            <w:pPr>
-              <w:spacing w:after="40" w:before="0" w:line="240" w:lineRule="auto"/>
-            </w:pPr>
-          </w:p>
-        </w:tc>
-        <w:tc>
-          <w:tcPr>
-            <w:tcW w:type="dxa" w:w="1728"/>
-            <w:vAlign w:val="top"/>
-          </w:tcPr>
-          <w:p>
-            <w:pPr>
-              <w:spacing w:after="40" w:before="0" w:line="240" w:lineRule="auto"/>
-            </w:pPr>
-          </w:p>
-          <w:p>
-            <w:pPr>
-              <w:spacing w:after="40" w:before="0" w:line="240" w:lineRule="auto"/>
-            </w:pPr>
-            <w:r>
-              <w:rPr>
-                <w:rFonts w:ascii="Arial" w:hAnsi="Arial" w:eastAsia="Arial"/>
-                <w:b/>
-                <w:sz w:val="15"/>
-              </w:rPr>
-              <w:t>242.000</w:t>
-            </w:r>
-          </w:p>
-        </w:tc>
-        <w:tc>
-          <w:tcPr>
-            <w:tcW w:type="dxa" w:w="1728"/>
-            <w:vAlign w:val="top"/>
-          </w:tcPr>
-          <w:p>
-            <w:pPr>
-              <w:spacing w:after="40" w:before="0" w:line="240" w:lineRule="auto"/>
-            </w:pPr>
-          </w:p>
-        </w:tc>
-      </w:tr>
-    </w:tbl>
-    <w:p/>
-    <w:p>
-      <w:pPr>
-        <w:spacing w:after="60" w:before="0" w:line="240" w:lineRule="auto"/>
-      </w:pPr>
-      <w:r>
-        <w:rPr>
-          <w:rFonts w:ascii="Arial" w:hAnsi="Arial" w:eastAsia="Arial"/>
-          <w:b/>
-          <w:sz w:val="18"/>
-        </w:rPr>
-        <w:t>Gerekçe:</w:t>
-      </w:r>
-      <w:r>
-        <w:rPr>
-          <w:rFonts w:ascii="Arial" w:hAnsi="Arial" w:eastAsia="Arial"/>
-          <w:sz w:val="18"/>
-        </w:rPr>
-        <w:t xml:space="preserve"> "Yeni ürün/yöntem" odaklı bu projede donanım, mevcut prototipi tamamlayacak ölçüde sınırlı tutulmuştur. Hesaplama yoğun eğitim işleri için proje kabulünden sonra TRUBA (TÜBİTAK ULAKBİM) uygunluk ve kaynak tahsisi başvurusu yapılacak; satın alınacak GPU iş istasyonu ise geliştirme, çıkarım servisi, PEFT ölçeğinde ince ayar ve TRUBA tahsisinin gecikmesi durumunda yerel olarak yürütülebilecek işler için B planı olarak kullanılacaktır. Bu yaklaşım, makine-teçhizatın toplam bütçeyle dengeli olması kuralıyla doğrudan uyumludur.</w:t>
-      </w:r>
-    </w:p>
-    <w:p>
-      <w:pPr>
-        <w:spacing w:after="60" w:before="0" w:line="240" w:lineRule="auto"/>
-      </w:pPr>
-      <w:r>
-        <w:rPr>
-          <w:rFonts w:ascii="Arial" w:hAnsi="Arial" w:eastAsia="Arial"/>
-          <w:b/>
-          <w:sz w:val="19"/>
-        </w:rPr>
-        <w:t>4. Hizmet Alımı — 60.000 TL</w:t>
-      </w:r>
-    </w:p>
-    <w:tbl>
-      <w:tblPr>
-        <w:tblStyle w:val="TableGrid"/>
-        <w:tblW w:type="auto" w:w="0"/>
-        <w:tblLook w:firstColumn="1" w:firstRow="1" w:lastColumn="0" w:lastRow="0" w:noHBand="0" w:noVBand="1" w:val="04A0"/>
-        <w:jc w:val="center"/>
-        <w:tblBorders>
-          <w:top w:val="single" w:sz="4" w:space="0" w:color="000000"/>
-          <w:left w:val="single" w:sz="4" w:space="0" w:color="000000"/>
-          <w:bottom w:val="single" w:sz="4" w:space="0" w:color="000000"/>
-          <w:right w:val="single" w:sz="4" w:space="0" w:color="000000"/>
-          <w:insideH w:val="single" w:sz="4" w:space="0" w:color="000000"/>
-          <w:insideV w:val="single" w:sz="4" w:space="0" w:color="000000"/>
-        </w:tblBorders>
-      </w:tblPr>
-      <w:tblGrid>
-        <w:gridCol w:w="2880"/>
-        <w:gridCol w:w="2880"/>
-        <w:gridCol w:w="2880"/>
-      </w:tblGrid>
-      <w:tr>
-        <w:tc>
-          <w:tcPr>
-            <w:tcW w:type="dxa" w:w="2880"/>
-            <w:vAlign w:val="top"/>
-          </w:tcPr>
-          <w:p>
-            <w:pPr>
-              <w:spacing w:after="40" w:before="0" w:line="240" w:lineRule="auto"/>
-            </w:pPr>
-          </w:p>
-          <w:p>
-            <w:pPr>
-              <w:spacing w:after="40" w:before="0" w:line="240" w:lineRule="auto"/>
-            </w:pPr>
-            <w:r>
-              <w:rPr>
-                <w:rFonts w:ascii="Arial" w:hAnsi="Arial" w:eastAsia="Arial"/>
-                <w:b/>
-                <w:sz w:val="15"/>
-              </w:rPr>
-              <w:t>Kalem</w:t>
-            </w:r>
-          </w:p>
-        </w:tc>
-        <w:tc>
-          <w:tcPr>
-            <w:tcW w:type="dxa" w:w="2880"/>
-            <w:vAlign w:val="top"/>
-          </w:tcPr>
-          <w:p>
-            <w:pPr>
-              <w:spacing w:after="40" w:before="0" w:line="240" w:lineRule="auto"/>
-            </w:pPr>
-          </w:p>
-          <w:p>
-            <w:pPr>
-              <w:spacing w:after="40" w:before="0" w:line="240" w:lineRule="auto"/>
-            </w:pPr>
-            <w:r>
-              <w:rPr>
-                <w:rFonts w:ascii="Arial" w:hAnsi="Arial" w:eastAsia="Arial"/>
-                <w:b/>
-                <w:sz w:val="15"/>
-              </w:rPr>
-              <w:t>Tutar (TL)</w:t>
-            </w:r>
-          </w:p>
-        </w:tc>
-        <w:tc>
-          <w:tcPr>
-            <w:tcW w:type="dxa" w:w="2880"/>
-            <w:vAlign w:val="top"/>
-          </w:tcPr>
-          <w:p>
-            <w:pPr>
-              <w:spacing w:after="40" w:before="0" w:line="240" w:lineRule="auto"/>
-            </w:pPr>
-          </w:p>
-          <w:p>
-            <w:pPr>
-              <w:spacing w:after="40" w:before="0" w:line="240" w:lineRule="auto"/>
-            </w:pPr>
-            <w:r>
-              <w:rPr>
-                <w:rFonts w:ascii="Arial" w:hAnsi="Arial" w:eastAsia="Arial"/>
-                <w:b/>
-                <w:sz w:val="15"/>
-              </w:rPr>
-              <w:t>Gerekçe</w:t>
-            </w:r>
-          </w:p>
-        </w:tc>
-      </w:tr>
-      <w:tr>
-        <w:tc>
-          <w:tcPr>
-            <w:tcW w:type="dxa" w:w="2880"/>
-            <w:vAlign w:val="top"/>
-          </w:tcPr>
-          <w:p>
-            <w:pPr>
-              <w:spacing w:after="40" w:before="0" w:line="240" w:lineRule="auto"/>
-            </w:pPr>
-          </w:p>
-          <w:p>
-            <w:pPr>
-              <w:spacing w:after="40" w:before="0" w:line="240" w:lineRule="auto"/>
-            </w:pPr>
-            <w:r>
-              <w:rPr>
-                <w:rFonts w:ascii="Arial" w:hAnsi="Arial" w:eastAsia="Arial"/>
-                <w:sz w:val="15"/>
-              </w:rPr>
-              <w:t>Ticari LLM API kullanımı (L4 yükseltme + kıyaslama)</w:t>
-            </w:r>
-          </w:p>
-        </w:tc>
-        <w:tc>
-          <w:tcPr>
-            <w:tcW w:type="dxa" w:w="2880"/>
-            <w:vAlign w:val="top"/>
-          </w:tcPr>
-          <w:p>
-            <w:pPr>
-              <w:spacing w:after="40" w:before="0" w:line="240" w:lineRule="auto"/>
-            </w:pPr>
-          </w:p>
-          <w:p>
-            <w:pPr>
-              <w:spacing w:after="40" w:before="0" w:line="240" w:lineRule="auto"/>
-            </w:pPr>
-            <w:r>
-              <w:rPr>
-                <w:rFonts w:ascii="Arial" w:hAnsi="Arial" w:eastAsia="Arial"/>
-                <w:sz w:val="15"/>
-              </w:rPr>
-              <w:t>35.000</w:t>
-            </w:r>
-          </w:p>
-        </w:tc>
-        <w:tc>
-          <w:tcPr>
-            <w:tcW w:type="dxa" w:w="2880"/>
-            <w:vAlign w:val="top"/>
-          </w:tcPr>
-          <w:p>
-            <w:pPr>
-              <w:spacing w:after="40" w:before="0" w:line="240" w:lineRule="auto"/>
-            </w:pPr>
-          </w:p>
-          <w:p>
-            <w:pPr>
-              <w:spacing w:after="40" w:before="0" w:line="240" w:lineRule="auto"/>
-            </w:pPr>
-            <w:r>
-              <w:rPr>
-                <w:rFonts w:ascii="Arial" w:hAnsi="Arial" w:eastAsia="Arial"/>
-                <w:sz w:val="15"/>
-              </w:rPr>
-              <w:t>Maliyet-kalite kıyaslaması ve yalnızca başarısız alt görevlerde L4 katmanı için sınırlı ticari API çağrıları.</w:t>
-            </w:r>
-          </w:p>
-        </w:tc>
-      </w:tr>
-      <w:tr>
-        <w:tc>
-          <w:tcPr>
-            <w:tcW w:type="dxa" w:w="2880"/>
-            <w:vAlign w:val="top"/>
-          </w:tcPr>
-          <w:p>
-            <w:pPr>
-              <w:spacing w:after="40" w:before="0" w:line="240" w:lineRule="auto"/>
-            </w:pPr>
-          </w:p>
-          <w:p>
-            <w:pPr>
-              <w:spacing w:after="40" w:before="0" w:line="240" w:lineRule="auto"/>
-            </w:pPr>
-            <w:r>
-              <w:rPr>
-                <w:rFonts w:ascii="Arial" w:hAnsi="Arial" w:eastAsia="Arial"/>
-                <w:sz w:val="15"/>
-              </w:rPr>
-              <w:t>Bulut yedekleme / dağıtım</w:t>
-            </w:r>
-          </w:p>
-        </w:tc>
-        <w:tc>
-          <w:tcPr>
-            <w:tcW w:type="dxa" w:w="2880"/>
-            <w:vAlign w:val="top"/>
-          </w:tcPr>
-          <w:p>
-            <w:pPr>
-              <w:spacing w:after="40" w:before="0" w:line="240" w:lineRule="auto"/>
-            </w:pPr>
-          </w:p>
-          <w:p>
-            <w:pPr>
-              <w:spacing w:after="40" w:before="0" w:line="240" w:lineRule="auto"/>
-            </w:pPr>
-            <w:r>
-              <w:rPr>
-                <w:rFonts w:ascii="Arial" w:hAnsi="Arial" w:eastAsia="Arial"/>
-                <w:sz w:val="15"/>
-              </w:rPr>
-              <w:t>10.000</w:t>
-            </w:r>
-          </w:p>
-        </w:tc>
-        <w:tc>
-          <w:tcPr>
-            <w:tcW w:type="dxa" w:w="2880"/>
-            <w:vAlign w:val="top"/>
-          </w:tcPr>
-          <w:p>
-            <w:pPr>
-              <w:spacing w:after="40" w:before="0" w:line="240" w:lineRule="auto"/>
-            </w:pPr>
-          </w:p>
-          <w:p>
-            <w:pPr>
-              <w:spacing w:after="40" w:before="0" w:line="240" w:lineRule="auto"/>
-            </w:pPr>
-            <w:r>
-              <w:rPr>
-                <w:rFonts w:ascii="Arial" w:hAnsi="Arial" w:eastAsia="Arial"/>
-                <w:sz w:val="15"/>
-              </w:rPr>
-              <w:t>Felaket kurtarma, yedekleme ve API dağıtım esnekliği.</w:t>
-            </w:r>
-          </w:p>
-        </w:tc>
-      </w:tr>
-      <w:tr>
-        <w:tc>
-          <w:tcPr>
-            <w:tcW w:type="dxa" w:w="2880"/>
-            <w:vAlign w:val="top"/>
-          </w:tcPr>
-          <w:p>
-            <w:pPr>
-              <w:spacing w:after="40" w:before="0" w:line="240" w:lineRule="auto"/>
-            </w:pPr>
-          </w:p>
-          <w:p>
-            <w:pPr>
-              <w:spacing w:after="40" w:before="0" w:line="240" w:lineRule="auto"/>
-            </w:pPr>
-            <w:r>
-              <w:rPr>
-                <w:rFonts w:ascii="Arial" w:hAnsi="Arial" w:eastAsia="Arial"/>
-                <w:sz w:val="15"/>
-              </w:rPr>
-              <w:t>TTO patent taraması güncelleme + akademik redaksiyon/çeviri</w:t>
-            </w:r>
-          </w:p>
-        </w:tc>
-        <w:tc>
-          <w:tcPr>
-            <w:tcW w:type="dxa" w:w="2880"/>
-            <w:vAlign w:val="top"/>
-          </w:tcPr>
-          <w:p>
-            <w:pPr>
-              <w:spacing w:after="40" w:before="0" w:line="240" w:lineRule="auto"/>
-            </w:pPr>
-          </w:p>
-          <w:p>
-            <w:pPr>
-              <w:spacing w:after="40" w:before="0" w:line="240" w:lineRule="auto"/>
-            </w:pPr>
-            <w:r>
-              <w:rPr>
-                <w:rFonts w:ascii="Arial" w:hAnsi="Arial" w:eastAsia="Arial"/>
-                <w:sz w:val="15"/>
-              </w:rPr>
-              <w:t>15.000</w:t>
-            </w:r>
-          </w:p>
-        </w:tc>
-        <w:tc>
-          <w:tcPr>
-            <w:tcW w:type="dxa" w:w="2880"/>
-            <w:vAlign w:val="top"/>
-          </w:tcPr>
-          <w:p>
-            <w:pPr>
-              <w:spacing w:after="40" w:before="0" w:line="240" w:lineRule="auto"/>
-            </w:pPr>
-          </w:p>
-          <w:p>
-            <w:pPr>
-              <w:spacing w:after="40" w:before="0" w:line="240" w:lineRule="auto"/>
-            </w:pPr>
-            <w:r>
-              <w:rPr>
-                <w:rFonts w:ascii="Arial" w:hAnsi="Arial" w:eastAsia="Arial"/>
-                <w:sz w:val="15"/>
-              </w:rPr>
-              <w:t>Patent ön taramasının ürünleşme aşamasında güncellenmesi ve yayın redaksiyonu.</w:t>
-            </w:r>
-          </w:p>
-        </w:tc>
-      </w:tr>
-      <w:tr>
-        <w:tc>
-          <w:tcPr>
-            <w:tcW w:type="dxa" w:w="2880"/>
-            <w:vAlign w:val="top"/>
-          </w:tcPr>
-          <w:p>
-            <w:pPr>
-              <w:spacing w:after="40" w:before="0" w:line="240" w:lineRule="auto"/>
-            </w:pPr>
-          </w:p>
-          <w:p>
-            <w:pPr>
-              <w:spacing w:after="40" w:before="0" w:line="240" w:lineRule="auto"/>
-            </w:pPr>
-            <w:r>
-              <w:rPr>
-                <w:rFonts w:ascii="Arial" w:hAnsi="Arial" w:eastAsia="Arial"/>
-                <w:b/>
-                <w:sz w:val="15"/>
-              </w:rPr>
-              <w:t>Ara toplam</w:t>
-            </w:r>
-          </w:p>
-        </w:tc>
-        <w:tc>
-          <w:tcPr>
-            <w:tcW w:type="dxa" w:w="2880"/>
-            <w:vAlign w:val="top"/>
-          </w:tcPr>
-          <w:p>
-            <w:pPr>
-              <w:spacing w:after="40" w:before="0" w:line="240" w:lineRule="auto"/>
-            </w:pPr>
-          </w:p>
-          <w:p>
-            <w:pPr>
-              <w:spacing w:after="40" w:before="0" w:line="240" w:lineRule="auto"/>
-            </w:pPr>
-            <w:r>
-              <w:rPr>
-                <w:rFonts w:ascii="Arial" w:hAnsi="Arial" w:eastAsia="Arial"/>
-                <w:b/>
-                <w:sz w:val="15"/>
-              </w:rPr>
-              <w:t>60.000</w:t>
-            </w:r>
-          </w:p>
-        </w:tc>
-        <w:tc>
-          <w:tcPr>
-            <w:tcW w:type="dxa" w:w="2880"/>
-            <w:vAlign w:val="top"/>
-          </w:tcPr>
-          <w:p>
-            <w:pPr>
-              <w:spacing w:after="40" w:before="0" w:line="240" w:lineRule="auto"/>
-            </w:pPr>
-          </w:p>
-        </w:tc>
-      </w:tr>
-    </w:tbl>
-    <w:p/>
-    <w:p>
-      <w:pPr>
-        <w:spacing w:after="60" w:before="0" w:line="240" w:lineRule="auto"/>
-      </w:pPr>
-      <w:r>
-        <w:rPr>
-          <w:rFonts w:ascii="Arial" w:hAnsi="Arial" w:eastAsia="Arial"/>
-          <w:b/>
-          <w:sz w:val="19"/>
-        </w:rPr>
-        <w:t>5. Sarf Malzemesi — 25.000 TL</w:t>
-      </w:r>
-    </w:p>
-    <w:tbl>
-      <w:tblPr>
-        <w:tblStyle w:val="TableGrid"/>
-        <w:tblW w:type="auto" w:w="0"/>
-        <w:tblLook w:firstColumn="1" w:firstRow="1" w:lastColumn="0" w:lastRow="0" w:noHBand="0" w:noVBand="1" w:val="04A0"/>
-        <w:jc w:val="center"/>
-        <w:tblBorders>
-          <w:top w:val="single" w:sz="4" w:space="0" w:color="000000"/>
-          <w:left w:val="single" w:sz="4" w:space="0" w:color="000000"/>
-          <w:bottom w:val="single" w:sz="4" w:space="0" w:color="000000"/>
-          <w:right w:val="single" w:sz="4" w:space="0" w:color="000000"/>
-          <w:insideH w:val="single" w:sz="4" w:space="0" w:color="000000"/>
-          <w:insideV w:val="single" w:sz="4" w:space="0" w:color="000000"/>
-        </w:tblBorders>
-      </w:tblPr>
-      <w:tblGrid>
-        <w:gridCol w:w="2880"/>
-        <w:gridCol w:w="2880"/>
-        <w:gridCol w:w="2880"/>
-      </w:tblGrid>
-      <w:tr>
-        <w:tc>
-          <w:tcPr>
-            <w:tcW w:type="dxa" w:w="2880"/>
-            <w:vAlign w:val="top"/>
-          </w:tcPr>
-          <w:p>
-            <w:pPr>
-              <w:spacing w:after="40" w:before="0" w:line="240" w:lineRule="auto"/>
-            </w:pPr>
-          </w:p>
-          <w:p>
-            <w:pPr>
-              <w:spacing w:after="40" w:before="0" w:line="240" w:lineRule="auto"/>
-            </w:pPr>
-            <w:r>
-              <w:rPr>
-                <w:rFonts w:ascii="Arial" w:hAnsi="Arial" w:eastAsia="Arial"/>
-                <w:b/>
-                <w:sz w:val="15"/>
-              </w:rPr>
-              <w:t>Kalem</w:t>
-            </w:r>
-          </w:p>
-        </w:tc>
-        <w:tc>
-          <w:tcPr>
-            <w:tcW w:type="dxa" w:w="2880"/>
-            <w:vAlign w:val="top"/>
-          </w:tcPr>
-          <w:p>
-            <w:pPr>
-              <w:spacing w:after="40" w:before="0" w:line="240" w:lineRule="auto"/>
-            </w:pPr>
-          </w:p>
-          <w:p>
-            <w:pPr>
-              <w:spacing w:after="40" w:before="0" w:line="240" w:lineRule="auto"/>
-            </w:pPr>
-            <w:r>
-              <w:rPr>
-                <w:rFonts w:ascii="Arial" w:hAnsi="Arial" w:eastAsia="Arial"/>
-                <w:b/>
-                <w:sz w:val="15"/>
-              </w:rPr>
-              <w:t>Tutar (TL)</w:t>
-            </w:r>
-          </w:p>
-        </w:tc>
-        <w:tc>
-          <w:tcPr>
-            <w:tcW w:type="dxa" w:w="2880"/>
-            <w:vAlign w:val="top"/>
-          </w:tcPr>
-          <w:p>
-            <w:pPr>
-              <w:spacing w:after="40" w:before="0" w:line="240" w:lineRule="auto"/>
-            </w:pPr>
-          </w:p>
-          <w:p>
-            <w:pPr>
-              <w:spacing w:after="40" w:before="0" w:line="240" w:lineRule="auto"/>
-            </w:pPr>
-            <w:r>
-              <w:rPr>
-                <w:rFonts w:ascii="Arial" w:hAnsi="Arial" w:eastAsia="Arial"/>
-                <w:b/>
-                <w:sz w:val="15"/>
-              </w:rPr>
-              <w:t>Gerekçe</w:t>
-            </w:r>
-          </w:p>
-        </w:tc>
-      </w:tr>
-      <w:tr>
-        <w:tc>
-          <w:tcPr>
-            <w:tcW w:type="dxa" w:w="2880"/>
-            <w:vAlign w:val="top"/>
-          </w:tcPr>
-          <w:p>
-            <w:pPr>
-              <w:spacing w:after="40" w:before="0" w:line="240" w:lineRule="auto"/>
-            </w:pPr>
-          </w:p>
-          <w:p>
-            <w:pPr>
-              <w:spacing w:after="40" w:before="0" w:line="240" w:lineRule="auto"/>
-            </w:pPr>
-            <w:r>
-              <w:rPr>
-                <w:rFonts w:ascii="Arial" w:hAnsi="Arial" w:eastAsia="Arial"/>
-                <w:sz w:val="15"/>
-              </w:rPr>
-              <w:t>SSD/HDD yedekleri, bileşenler, kablolar ve küçük donanım</w:t>
-            </w:r>
-          </w:p>
-        </w:tc>
-        <w:tc>
-          <w:tcPr>
-            <w:tcW w:type="dxa" w:w="2880"/>
-            <w:vAlign w:val="top"/>
-          </w:tcPr>
-          <w:p>
-            <w:pPr>
-              <w:spacing w:after="40" w:before="0" w:line="240" w:lineRule="auto"/>
-            </w:pPr>
-          </w:p>
-          <w:p>
-            <w:pPr>
-              <w:spacing w:after="40" w:before="0" w:line="240" w:lineRule="auto"/>
-            </w:pPr>
-            <w:r>
-              <w:rPr>
-                <w:rFonts w:ascii="Arial" w:hAnsi="Arial" w:eastAsia="Arial"/>
-                <w:sz w:val="15"/>
-              </w:rPr>
-              <w:t>25.000</w:t>
-            </w:r>
-          </w:p>
-        </w:tc>
-        <w:tc>
-          <w:tcPr>
-            <w:tcW w:type="dxa" w:w="2880"/>
-            <w:vAlign w:val="top"/>
-          </w:tcPr>
-          <w:p>
-            <w:pPr>
-              <w:spacing w:after="40" w:before="0" w:line="240" w:lineRule="auto"/>
-            </w:pPr>
-          </w:p>
-          <w:p>
-            <w:pPr>
-              <w:spacing w:after="40" w:before="0" w:line="240" w:lineRule="auto"/>
-            </w:pPr>
-            <w:r>
-              <w:rPr>
-                <w:rFonts w:ascii="Arial" w:hAnsi="Arial" w:eastAsia="Arial"/>
-                <w:sz w:val="15"/>
-              </w:rPr>
-              <w:t>Depolama genişletme, yedek parça ve laboratuvar sarf ihtiyaçları.</w:t>
-            </w:r>
-          </w:p>
-        </w:tc>
-      </w:tr>
-    </w:tbl>
-    <w:p/>
-    <w:p>
-      <w:pPr>
-        <w:spacing w:after="60" w:before="0" w:line="240" w:lineRule="auto"/>
-      </w:pPr>
-      <w:r>
-        <w:rPr>
-          <w:rFonts w:ascii="Arial" w:hAnsi="Arial" w:eastAsia="Arial"/>
-          <w:b/>
-          <w:sz w:val="19"/>
-        </w:rPr>
-        <w:t>6. Seyahat — 45.000 TL</w:t>
-      </w:r>
-    </w:p>
-    <w:tbl>
-      <w:tblPr>
-        <w:tblStyle w:val="TableGrid"/>
-        <w:tblW w:type="auto" w:w="0"/>
-        <w:tblLook w:firstColumn="1" w:firstRow="1" w:lastColumn="0" w:lastRow="0" w:noHBand="0" w:noVBand="1" w:val="04A0"/>
-        <w:jc w:val="center"/>
-        <w:tblBorders>
-          <w:top w:val="single" w:sz="4" w:space="0" w:color="000000"/>
-          <w:left w:val="single" w:sz="4" w:space="0" w:color="000000"/>
-          <w:bottom w:val="single" w:sz="4" w:space="0" w:color="000000"/>
-          <w:right w:val="single" w:sz="4" w:space="0" w:color="000000"/>
-          <w:insideH w:val="single" w:sz="4" w:space="0" w:color="000000"/>
-          <w:insideV w:val="single" w:sz="4" w:space="0" w:color="000000"/>
-        </w:tblBorders>
-      </w:tblPr>
-      <w:tblGrid>
-        <w:gridCol w:w="2880"/>
-        <w:gridCol w:w="2880"/>
-        <w:gridCol w:w="2880"/>
-      </w:tblGrid>
-      <w:tr>
-        <w:tc>
-          <w:tcPr>
-            <w:tcW w:type="dxa" w:w="2880"/>
-            <w:vAlign w:val="top"/>
-          </w:tcPr>
-          <w:p>
-            <w:pPr>
-              <w:spacing w:after="40" w:before="0" w:line="240" w:lineRule="auto"/>
-            </w:pPr>
-          </w:p>
-          <w:p>
-            <w:pPr>
-              <w:spacing w:after="40" w:before="0" w:line="240" w:lineRule="auto"/>
-            </w:pPr>
-            <w:r>
-              <w:rPr>
-                <w:rFonts w:ascii="Arial" w:hAnsi="Arial" w:eastAsia="Arial"/>
-                <w:b/>
-                <w:sz w:val="15"/>
-              </w:rPr>
-              <w:t>Kalem</w:t>
-            </w:r>
-          </w:p>
-        </w:tc>
-        <w:tc>
-          <w:tcPr>
-            <w:tcW w:type="dxa" w:w="2880"/>
-            <w:vAlign w:val="top"/>
-          </w:tcPr>
-          <w:p>
-            <w:pPr>
-              <w:spacing w:after="40" w:before="0" w:line="240" w:lineRule="auto"/>
-            </w:pPr>
-          </w:p>
-          <w:p>
-            <w:pPr>
-              <w:spacing w:after="40" w:before="0" w:line="240" w:lineRule="auto"/>
-            </w:pPr>
-            <w:r>
-              <w:rPr>
-                <w:rFonts w:ascii="Arial" w:hAnsi="Arial" w:eastAsia="Arial"/>
-                <w:b/>
-                <w:sz w:val="15"/>
-              </w:rPr>
-              <w:t>Tutar (TL)</w:t>
-            </w:r>
-          </w:p>
-        </w:tc>
-        <w:tc>
-          <w:tcPr>
-            <w:tcW w:type="dxa" w:w="2880"/>
-            <w:vAlign w:val="top"/>
-          </w:tcPr>
-          <w:p>
-            <w:pPr>
-              <w:spacing w:after="40" w:before="0" w:line="240" w:lineRule="auto"/>
-            </w:pPr>
-          </w:p>
-          <w:p>
-            <w:pPr>
-              <w:spacing w:after="40" w:before="0" w:line="240" w:lineRule="auto"/>
-            </w:pPr>
-            <w:r>
-              <w:rPr>
-                <w:rFonts w:ascii="Arial" w:hAnsi="Arial" w:eastAsia="Arial"/>
-                <w:b/>
-                <w:sz w:val="15"/>
-              </w:rPr>
-              <w:t>Gerekçe</w:t>
-            </w:r>
-          </w:p>
-        </w:tc>
-      </w:tr>
-      <w:tr>
-        <w:tc>
-          <w:tcPr>
-            <w:tcW w:type="dxa" w:w="2880"/>
-            <w:vAlign w:val="top"/>
-          </w:tcPr>
-          <w:p>
-            <w:pPr>
-              <w:spacing w:after="40" w:before="0" w:line="240" w:lineRule="auto"/>
-            </w:pPr>
-          </w:p>
-          <w:p>
-            <w:pPr>
-              <w:spacing w:after="40" w:before="0" w:line="240" w:lineRule="auto"/>
-            </w:pPr>
-            <w:r>
-              <w:rPr>
-                <w:rFonts w:ascii="Arial" w:hAnsi="Arial" w:eastAsia="Arial"/>
-                <w:sz w:val="15"/>
-              </w:rPr>
-              <w:t>2–3 bilimsel konferans sunumu (yurt içi + 1 yurt dışı)</w:t>
-            </w:r>
-          </w:p>
-        </w:tc>
-        <w:tc>
-          <w:tcPr>
-            <w:tcW w:type="dxa" w:w="2880"/>
-            <w:vAlign w:val="top"/>
-          </w:tcPr>
-          <w:p>
-            <w:pPr>
-              <w:spacing w:after="40" w:before="0" w:line="240" w:lineRule="auto"/>
-            </w:pPr>
-          </w:p>
-          <w:p>
-            <w:pPr>
-              <w:spacing w:after="40" w:before="0" w:line="240" w:lineRule="auto"/>
-            </w:pPr>
-            <w:r>
-              <w:rPr>
-                <w:rFonts w:ascii="Arial" w:hAnsi="Arial" w:eastAsia="Arial"/>
-                <w:sz w:val="15"/>
-              </w:rPr>
-              <w:t>45.000</w:t>
-            </w:r>
-          </w:p>
-        </w:tc>
-        <w:tc>
-          <w:tcPr>
-            <w:tcW w:type="dxa" w:w="2880"/>
-            <w:vAlign w:val="top"/>
-          </w:tcPr>
-          <w:p>
-            <w:pPr>
-              <w:spacing w:after="40" w:before="0" w:line="240" w:lineRule="auto"/>
-            </w:pPr>
-          </w:p>
-          <w:p>
-            <w:pPr>
-              <w:spacing w:after="40" w:before="0" w:line="240" w:lineRule="auto"/>
-            </w:pPr>
-            <w:r>
-              <w:rPr>
-                <w:rFonts w:ascii="Arial" w:hAnsi="Arial" w:eastAsia="Arial"/>
-                <w:sz w:val="15"/>
-              </w:rPr>
-              <w:t>En az 3 hakemli yayının ve açık kıyaslama sonuçlarının bilimsel yayılımı (WP5).</w:t>
-            </w:r>
-          </w:p>
-        </w:tc>
-      </w:tr>
-    </w:tbl>
-    <w:p/>
-    <w:p>
-      <w:pPr>
-        <w:spacing w:after="60" w:before="0" w:line="240" w:lineRule="auto"/>
-      </w:pPr>
-      <w:r>
-        <w:rPr>
-          <w:rFonts w:ascii="Arial" w:hAnsi="Arial" w:eastAsia="Arial"/>
-          <w:b/>
-          <w:sz w:val="19"/>
-        </w:rPr>
-        <w:t>7. Üst Limit Dışı Kalemler (bilgi amaçlı)</w:t>
-      </w:r>
-    </w:p>
-    <w:p>
-      <w:pPr>
-        <w:spacing w:after="60" w:before="0" w:line="240" w:lineRule="auto"/>
-        <w:ind w:left="198" w:hanging="113"/>
-      </w:pPr>
-      <w:r>
-        <w:rPr>
-          <w:rFonts w:ascii="Arial" w:hAnsi="Arial" w:eastAsia="Arial"/>
-          <w:sz w:val="18"/>
-        </w:rPr>
-        <w:t xml:space="preserve">• </w:t>
-      </w:r>
-      <w:r>
-        <w:rPr>
-          <w:rFonts w:ascii="Arial" w:hAnsi="Arial" w:eastAsia="Arial"/>
-          <w:b/>
-          <w:sz w:val="18"/>
-        </w:rPr>
-        <w:t>Proje Teşvik İkramiyesi (PTİ):</w:t>
-      </w:r>
-      <w:r>
-        <w:rPr>
-          <w:rFonts w:ascii="Arial" w:hAnsi="Arial" w:eastAsia="Arial"/>
-          <w:sz w:val="18"/>
-        </w:rPr>
-        <w:t xml:space="preserve"> Yürütücü ve araştırmacılara TÜBİTAK mevzuatına göre ayrıca ödenir; 1.200.000 TL üst limitine dahil değildir.</w:t>
-      </w:r>
-    </w:p>
-    <w:p>
-      <w:pPr>
-        <w:spacing w:after="60" w:before="0" w:line="240" w:lineRule="auto"/>
-        <w:ind w:left="198" w:hanging="113"/>
-      </w:pPr>
-      <w:r>
-        <w:rPr>
-          <w:rFonts w:ascii="Arial" w:hAnsi="Arial" w:eastAsia="Arial"/>
-          <w:sz w:val="18"/>
-        </w:rPr>
-        <w:t xml:space="preserve">• </w:t>
-      </w:r>
-      <w:r>
-        <w:rPr>
-          <w:rFonts w:ascii="Arial" w:hAnsi="Arial" w:eastAsia="Arial"/>
-          <w:b/>
-          <w:sz w:val="18"/>
-        </w:rPr>
-        <w:t>Kurum Hissesi:</w:t>
-      </w:r>
-      <w:r>
-        <w:rPr>
-          <w:rFonts w:ascii="Arial" w:hAnsi="Arial" w:eastAsia="Arial"/>
-          <w:sz w:val="18"/>
-        </w:rPr>
-        <w:t xml:space="preserve"> Ev sahibi kuruma genel gider olarak TÜBİTAK tarafından ayrıca eklenir; üst limite dahil değildir.</w:t>
-      </w:r>
-    </w:p>
-    <w:p>
-      <w:pPr>
-        <w:spacing w:after="60" w:before="0" w:line="240" w:lineRule="auto"/>
-      </w:pPr>
-      <w:r>
-        <w:rPr>
-          <w:rFonts w:ascii="Arial" w:hAnsi="Arial" w:eastAsia="Arial"/>
-          <w:b/>
-          <w:sz w:val="19"/>
-        </w:rPr>
-        <w:t>8. Teyit Edilecek Varsayımlar</w:t>
-      </w:r>
-    </w:p>
-    <w:p>
-      <w:pPr>
-        <w:spacing w:after="60" w:before="0" w:line="240" w:lineRule="auto"/>
-        <w:ind w:left="198" w:hanging="113"/>
-      </w:pPr>
-      <w:r>
-        <w:rPr>
-          <w:rFonts w:ascii="Arial" w:hAnsi="Arial" w:eastAsia="Arial"/>
-          <w:sz w:val="18"/>
-        </w:rPr>
-        <w:t xml:space="preserve">1. </w:t>
-      </w:r>
-      <w:r>
-        <w:rPr>
-          <w:rFonts w:ascii="Arial" w:hAnsi="Arial" w:eastAsia="Arial"/>
-          <w:b/>
-          <w:sz w:val="18"/>
-        </w:rPr>
-        <w:t>Burs durumu:</w:t>
-      </w:r>
-      <w:r>
-        <w:rPr>
-          <w:rFonts w:ascii="Arial" w:hAnsi="Arial" w:eastAsia="Arial"/>
-          <w:sz w:val="18"/>
-        </w:rPr>
-        <w:t xml:space="preserve"> İki yüksek lisans bursiyeri, 22.500 TL oranının uygulanabilmesi için yüksek lisans döneminde </w:t>
-      </w:r>
-      <w:r>
-        <w:rPr>
-          <w:rFonts w:ascii="Arial" w:hAnsi="Arial" w:eastAsia="Arial"/>
-          <w:i/>
-          <w:sz w:val="18"/>
-        </w:rPr>
-        <w:t>çalışmayan</w:t>
-      </w:r>
-      <w:r>
-        <w:rPr>
-          <w:rFonts w:ascii="Arial" w:hAnsi="Arial" w:eastAsia="Arial"/>
-          <w:sz w:val="18"/>
-        </w:rPr>
-        <w:t xml:space="preserve"> (başka bir işte sigortalı olmayan, tam zamanlı) statüde olmalıdır. Çalışan statüsünde oran 6.000 TL'ye düşer ve bütçe yeniden hesaplanır.</w:t>
-      </w:r>
-    </w:p>
-    <w:p>
-      <w:pPr>
-        <w:spacing w:after="60" w:before="0" w:line="240" w:lineRule="auto"/>
-        <w:ind w:left="198" w:hanging="113"/>
-      </w:pPr>
-      <w:r>
-        <w:rPr>
-          <w:rFonts w:ascii="Arial" w:hAnsi="Arial" w:eastAsia="Arial"/>
-          <w:sz w:val="18"/>
-        </w:rPr>
-        <w:t xml:space="preserve">2. </w:t>
-      </w:r>
-      <w:r>
-        <w:rPr>
-          <w:rFonts w:ascii="Arial" w:hAnsi="Arial" w:eastAsia="Arial"/>
-          <w:b/>
-          <w:sz w:val="18"/>
-        </w:rPr>
-        <w:t>Yüksek lisansa geçiş ayı:</w:t>
-      </w:r>
-      <w:r>
-        <w:rPr>
-          <w:rFonts w:ascii="Arial" w:hAnsi="Arial" w:eastAsia="Arial"/>
-          <w:sz w:val="18"/>
-        </w:rPr>
-        <w:t xml:space="preserve"> ~7. ay varsayılmıştır; gerçek kayıt takvimi WP4 doğrulama penceresiyle (4–16. ay) uyumlu olacak şekilde teyit edilmelidir.</w:t>
-      </w:r>
-    </w:p>
-    <w:p>
-      <w:pPr>
-        <w:spacing w:after="60" w:before="0" w:line="240" w:lineRule="auto"/>
-        <w:ind w:left="198" w:hanging="113"/>
-      </w:pPr>
-      <w:r>
-        <w:rPr>
-          <w:rFonts w:ascii="Arial" w:hAnsi="Arial" w:eastAsia="Arial"/>
-          <w:sz w:val="18"/>
-        </w:rPr>
-        <w:t xml:space="preserve">3. </w:t>
-      </w:r>
-      <w:r>
-        <w:rPr>
-          <w:rFonts w:ascii="Arial" w:hAnsi="Arial" w:eastAsia="Arial"/>
-          <w:b/>
-          <w:sz w:val="18"/>
-        </w:rPr>
-        <w:t>Donanım fiyatları:</w:t>
-      </w:r>
-      <w:r>
-        <w:rPr>
-          <w:rFonts w:ascii="Arial" w:hAnsi="Arial" w:eastAsia="Arial"/>
-          <w:sz w:val="18"/>
-        </w:rPr>
-        <w:t xml:space="preserve"> GPU iş istasyonu, NAS ve KGK tutarları tahminîdir; güncel piyasa teklifleriyle (döviz/ithalat etkisi dahil) güncellenecektir. Tek GPU'lu iş istasyonunun kesin modeli, 16–24 GB VRAM sınıfında kalacak biçimde teklif aşamasında belirlenecektir; daha büyük eğitim işleri TRUBA veya gerekirse kısa süreli bulut GPU ile yürütülecektir.</w:t>
-      </w:r>
-    </w:p>
-    <w:p>
-      <w:pPr>
-        <w:spacing w:after="60" w:before="0" w:line="240" w:lineRule="auto"/>
-        <w:ind w:left="198" w:hanging="113"/>
-      </w:pPr>
-      <w:r>
-        <w:rPr>
-          <w:rFonts w:ascii="Arial" w:hAnsi="Arial" w:eastAsia="Arial"/>
-          <w:sz w:val="18"/>
-        </w:rPr>
-        <w:t xml:space="preserve">4. </w:t>
-      </w:r>
-      <w:r>
-        <w:rPr>
-          <w:rFonts w:ascii="Arial" w:hAnsi="Arial" w:eastAsia="Arial"/>
-          <w:b/>
-          <w:sz w:val="18"/>
-        </w:rPr>
-        <w:t>TRUBA tahsisi:</w:t>
-      </w:r>
-      <w:r>
-        <w:rPr>
-          <w:rFonts w:ascii="Arial" w:hAnsi="Arial" w:eastAsia="Arial"/>
-          <w:sz w:val="18"/>
-        </w:rPr>
-        <w:t xml:space="preserve"> Ağır ince ayar iş yükü için proje kabulü sonrası TRUBA uygunluk/kaynak tahsisi başvurusu yapılacaktır; tahsisin gecikmesi/düşüklüğü riski ve B planı ana belgenin Risk Yönetimi bölümünde (WP3/WP4 satırı) ele alınmıştır.</w:t>
-      </w:r>
-    </w:p>
-    <w:p>
-      <w:pPr>
-        <w:spacing w:after="60" w:before="0" w:line="240" w:lineRule="auto"/>
-        <w:ind w:left="198" w:hanging="113"/>
-      </w:pPr>
-      <w:r>
-        <w:rPr>
-          <w:rFonts w:ascii="Arial" w:hAnsi="Arial" w:eastAsia="Arial"/>
-          <w:sz w:val="18"/>
-        </w:rPr>
-        <w:t xml:space="preserve">5. </w:t>
-      </w:r>
-      <w:r>
-        <w:rPr>
-          <w:rFonts w:ascii="Arial" w:hAnsi="Arial" w:eastAsia="Arial"/>
-          <w:b/>
-          <w:sz w:val="18"/>
-        </w:rPr>
-        <w:t>Bursiyer-ad eşleştirmesi:</w:t>
-      </w:r>
-      <w:r>
-        <w:rPr>
-          <w:rFonts w:ascii="Arial" w:hAnsi="Arial" w:eastAsia="Arial"/>
-          <w:sz w:val="18"/>
-        </w:rPr>
-        <w:t xml:space="preserve"> B1–B4 rolleri ana belgedeki iş paketi görev dağılımıyla eşleştirilecektir; iki gıda mühendisliği bursiyeri yüksek lisansa geçen bursiyerlerdir.</w:t>
-      </w:r>
-    </w:p>
-    <w:p>
-      <w:pPr>
-        <w:spacing w:after="60" w:before="0" w:line="240" w:lineRule="auto"/>
-        <w:ind w:left="198" w:hanging="113"/>
-      </w:pPr>
-      <w:r>
-        <w:rPr>
-          <w:rFonts w:ascii="Arial" w:hAnsi="Arial" w:eastAsia="Arial"/>
-          <w:sz w:val="18"/>
-        </w:rPr>
-        <w:t xml:space="preserve">6. </w:t>
-      </w:r>
-      <w:r>
-        <w:rPr>
-          <w:rFonts w:ascii="Arial" w:hAnsi="Arial" w:eastAsia="Arial"/>
-          <w:b/>
-          <w:sz w:val="18"/>
-        </w:rPr>
-        <w:t>Kalem sınıflandırması:</w:t>
-      </w:r>
-      <w:r>
-        <w:rPr>
-          <w:rFonts w:ascii="Arial" w:hAnsi="Arial" w:eastAsia="Arial"/>
-          <w:sz w:val="18"/>
-        </w:rPr>
-        <w:t xml:space="preserve"> Ticari API/bulut giderlerinin "Hizmet Alımı" altında sınıflandırılması PBS kalem tanımlarına göre teyit edilecektir.</w:t>
       </w:r>
     </w:p>
     <w:p>

</xml_diff>

<commit_message>
Preserve official 1005 template margins
</commit_message>
<xml_diff>
--- a/docs/OpenNutri_1005_Application_Filled_Template.docx
+++ b/docs/OpenNutri_1005_Application_Filled_Template.docx
@@ -5706,7 +5706,7 @@
           <w:footerReference w:type="first" r:id="rId7"/>
           <w:type w:val="nextPage"/>
           <w:pgSz w:w="11906" w:h="16838"/>
-          <w:pgMar w:left="907" w:right="907" w:gutter="0" w:header="851" w:top="907" w:footer="851" w:bottom="907"/>
+          <w:pgMar w:left="1077" w:right="1077" w:gutter="0" w:header="851" w:top="1440" w:footer="851" w:bottom="1440"/>
           <w:pgNumType w:start="1" w:fmt="decimal"/>
           <w:formProt w:val="false"/>
           <w:titlePg/>
@@ -6988,7 +6988,7 @@
           <w:footerReference w:type="default" r:id="rId9"/>
           <w:type w:val="nextPage"/>
           <w:pgSz w:orient="landscape" w:w="16838" w:h="11906"/>
-          <w:pgMar w:left="907" w:right="907" w:gutter="0" w:header="851" w:top="907" w:footer="851" w:bottom="907"/>
+          <w:pgMar w:left="1077" w:right="1077" w:gutter="0" w:header="851" w:top="1440" w:footer="851" w:bottom="1440"/>
           <w:pgNumType w:fmt="decimal"/>
           <w:formProt w:val="false"/>
           <w:textDirection w:val="lrTb"/>
@@ -13075,7 +13075,7 @@
       <w:footerReference w:type="default" r:id="rId12"/>
       <w:type w:val="nextPage"/>
       <w:pgSz w:w="11906" w:h="16838"/>
-      <w:pgMar w:left="907" w:right="907" w:gutter="0" w:header="851" w:top="907" w:footer="851" w:bottom="907"/>
+      <w:pgMar w:left="1077" w:right="1077" w:gutter="0" w:header="851" w:top="1440" w:footer="851" w:bottom="1440"/>
       <w:pgNumType w:fmt="decimal"/>
       <w:formProt w:val="false"/>
       <w:textDirection w:val="lrTb"/>

</xml_diff>

<commit_message>
Use 9 point text in main 1005 tables
</commit_message>
<xml_diff>
--- a/docs/OpenNutri_1005_Application_Filled_Template.docx
+++ b/docs/OpenNutri_1005_Application_Filled_Template.docx
@@ -6081,7 +6081,7 @@
               <w:rPr>
                 <w:rFonts w:ascii="Arial" w:hAnsi="Arial" w:eastAsia="Arial"/>
                 <w:b/>
-                <w:sz w:val="14"/>
+                <w:sz w:val="18"/>
               </w:rPr>
               <w:t>İP No</w:t>
             </w:r>
@@ -6112,7 +6112,7 @@
               <w:rPr>
                 <w:rFonts w:ascii="Arial" w:hAnsi="Arial" w:eastAsia="Arial"/>
                 <w:b/>
-                <w:sz w:val="14"/>
+                <w:sz w:val="18"/>
               </w:rPr>
               <w:t>İş Paketinin Adı ve Hedefleri</w:t>
             </w:r>
@@ -6143,7 +6143,7 @@
               <w:rPr>
                 <w:rFonts w:ascii="Arial" w:hAnsi="Arial" w:eastAsia="Arial"/>
                 <w:b/>
-                <w:sz w:val="14"/>
+                <w:sz w:val="18"/>
               </w:rPr>
               <w:t>Sorumlu Ekip</w:t>
             </w:r>
@@ -6174,7 +6174,7 @@
               <w:rPr>
                 <w:rFonts w:ascii="Arial" w:hAnsi="Arial" w:eastAsia="Arial"/>
                 <w:b/>
-                <w:sz w:val="14"/>
+                <w:sz w:val="18"/>
               </w:rPr>
               <w:t>Zaman Aralığı</w:t>
             </w:r>
@@ -6205,7 +6205,7 @@
               <w:rPr>
                 <w:rFonts w:ascii="Arial" w:hAnsi="Arial" w:eastAsia="Arial"/>
                 <w:b/>
-                <w:sz w:val="14"/>
+                <w:sz w:val="18"/>
               </w:rPr>
               <w:t>Başarı Ölçütü ve Katkısı</w:t>
             </w:r>
@@ -6230,7 +6230,7 @@
             <w:r>
               <w:rPr>
                 <w:rFonts w:ascii="Arial" w:hAnsi="Arial" w:eastAsia="Arial"/>
-                <w:sz w:val="14"/>
+                <w:sz w:val="18"/>
               </w:rPr>
               <w:t>1</w:t>
             </w:r>
@@ -6254,14 +6254,14 @@
               <w:rPr>
                 <w:rFonts w:ascii="Arial" w:hAnsi="Arial" w:eastAsia="Arial"/>
                 <w:b/>
-                <w:sz w:val="14"/>
+                <w:sz w:val="18"/>
               </w:rPr>
               <w:t>Akıllı Literatür Tarama ve L2 Sınıflandırma Hattı:</w:t>
             </w:r>
             <w:r>
               <w:rPr>
                 <w:rFonts w:ascii="Arial" w:hAnsi="Arial" w:eastAsia="Arial"/>
-                <w:sz w:val="14"/>
+                <w:sz w:val="18"/>
               </w:rPr>
               <w:t xml:space="preserve"> L1 akıllı tarayıcı, L2 sınıflandırıcı, veri tabanı şeması ve kaynak erişim hattı.</w:t>
             </w:r>
@@ -6284,7 +6284,7 @@
             <w:r>
               <w:rPr>
                 <w:rFonts w:ascii="Arial" w:hAnsi="Arial" w:eastAsia="Arial"/>
-                <w:sz w:val="14"/>
+                <w:sz w:val="18"/>
               </w:rPr>
               <w:t>Yürütücü: Prof. Dr. Murat Ceylan; Araştırmacı: Prof. Dr. Servet Gülüm Şumnu; Bursiyerler: Arciel Aliognis, Alijon Alimov</w:t>
             </w:r>
@@ -6307,7 +6307,7 @@
             <w:r>
               <w:rPr>
                 <w:rFonts w:ascii="Arial" w:hAnsi="Arial" w:eastAsia="Arial"/>
-                <w:sz w:val="14"/>
+                <w:sz w:val="18"/>
               </w:rPr>
               <w:t>1-4. Aylar</w:t>
             </w:r>
@@ -6330,7 +6330,7 @@
             <w:r>
               <w:rPr>
                 <w:rFonts w:ascii="Arial" w:hAnsi="Arial" w:eastAsia="Arial"/>
-                <w:sz w:val="14"/>
+                <w:sz w:val="18"/>
               </w:rPr>
               <w:t>Çok kaynaklı tarayıcı çalışır durumda; L2 F1 ≥0,92; ≥100.000 ilgili makaleye ulaşabilecek aday havuz ve tekilleştirme hattı.</w:t>
             </w:r>
@@ -6355,7 +6355,7 @@
             <w:r>
               <w:rPr>
                 <w:rFonts w:ascii="Arial" w:hAnsi="Arial" w:eastAsia="Arial"/>
-                <w:sz w:val="14"/>
+                <w:sz w:val="18"/>
               </w:rPr>
               <w:t>2</w:t>
             </w:r>
@@ -6379,14 +6379,14 @@
               <w:rPr>
                 <w:rFonts w:ascii="Arial" w:hAnsi="Arial" w:eastAsia="Arial"/>
                 <w:b/>
-                <w:sz w:val="14"/>
+                <w:sz w:val="18"/>
               </w:rPr>
               <w:t>Çekirdek Çıkarma Motoru (L3):</w:t>
             </w:r>
             <w:r>
               <w:rPr>
                 <w:rFonts w:ascii="Arial" w:hAnsi="Arial" w:eastAsia="Arial"/>
-                <w:sz w:val="14"/>
+                <w:sz w:val="18"/>
               </w:rPr>
               <w:t xml:space="preserve"> Alt göreve özgü ağırlıkları açık modeller, normalizasyon, varlık bağlama ve gıda bilimi doğrulama kuralları.</w:t>
             </w:r>
@@ -6409,7 +6409,7 @@
             <w:r>
               <w:rPr>
                 <w:rFonts w:ascii="Arial" w:hAnsi="Arial" w:eastAsia="Arial"/>
-                <w:sz w:val="14"/>
+                <w:sz w:val="18"/>
               </w:rPr>
               <w:t>Yürütücü: Prof. Dr. Murat Ceylan; Araştırmacılar: Dr. Engin Esme, Prof. Dr. Servet Gülüm Şumnu; Bursiyerler: Arciel Aliognis, Aleyna Özcan, Peri Açıkgöz</w:t>
             </w:r>
@@ -6432,7 +6432,7 @@
             <w:r>
               <w:rPr>
                 <w:rFonts w:ascii="Arial" w:hAnsi="Arial" w:eastAsia="Arial"/>
-                <w:sz w:val="14"/>
+                <w:sz w:val="18"/>
               </w:rPr>
               <w:t>3-8. Aylar</w:t>
             </w:r>
@@ -6455,7 +6455,7 @@
             <w:r>
               <w:rPr>
                 <w:rFonts w:ascii="Arial" w:hAnsi="Arial" w:eastAsia="Arial"/>
-                <w:sz w:val="14"/>
+                <w:sz w:val="18"/>
               </w:rPr>
               <w:t>L3 alt görevleri entegre; ≥10 doğrulama kuralı aktif; ticari API tabanlı referansa göre en az %30 maliyet düşüşü; düşük güvenli kayıtların L4/L5'e güvenli yönlendirilmesi.</w:t>
             </w:r>
@@ -6480,7 +6480,7 @@
             <w:r>
               <w:rPr>
                 <w:rFonts w:ascii="Arial" w:hAnsi="Arial" w:eastAsia="Arial"/>
-                <w:sz w:val="14"/>
+                <w:sz w:val="18"/>
               </w:rPr>
               <w:t>3</w:t>
             </w:r>
@@ -6504,14 +6504,14 @@
               <w:rPr>
                 <w:rFonts w:ascii="Arial" w:hAnsi="Arial" w:eastAsia="Arial"/>
                 <w:b/>
-                <w:sz w:val="14"/>
+                <w:sz w:val="18"/>
               </w:rPr>
               <w:t>Kademeli Entegrasyon ve Yönlendirici:</w:t>
             </w:r>
             <w:r>
               <w:rPr>
                 <w:rFonts w:ascii="Arial" w:hAnsi="Arial" w:eastAsia="Arial"/>
-                <w:sz w:val="14"/>
+                <w:sz w:val="18"/>
               </w:rPr>
               <w:t xml:space="preserve"> L4 ticari model yükseltmesi, RAG/istem dosyası, Öğrenilmiş Yönlendirici ve maliyet optimizasyonu.</w:t>
             </w:r>
@@ -6534,7 +6534,7 @@
             <w:r>
               <w:rPr>
                 <w:rFonts w:ascii="Arial" w:hAnsi="Arial" w:eastAsia="Arial"/>
-                <w:sz w:val="14"/>
+                <w:sz w:val="18"/>
               </w:rPr>
               <w:t>Yürütücü: Prof. Dr. Murat Ceylan; Araştırmacı: Dr. Engin Esme; Bursiyerler: Arciel Aliognis, Alijon Alimov</w:t>
             </w:r>
@@ -6557,7 +6557,7 @@
             <w:r>
               <w:rPr>
                 <w:rFonts w:ascii="Arial" w:hAnsi="Arial" w:eastAsia="Arial"/>
-                <w:sz w:val="14"/>
+                <w:sz w:val="18"/>
               </w:rPr>
               <w:t>5-10. Aylar</w:t>
             </w:r>
@@ -6580,7 +6580,7 @@
             <w:r>
               <w:rPr>
                 <w:rFonts w:ascii="Arial" w:hAnsi="Arial" w:eastAsia="Arial"/>
-                <w:sz w:val="14"/>
+                <w:sz w:val="18"/>
               </w:rPr>
               <w:t>L1-L4 uçtan uca çalışır; yönlendirici rastgele/statik yönlendirmeye göre ≥%20 maliyet düşüşü sağlar; L5 hariç uçtan uca gecikme &lt;60 sn/makale hedeflenir.</w:t>
             </w:r>
@@ -6605,7 +6605,7 @@
             <w:r>
               <w:rPr>
                 <w:rFonts w:ascii="Arial" w:hAnsi="Arial" w:eastAsia="Arial"/>
-                <w:sz w:val="14"/>
+                <w:sz w:val="18"/>
               </w:rPr>
               <w:t>4</w:t>
             </w:r>
@@ -6629,14 +6629,14 @@
               <w:rPr>
                 <w:rFonts w:ascii="Arial" w:hAnsi="Arial" w:eastAsia="Arial"/>
                 <w:b/>
-                <w:sz w:val="14"/>
+                <w:sz w:val="18"/>
               </w:rPr>
               <w:t>Uzman Doğrulama ve Katmanlar Arası Öğrenme:</w:t>
             </w:r>
             <w:r>
               <w:rPr>
                 <w:rFonts w:ascii="Arial" w:hAnsi="Arial" w:eastAsia="Arial"/>
-                <w:sz w:val="14"/>
+                <w:sz w:val="18"/>
               </w:rPr>
               <w:t xml:space="preserve"> Kalibrasyon, uyarlanabilir doğrulama protokolü, altın standart veri üretimi ve uzman geri bildirimli model iyileştirme.</w:t>
             </w:r>
@@ -6659,7 +6659,7 @@
             <w:r>
               <w:rPr>
                 <w:rFonts w:ascii="Arial" w:hAnsi="Arial" w:eastAsia="Arial"/>
-                <w:sz w:val="14"/>
+                <w:sz w:val="18"/>
               </w:rPr>
               <w:t>Yürütücü: Prof. Dr. Murat Ceylan; Araştırmacılar: Prof. Dr. Servet Gülüm Şumnu, Dr. Engin Esme; Bursiyerler: Alijon Alimov, Arciel Aliognis, Aleyna Özcan, Peri Açıkgöz</w:t>
             </w:r>
@@ -6682,7 +6682,7 @@
             <w:r>
               <w:rPr>
                 <w:rFonts w:ascii="Arial" w:hAnsi="Arial" w:eastAsia="Arial"/>
-                <w:sz w:val="14"/>
+                <w:sz w:val="18"/>
               </w:rPr>
               <w:t>4-16. Aylar</w:t>
             </w:r>
@@ -6705,7 +6705,7 @@
             <w:r>
               <w:rPr>
                 <w:rFonts w:ascii="Arial" w:hAnsi="Arial" w:eastAsia="Arial"/>
-                <w:sz w:val="14"/>
+                <w:sz w:val="18"/>
               </w:rPr>
               <w:t>≥5.000 uzman doğrulamalı makale; ≥25.000 altın standart kayıt; kabul edilen kayıtların rastgele denetiminde hata &lt;%0,5; otomatik onay oranı ≥%90.</w:t>
             </w:r>
@@ -6730,7 +6730,7 @@
             <w:r>
               <w:rPr>
                 <w:rFonts w:ascii="Arial" w:hAnsi="Arial" w:eastAsia="Arial"/>
-                <w:sz w:val="14"/>
+                <w:sz w:val="18"/>
               </w:rPr>
               <w:t>5</w:t>
             </w:r>
@@ -6754,14 +6754,14 @@
               <w:rPr>
                 <w:rFonts w:ascii="Arial" w:hAnsi="Arial" w:eastAsia="Arial"/>
                 <w:b/>
-                <w:sz w:val="14"/>
+                <w:sz w:val="18"/>
               </w:rPr>
               <w:t>Üretim API'si, Kıyaslama Doğrulaması ve Açık Araştırma Çıktıları:</w:t>
             </w:r>
             <w:r>
               <w:rPr>
                 <w:rFonts w:ascii="Arial" w:hAnsi="Arial" w:eastAsia="Arial"/>
-                <w:sz w:val="14"/>
+                <w:sz w:val="18"/>
               </w:rPr>
               <w:t xml:space="preserve"> REST API, açık araştırma veri seti, performans kıyaslaması, dokümantasyon ve yayınlar.</w:t>
             </w:r>
@@ -6784,7 +6784,7 @@
             <w:r>
               <w:rPr>
                 <w:rFonts w:ascii="Arial" w:hAnsi="Arial" w:eastAsia="Arial"/>
-                <w:sz w:val="14"/>
+                <w:sz w:val="18"/>
               </w:rPr>
               <w:t>Yürütücü: Prof. Dr. Murat Ceylan; Araştırmacılar: Dr. Engin Esme, Prof. Dr. Servet Gülüm Şumnu; Bursiyerler: Alijon Alimov, Arciel Aliognis, Aleyna Özcan, Peri Açıkgöz</w:t>
             </w:r>
@@ -6807,7 +6807,7 @@
             <w:r>
               <w:rPr>
                 <w:rFonts w:ascii="Arial" w:hAnsi="Arial" w:eastAsia="Arial"/>
-                <w:sz w:val="14"/>
+                <w:sz w:val="18"/>
               </w:rPr>
               <w:t>14-18. Aylar</w:t>
             </w:r>
@@ -6830,7 +6830,7 @@
             <w:r>
               <w:rPr>
                 <w:rFonts w:ascii="Arial" w:hAnsi="Arial" w:eastAsia="Arial"/>
-                <w:sz w:val="14"/>
+                <w:sz w:val="18"/>
               </w:rPr>
               <w:t>≥500.000 gıda-besin kaydı; API yayında (&lt;200 ms p95 yanıt süresi, ≥100 istek/saniye); açık veri ve kıyaslama raporu yayımlanır; ≥3 makale hakemli dergilere gönderilir.</w:t>
             </w:r>
@@ -6857,7 +6857,7 @@
               <w:rPr>
                 <w:rFonts w:ascii="Arial" w:hAnsi="Arial" w:eastAsia="Arial"/>
                 <w:b/>
-                <w:sz w:val="14"/>
+                <w:sz w:val="18"/>
               </w:rPr>
               <w:t>İş-Zaman Çizelgesi (Gantt) — Aylar 1-18</w:t>
             </w:r>
@@ -7302,7 +7302,7 @@
               <w:rPr>
                 <w:rFonts w:ascii="Arial" w:hAnsi="Arial" w:eastAsia="Arial"/>
                 <w:b/>
-                <w:sz w:val="14"/>
+                <w:sz w:val="18"/>
               </w:rPr>
               <w:t>İP No</w:t>
             </w:r>
@@ -7333,7 +7333,7 @@
               <w:rPr>
                 <w:rFonts w:ascii="Arial" w:hAnsi="Arial" w:eastAsia="Arial"/>
                 <w:b/>
-                <w:sz w:val="14"/>
+                <w:sz w:val="18"/>
               </w:rPr>
               <w:t>Risk</w:t>
             </w:r>
@@ -7364,7 +7364,7 @@
               <w:rPr>
                 <w:rFonts w:ascii="Arial" w:hAnsi="Arial" w:eastAsia="Arial"/>
                 <w:b/>
-                <w:sz w:val="14"/>
+                <w:sz w:val="18"/>
               </w:rPr>
               <w:t>B Planı / Yönetim Yaklaşımı</w:t>
             </w:r>
@@ -7389,7 +7389,7 @@
             <w:r>
               <w:rPr>
                 <w:rFonts w:ascii="Arial" w:hAnsi="Arial" w:eastAsia="Arial"/>
-                <w:sz w:val="14"/>
+                <w:sz w:val="18"/>
               </w:rPr>
               <w:t>WP1</w:t>
             </w:r>
@@ -7412,7 +7412,7 @@
             <w:r>
               <w:rPr>
                 <w:rFonts w:ascii="Arial" w:hAnsi="Arial" w:eastAsia="Arial"/>
-                <w:sz w:val="14"/>
+                <w:sz w:val="18"/>
               </w:rPr>
               <w:t>Yayıncı API hız sınırları veya lisans kısıtları hedef literatür hacmini düşürür.</w:t>
             </w:r>
@@ -7435,7 +7435,7 @@
             <w:r>
               <w:rPr>
                 <w:rFonts w:ascii="Arial" w:hAnsi="Arial" w:eastAsia="Arial"/>
-                <w:sz w:val="14"/>
+                <w:sz w:val="18"/>
               </w:rPr>
               <w:t>OpenAlex, Semantic Scholar açık veri setleri ve Europe PMC/PubMed Central toplu erişimleri önceliklendirilir; DergiPark ve kurumsal erişim kanalları ayrı izlenir; Google Scholar temel otomasyon kaynağı yapılmaz.</w:t>
             </w:r>
@@ -7460,7 +7460,7 @@
             <w:r>
               <w:rPr>
                 <w:rFonts w:ascii="Arial" w:hAnsi="Arial" w:eastAsia="Arial"/>
-                <w:sz w:val="14"/>
+                <w:sz w:val="18"/>
               </w:rPr>
               <w:t>WP1</w:t>
             </w:r>
@@ -7483,7 +7483,7 @@
             <w:r>
               <w:rPr>
                 <w:rFonts w:ascii="Arial" w:hAnsi="Arial" w:eastAsia="Arial"/>
-                <w:sz w:val="14"/>
+                <w:sz w:val="18"/>
               </w:rPr>
               <w:t>GPU/NAS donanımının kurumsal satın alma süreci uzayabilir.</w:t>
             </w:r>
@@ -7506,7 +7506,7 @@
             <w:r>
               <w:rPr>
                 <w:rFonts w:ascii="Arial" w:hAnsi="Arial" w:eastAsia="Arial"/>
-                <w:sz w:val="14"/>
+                <w:sz w:val="18"/>
               </w:rPr>
               <w:t>Kritik geliştirme erken dönemde mevcut prototip donanımı, kurum kaynakları ve uygun olduğunda TRUBA üzerinde sürdürülür; satın alma proje başında başlatılır; gerekirse kısa süreli bulut GPU köprü olarak kullanılır.</w:t>
             </w:r>
@@ -7531,7 +7531,7 @@
             <w:r>
               <w:rPr>
                 <w:rFonts w:ascii="Arial" w:hAnsi="Arial" w:eastAsia="Arial"/>
-                <w:sz w:val="14"/>
+                <w:sz w:val="18"/>
               </w:rPr>
               <w:t>WP2</w:t>
             </w:r>
@@ -7554,7 +7554,7 @@
             <w:r>
               <w:rPr>
                 <w:rFonts w:ascii="Arial" w:hAnsi="Arial" w:eastAsia="Arial"/>
-                <w:sz w:val="14"/>
+                <w:sz w:val="18"/>
               </w:rPr>
               <w:t>Karmaşık veya taranmış tablolarda düzen/OCR hataları çıkarımı bozabilir.</w:t>
             </w:r>
@@ -7577,7 +7577,7 @@
             <w:r>
               <w:rPr>
                 <w:rFonts w:ascii="Arial" w:hAnsi="Arial" w:eastAsia="Arial"/>
-                <w:sz w:val="14"/>
+                <w:sz w:val="18"/>
               </w:rPr>
               <w:t>Tablo yapısı ayrıştırma ve düzen analizi modülleri kullanılır; düşük güvenli tablo çıkarımları otomatik kabul edilmeden L5'e yönlendirilir; gıda bilimi doğrulama kuralları (kütle ve enerji dengesi) tutarsız değerleri yakalar.</w:t>
             </w:r>
@@ -7602,7 +7602,7 @@
             <w:r>
               <w:rPr>
                 <w:rFonts w:ascii="Arial" w:hAnsi="Arial" w:eastAsia="Arial"/>
-                <w:sz w:val="14"/>
+                <w:sz w:val="18"/>
               </w:rPr>
               <w:t>WP2</w:t>
             </w:r>
@@ -7625,7 +7625,7 @@
             <w:r>
               <w:rPr>
                 <w:rFonts w:ascii="Arial" w:hAnsi="Arial" w:eastAsia="Arial"/>
-                <w:sz w:val="14"/>
+                <w:sz w:val="18"/>
               </w:rPr>
               <w:t>İlk L3 modelleri beklenen doğruluğa ulaşamaz.</w:t>
             </w:r>
@@ -7648,7 +7648,7 @@
             <w:r>
               <w:rPr>
                 <w:rFonts w:ascii="Arial" w:hAnsi="Arial" w:eastAsia="Arial"/>
-                <w:sz w:val="14"/>
+                <w:sz w:val="18"/>
               </w:rPr>
               <w:t>Alt görevleri daha dar uzman modellere bölmek, L4 kullanımını geçici artırmak, doğrulama kurallarını sıkılaştırmak ve düşük güvenli kayıtları otomatik kabul etmeden L5'e yönlendirmek.</w:t>
             </w:r>
@@ -7673,7 +7673,7 @@
             <w:r>
               <w:rPr>
                 <w:rFonts w:ascii="Arial" w:hAnsi="Arial" w:eastAsia="Arial"/>
-                <w:sz w:val="14"/>
+                <w:sz w:val="18"/>
               </w:rPr>
               <w:t>WP3</w:t>
             </w:r>
@@ -7696,7 +7696,7 @@
             <w:r>
               <w:rPr>
                 <w:rFonts w:ascii="Arial" w:hAnsi="Arial" w:eastAsia="Arial"/>
-                <w:sz w:val="14"/>
+                <w:sz w:val="18"/>
               </w:rPr>
               <w:t>Öğrenilmiş Yönlendirici yeterince hızlı yakınsamaz veya pahalı katmanlara fazla yönlendirir.</w:t>
             </w:r>
@@ -7719,7 +7719,7 @@
             <w:r>
               <w:rPr>
                 <w:rFonts w:ascii="Arial" w:hAnsi="Arial" w:eastAsia="Arial"/>
-                <w:sz w:val="14"/>
+                <w:sz w:val="18"/>
               </w:rPr>
               <w:t>FrugalGPT tarzı statik eşik kademesi yedek olarak kullanılır; katman başına maliyet tavanları ve API bütçe alarmı uygulanır.</w:t>
             </w:r>
@@ -7744,7 +7744,7 @@
             <w:r>
               <w:rPr>
                 <w:rFonts w:ascii="Arial" w:hAnsi="Arial" w:eastAsia="Arial"/>
-                <w:sz w:val="14"/>
+                <w:sz w:val="18"/>
               </w:rPr>
               <w:t>WP3</w:t>
             </w:r>
@@ -7767,7 +7767,7 @@
             <w:r>
               <w:rPr>
                 <w:rFonts w:ascii="Arial" w:hAnsi="Arial" w:eastAsia="Arial"/>
-                <w:sz w:val="14"/>
+                <w:sz w:val="18"/>
               </w:rPr>
               <w:t>Ticari API fiyatları veya erişim koşulları proje süresince değişir.</w:t>
             </w:r>
@@ -7790,7 +7790,7 @@
             <w:r>
               <w:rPr>
                 <w:rFonts w:ascii="Arial" w:hAnsi="Arial" w:eastAsia="Arial"/>
-                <w:sz w:val="14"/>
+                <w:sz w:val="18"/>
               </w:rPr>
               <w:t>Çoklu sağlayıcı listesi tutulur; L4 yalnızca başarısız alt görev için kullanılır; ağırlıkları açık model seçenekleri ve L3 iyileştirme döngüsü L4 bağımlılığını azaltır.</w:t>
             </w:r>
@@ -7815,7 +7815,7 @@
             <w:r>
               <w:rPr>
                 <w:rFonts w:ascii="Arial" w:hAnsi="Arial" w:eastAsia="Arial"/>
-                <w:sz w:val="14"/>
+                <w:sz w:val="18"/>
               </w:rPr>
               <w:t>WP4</w:t>
             </w:r>
@@ -7838,7 +7838,7 @@
             <w:r>
               <w:rPr>
                 <w:rFonts w:ascii="Arial" w:hAnsi="Arial" w:eastAsia="Arial"/>
-                <w:sz w:val="14"/>
+                <w:sz w:val="18"/>
               </w:rPr>
               <w:t>Doğrulama kapasitesi 5.000 makale hedefine yetişmez.</w:t>
             </w:r>
@@ -7861,7 +7861,7 @@
             <w:r>
               <w:rPr>
                 <w:rFonts w:ascii="Arial" w:hAnsi="Arial" w:eastAsia="Arial"/>
-                <w:sz w:val="14"/>
+                <w:sz w:val="18"/>
               </w:rPr>
               <w:t>Aktif öğrenme kuyruğu en yüksek değerli makaleleri önceliklendirir; yönergeler sadeleştirilir; Prof. Dr. Şumnu gözetiminde eğitim/kalibrasyon artırılır; kalite hedefi korunarak hacim riski erken raporlanır.</w:t>
             </w:r>
@@ -7886,7 +7886,7 @@
             <w:r>
               <w:rPr>
                 <w:rFonts w:ascii="Arial" w:hAnsi="Arial" w:eastAsia="Arial"/>
-                <w:sz w:val="14"/>
+                <w:sz w:val="18"/>
               </w:rPr>
               <w:t>WP3/WP4</w:t>
             </w:r>
@@ -7909,7 +7909,7 @@
             <w:r>
               <w:rPr>
                 <w:rFonts w:ascii="Arial" w:hAnsi="Arial" w:eastAsia="Arial"/>
-                <w:sz w:val="14"/>
+                <w:sz w:val="18"/>
               </w:rPr>
               <w:t>TRUBA hesaplama tahsisi gecikebilir veya beklenenden düşük olabilir.</w:t>
             </w:r>
@@ -7932,7 +7932,7 @@
             <w:r>
               <w:rPr>
                 <w:rFonts w:ascii="Arial" w:hAnsi="Arial" w:eastAsia="Arial"/>
-                <w:sz w:val="14"/>
+                <w:sz w:val="18"/>
               </w:rPr>
               <w:t>Ağır ince ayar işleri PEFT (LoRA/QLoRA) ile küçük donanıma sığacak biçimde tasarlanır; proje kapsamındaki GPU iş istasyonu PEFT ölçeğinde yedek hesaplama sağlar; iş yükü gerektiğinde kısa süreli bulut GPU'ya taşınır.</w:t>
             </w:r>
@@ -7957,7 +7957,7 @@
             <w:r>
               <w:rPr>
                 <w:rFonts w:ascii="Arial" w:hAnsi="Arial" w:eastAsia="Arial"/>
-                <w:sz w:val="14"/>
+                <w:sz w:val="18"/>
               </w:rPr>
               <w:t>WP5</w:t>
             </w:r>
@@ -7980,7 +7980,7 @@
             <w:r>
               <w:rPr>
                 <w:rFonts w:ascii="Arial" w:hAnsi="Arial" w:eastAsia="Arial"/>
-                <w:sz w:val="14"/>
+                <w:sz w:val="18"/>
               </w:rPr>
               <w:t>Nihai kıyaslama beklenen otomatik onay oranına ulaşamaz.</w:t>
             </w:r>
@@ -8003,7 +8003,7 @@
             <w:r>
               <w:rPr>
                 <w:rFonts w:ascii="Arial" w:hAnsi="Arial" w:eastAsia="Arial"/>
-                <w:sz w:val="14"/>
+                <w:sz w:val="18"/>
               </w:rPr>
               <w:t>Veri tabanı hata hedefi L5 doğrulama ve rastgele denetimle korunur; otomatik onay oranı düşük kalırsa sistem daha fazla kaydı L5'e yönlendirir ve sonuçlar sınırlılık olarak raporlanır.</w:t>
             </w:r>
@@ -8028,7 +8028,7 @@
             <w:r>
               <w:rPr>
                 <w:rFonts w:ascii="Arial" w:hAnsi="Arial" w:eastAsia="Arial"/>
-                <w:sz w:val="14"/>
+                <w:sz w:val="18"/>
               </w:rPr>
               <w:t>Genel (Yasal)</w:t>
             </w:r>
@@ -8051,7 +8051,7 @@
             <w:r>
               <w:rPr>
                 <w:rFonts w:ascii="Arial" w:hAnsi="Arial" w:eastAsia="Arial"/>
-                <w:sz w:val="14"/>
+                <w:sz w:val="18"/>
               </w:rPr>
               <w:t>Telif ve metin-veri madenciliği (TDM) lisans kısıtları kapalı içeriğe erişimi sınırlayabilir.</w:t>
             </w:r>
@@ -8074,7 +8074,7 @@
             <w:r>
               <w:rPr>
                 <w:rFonts w:ascii="Arial" w:hAnsi="Arial" w:eastAsia="Arial"/>
-                <w:sz w:val="14"/>
+                <w:sz w:val="18"/>
               </w:rPr>
               <w:t>Açık erişim ve TDM uyumlu kaynaklar (Europe PMC, OpenAlex, açık lisanslı tam metinler) önceliklendirilir; kapalı içerikte yalnızca kurumsal/EKUAL lisans kapsamı ve ilgili istisnalar dahilinde çalışılır; yayımlanan çıktı telifli tam metin değil, kaynağa atıflı sayısal bileşim kayıtlarıdır; belirsiz durumlarda kurum hukuk birimi/TTO görüşü alınır.</w:t>
             </w:r>
@@ -8099,7 +8099,7 @@
             <w:r>
               <w:rPr>
                 <w:rFonts w:ascii="Arial" w:hAnsi="Arial" w:eastAsia="Arial"/>
-                <w:sz w:val="14"/>
+                <w:sz w:val="18"/>
               </w:rPr>
               <w:t>Yönetim</w:t>
             </w:r>
@@ -8122,7 +8122,7 @@
             <w:r>
               <w:rPr>
                 <w:rFonts w:ascii="Arial" w:hAnsi="Arial" w:eastAsia="Arial"/>
-                <w:sz w:val="14"/>
+                <w:sz w:val="18"/>
               </w:rPr>
               <w:t>Anahtar personel veya bursiyer ayrılması (mezuniyet, devir).</w:t>
             </w:r>
@@ -8145,7 +8145,7 @@
             <w:r>
               <w:rPr>
                 <w:rFonts w:ascii="Arial" w:hAnsi="Arial" w:eastAsia="Arial"/>
-                <w:sz w:val="14"/>
+                <w:sz w:val="18"/>
               </w:rPr>
               <w:t>Görevler en az iki kişiye yayılır; kod, veri ve protokoller sürüm kontrolü ve dokümantasyonla devredilebilir tutulur; bursiyer havuzu ilgili bölümlerden yenilenir; iki gıda mühendisliği bursiyerinin yüksek lisansa geçişi süreklilik sağlar.</w:t>
             </w:r>
@@ -8489,7 +8489,7 @@
               <w:rPr>
                 <w:rFonts w:ascii="Arial" w:hAnsi="Arial" w:eastAsia="Arial"/>
                 <w:b/>
-                <w:sz w:val="14"/>
+                <w:sz w:val="18"/>
               </w:rPr>
               <w:t>Altyapı / Erişim Kanalı</w:t>
             </w:r>
@@ -8520,7 +8520,7 @@
               <w:rPr>
                 <w:rFonts w:ascii="Arial" w:hAnsi="Arial" w:eastAsia="Arial"/>
                 <w:b/>
-                <w:sz w:val="14"/>
+                <w:sz w:val="18"/>
               </w:rPr>
               <w:t>Projede Kullanım Amacı</w:t>
             </w:r>
@@ -8545,7 +8545,7 @@
             <w:r>
               <w:rPr>
                 <w:rFonts w:ascii="Arial" w:hAnsi="Arial" w:eastAsia="Arial"/>
-                <w:sz w:val="14"/>
+                <w:sz w:val="18"/>
               </w:rPr>
               <w:t>Ev sahibi kurum sunucuları ve proje kapsamında alınacak GPU/NAS donanımı</w:t>
             </w:r>
@@ -8568,7 +8568,7 @@
             <w:r>
               <w:rPr>
                 <w:rFonts w:ascii="Arial" w:hAnsi="Arial" w:eastAsia="Arial"/>
-                <w:sz w:val="14"/>
+                <w:sz w:val="18"/>
               </w:rPr>
               <w:t>Birincil veri tabanı, çıkarım servisleri, model kontrol noktaları, PDF/tam metin önbelleği ve yedekleme.</w:t>
             </w:r>
@@ -8593,7 +8593,7 @@
             <w:r>
               <w:rPr>
                 <w:rFonts w:ascii="Arial" w:hAnsi="Arial" w:eastAsia="Arial"/>
-                <w:sz w:val="14"/>
+                <w:sz w:val="18"/>
               </w:rPr>
               <w:t>TRUBA yüksek başarımlı hesaplama kaynakları (TÜBİTAK ULAKBİM, 2026; proje kabulü sonrası uygunluk ve kaynak tahsisi başvurusu yapılacak hesaplama kanalı)</w:t>
             </w:r>
@@ -8616,7 +8616,7 @@
             <w:r>
               <w:rPr>
                 <w:rFonts w:ascii="Arial" w:hAnsi="Arial" w:eastAsia="Arial"/>
-                <w:sz w:val="14"/>
+                <w:sz w:val="18"/>
               </w:rPr>
               <w:t>Büyük ölçekli LLM ince ayarı, RLHF/tercih temelli eğitim süreçleri ve model kıyaslaması; tahsis gecikirse PEFT ölçeğindeki işler proje GPU'su ve kurum kaynaklarıyla yürütülür.</w:t>
             </w:r>
@@ -8641,7 +8641,7 @@
             <w:r>
               <w:rPr>
                 <w:rFonts w:ascii="Arial" w:hAnsi="Arial" w:eastAsia="Arial"/>
-                <w:sz w:val="14"/>
+                <w:sz w:val="18"/>
               </w:rPr>
               <w:t>Üniversite kütüphanesi ve EKUAL erişimi</w:t>
             </w:r>
@@ -8664,7 +8664,7 @@
             <w:r>
               <w:rPr>
                 <w:rFonts w:ascii="Arial" w:hAnsi="Arial" w:eastAsia="Arial"/>
-                <w:sz w:val="14"/>
+                <w:sz w:val="18"/>
               </w:rPr>
               <w:t>Web of Science, Scopus, ScienceDirect ve diğer lisanslı kaynaklarda literatür keşfi ve yasal tam metin erişimi.</w:t>
             </w:r>
@@ -8689,7 +8689,7 @@
             <w:r>
               <w:rPr>
                 <w:rFonts w:ascii="Arial" w:hAnsi="Arial" w:eastAsia="Arial"/>
-                <w:sz w:val="14"/>
+                <w:sz w:val="18"/>
               </w:rPr>
               <w:t>Mevcut OpenNutri prototip altyapısı</w:t>
             </w:r>
@@ -8712,7 +8712,7 @@
             <w:r>
               <w:rPr>
                 <w:rFonts w:ascii="Arial" w:hAnsi="Arial" w:eastAsia="Arial"/>
-                <w:sz w:val="14"/>
+                <w:sz w:val="18"/>
               </w:rPr>
               <w:t>Crawler, model kademesi, normalizasyon, uzman doğrulama arayüzü ve operasyonel veri tabanı için başlangıç platformu.</w:t>
             </w:r>
@@ -9058,7 +9058,7 @@
               <w:rPr>
                 <w:rFonts w:ascii="Arial" w:hAnsi="Arial" w:eastAsia="Arial"/>
                 <w:b/>
-                <w:sz w:val="14"/>
+                <w:sz w:val="18"/>
               </w:rPr>
               <w:t>Çıktı Türü</w:t>
             </w:r>
@@ -9088,7 +9088,7 @@
               <w:rPr>
                 <w:rFonts w:ascii="Arial" w:hAnsi="Arial" w:eastAsia="Arial"/>
                 <w:b/>
-                <w:sz w:val="14"/>
+                <w:sz w:val="18"/>
               </w:rPr>
               <w:t>Çıktı</w:t>
             </w:r>
@@ -9118,7 +9118,7 @@
               <w:rPr>
                 <w:rFonts w:ascii="Arial" w:hAnsi="Arial" w:eastAsia="Arial"/>
                 <w:b/>
-                <w:sz w:val="14"/>
+                <w:sz w:val="18"/>
               </w:rPr>
               <w:t>Öngörülen Zaman Aralığı</w:t>
             </w:r>
@@ -9143,7 +9143,7 @@
             <w:r>
               <w:rPr>
                 <w:rFonts w:ascii="Arial" w:hAnsi="Arial" w:eastAsia="Arial"/>
-                <w:sz w:val="14"/>
+                <w:sz w:val="18"/>
               </w:rPr>
               <w:t>Bilimsel/Akademik</w:t>
             </w:r>
@@ -9166,7 +9166,7 @@
             <w:r>
               <w:rPr>
                 <w:rFonts w:ascii="Arial" w:hAnsi="Arial" w:eastAsia="Arial"/>
-                <w:sz w:val="14"/>
+                <w:sz w:val="18"/>
               </w:rPr>
               <w:t>Büyük ölçekli gıda bileşimi veri çıkarma kıyaslaması: ticari ve ağırlıkları açık LLM'ler ile OpenNutri'nin doğruluk, maliyet ve hız karşılaştırması; değerlendirme veri seti ve kodunun yayımlanması.</w:t>
             </w:r>
@@ -9189,7 +9189,7 @@
             <w:r>
               <w:rPr>
                 <w:rFonts w:ascii="Arial" w:hAnsi="Arial" w:eastAsia="Arial"/>
-                <w:sz w:val="14"/>
+                <w:sz w:val="18"/>
               </w:rPr>
               <w:t>12-18 ay</w:t>
             </w:r>
@@ -9214,7 +9214,7 @@
             <w:r>
               <w:rPr>
                 <w:rFonts w:ascii="Arial" w:hAnsi="Arial" w:eastAsia="Arial"/>
-                <w:sz w:val="14"/>
+                <w:sz w:val="18"/>
               </w:rPr>
               <w:t>Bilimsel/Akademik</w:t>
             </w:r>
@@ -9237,7 +9237,7 @@
             <w:r>
               <w:rPr>
                 <w:rFonts w:ascii="Arial" w:hAnsi="Arial" w:eastAsia="Arial"/>
-                <w:sz w:val="14"/>
+                <w:sz w:val="18"/>
               </w:rPr>
               <w:t>Kademeli Hibrit Zekâ mimarisi makalesi: L1-L5 işlem hattı, Öğrenilmiş Yönlendirici, katmanlar arası öğrenme, ablasyon çalışmaları ve maliyet analizi.</w:t>
             </w:r>
@@ -9260,7 +9260,7 @@
             <w:r>
               <w:rPr>
                 <w:rFonts w:ascii="Arial" w:hAnsi="Arial" w:eastAsia="Arial"/>
-                <w:sz w:val="14"/>
+                <w:sz w:val="18"/>
               </w:rPr>
               <w:t>12-18 ay</w:t>
             </w:r>
@@ -9285,7 +9285,7 @@
             <w:r>
               <w:rPr>
                 <w:rFonts w:ascii="Arial" w:hAnsi="Arial" w:eastAsia="Arial"/>
-                <w:sz w:val="14"/>
+                <w:sz w:val="18"/>
               </w:rPr>
               <w:t>Bilimsel/Akademik</w:t>
             </w:r>
@@ -9308,7 +9308,7 @@
             <w:r>
               <w:rPr>
                 <w:rFonts w:ascii="Arial" w:hAnsi="Arial" w:eastAsia="Arial"/>
-                <w:sz w:val="14"/>
+                <w:sz w:val="18"/>
               </w:rPr>
               <w:t>OpenNutri-DB veri seti makalesi: veri tabanı tanımı, metodoloji, Türk gıda veri açığı analizi ve USDA/EuroFIR/TürKomp karşılaştırması.</w:t>
             </w:r>
@@ -9331,7 +9331,7 @@
             <w:r>
               <w:rPr>
                 <w:rFonts w:ascii="Arial" w:hAnsi="Arial" w:eastAsia="Arial"/>
-                <w:sz w:val="14"/>
+                <w:sz w:val="18"/>
               </w:rPr>
               <w:t>12-18 ay</w:t>
             </w:r>
@@ -9356,7 +9356,7 @@
             <w:r>
               <w:rPr>
                 <w:rFonts w:ascii="Arial" w:hAnsi="Arial" w:eastAsia="Arial"/>
-                <w:sz w:val="14"/>
+                <w:sz w:val="18"/>
               </w:rPr>
               <w:t>Ekonomik/Ticari/Sosyal</w:t>
             </w:r>
@@ -9379,7 +9379,7 @@
             <w:r>
               <w:rPr>
                 <w:rFonts w:ascii="Arial" w:hAnsi="Arial" w:eastAsia="Arial"/>
-                <w:sz w:val="14"/>
+                <w:sz w:val="18"/>
               </w:rPr>
               <w:t>OpenNutri Veri Tabanı: en az 500.000 kaynağı izlenebilir gıda-besin kaydı, en az 5.000 özgün Türk gıda ürünü/varyantı ve kaynakta mevcut olduğunda USDA FoodData Central'dan türetilen proje şemasındaki 181'e kadar besin bileşeni.</w:t>
             </w:r>
@@ -9402,7 +9402,7 @@
             <w:r>
               <w:rPr>
                 <w:rFonts w:ascii="Arial" w:hAnsi="Arial" w:eastAsia="Arial"/>
-                <w:sz w:val="14"/>
+                <w:sz w:val="18"/>
               </w:rPr>
               <w:t>6-12 ay ilk sürüm; 12-18 ay tam ölçek</w:t>
             </w:r>
@@ -9427,7 +9427,7 @@
             <w:r>
               <w:rPr>
                 <w:rFonts w:ascii="Arial" w:hAnsi="Arial" w:eastAsia="Arial"/>
-                <w:sz w:val="14"/>
+                <w:sz w:val="18"/>
               </w:rPr>
               <w:t>Ekonomik/Ticari/Sosyal</w:t>
             </w:r>
@@ -9450,7 +9450,7 @@
             <w:r>
               <w:rPr>
                 <w:rFonts w:ascii="Arial" w:hAnsi="Arial" w:eastAsia="Arial"/>
-                <w:sz w:val="14"/>
+                <w:sz w:val="18"/>
               </w:rPr>
               <w:t>OpenNutri API: sürekli güncellenen veri tabanına erişim sağlayan, dokümantasyon ve SDK içeren üretim REST API.</w:t>
             </w:r>
@@ -9473,7 +9473,7 @@
             <w:r>
               <w:rPr>
                 <w:rFonts w:ascii="Arial" w:hAnsi="Arial" w:eastAsia="Arial"/>
-                <w:sz w:val="14"/>
+                <w:sz w:val="18"/>
               </w:rPr>
               <w:t>12-18 ay</w:t>
             </w:r>
@@ -9498,7 +9498,7 @@
             <w:r>
               <w:rPr>
                 <w:rFonts w:ascii="Arial" w:hAnsi="Arial" w:eastAsia="Arial"/>
-                <w:sz w:val="14"/>
+                <w:sz w:val="18"/>
               </w:rPr>
               <w:t>Ekonomik/Ticari/Sosyal</w:t>
             </w:r>
@@ -9521,7 +9521,7 @@
             <w:r>
               <w:rPr>
                 <w:rFonts w:ascii="Arial" w:hAnsi="Arial" w:eastAsia="Arial"/>
-                <w:sz w:val="14"/>
+                <w:sz w:val="18"/>
               </w:rPr>
               <w:t>Kademeli doğrulama motoru: başka ülkelerin veya kurumların gıda bileşimi dijitalleştirme süreçlerine uyarlanabilir veri çıkarma/doğrulama motoru.</w:t>
             </w:r>
@@ -9544,7 +9544,7 @@
             <w:r>
               <w:rPr>
                 <w:rFonts w:ascii="Arial" w:hAnsi="Arial" w:eastAsia="Arial"/>
-                <w:sz w:val="14"/>
+                <w:sz w:val="18"/>
               </w:rPr>
               <w:t>12-18 ay</w:t>
             </w:r>
@@ -9569,7 +9569,7 @@
             <w:r>
               <w:rPr>
                 <w:rFonts w:ascii="Arial" w:hAnsi="Arial" w:eastAsia="Arial"/>
-                <w:sz w:val="14"/>
+                <w:sz w:val="18"/>
               </w:rPr>
               <w:t>Araştırmacı Yetiştirme</w:t>
             </w:r>
@@ -9592,7 +9592,7 @@
             <w:r>
               <w:rPr>
                 <w:rFonts w:ascii="Arial" w:hAnsi="Arial" w:eastAsia="Arial"/>
-                <w:sz w:val="14"/>
+                <w:sz w:val="18"/>
               </w:rPr>
               <w:t>Yazılım/Yapay Zekâ ekibi: LLM ince ayarı, RAG, RLHF/tercih temelli öğrenme, rota optimizasyonu, API geliştirme ve gıda veri standartları konularında uygulamalı eğitim.</w:t>
             </w:r>
@@ -9615,7 +9615,7 @@
             <w:r>
               <w:rPr>
                 <w:rFonts w:ascii="Arial" w:hAnsi="Arial" w:eastAsia="Arial"/>
-                <w:sz w:val="14"/>
+                <w:sz w:val="18"/>
               </w:rPr>
               <w:t>0-6 / 6-12 / 12-18 ay boyunca sürekli</w:t>
             </w:r>
@@ -9640,7 +9640,7 @@
             <w:r>
               <w:rPr>
                 <w:rFonts w:ascii="Arial" w:hAnsi="Arial" w:eastAsia="Arial"/>
-                <w:sz w:val="14"/>
+                <w:sz w:val="18"/>
               </w:rPr>
               <w:t>Araştırmacı Yetiştirme</w:t>
             </w:r>
@@ -9663,7 +9663,7 @@
             <w:r>
               <w:rPr>
                 <w:rFonts w:ascii="Arial" w:hAnsi="Arial" w:eastAsia="Arial"/>
-                <w:sz w:val="14"/>
+                <w:sz w:val="18"/>
               </w:rPr>
               <w:t>Gıda Bilimi ekibi: gıda bileşimi analizi, Türk gıda profillemesi, kalite kontrol protokolleri, USDA/EuroFIR/TürKomp çapraz referanslama ve yapay zekâ destekli doğrulama iş akışları.</w:t>
             </w:r>
@@ -9686,7 +9686,7 @@
             <w:r>
               <w:rPr>
                 <w:rFonts w:ascii="Arial" w:hAnsi="Arial" w:eastAsia="Arial"/>
-                <w:sz w:val="14"/>
+                <w:sz w:val="18"/>
               </w:rPr>
               <w:t>0-6 / 6-12 / 12-18 ay boyunca sürekli</w:t>
             </w:r>
@@ -9711,7 +9711,7 @@
             <w:r>
               <w:rPr>
                 <w:rFonts w:ascii="Arial" w:hAnsi="Arial" w:eastAsia="Arial"/>
-                <w:sz w:val="14"/>
+                <w:sz w:val="18"/>
               </w:rPr>
               <w:t>Araştırmacı Yetiştirme</w:t>
             </w:r>
@@ -9734,7 +9734,7 @@
             <w:r>
               <w:rPr>
                 <w:rFonts w:ascii="Arial" w:hAnsi="Arial" w:eastAsia="Arial"/>
-                <w:sz w:val="14"/>
+                <w:sz w:val="18"/>
               </w:rPr>
               <w:t>İki yüksek lisans tezi: gıda mühendisliği bursiyerlerinin doğrulama metodolojisi, Türk gıda veri açığı ve yapay zekâ destekli gıda bileşimi doğrulaması üzerine tez çalışmaları.</w:t>
             </w:r>
@@ -9757,7 +9757,7 @@
             <w:r>
               <w:rPr>
                 <w:rFonts w:ascii="Arial" w:hAnsi="Arial" w:eastAsia="Arial"/>
-                <w:sz w:val="14"/>
+                <w:sz w:val="18"/>
               </w:rPr>
               <w:t>6-12 / 12-18 ay</w:t>
             </w:r>
@@ -10136,7 +10136,7 @@
               <w:rPr>
                 <w:rFonts w:ascii="Arial" w:hAnsi="Arial" w:eastAsia="Arial"/>
                 <w:b/>
-                <w:sz w:val="14"/>
+                <w:sz w:val="18"/>
               </w:rPr>
               <w:t>Etki Türü</w:t>
             </w:r>
@@ -10173,7 +10173,7 @@
               <w:rPr>
                 <w:rFonts w:ascii="Arial" w:hAnsi="Arial" w:eastAsia="Arial"/>
                 <w:b/>
-                <w:sz w:val="14"/>
+                <w:sz w:val="18"/>
               </w:rPr>
               <w:t>Etki</w:t>
             </w:r>
@@ -10210,7 +10210,7 @@
               <w:rPr>
                 <w:rFonts w:ascii="Arial" w:hAnsi="Arial" w:eastAsia="Arial"/>
                 <w:b/>
-                <w:sz w:val="14"/>
+                <w:sz w:val="18"/>
               </w:rPr>
               <w:t>Öngörülen Zaman</w:t>
             </w:r>
@@ -10235,7 +10235,7 @@
             <w:r>
               <w:rPr>
                 <w:rFonts w:ascii="Arial" w:hAnsi="Arial" w:eastAsia="Arial"/>
-                <w:sz w:val="14"/>
+                <w:sz w:val="18"/>
               </w:rPr>
               <w:t>Toplumsal/Kültürel</w:t>
             </w:r>
@@ -10258,7 +10258,7 @@
             <w:r>
               <w:rPr>
                 <w:rFonts w:ascii="Arial" w:hAnsi="Arial" w:eastAsia="Arial"/>
-                <w:sz w:val="14"/>
+                <w:sz w:val="18"/>
               </w:rPr>
               <w:t>Türk yemek kültürüne uyarlanmış kanıta dayalı beslenme rehberliği; yerel gıdalar için daha doğru beslenme takibi ve diyet uygulamaları.</w:t>
             </w:r>
@@ -10281,7 +10281,7 @@
             <w:r>
               <w:rPr>
                 <w:rFonts w:ascii="Arial" w:hAnsi="Arial" w:eastAsia="Arial"/>
-                <w:sz w:val="14"/>
+                <w:sz w:val="18"/>
               </w:rPr>
               <w:t>18-36 ay</w:t>
             </w:r>
@@ -10306,7 +10306,7 @@
             <w:r>
               <w:rPr>
                 <w:rFonts w:ascii="Arial" w:hAnsi="Arial" w:eastAsia="Arial"/>
-                <w:sz w:val="14"/>
+                <w:sz w:val="18"/>
               </w:rPr>
               <w:t>Toplumsal/Kültürel</w:t>
             </w:r>
@@ -10329,7 +10329,7 @@
             <w:r>
               <w:rPr>
                 <w:rFonts w:ascii="Arial" w:hAnsi="Arial" w:eastAsia="Arial"/>
-                <w:sz w:val="14"/>
+                <w:sz w:val="18"/>
               </w:rPr>
               <w:t>Halk sağlığı politikaları için bölgesel ve ürün bazlı besin bileşimi referansı; okul beslenmesi ve bölgesel müdahalelerde yerel veri kullanımı.</w:t>
             </w:r>
@@ -10352,7 +10352,7 @@
             <w:r>
               <w:rPr>
                 <w:rFonts w:ascii="Arial" w:hAnsi="Arial" w:eastAsia="Arial"/>
-                <w:sz w:val="14"/>
+                <w:sz w:val="18"/>
               </w:rPr>
               <w:t>18-36 ay</w:t>
             </w:r>
@@ -10377,7 +10377,7 @@
             <w:r>
               <w:rPr>
                 <w:rFonts w:ascii="Arial" w:hAnsi="Arial" w:eastAsia="Arial"/>
-                <w:sz w:val="14"/>
+                <w:sz w:val="18"/>
               </w:rPr>
               <w:t>Sürdürülebilirlik</w:t>
             </w:r>
@@ -10400,7 +10400,7 @@
             <w:r>
               <w:rPr>
                 <w:rFonts w:ascii="Arial" w:hAnsi="Arial" w:eastAsia="Arial"/>
-                <w:sz w:val="14"/>
+                <w:sz w:val="18"/>
               </w:rPr>
               <w:t>Gıda tedarik zinciri izlenebilirliği ve Yeşil Mutabakat uyum süreçlerinde bileşimsel veri desteği.</w:t>
             </w:r>
@@ -10423,7 +10423,7 @@
             <w:r>
               <w:rPr>
                 <w:rFonts w:ascii="Arial" w:hAnsi="Arial" w:eastAsia="Arial"/>
-                <w:sz w:val="14"/>
+                <w:sz w:val="18"/>
               </w:rPr>
               <w:t>18-42 ay</w:t>
             </w:r>
@@ -10448,7 +10448,7 @@
             <w:r>
               <w:rPr>
                 <w:rFonts w:ascii="Arial" w:hAnsi="Arial" w:eastAsia="Arial"/>
-                <w:sz w:val="14"/>
+                <w:sz w:val="18"/>
               </w:rPr>
               <w:t>Akademik</w:t>
             </w:r>
@@ -10471,7 +10471,7 @@
             <w:r>
               <w:rPr>
                 <w:rFonts w:ascii="Arial" w:hAnsi="Arial" w:eastAsia="Arial"/>
-                <w:sz w:val="14"/>
+                <w:sz w:val="18"/>
               </w:rPr>
               <w:t>Yapay zekâ destekli gıda bileşimi çıkarımı için açık kıyaslama ve metodoloji; farmakoloji, çevre bilimi ve malzeme bilimi gibi alanlara aktarılabilir mimari.</w:t>
             </w:r>
@@ -10494,7 +10494,7 @@
             <w:r>
               <w:rPr>
                 <w:rFonts w:ascii="Arial" w:hAnsi="Arial" w:eastAsia="Arial"/>
-                <w:sz w:val="14"/>
+                <w:sz w:val="18"/>
               </w:rPr>
               <w:t>12-24 ay</w:t>
             </w:r>
@@ -10519,7 +10519,7 @@
             <w:r>
               <w:rPr>
                 <w:rFonts w:ascii="Arial" w:hAnsi="Arial" w:eastAsia="Arial"/>
-                <w:sz w:val="14"/>
+                <w:sz w:val="18"/>
               </w:rPr>
               <w:t>Akademik</w:t>
             </w:r>
@@ -10542,7 +10542,7 @@
             <w:r>
               <w:rPr>
                 <w:rFonts w:ascii="Arial" w:hAnsi="Arial" w:eastAsia="Arial"/>
-                <w:sz w:val="14"/>
+                <w:sz w:val="18"/>
               </w:rPr>
               <w:t>USDA FoodData Central, EFSA ve FAO/INFOODS gibi veri ekosistemleriyle uyumlu format sayesinde ulusal/uluslararası iş birliği zemini.</w:t>
             </w:r>
@@ -10565,7 +10565,7 @@
             <w:r>
               <w:rPr>
                 <w:rFonts w:ascii="Arial" w:hAnsi="Arial" w:eastAsia="Arial"/>
-                <w:sz w:val="14"/>
+                <w:sz w:val="18"/>
               </w:rPr>
               <w:t>18-36 ay</w:t>
             </w:r>
@@ -10590,7 +10590,7 @@
             <w:r>
               <w:rPr>
                 <w:rFonts w:ascii="Arial" w:hAnsi="Arial" w:eastAsia="Arial"/>
-                <w:sz w:val="14"/>
+                <w:sz w:val="18"/>
               </w:rPr>
               <w:t>Akademik</w:t>
             </w:r>
@@ -10613,7 +10613,7 @@
             <w:r>
               <w:rPr>
                 <w:rFonts w:ascii="Arial" w:hAnsi="Arial" w:eastAsia="Arial"/>
-                <w:sz w:val="14"/>
+                <w:sz w:val="18"/>
               </w:rPr>
               <w:t>Yapay zekâ ve gıda bilimi kesişiminde eğitim almış 4 bursiyer; ikisi yüksek lisans düzeyine geçerek tez üretir, ekipte disiplinler arası uzmanlık kazanılır.</w:t>
             </w:r>
@@ -10636,7 +10636,7 @@
             <w:r>
               <w:rPr>
                 <w:rFonts w:ascii="Arial" w:hAnsi="Arial" w:eastAsia="Arial"/>
-                <w:sz w:val="14"/>
+                <w:sz w:val="18"/>
               </w:rPr>
               <w:t>0-18 ay</w:t>
             </w:r>
@@ -10661,7 +10661,7 @@
             <w:r>
               <w:rPr>
                 <w:rFonts w:ascii="Arial" w:hAnsi="Arial" w:eastAsia="Arial"/>
-                <w:sz w:val="14"/>
+                <w:sz w:val="18"/>
               </w:rPr>
               <w:t>Ekonomik</w:t>
             </w:r>
@@ -10684,7 +10684,7 @@
             <w:r>
               <w:rPr>
                 <w:rFonts w:ascii="Arial" w:hAnsi="Arial" w:eastAsia="Arial"/>
-                <w:sz w:val="14"/>
+                <w:sz w:val="18"/>
               </w:rPr>
               <w:t>Gıda ihracatı, sağlık teknolojisi, diyetisyen uygulamaları, gıda üretim kalite kontrolü ve tarımsal ürün pazarlaması için veri altyapısı.</w:t>
             </w:r>
@@ -10707,7 +10707,7 @@
             <w:r>
               <w:rPr>
                 <w:rFonts w:ascii="Arial" w:hAnsi="Arial" w:eastAsia="Arial"/>
-                <w:sz w:val="14"/>
+                <w:sz w:val="18"/>
               </w:rPr>
               <w:t>18-36 ay</w:t>
             </w:r>
@@ -10732,7 +10732,7 @@
             <w:r>
               <w:rPr>
                 <w:rFonts w:ascii="Arial" w:hAnsi="Arial" w:eastAsia="Arial"/>
-                <w:sz w:val="14"/>
+                <w:sz w:val="18"/>
               </w:rPr>
               <w:t>Ekonomik</w:t>
             </w:r>
@@ -10755,7 +10755,7 @@
             <w:r>
               <w:rPr>
                 <w:rFonts w:ascii="Arial" w:hAnsi="Arial" w:eastAsia="Arial"/>
-                <w:sz w:val="14"/>
+                <w:sz w:val="18"/>
               </w:rPr>
               <w:t>Veri lisanslama, API aboneliği ve doğrulama motoru uyarlamasıyla iki ana gelir kanalı.</w:t>
             </w:r>
@@ -10778,7 +10778,7 @@
             <w:r>
               <w:rPr>
                 <w:rFonts w:ascii="Arial" w:hAnsi="Arial" w:eastAsia="Arial"/>
-                <w:sz w:val="14"/>
+                <w:sz w:val="18"/>
               </w:rPr>
               <w:t>24-48 ay</w:t>
             </w:r>
@@ -10803,7 +10803,7 @@
             <w:r>
               <w:rPr>
                 <w:rFonts w:ascii="Arial" w:hAnsi="Arial" w:eastAsia="Arial"/>
-                <w:sz w:val="14"/>
+                <w:sz w:val="18"/>
               </w:rPr>
               <w:t>İstihdam</w:t>
             </w:r>
@@ -10826,7 +10826,7 @@
             <w:r>
               <w:rPr>
                 <w:rFonts w:ascii="Arial" w:hAnsi="Arial" w:eastAsia="Arial"/>
-                <w:sz w:val="14"/>
+                <w:sz w:val="18"/>
               </w:rPr>
               <w:t>Proje sonrası 2 yıl içinde veri operasyonları, API mühendisliği ve iş geliştirme rollerini kapsayan 5-10 kişilik spin-off hedefi; ekosistemde 10-20 dolaylı istihdam potansiyeli.</w:t>
             </w:r>
@@ -10849,7 +10849,7 @@
             <w:r>
               <w:rPr>
                 <w:rFonts w:ascii="Arial" w:hAnsi="Arial" w:eastAsia="Arial"/>
-                <w:sz w:val="14"/>
+                <w:sz w:val="18"/>
               </w:rPr>
               <w:t>18-36 ay</w:t>
             </w:r>
@@ -10874,7 +10874,7 @@
             <w:r>
               <w:rPr>
                 <w:rFonts w:ascii="Arial" w:hAnsi="Arial" w:eastAsia="Arial"/>
-                <w:sz w:val="14"/>
+                <w:sz w:val="18"/>
               </w:rPr>
               <w:t>Rekabetçilik</w:t>
             </w:r>
@@ -10897,7 +10897,7 @@
             <w:r>
               <w:rPr>
                 <w:rFonts w:ascii="Arial" w:hAnsi="Arial" w:eastAsia="Arial"/>
-                <w:sz w:val="14"/>
+                <w:sz w:val="18"/>
               </w:rPr>
               <w:t>Yabancı besin veri tabanlarına bağımlılığı azaltan, Türk gıdalarını kapsayan ulusal alternatif; ihracat ve yerli sağlık teknolojileri için doğruluk avantajı.</w:t>
             </w:r>
@@ -10920,7 +10920,7 @@
             <w:r>
               <w:rPr>
                 <w:rFonts w:ascii="Arial" w:hAnsi="Arial" w:eastAsia="Arial"/>
-                <w:sz w:val="14"/>
+                <w:sz w:val="18"/>
               </w:rPr>
               <w:t>18-48 ay</w:t>
             </w:r>
@@ -10945,7 +10945,7 @@
             <w:r>
               <w:rPr>
                 <w:rFonts w:ascii="Arial" w:hAnsi="Arial" w:eastAsia="Arial"/>
-                <w:sz w:val="14"/>
+                <w:sz w:val="18"/>
               </w:rPr>
               <w:t>Ulusal Güvenlik</w:t>
             </w:r>
@@ -10968,7 +10968,7 @@
             <w:r>
               <w:rPr>
                 <w:rFonts w:ascii="Arial" w:hAnsi="Arial" w:eastAsia="Arial"/>
-                <w:sz w:val="14"/>
+                <w:sz w:val="18"/>
               </w:rPr>
               <w:t>Gıda bileşimi verisi üzerinde ulusal kontrol, yabancı veri tabanı fiyat/erişim değişikliklerine karşı dayanıklılık ve kriz dönemlerinde beslenme planlaması desteği.</w:t>
             </w:r>
@@ -10991,7 +10991,7 @@
             <w:r>
               <w:rPr>
                 <w:rFonts w:ascii="Arial" w:hAnsi="Arial" w:eastAsia="Arial"/>
-                <w:sz w:val="14"/>
+                <w:sz w:val="18"/>
               </w:rPr>
               <w:t>12-48 ay</w:t>
             </w:r>
@@ -11016,7 +11016,7 @@
             <w:r>
               <w:rPr>
                 <w:rFonts w:ascii="Arial" w:hAnsi="Arial" w:eastAsia="Arial"/>
-                <w:sz w:val="14"/>
+                <w:sz w:val="18"/>
               </w:rPr>
               <w:t>Veri Egemenliği / Siber Dayanıklılık</w:t>
             </w:r>
@@ -11039,7 +11039,7 @@
             <w:r>
               <w:rPr>
                 <w:rFonts w:ascii="Arial" w:hAnsi="Arial" w:eastAsia="Arial"/>
-                <w:sz w:val="14"/>
+                <w:sz w:val="18"/>
               </w:rPr>
               <w:t>Çekirdek veri ve model altyapısının kurum/proje donanımı ve tahsis alınan TRUBA kaynakları üzerinde yürütülmesi, bulut kullanımının yedekleme ve dağıtımla sınırlandırılması ve açık kaynaklı yığın sayesinde verinin yurt içinde tutulması; yabancı bulut/tedarikçi bağımlılığının ve buna bağlı erişim/fiyat risklerinin azaltılması.</w:t>
             </w:r>
@@ -11062,7 +11062,7 @@
             <w:r>
               <w:rPr>
                 <w:rFonts w:ascii="Arial" w:hAnsi="Arial" w:eastAsia="Arial"/>
-                <w:sz w:val="14"/>
+                <w:sz w:val="18"/>
               </w:rPr>
               <w:t>12-48 ay</w:t>
             </w:r>
@@ -11790,7 +11790,7 @@
               <w:rPr>
                 <w:rFonts w:ascii="Arial" w:hAnsi="Arial" w:eastAsia="Arial"/>
                 <w:b/>
-                <w:sz w:val="14"/>
+                <w:sz w:val="18"/>
               </w:rPr>
               <w:t>Etkinlik Türü</w:t>
             </w:r>
@@ -11821,7 +11821,7 @@
               <w:rPr>
                 <w:rFonts w:ascii="Arial" w:hAnsi="Arial" w:eastAsia="Arial"/>
                 <w:b/>
-                <w:sz w:val="14"/>
+                <w:sz w:val="18"/>
               </w:rPr>
               <w:t>Paydaş / Olası Kullanıcılar</w:t>
             </w:r>
@@ -11852,7 +11852,7 @@
               <w:rPr>
                 <w:rFonts w:ascii="Arial" w:hAnsi="Arial" w:eastAsia="Arial"/>
                 <w:b/>
-                <w:sz w:val="14"/>
+                <w:sz w:val="18"/>
               </w:rPr>
               <w:t>Zaman ve Süre</w:t>
             </w:r>
@@ -11877,7 +11877,7 @@
             <w:r>
               <w:rPr>
                 <w:rFonts w:ascii="Arial" w:hAnsi="Arial" w:eastAsia="Arial"/>
-                <w:sz w:val="14"/>
+                <w:sz w:val="18"/>
               </w:rPr>
               <w:t>Proje web sitesi: dokümantasyon, ilerleme güncellemeleri, API erken erişim kaydı</w:t>
             </w:r>
@@ -11900,7 +11900,7 @@
             <w:r>
               <w:rPr>
                 <w:rFonts w:ascii="Arial" w:hAnsi="Arial" w:eastAsia="Arial"/>
-                <w:sz w:val="14"/>
+                <w:sz w:val="18"/>
               </w:rPr>
               <w:t>Araştırmacılar, geliştiriciler, gıda endüstrisi profesyonelleri, genel kamuoyu</w:t>
             </w:r>
@@ -11924,14 +11924,14 @@
             <w:r>
               <w:rPr>
                 <w:rFonts w:ascii="Arial" w:hAnsi="Arial" w:eastAsia="Arial"/>
-                <w:sz w:val="14"/>
+                <w:sz w:val="18"/>
               </w:rPr>
               <w:t xml:space="preserve">1. </w:t>
             </w:r>
             <w:r>
               <w:rPr>
                 <w:rFonts w:ascii="Arial" w:hAnsi="Arial" w:eastAsia="Arial"/>
-                <w:sz w:val="14"/>
+                <w:sz w:val="18"/>
               </w:rPr>
               <w:t>aydan itibaren; proje süresince ve sonrasında</w:t>
             </w:r>
@@ -11956,7 +11956,7 @@
             <w:r>
               <w:rPr>
                 <w:rFonts w:ascii="Arial" w:hAnsi="Arial" w:eastAsia="Arial"/>
-                <w:sz w:val="14"/>
+                <w:sz w:val="18"/>
               </w:rPr>
               <w:t>Akademik/profesyonel duyurular (ResearchGate, Google Scholar profili, LinkedIn, X)</w:t>
             </w:r>
@@ -11979,7 +11979,7 @@
             <w:r>
               <w:rPr>
                 <w:rFonts w:ascii="Arial" w:hAnsi="Arial" w:eastAsia="Arial"/>
-                <w:sz w:val="14"/>
+                <w:sz w:val="18"/>
               </w:rPr>
               <w:t>Akademik ve profesyonel kitle</w:t>
             </w:r>
@@ -12003,14 +12003,14 @@
             <w:r>
               <w:rPr>
                 <w:rFonts w:ascii="Arial" w:hAnsi="Arial" w:eastAsia="Arial"/>
-                <w:sz w:val="14"/>
+                <w:sz w:val="18"/>
               </w:rPr>
               <w:t xml:space="preserve">6. </w:t>
             </w:r>
             <w:r>
               <w:rPr>
                 <w:rFonts w:ascii="Arial" w:hAnsi="Arial" w:eastAsia="Arial"/>
-                <w:sz w:val="14"/>
+                <w:sz w:val="18"/>
               </w:rPr>
               <w:t>aydan itibaren sürekli</w:t>
             </w:r>
@@ -12035,7 +12035,7 @@
             <w:r>
               <w:rPr>
                 <w:rFonts w:ascii="Arial" w:hAnsi="Arial" w:eastAsia="Arial"/>
-                <w:sz w:val="14"/>
+                <w:sz w:val="18"/>
               </w:rPr>
               <w:t>Hakemli yayınlar: kıyaslama, mimari, veri seti</w:t>
             </w:r>
@@ -12058,7 +12058,7 @@
             <w:r>
               <w:rPr>
                 <w:rFonts w:ascii="Arial" w:hAnsi="Arial" w:eastAsia="Arial"/>
-                <w:sz w:val="14"/>
+                <w:sz w:val="18"/>
               </w:rPr>
               <w:t>Gıda bilimi, yapay zekâ/NLP ve veri bilimi toplulukları</w:t>
             </w:r>
@@ -12081,7 +12081,7 @@
             <w:r>
               <w:rPr>
                 <w:rFonts w:ascii="Arial" w:hAnsi="Arial" w:eastAsia="Arial"/>
-                <w:sz w:val="14"/>
+                <w:sz w:val="18"/>
               </w:rPr>
               <w:t>12-18. aylar</w:t>
             </w:r>
@@ -12106,7 +12106,7 @@
             <w:r>
               <w:rPr>
                 <w:rFonts w:ascii="Arial" w:hAnsi="Arial" w:eastAsia="Arial"/>
-                <w:sz w:val="14"/>
+                <w:sz w:val="18"/>
               </w:rPr>
               <w:t>Açık araştırma veri seti yayını (Zenodo / HuggingFace)</w:t>
             </w:r>
@@ -12129,7 +12129,7 @@
             <w:r>
               <w:rPr>
                 <w:rFonts w:ascii="Arial" w:hAnsi="Arial" w:eastAsia="Arial"/>
-                <w:sz w:val="14"/>
+                <w:sz w:val="18"/>
               </w:rPr>
               <w:t>Küresel araştırma topluluğu, FAO/INFOODS, USDA/EFSA ekosistemi, sağlık teknolojisi geliştiricileri</w:t>
             </w:r>
@@ -12152,7 +12152,7 @@
             <w:r>
               <w:rPr>
                 <w:rFonts w:ascii="Arial" w:hAnsi="Arial" w:eastAsia="Arial"/>
-                <w:sz w:val="14"/>
+                <w:sz w:val="18"/>
               </w:rPr>
               <w:t>14-16. aylar</w:t>
             </w:r>
@@ -12177,7 +12177,7 @@
             <w:r>
               <w:rPr>
                 <w:rFonts w:ascii="Arial" w:hAnsi="Arial" w:eastAsia="Arial"/>
-                <w:sz w:val="14"/>
+                <w:sz w:val="18"/>
               </w:rPr>
               <w:t>API dokümantasyonu ve SDK sürümü</w:t>
             </w:r>
@@ -12200,7 +12200,7 @@
             <w:r>
               <w:rPr>
                 <w:rFonts w:ascii="Arial" w:hAnsi="Arial" w:eastAsia="Arial"/>
-                <w:sz w:val="14"/>
+                <w:sz w:val="18"/>
               </w:rPr>
               <w:t>Yazılım geliştiriciler, sağlık teknolojisi şirketleri, beslenme uygulamaları</w:t>
             </w:r>
@@ -12223,7 +12223,7 @@
             <w:r>
               <w:rPr>
                 <w:rFonts w:ascii="Arial" w:hAnsi="Arial" w:eastAsia="Arial"/>
-                <w:sz w:val="14"/>
+                <w:sz w:val="18"/>
               </w:rPr>
               <w:t>14-16. aylar</w:t>
             </w:r>
@@ -12248,7 +12248,7 @@
             <w:r>
               <w:rPr>
                 <w:rFonts w:ascii="Arial" w:hAnsi="Arial" w:eastAsia="Arial"/>
-                <w:sz w:val="14"/>
+                <w:sz w:val="18"/>
               </w:rPr>
               <w:t>Ulusal akademik çalıştay/seminer</w:t>
             </w:r>
@@ -12271,7 +12271,7 @@
             <w:r>
               <w:rPr>
                 <w:rFonts w:ascii="Arial" w:hAnsi="Arial" w:eastAsia="Arial"/>
-                <w:sz w:val="14"/>
+                <w:sz w:val="18"/>
               </w:rPr>
               <w:t>Türk gıda bilimi ve bilgisayar bilimi araştırmacıları, lisansüstü öğrenciler, TürKomp/BEBIS ekibi</w:t>
             </w:r>
@@ -12295,14 +12295,14 @@
             <w:r>
               <w:rPr>
                 <w:rFonts w:ascii="Arial" w:hAnsi="Arial" w:eastAsia="Arial"/>
-                <w:sz w:val="14"/>
+                <w:sz w:val="18"/>
               </w:rPr>
               <w:t xml:space="preserve">14. </w:t>
             </w:r>
             <w:r>
               <w:rPr>
                 <w:rFonts w:ascii="Arial" w:hAnsi="Arial" w:eastAsia="Arial"/>
-                <w:sz w:val="14"/>
+                <w:sz w:val="18"/>
               </w:rPr>
               <w:t>ay</w:t>
             </w:r>
@@ -12327,7 +12327,7 @@
             <w:r>
               <w:rPr>
                 <w:rFonts w:ascii="Arial" w:hAnsi="Arial" w:eastAsia="Arial"/>
-                <w:sz w:val="14"/>
+                <w:sz w:val="18"/>
               </w:rPr>
               <w:t>Sektör tanıtım günü / paydaş toplantısı</w:t>
             </w:r>
@@ -12350,7 +12350,7 @@
             <w:r>
               <w:rPr>
                 <w:rFonts w:ascii="Arial" w:hAnsi="Arial" w:eastAsia="Arial"/>
-                <w:sz w:val="14"/>
+                <w:sz w:val="18"/>
               </w:rPr>
               <w:t>Gıda ihracatçıları, sağlık teknolojisi girişimleri, diyetisyenler, kamu paydaşları</w:t>
             </w:r>
@@ -12374,14 +12374,14 @@
             <w:r>
               <w:rPr>
                 <w:rFonts w:ascii="Arial" w:hAnsi="Arial" w:eastAsia="Arial"/>
-                <w:sz w:val="14"/>
+                <w:sz w:val="18"/>
               </w:rPr>
               <w:t xml:space="preserve">16. </w:t>
             </w:r>
             <w:r>
               <w:rPr>
                 <w:rFonts w:ascii="Arial" w:hAnsi="Arial" w:eastAsia="Arial"/>
-                <w:sz w:val="14"/>
+                <w:sz w:val="18"/>
               </w:rPr>
               <w:t>ay</w:t>
             </w:r>
@@ -12406,7 +12406,7 @@
             <w:r>
               <w:rPr>
                 <w:rFonts w:ascii="Arial" w:hAnsi="Arial" w:eastAsia="Arial"/>
-                <w:sz w:val="14"/>
+                <w:sz w:val="18"/>
               </w:rPr>
               <w:t>Uluslararası konferans sunumları</w:t>
             </w:r>
@@ -12429,7 +12429,7 @@
             <w:r>
               <w:rPr>
                 <w:rFonts w:ascii="Arial" w:hAnsi="Arial" w:eastAsia="Arial"/>
-                <w:sz w:val="14"/>
+                <w:sz w:val="18"/>
               </w:rPr>
               <w:t>Akademik topluluk ve sektör temsilcileri</w:t>
             </w:r>
@@ -12452,7 +12452,7 @@
             <w:r>
               <w:rPr>
                 <w:rFonts w:ascii="Arial" w:hAnsi="Arial" w:eastAsia="Arial"/>
-                <w:sz w:val="14"/>
+                <w:sz w:val="18"/>
               </w:rPr>
               <w:t>15-18. aylar</w:t>
             </w:r>
@@ -12477,7 +12477,7 @@
             <w:r>
               <w:rPr>
                 <w:rFonts w:ascii="Arial" w:hAnsi="Arial" w:eastAsia="Arial"/>
-                <w:sz w:val="14"/>
+                <w:sz w:val="18"/>
               </w:rPr>
               <w:t>Türk gıda ihracatçı birliklerine doğrudan erişim</w:t>
             </w:r>
@@ -12500,7 +12500,7 @@
             <w:r>
               <w:rPr>
                 <w:rFonts w:ascii="Arial" w:hAnsi="Arial" w:eastAsia="Arial"/>
-                <w:sz w:val="14"/>
+                <w:sz w:val="18"/>
               </w:rPr>
               <w:t>TİM ve ilgili ihracatçı birlikleri, gıda ihracat şirketleri</w:t>
             </w:r>
@@ -12523,7 +12523,7 @@
             <w:r>
               <w:rPr>
                 <w:rFonts w:ascii="Arial" w:hAnsi="Arial" w:eastAsia="Arial"/>
-                <w:sz w:val="14"/>
+                <w:sz w:val="18"/>
               </w:rPr>
               <w:t>14-18. aylar</w:t>
             </w:r>
@@ -12548,7 +12548,7 @@
             <w:r>
               <w:rPr>
                 <w:rFonts w:ascii="Arial" w:hAnsi="Arial" w:eastAsia="Arial"/>
-                <w:sz w:val="14"/>
+                <w:sz w:val="18"/>
               </w:rPr>
               <w:t>TÜBİTAK proje tanıtımı / bilim fuarı katılımı</w:t>
             </w:r>
@@ -12571,7 +12571,7 @@
             <w:r>
               <w:rPr>
                 <w:rFonts w:ascii="Arial" w:hAnsi="Arial" w:eastAsia="Arial"/>
-                <w:sz w:val="14"/>
+                <w:sz w:val="18"/>
               </w:rPr>
               <w:t>TÜBİTAK topluluğu, genel kamuoyu, potansiyel sektör ortakları</w:t>
             </w:r>
@@ -12595,14 +12595,14 @@
             <w:r>
               <w:rPr>
                 <w:rFonts w:ascii="Arial" w:hAnsi="Arial" w:eastAsia="Arial"/>
-                <w:sz w:val="14"/>
+                <w:sz w:val="18"/>
               </w:rPr>
               <w:t xml:space="preserve">18. </w:t>
             </w:r>
             <w:r>
               <w:rPr>
                 <w:rFonts w:ascii="Arial" w:hAnsi="Arial" w:eastAsia="Arial"/>
-                <w:sz w:val="14"/>
+                <w:sz w:val="18"/>
               </w:rPr>
               <w:t>ay</w:t>
             </w:r>

</xml_diff>

<commit_message>
Drop committed +15 learning target; make TürKomp complementarity explicit
Goal 4: remove the committed "+15 puan" L3 auto-resolution target and the WP4
clause. It was largely redundant — cost-per-paper already captures commercial-API
reliance and auto-approval rate already captures human-free completion. The
cross-layer-learning effect is now stated as tracked via those two metrics plus
the existing 4.7.3 learning-curve and router-regret analyses, with no extra
committed number to defend.

4.6.1: add an explicit complement-not-compete stance toward TürKomp — OpenNutri
does not re-produce TürKomp's high-quality basic-food analysis; it makes that
national data internationally interoperable and scales coverage to the literature
tail (regional products, variants, prepared dishes) that TürKomp's manual lab
method has not reached. Respectful framing given TÜBİTAK MAM authored TürKomp.

Main form stays 19 pages.

Co-Authored-By: Claude Opus 4.8 <noreply@anthropic.com>
</commit_message>
<xml_diff>
--- a/docs/OpenNutri_1005_Application_Filled_Template.docx
+++ b/docs/OpenNutri_1005_Application_Filled_Template.docx
@@ -1642,19 +1642,7 @@
                 <w:rFonts w:ascii="Arial" w:hAnsi="Arial" w:eastAsia="Arial"/>
                 <w:sz w:val="18"/>
               </w:rPr>
-              <w:t>Hedef 1'de tanımlanan dört ölçüt (otomatik onay doğruluğu ≥%99,5, otomatik onay oranı ≥%90, veri tabanı hata oranı &lt;%0,5, makale başına maliyet &lt;$0,01), uzman geri bildirimiyle eğitilen alt katmanların zaman içinde iyileşmesiyle hedeflenir. Maliyet hedefleri otomatik işleme maliyetini ifade eder; uzman doğrulama emeği WP4'te ayrıca bütçelenir. Ölçütlerin tam tanımları Bölüm 4.7.1'dedir.</w:t>
-            </w:r>
-          </w:p>
-          <w:p>
-            <w:pPr>
-              <w:spacing w:after="40" w:before="0" w:line="240" w:lineRule="auto"/>
-            </w:pPr>
-            <w:r>
-              <w:rPr>
-                <w:rFonts w:ascii="Arial" w:hAnsi="Arial" w:eastAsia="Arial"/>
-                <w:sz w:val="18"/>
-              </w:rPr>
-              <w:t>Bunlara ek olarak, katmanlar arası öğrenmenin etkisini doğrudan ölçen bir gösterge izlenir: aynı zorluk dağılımı için, L4/L5 yükseltmesine gerek kalmadan L3'te otomatik çözülen makalelerin oranının, proje başındaki kalibrasyon düzeyine kıyasla WP4 boyunca anlamlı biçimde artması (hedef olarak en az +15 puan). Bu gösterge, uzman geri bildiriminin yalnızca bir kalite kontrol maliyeti değil, alt katmanları iyileştiren bir eğitim yatırımı olduğu yönündeki temel iddianın doğrudan kanıtıdır.</w:t>
+              <w:t>Hedef 1'de tanımlanan dört ölçüt (otomatik onay doğruluğu ≥%99,5, otomatik onay oranı ≥%90, veri tabanı hata oranı &lt;%0,5, makale başına maliyet &lt;$0,01), uzman geri bildirimiyle eğitilen alt katmanların zaman içinde iyileşmesiyle hedeflenir. Maliyet hedefleri otomatik işleme maliyetini ifade eder; uzman doğrulama emeği WP4'te ayrıca bütçelenir. Ölçütlerin tam tanımları Bölüm 4.7.1'dedir. Katmanlar arası öğrenmenin etkisi ayrıca makale başına maliyetin düşmesi ve otomatik onay oranının artmasıyla, ek olarak Bölüm 4.7.3'teki öğrenme eğrileri ve yönlendirici pişmanlık analizleriyle izlenecektir.</w:t>
             </w:r>
           </w:p>
           <w:p>
@@ -5070,7 +5058,7 @@
                 <w:rFonts w:ascii="Arial" w:hAnsi="Arial" w:eastAsia="Arial"/>
                 <w:sz w:val="18"/>
               </w:rPr>
-              <w:t>TürKomp 500'den fazla analiz edilmiş gıda için güçlü bir temel sunsa da Türkiye'nin tarımsal ve kültürel gıda çeşitliliği çok daha geniştir. Bilimsel literatürde belgelenen birçok yerel gıda, yöresel ürün ve ürün varyantı USDA FoodData Central veya EuroFIR gibi uluslararası gıda bileşimi veri tabanlarında bulunmamaktadır. Bu açığın kesin ölçümü projenin erken çıktılarından biridir: Türkçe ve Türkiye kaynaklı literatür sistematik olarak indekslenecek, uluslararası veri tabanlarında bulunmayan gıda öğeleri makine tarafından okunabilir biçimde sayılacak ve en az 5.000 özgün Türk gıda ürünü veya varyantı hedeflenecektir.</w:t>
+              <w:t>TürKomp 500'den fazla analiz edilmiş gıda için güçlü bir temel sunsa da Türkiye'nin tarımsal ve kültürel gıda çeşitliliği çok daha geniştir. Bilimsel literatürde belgelenen birçok yerel gıda, yöresel ürün ve ürün varyantı USDA FoodData Central veya EuroFIR gibi uluslararası gıda bileşimi veri tabanlarında bulunmamaktadır. Bu açığın kesin ölçümü projenin erken çıktılarından biridir: Türkçe ve Türkiye kaynaklı literatür sistematik olarak indekslenecek, uluslararası veri tabanlarında bulunmayan gıda öğeleri makine tarafından okunabilir biçimde sayılacak ve en az 5.000 özgün Türk gıda ürünü veya varyantı hedeflenecektir. OpenNutri'nin TürKomp karşısındaki konumu rekabet değil tamamlayıcılıktır: amaç, TürKomp'un yüksek kaliteyle analiz ettiği temel gıdaları yeniden üretmek değil; bu ulusal veriyi uluslararası altyapılarla birlikte çalışabilir kılmak ve TürKomp'un manuel laboratuvar yöntemiyle henüz ulaşamadığı geniş literatür kuyruğunu (yöresel ürünler, ürün varyantları ve hazır yemekler) ölçeklenebilir biçimde kapsamaktır.</w:t>
             </w:r>
           </w:p>
           <w:p>
@@ -6759,7 +6747,7 @@
                 <w:rFonts w:ascii="Arial" w:hAnsi="Arial" w:eastAsia="Arial"/>
                 <w:sz w:val="18"/>
               </w:rPr>
-              <w:t>≥5.000 uzman doğrulamalı makale; ≥25.000 altın standart kayıt; kabul edilen kayıtların rastgele denetiminde hata &lt;%0,5; otomatik onay oranı ≥%90; L3'te yükseltmesiz otomatik çözülen makale oranında kalibrasyona göre ölçülebilir artış (katmanlar arası öğrenme etkisi).</w:t>
+              <w:t>≥5.000 uzman doğrulamalı makale; ≥25.000 altın standart kayıt; kabul edilen kayıtların rastgele denetiminde hata &lt;%0,5; otomatik onay oranı ≥%90.</w:t>
             </w:r>
           </w:p>
         </w:tc>

</xml_diff>

<commit_message>
Polish 1005 main form acceptance pass
</commit_message>
<xml_diff>
--- a/docs/OpenNutri_1005_Application_Filled_Template.docx
+++ b/docs/OpenNutri_1005_Application_Filled_Template.docx
@@ -597,7 +597,7 @@
                 <w:rFonts w:ascii="Arial" w:hAnsi="Arial" w:eastAsia="Arial"/>
                 <w:sz w:val="18"/>
               </w:rPr>
-              <w:t>Akademik literatürde yer alan birçok belirgin Türk gıdası, USDA FoodData Central ve EuroFIR gibi uluslararası gıda bileşimi veri tabanlarında bulunmamaktadır; proje bu açığı kapatmak üzere tasarlanmıştır (Bölüm 4.6.1).</w:t>
+              <w:t>Akademik literatürde yer alan birçok belirgin Türk gıdası, USDA FoodData Central gibi uluslararası gıda bileşimi veri altyapılarında yeterince temsil edilmemektedir; proje bu açığı kapatmak üzere tasarlanmıştır (Bölüm 4.6.1).</w:t>
             </w:r>
           </w:p>
           <w:p>
@@ -1642,7 +1642,7 @@
                 <w:rFonts w:ascii="Arial" w:hAnsi="Arial" w:eastAsia="Arial"/>
                 <w:sz w:val="18"/>
               </w:rPr>
-              <w:t>Hedef 1'de tanımlanan dört ölçüt (otomatik onay doğruluğu ≥%99,5, otomatik onay oranı ≥%90, veri tabanı hata oranı &lt;%0,5, makale başına maliyet &lt;$0,01), uzman geri bildirimiyle eğitilen alt katmanların zaman içinde iyileşmesiyle hedeflenir. Maliyet hedefleri otomatik işleme maliyetini ifade eder; uzman doğrulama emeği WP4'te ayrıca bütçelenir. Ölçütlerin tam tanımları Bölüm 4.7.1'dedir. Katmanlar arası öğrenmenin etkisi ayrıca makale başına maliyetin düşmesi ve otomatik onay oranının artmasıyla, ek olarak Bölüm 4.7.3'teki öğrenme eğrileri ve yönlendirici pişmanlık analizleriyle izlenecektir.</w:t>
+              <w:t>Hedef 1'de tanımlanan dört ölçüt (otomatik onay doğruluğu ≥%99,5, otomatik onay oranı ≥%90, veri tabanı hata oranı &lt;%0,5, makale başına maliyet &lt;$0,01), uzman geri bildirimiyle eğitilen alt katmanların zaman içinde iyileşmesiyle hedeflenir. Maliyet hedefleri otomatik işleme maliyetini ifade eder; uzman doğrulama emeği WP4'te ayrıca bütçelenir. Ölçütlerin tam tanımları Bölüm 4.7.1'dedir. Katmanlar arası öğrenmenin etkisi ayrıca makale başına maliyetin düşmesi, otomatik onay oranının artması ve aynı hata kısıtı korunurken L4/L5'e yönlendirilmesi gereken makale payının değerlendirme döngüleri boyunca azalmasıyla izlenecektir; bu analiz Bölüm 4.7.3'teki öğrenme eğrileri ve yönlendirici pişmanlık ölçümleriyle raporlanacaktır.</w:t>
             </w:r>
           </w:p>
           <w:p>
@@ -2554,7 +2554,7 @@
                 <w:rFonts w:ascii="Arial" w:hAnsi="Arial" w:eastAsia="Arial"/>
                 <w:sz w:val="18"/>
               </w:rPr>
-              <w:t xml:space="preserve"> Ticarileşmenin maliyet temeli iki kalemden oluşur: makale başına bir defalık otomatik işleme maliyeti (Hedef 1'de proje sonunda &lt;$0,01 hedeflenir) ve API'yi ayakta tutan tekrarlayan altyapı maliyeti (Bölüm 3.4'te proje sonrası ~12.500 TL/yıl). Çıkarım maliyeti bir kayıt için yalnızca bir kez oluşur; üretilen kayıt çok sayıda API çağrısına neredeyse maliyetsiz biçimde yeniden sunulabildiğinden çağrı başına marjinal sunum maliyeti çok düşüktür. Bu yapı kademeli bir gelir modeline olanak tanır: ücretsiz akademik erişim, kullanım hacmine göre fiyatlanan ticari API abonelikleri ve toplu veri/lisans anlaşmaları. Gösterge niteliğindeki bir değerlendirmeyle, yıllık tekrarlayan işletme maliyetinin karşılanması yalnızca birkaç orta ölçekli kurumsal aboneliği gerektirir; bu nedenle başabaş noktasının düşük bir müşteri sayısında ulaşılabilir olduğu öngörülmektedir. Kesin fiyat kademeleri, çağrı başına sunum maliyeti ve ayrıntılı başabaş analizi; pilot sonuçlarına ve değerlendirme dönemindeki güncel model ve altyapı fiyatlarına göre Bölüm 6.3'teki ürünleşme yol haritasında nihaileştirilecektir.</w:t>
+              <w:t xml:space="preserve"> Ticarileşmenin maliyet temeli iki kalemden oluşur: makale başına bir defalık otomatik işleme maliyeti (Hedef 1'de proje sonunda &lt;$0,01 hedeflenir) ve API'yi ayakta tutan tekrarlayan altyapı maliyeti (Bölüm 3.4'te proje sonrası ~12.500 TL/yıl). Bu düşük tutar, proje donanımı edinildikten sonraki değişken işleme/sunum maliyetini ifade eder; personel, satış, destek ve donanım amortismanı ticari fiyatlandırmada ayrıca dikkate alınacaktır. Çıkarım maliyeti bir kayıt için yalnızca bir kez oluşur; üretilen kayıt çok sayıda API çağrısına neredeyse maliyetsiz biçimde yeniden sunulabildiğinden çağrı başına marjinal sunum maliyeti çok düşüktür. Bu yapı kademeli bir gelir modeline olanak tanır: ücretsiz akademik erişim, kullanım hacmine göre fiyatlanan ticari API abonelikleri ve toplu veri/lisans anlaşmaları. Gösterge niteliğindeki bir değerlendirmeyle, yıllık tekrarlayan işletme maliyetinin karşılanması yalnızca birkaç orta ölçekli kurumsal aboneliği gerektirir; bu nedenle başabaş noktasının düşük bir müşteri sayısında ulaşılabilir olduğu öngörülmektedir. Kesin fiyat kademeleri, çağrı başına sunum maliyeti ve ayrıntılı başabaş analizi; pilot sonuçlarına ve değerlendirme dönemindeki güncel model ve altyapı fiyatlarına göre Bölüm 6.3'teki ürünleşme yol haritasında nihaileştirilecektir.</w:t>
             </w:r>
           </w:p>
           <w:p>
@@ -5058,7 +5058,7 @@
                 <w:rFonts w:ascii="Arial" w:hAnsi="Arial" w:eastAsia="Arial"/>
                 <w:sz w:val="18"/>
               </w:rPr>
-              <w:t>TürKomp 500'den fazla analiz edilmiş gıda için güçlü bir temel sunsa da Türkiye'nin tarımsal ve kültürel gıda çeşitliliği çok daha geniştir. Bilimsel literatürde belgelenen birçok yerel gıda, yöresel ürün ve ürün varyantı USDA FoodData Central veya EuroFIR gibi uluslararası gıda bileşimi veri tabanlarında bulunmamaktadır. Bu açığın kesin ölçümü projenin erken çıktılarından biridir: Türkçe ve Türkiye kaynaklı literatür sistematik olarak indekslenecek, uluslararası veri tabanlarında bulunmayan gıda öğeleri makine tarafından okunabilir biçimde sayılacak ve en az 5.000 özgün Türk gıda ürünü veya varyantı hedeflenecektir. OpenNutri'nin TürKomp karşısındaki konumu rekabet değil tamamlayıcılıktır: amaç, TürKomp'un yüksek kaliteyle analiz ettiği temel gıdaları yeniden üretmek değil; bu ulusal veriyi uluslararası altyapılarla birlikte çalışabilir kılmak ve TürKomp'un manuel laboratuvar yöntemiyle henüz ulaşamadığı geniş literatür kuyruğunu (yöresel ürünler, ürün varyantları ve hazır yemekler) ölçeklenebilir biçimde kapsamaktır.</w:t>
+              <w:t>TürKomp 500'den fazla analiz edilmiş gıda için güçlü bir temel sunsa da Türkiye'nin tarımsal ve kültürel gıda çeşitliliği çok daha geniştir. Bilimsel literatürde belgelenen birçok yerel gıda, yöresel ürün ve ürün varyantı uluslararası gıda bileşimi veri altyapılarında yeterince temsil edilmemektedir. Bu açığın kesin ölçümü projenin erken çıktılarından biridir: Türkçe ve Türkiye kaynaklı literatür sistematik olarak indekslenecek, uluslararası veri tabanlarında bulunmayan gıda öğeleri makine tarafından okunabilir biçimde sayılacak ve en az 5.000 özgün Türk gıda ürünü veya varyantı hedeflenecektir. OpenNutri'nin TürKomp karşısındaki konumu rekabet değil tamamlayıcılıktır: amaç, TürKomp'un yüksek kaliteyle analiz ettiği temel gıdaları yeniden üretmek değil; bu ulusal veriyi uluslararası altyapılarla birlikte çalışabilir kılmak ve TürKomp'un manuel laboratuvar yöntemiyle henüz ulaşamadığı geniş literatür kuyruğunu (yöresel ürünler, ürün varyantları ve hazır yemekler) ölçeklenebilir biçimde kapsamaktır.</w:t>
             </w:r>
           </w:p>
           <w:p>
@@ -5236,7 +5236,7 @@
                 <w:rFonts w:ascii="Arial" w:hAnsi="Arial" w:eastAsia="Arial"/>
                 <w:sz w:val="18"/>
               </w:rPr>
-              <w:t>Veri tabanı hata oranı denetimi, kabul edilmiş kayıtlar içinden gıda kategorisi, besin grubu, kaynak türü, dil ve çıkarım katmanına göre tabakalı rastgele örnekleme ile yürütülecektir. &lt;%0,5 hata hedefinin istatistiksel olarak desteklenebilmesi için her denetim döngüsünde bir taban örneklem büyüklüğü uygulanır: binom güven aralığı mantığıyla, sıfır hatalı gözlemde %95 üst güven sınırı yaklaşık 3/n'dir ("üçler kuralı"); dolayısıyla küresel hata oranını %95 güvenle %0,5'in altında tutmak yaklaşık 600 kaydın hatasız denetlenmesini gerektirir; birkaç hatalı gözleme tolerans tanımak için döngü başına taban örneklem ~600-1.000 kayda çıkarılır. Bu taban örneklem küresel orana ilişkindir; tabakalandırma, örneklemi sınıflara dağıtmak ve sınıflar arası farklılıkları saptamak için kullanılır, her tabakaya ayrı bir %0,5 garantisi vermez. Yüksek riskli tabakalarda (karmaşık tablolar, taranmış PDF'ler, düşük kaynaklı diller gibi) hedefli aşırı örnekleme yapılır. Sayısal yükseltme kuralı: bir tabakanın gözlemlenen hata oranına ait %95 güven aralığının üst sınırı %0,5'i aştığında, o tabaka için otomatik kabul eşiği yükseltilir ve etkilenen kayıtlar L5 uzman doğrulamasına yönlendirilir.</w:t>
+              <w:t>Veri tabanı hata oranı denetimi, kabul edilmiş kayıtlar içinden gıda kategorisi, besin grubu, kaynak türü, dil ve çıkarım katmanına göre tabakalı rastgele örnekleme ile yürütülecektir. &lt;%0,5 hata hedefinin istatistiksel olarak desteklenebilmesi için her denetim döngüsünde bir taban örneklem büyüklüğü uygulanır: binom güven aralığı mantığıyla, sıfır hatalı gözlemde %95 üst güven sınırı yaklaşık 3/n'dir ("üçler kuralı"); dolayısıyla küresel hata oranını %95 güvenle %0,5'in altında tutmak yaklaşık 600 kaydın hatasız denetlenmesini gerektirir; birkaç hatalı gözleme tolerans tanımak için döngü başına taban örneklem ~600-1.000 kayda çıkarılır. Bu taban örneklem küresel orana ilişkindir; tabakalandırma, örneklemi sınıflara dağıtmak ve sınıflar arası farklılıkları saptamak için kullanılır, her tabakaya ayrı bir %0,5 garantisi vermez. Yüksek riskli tabakalarda (karmaşık tablolar, taranmış/OCR gerektiren PDF'ler, Türkçe yayınlar ve yeni model sürümleri gibi) hedefli aşırı örnekleme yapılır. Sayısal yükseltme kuralı: bir tabakanın gözlemlenen hata oranına ait %95 güven aralığının üst sınırı %0,5'i aştığında, o tabaka için otomatik kabul eşiği yükseltilir ve etkilenen kayıtlar L5 uzman doğrulamasına yönlendirilir.</w:t>
             </w:r>
           </w:p>
           <w:p>
@@ -6154,7 +6154,7 @@
                 <w:b/>
                 <w:sz w:val="18"/>
               </w:rPr>
-              <w:t>İş Paketinin Adı ve Hedefleri</w:t>
+              <w:t>İş Paketlerinin Adı ve Hedefleri</w:t>
             </w:r>
           </w:p>
         </w:tc>
@@ -6185,7 +6185,7 @@
                 <w:b/>
                 <w:sz w:val="18"/>
               </w:rPr>
-              <w:t>Sorumlu Ekip</w:t>
+              <w:t>Kim(ler) Tarafından Gerçekleştirileceği</w:t>
             </w:r>
           </w:p>
         </w:tc>
@@ -6216,7 +6216,7 @@
                 <w:b/>
                 <w:sz w:val="18"/>
               </w:rPr>
-              <w:t>Zaman Aralığı</w:t>
+              <w:t>Zaman Aralığı (..-.. Ay)</w:t>
             </w:r>
           </w:p>
         </w:tc>
@@ -6247,7 +6247,7 @@
                 <w:b/>
                 <w:sz w:val="18"/>
               </w:rPr>
-              <w:t>Başarı Ölçütü ve Katkısı</w:t>
+              <w:t>Başarı Ölçütü ve Projenin Başarısına Katkısı</w:t>
             </w:r>
           </w:p>
         </w:tc>
@@ -7375,7 +7375,7 @@
                 <w:b/>
                 <w:sz w:val="18"/>
               </w:rPr>
-              <w:t>Risk</w:t>
+              <w:t>En Önemli Riskler</w:t>
             </w:r>
           </w:p>
         </w:tc>
@@ -7406,7 +7406,7 @@
                 <w:b/>
                 <w:sz w:val="18"/>
               </w:rPr>
-              <w:t>B Planı / Yönetim Yaklaşımı</w:t>
+              <w:t>Risk Yönetimi (B Planı)</w:t>
             </w:r>
           </w:p>
         </w:tc>
@@ -8602,7 +8602,7 @@
                 <w:b/>
                 <w:sz w:val="18"/>
               </w:rPr>
-              <w:t>Altyapı / Erişim Kanalı</w:t>
+              <w:t>Kuruluşta Bulunan Altyapı/Ekipman Türü, Modeli</w:t>
             </w:r>
           </w:p>
         </w:tc>
@@ -9231,7 +9231,7 @@
                 <w:b/>
                 <w:sz w:val="18"/>
               </w:rPr>
-              <w:t>Öngörülen Zaman Aralığı</w:t>
+              <w:t>Zaman Aralığı</w:t>
             </w:r>
           </w:p>
         </w:tc>
@@ -9682,7 +9682,7 @@
                 <w:rFonts w:ascii="Arial" w:hAnsi="Arial" w:eastAsia="Arial"/>
                 <w:sz w:val="18"/>
               </w:rPr>
-              <w:t>Araştırmacı Yetiştirme</w:t>
+              <w:t>Araştırmacı Yetiştirilmesi</w:t>
             </w:r>
           </w:p>
         </w:tc>
@@ -9753,7 +9753,7 @@
                 <w:rFonts w:ascii="Arial" w:hAnsi="Arial" w:eastAsia="Arial"/>
                 <w:sz w:val="18"/>
               </w:rPr>
-              <w:t>Araştırmacı Yetiştirme</w:t>
+              <w:t>Araştırmacı Yetiştirilmesi</w:t>
             </w:r>
           </w:p>
         </w:tc>
@@ -9824,7 +9824,7 @@
                 <w:rFonts w:ascii="Arial" w:hAnsi="Arial" w:eastAsia="Arial"/>
                 <w:sz w:val="18"/>
               </w:rPr>
-              <w:t>Araştırmacı Yetiştirme</w:t>
+              <w:t>Araştırmacı Yetiştirilmesi</w:t>
             </w:r>
           </w:p>
         </w:tc>
@@ -10323,7 +10323,7 @@
                 <w:b/>
                 <w:sz w:val="18"/>
               </w:rPr>
-              <w:t>Öngörülen Zaman</w:t>
+              <w:t>Etkinin Elde Edilmesi Öngörülen Zaman</w:t>
             </w:r>
           </w:p>
         </w:tc>
@@ -10868,7 +10868,7 @@
                 <w:rFonts w:ascii="Arial" w:hAnsi="Arial" w:eastAsia="Arial"/>
                 <w:sz w:val="18"/>
               </w:rPr>
-              <w:t>Veri lisanslama, API aboneliği ve doğrulama motoru uyarlamasıyla iki ana gelir kanalı.</w:t>
+              <w:t>Veri lisanslama, API aboneliği ve doğrulama motoru uyarlamasıyla çeşitlendirilmiş gelir kanalları.</w:t>
             </w:r>
           </w:p>
         </w:tc>
@@ -11993,7 +11993,7 @@
                 <w:b/>
                 <w:sz w:val="18"/>
               </w:rPr>
-              <w:t>Zaman ve Süre</w:t>
+              <w:t>Etkinliğin Zamanı ve Süresi</w:t>
             </w:r>
           </w:p>
         </w:tc>

</xml_diff>

<commit_message>
Soften TürKomp framing, fix gap-count consistency, add recall guard
Layered on top of the polish pass (968c390):
- §1: reframe TürKomp as a respectfully-described national base whose
  manual-lab method is inherent costly to scale, instead of stating it
  "has not been systematically expanded" (avoids criticizing a
  TÜBİTAK-MAM database to a TÜBİTAK panel); same coverage-gap point.
- §4.6.1: harmonize opening count to ~580 (matched the figure already
  used two sentences later in the same subsection).
- §4.7.1: add a recall guard so the <0.5% error target cannot be met by
  over-rejection — precision/recall/auto-approval co-reported on the
  locked test set; low-recall strata escalate to L4/L5 rather than drop.

Main form 19 pp, EK1 2 pp, EK2 6 pp; Arial 9; no markdown artifacts;
only [KURUM]/[EKİP] placeholders remain.

Co-Authored-By: Claude Opus 4.8 <noreply@anthropic.com>
</commit_message>
<xml_diff>
--- a/docs/OpenNutri_1005_Application_Filled_Template.docx
+++ b/docs/OpenNutri_1005_Application_Filled_Template.docx
@@ -545,7 +545,7 @@
                 <w:rFonts w:ascii="Arial" w:hAnsi="Arial" w:eastAsia="Arial"/>
                 <w:sz w:val="18"/>
               </w:rPr>
-              <w:t>Türkiye'nin ulusal veri tabanı TürKomp, 500'den fazla gıdaya ait yaklaşık 63.000 bileşen verisiyle kritik ve yüksek kaliteli bir temel oluşturmuş (TÜBİTAK MAM Gıda Enstitüsü, 2014; KAMAG 1007), ancak kuruluşundan bu yana sistematik ve büyük ölçekli bir genişlemeye tabi tutulmamıştır. Manuel laboratuvar analizine dayanan bu yaklaşımın, ülkenin geniş tarımsal ve kültürel gıda çeşitliliğini kapsayacak biçimde ölçeklendirilmesi yüksek maliyetlidir.</w:t>
+              <w:t>Türkiye'nin ulusal veri tabanı TürKomp, 500'den fazla gıdaya ait yaklaşık 63.000 bileşen verisiyle kritik ve yüksek kaliteli bir temel oluşturmuştur (TÜBİTAK MAM Gıda Enstitüsü, 2014; KAMAG 1007). Ancak manuel laboratuvar analizine dayanan bu titiz yöntemle üretilen kapsamın, ülkenin geniş tarımsal ve kültürel gıda çeşitliliğine ve hızla büyüyen bilimsel literatüre yetişecek ölçeğe taşınması doğası gereği yüksek maliyetlidir; sonuçta literatürde belgelenen birçok yerel ürün, ürün varyantı ve hazır yemek ulusal ve uluslararası veri altyapılarına yeterince yansımamaktadır.</w:t>
             </w:r>
           </w:p>
           <w:p>
@@ -5058,7 +5058,7 @@
                 <w:rFonts w:ascii="Arial" w:hAnsi="Arial" w:eastAsia="Arial"/>
                 <w:sz w:val="18"/>
               </w:rPr>
-              <w:t>TürKomp 500'den fazla analiz edilmiş gıda için güçlü bir temel sunsa da Türkiye'nin tarımsal ve kültürel gıda çeşitliliği çok daha geniştir. Bilimsel literatürde belgelenen birçok yerel gıda, yöresel ürün ve ürün varyantı uluslararası gıda bileşimi veri altyapılarında yeterince temsil edilmemektedir. Bu açığın kesin ölçümü projenin erken çıktılarından biridir: Türkçe ve Türkiye kaynaklı literatür sistematik olarak indekslenecek, uluslararası veri tabanlarında bulunmayan gıda öğeleri makine tarafından okunabilir biçimde sayılacak ve en az 5.000 özgün Türk gıda ürünü veya varyantı hedeflenecektir. OpenNutri'nin TürKomp karşısındaki konumu rekabet değil tamamlayıcılıktır: amaç, TürKomp'un yüksek kaliteyle analiz ettiği temel gıdaları yeniden üretmek değil; bu ulusal veriyi uluslararası altyapılarla birlikte çalışabilir kılmak ve TürKomp'un manuel laboratuvar yöntemiyle henüz ulaşamadığı geniş literatür kuyruğunu (yöresel ürünler, ürün varyantları ve hazır yemekler) ölçeklenebilir biçimde kapsamaktır.</w:t>
+              <w:t>TürKomp yaklaşık 580 analiz edilmiş gıda için güçlü bir temel sunsa da Türkiye'nin tarımsal ve kültürel gıda çeşitliliği çok daha geniştir. Bilimsel literatürde belgelenen birçok yerel gıda, yöresel ürün ve ürün varyantı uluslararası gıda bileşimi veri altyapılarında yeterince temsil edilmemektedir. Bu açığın kesin ölçümü projenin erken çıktılarından biridir: Türkçe ve Türkiye kaynaklı literatür sistematik olarak indekslenecek, uluslararası veri tabanlarında bulunmayan gıda öğeleri makine tarafından okunabilir biçimde sayılacak ve en az 5.000 özgün Türk gıda ürünü veya varyantı hedeflenecektir. OpenNutri'nin TürKomp karşısındaki konumu rekabet değil tamamlayıcılıktır: amaç, TürKomp'un yüksek kaliteyle analiz ettiği temel gıdaları yeniden üretmek değil; bu ulusal veriyi uluslararası altyapılarla birlikte çalışabilir kılmak ve TürKomp'un manuel laboratuvar yöntemiyle henüz ulaşamadığı geniş literatür kuyruğunu (yöresel ürünler, ürün varyantları ve hazır yemekler) ölçeklenebilir biçimde kapsamaktır.</w:t>
             </w:r>
           </w:p>
           <w:p>
@@ -5237,6 +5237,18 @@
                 <w:sz w:val="18"/>
               </w:rPr>
               <w:t>Veri tabanı hata oranı denetimi, kabul edilmiş kayıtlar içinden gıda kategorisi, besin grubu, kaynak türü, dil ve çıkarım katmanına göre tabakalı rastgele örnekleme ile yürütülecektir. &lt;%0,5 hata hedefinin istatistiksel olarak desteklenebilmesi için her denetim döngüsünde bir taban örneklem büyüklüğü uygulanır: binom güven aralığı mantığıyla, sıfır hatalı gözlemde %95 üst güven sınırı yaklaşık 3/n'dir ("üçler kuralı"); dolayısıyla küresel hata oranını %95 güvenle %0,5'in altında tutmak yaklaşık 600 kaydın hatasız denetlenmesini gerektirir; birkaç hatalı gözleme tolerans tanımak için döngü başına taban örneklem ~600-1.000 kayda çıkarılır. Bu taban örneklem küresel orana ilişkindir; tabakalandırma, örneklemi sınıflara dağıtmak ve sınıflar arası farklılıkları saptamak için kullanılır, her tabakaya ayrı bir %0,5 garantisi vermez. Yüksek riskli tabakalarda (karmaşık tablolar, taranmış/OCR gerektiren PDF'ler, Türkçe yayınlar ve yeni model sürümleri gibi) hedefli aşırı örnekleme yapılır. Sayısal yükseltme kuralı: bir tabakanın gözlemlenen hata oranına ait %95 güven aralığının üst sınırı %0,5'i aştığında, o tabaka için otomatik kabul eşiği yükseltilir ve etkilenen kayıtlar L5 uzman doğrulamasına yönlendirilir.</w:t>
+            </w:r>
+          </w:p>
+          <w:p>
+            <w:pPr>
+              <w:spacing w:after="40" w:before="0" w:line="240" w:lineRule="auto"/>
+            </w:pPr>
+            <w:r>
+              <w:rPr>
+                <w:rFonts w:ascii="Arial" w:hAnsi="Arial" w:eastAsia="Arial"/>
+                <w:sz w:val="18"/>
+              </w:rPr>
+              <w:t>Denetim, sistemin kayıtları aşırı eleyerek yapay biçimde düşük hata oranı göstermesini önlemek için geri çağırma ölçütüyle birlikte değerlendirilir: kilitli test kümesinde kesinlik, geri çağırma ve otomatik onay oranı birlikte raporlanır; geri çağırması düşük kalan tabakalardaki kayıtlar elenmek yerine L4/L5 katmanlarına yönlendirilir. Böylece &lt;%0,5 hata hedefi, çıkarılabilir verinin göz ardı edilmesiyle değil doğru çıkarımla sağlanır.</w:t>
             </w:r>
           </w:p>
           <w:p>

</xml_diff>

<commit_message>
Fix 1005 compliance: §5.3 existing-vs-requested hardware, §4.6 self-hosting framing, §3.1 EPO
- §5.3: remove to-be-purchased GPU/NAS from the "existing infrastructure"
  table (it belongs in EK-2 Makine-Teçhizat, where it is already itemized);
  the row now lists only existing institutional servers/storage/network.
- §4.6: state honestly that the prototype currently accesses the open-weight
  Gemma model via a hosted API, and that fully self-hosted core inference on
  institutional/TRUBA hardware is the project step (low-risk because the
  weights are openly downloadable) — keeps the §6.2 sovereignty logic intact.
- §3.1: name EPO explicitly alongside Espacenet to match the official
  template's listed prior-art sources.

Co-Authored-By: Claude Opus 4.8 <noreply@anthropic.com>
</commit_message>
<xml_diff>
--- a/docs/OpenNutri_1005_Application_Filled_Template.docx
+++ b/docs/OpenNutri_1005_Application_Filled_Template.docx
@@ -2148,7 +2148,7 @@
                 <w:rFonts w:ascii="Arial" w:hAnsi="Arial" w:eastAsia="Arial"/>
                 <w:sz w:val="18"/>
               </w:rPr>
-              <w:t>Proje kapsamı için 16 Haziran 2026 tarihinde TURKPATENT, Espacenet ve Google Patents üzerinde Türkçe ve İngilizce anahtar kelimelerle ön tarama yapılmıştır. Kullanılan örnek terimler şunlardır: “gıda kompozisyon veri tabanı”, “besin değeri yapay zeka”, “otomatik gıda analizi”, “food composition database artificial intelligence”, “nutritional data extraction NLP”, “cascade model LLM routing”, “food ontology automated construction”.</w:t>
+              <w:t>Proje kapsamı için 16 Haziran 2026 tarihinde TURKPATENT, Espacenet (Avrupa Patent Ofisi/EPO) ve Google Patents üzerinde Türkçe ve İngilizce anahtar kelimelerle ön tarama yapılmıştır. Kullanılan örnek terimler şunlardır: “gıda kompozisyon veri tabanı”, “besin değeri yapay zeka”, “otomatik gıda analizi”, “food composition database artificial intelligence”, “nutritional data extraction NLP”, “cascade model LLM routing”, “food ontology automated construction”.</w:t>
             </w:r>
           </w:p>
           <w:p>
@@ -4993,7 +4993,7 @@
                 <w:rFonts w:ascii="Arial" w:hAnsi="Arial" w:eastAsia="Arial"/>
                 <w:sz w:val="18"/>
               </w:rPr>
-              <w:t>Bu prototip, projenin en yüksek riskli bileşeni olan çok parçalı sistem entegrasyonunu fiilen çalışır hale getirerek fizibilite riskini düşürmektedir. Proje desteği, prototipin eksik kalan araştırma bileşenlerini tamamlayacaktır: (1) tarama ve çıkarımın hazır/dışarıdan erişilen modellerden, kurum ve TRUBA/proje donanımında çalıştırılacak ince ayarlı ağırlıkları açık modellere taşınması; (2) gıda bilimi doğrulama kural motorunun sistematik olarak geliştirilmesi; (3) statik yönlendirme eşiklerinin yerine Öğrenilmiş Yönlendirici kurulması; (4) uzman düzeltmelerinin alt katmanları sürekli yeniden eğittiği öğrenme döngüsünün kapatılması. Tarama aşamasının halihazırda ağırlıkları açık bir modelle (Gemma ailesi) çalışması, çekirdek çıkarımın kurumun kendi donanımında tümüyle yerinde (self-hosted) çalıştırılmasına geçişi yeni bir yetenek değil düşük riskli bir genişletme hâline getirir; ağırlıkları açık modeller, kapalı ticari API'lerin aksine kurum denetimindeki donanımda barındırılabildiğinden bu yapı Bölüm 6.2'de tanımlanan veri egemenliği kazanımını da doğrudan güçlendirir.</w:t>
+              <w:t>Bu prototip, projenin en yüksek riskli bileşeni olan çok parçalı sistem entegrasyonunu fiilen çalışır hale getirerek fizibilite riskini düşürmektedir. Proje desteği, prototipin eksik kalan araştırma bileşenlerini tamamlayacaktır: (1) tarama ve çıkarımın hazır/dışarıdan erişilen modellerden, kurum ve TRUBA/proje donanımında çalıştırılacak ince ayarlı ağırlıkları açık modellere taşınması; (2) gıda bilimi doğrulama kural motorunun sistematik olarak geliştirilmesi; (3) statik yönlendirme eşiklerinin yerine Öğrenilmiş Yönlendirici kurulması; (4) uzman düzeltmelerinin alt katmanları sürekli yeniden eğittiği öğrenme döngüsünün kapatılması. Tarama aşaması halihazırda ağırlıkları açık bir model ailesiyle (Gemma) yürütülmektedir; ancak mevcut prototipte bu modele bir hizmet sağlayıcının API'si üzerinden erişilmektedir. Çekirdek çıkarımın kurumun kendi donanımında ve tahsis alınan TRUBA kaynaklarında tümüyle yerinde (self-hosted) çalıştırılması proje kapsamındaki adımdır; bu geçiş yeni bir yetenek değil düşük riskli bir genişletmedir, çünkü ağırlıkları açık modeller kapalı ticari API'lerin aksine indirilip kurum denetimindeki donanımda barındırılabilir. Bu yerinde dağıtım, Bölüm 6.2'de tanımlanan veri egemenliği kazanımını doğrudan güçlendirir.</w:t>
             </w:r>
           </w:p>
           <w:p>
@@ -8670,7 +8670,7 @@
                 <w:rFonts w:ascii="Arial" w:hAnsi="Arial" w:eastAsia="Arial"/>
                 <w:sz w:val="18"/>
               </w:rPr>
-              <w:t>Ev sahibi kurum sunucuları ve proje kapsamında alınacak GPU/NAS donanımı</w:t>
+              <w:t>Ev sahibi kurum sunucuları ve mevcut depolama/ağ altyapısı</w:t>
             </w:r>
           </w:p>
         </w:tc>
@@ -8693,7 +8693,7 @@
                 <w:rFonts w:ascii="Arial" w:hAnsi="Arial" w:eastAsia="Arial"/>
                 <w:sz w:val="18"/>
               </w:rPr>
-              <w:t>Birincil veri tabanı, çıkarım servisleri, model kontrol noktaları, PDF/tam metin önbelleği ve yedekleme.</w:t>
+              <w:t>Birincil veri tabanı, çıkarım servisleri ve PDF/tam metin önbelleği için temel sunucu, depolama ve ağ ortamı (proje kapsamında talep edilen GPU iş istasyonu ve NAS depolama EK-2 bütçesinde ayrıca yer almaktadır).</w:t>
             </w:r>
           </w:p>
         </w:tc>

</xml_diff>

<commit_message>
§6.2: tag every impact row with its official sub-bullet (lead-in form)
Each row now opens with the official 12th-Dev-Plan/1005 impact sub-type as a
bold lead-in inside the Etki cell (Yaşam kalitesi, Refah/eğitim, Sürdürülebilir
çevre, Yeni Ar-Ge kararları, Ulusal/uluslararası işbirlikleri, Üniversite-sanayi
işbirliği, Araştırmacı niteliği, Sektörel uygulama alanları, Küresel pazar,
İstihdam, Rekabetçilik, Ekonomik güvenlik, Siber güvenlik). Column 1 stays the
four official buckets. Full sub-category coverage signal, page-neutral (22pp).

Co-Authored-By: Claude Opus 4.8 <noreply@anthropic.com>
</commit_message>
<xml_diff>
--- a/docs/OpenNutri_1005_Application_Filled_Template.docx
+++ b/docs/OpenNutri_1005_Application_Filled_Template.docx
@@ -10720,9 +10720,17 @@
             <w:r>
               <w:rPr>
                 <w:rFonts w:ascii="Arial" w:hAnsi="Arial" w:eastAsia="Arial"/>
-                <w:sz w:val="18"/>
-              </w:rPr>
-              <w:t>Türk yemek kültürüne uyarlanmış kanıta dayalı beslenme rehberliği; yerel gıdalar için daha doğru beslenme takibi ve diyet uygulamaları (öngörü: proje sonrası 2 yıl içinde birden çok yerli beslenme/diyet uygulamasının OpenNutri verisini kullanması).</w:t>
+                <w:b/>
+                <w:sz w:val="18"/>
+              </w:rPr>
+              <w:t>Yaşam kalitesi:</w:t>
+            </w:r>
+            <w:r>
+              <w:rPr>
+                <w:rFonts w:ascii="Arial" w:hAnsi="Arial" w:eastAsia="Arial"/>
+                <w:sz w:val="18"/>
+              </w:rPr>
+              <w:t xml:space="preserve"> Türk yemek kültürüne uyarlanmış kanıta dayalı beslenme rehberliği; yerel gıdalar için daha doğru beslenme takibi ve diyet uygulamaları (öngörü: proje sonrası 2 yıl içinde birden çok yerli beslenme/diyet uygulamasının OpenNutri verisini kullanması).</w:t>
             </w:r>
           </w:p>
         </w:tc>
@@ -10791,9 +10799,17 @@
             <w:r>
               <w:rPr>
                 <w:rFonts w:ascii="Arial" w:hAnsi="Arial" w:eastAsia="Arial"/>
-                <w:sz w:val="18"/>
-              </w:rPr>
-              <w:t>Halk sağlığı politikaları için bölgesel ve ürün bazlı besin bileşimi referansı; okul beslenmesi ve bölgesel müdahalelerde yerel veri kullanımı.</w:t>
+                <w:b/>
+                <w:sz w:val="18"/>
+              </w:rPr>
+              <w:t>Refah/eğitim:</w:t>
+            </w:r>
+            <w:r>
+              <w:rPr>
+                <w:rFonts w:ascii="Arial" w:hAnsi="Arial" w:eastAsia="Arial"/>
+                <w:sz w:val="18"/>
+              </w:rPr>
+              <w:t xml:space="preserve"> Halk sağlığı politikaları için bölgesel ve ürün bazlı besin bileşimi referansı; okul beslenmesi ve bölgesel müdahalelerde yerel veri kullanımı.</w:t>
             </w:r>
           </w:p>
         </w:tc>
@@ -10862,9 +10878,17 @@
             <w:r>
               <w:rPr>
                 <w:rFonts w:ascii="Arial" w:hAnsi="Arial" w:eastAsia="Arial"/>
-                <w:sz w:val="18"/>
-              </w:rPr>
-              <w:t>Gıda tedarik zinciri izlenebilirliği ve Yeşil Mutabakat uyum süreçlerinde bileşimsel veri desteği.</w:t>
+                <w:b/>
+                <w:sz w:val="18"/>
+              </w:rPr>
+              <w:t>Sürdürülebilir çevre:</w:t>
+            </w:r>
+            <w:r>
+              <w:rPr>
+                <w:rFonts w:ascii="Arial" w:hAnsi="Arial" w:eastAsia="Arial"/>
+                <w:sz w:val="18"/>
+              </w:rPr>
+              <w:t xml:space="preserve"> Gıda tedarik zinciri izlenebilirliği ve Yeşil Mutabakat uyum süreçlerinde bileşimsel veri desteği.</w:t>
             </w:r>
           </w:p>
         </w:tc>
@@ -10933,9 +10957,17 @@
             <w:r>
               <w:rPr>
                 <w:rFonts w:ascii="Arial" w:hAnsi="Arial" w:eastAsia="Arial"/>
-                <w:sz w:val="18"/>
-              </w:rPr>
-              <w:t>Yapay zekâ destekli gıda bileşimi çıkarımı için açık kıyaslama ve metodoloji; mimari, benzer literatür-çıkarım problemlerine ilkesel olarak aktarılabilir (proje kapsamında ayrı bir alan doğrulaması yürütülmez).</w:t>
+                <w:b/>
+                <w:sz w:val="18"/>
+              </w:rPr>
+              <w:t>Yeni Ar-Ge kararları:</w:t>
+            </w:r>
+            <w:r>
+              <w:rPr>
+                <w:rFonts w:ascii="Arial" w:hAnsi="Arial" w:eastAsia="Arial"/>
+                <w:sz w:val="18"/>
+              </w:rPr>
+              <w:t xml:space="preserve"> Yapay zekâ destekli gıda bileşimi çıkarımı için açık kıyaslama ve metodoloji; mimari, benzer literatür-çıkarım problemlerine ilkesel olarak aktarılabilir (proje kapsamında ayrı bir alan doğrulaması yürütülmez).</w:t>
             </w:r>
           </w:p>
         </w:tc>
@@ -11004,9 +11036,17 @@
             <w:r>
               <w:rPr>
                 <w:rFonts w:ascii="Arial" w:hAnsi="Arial" w:eastAsia="Arial"/>
-                <w:sz w:val="18"/>
-              </w:rPr>
-              <w:t>USDA FoodData Central, EFSA ve FAO/INFOODS gibi veri ekosistemleriyle uyumlu format sayesinde ulusal/uluslararası iş birliği zemini (öngörü: 2 yıl içinde en az 1 resmi ulusal/uluslararası Ar-Ge iş birliği).</w:t>
+                <w:b/>
+                <w:sz w:val="18"/>
+              </w:rPr>
+              <w:t>Ulusal/uluslararası işbirlikleri:</w:t>
+            </w:r>
+            <w:r>
+              <w:rPr>
+                <w:rFonts w:ascii="Arial" w:hAnsi="Arial" w:eastAsia="Arial"/>
+                <w:sz w:val="18"/>
+              </w:rPr>
+              <w:t xml:space="preserve"> USDA FoodData Central, EFSA ve FAO/INFOODS gibi veri ekosistemleriyle uyumlu format sayesinde iş birliği zemini (öngörü: 2 yıl içinde en az 1 resmi ulusal/uluslararası Ar-Ge iş birliği).</w:t>
             </w:r>
           </w:p>
         </w:tc>
@@ -11054,7 +11094,7 @@
                 <w:rFonts w:ascii="Arial" w:hAnsi="Arial" w:eastAsia="Arial"/>
                 <w:sz w:val="18"/>
               </w:rPr>
-              <w:t>Akademik (Üniversite-Sanayi İşbirliği)</w:t>
+              <w:t>Akademik</w:t>
             </w:r>
           </w:p>
         </w:tc>
@@ -11075,9 +11115,17 @@
             <w:r>
               <w:rPr>
                 <w:rFonts w:ascii="Arial" w:hAnsi="Arial" w:eastAsia="Arial"/>
-                <w:sz w:val="18"/>
-              </w:rPr>
-              <w:t>Üretim API'si ve doğrulanmış veri tabanı, üniversite-sanayi iş birliği için somut ürün ve altyapı sağlar; gıda ihracatçıları ve sağlık teknolojisi firmaları akademik çıktıların doğrudan paydaşı hâline gelir.</w:t>
+                <w:b/>
+                <w:sz w:val="18"/>
+              </w:rPr>
+              <w:t>Üniversite-sanayi işbirliği:</w:t>
+            </w:r>
+            <w:r>
+              <w:rPr>
+                <w:rFonts w:ascii="Arial" w:hAnsi="Arial" w:eastAsia="Arial"/>
+                <w:sz w:val="18"/>
+              </w:rPr>
+              <w:t xml:space="preserve"> Üretim API'si ve doğrulanmış veri tabanı, üniversite-sanayi iş birliği için somut ürün ve altyapı sağlar; gıda ihracatçıları ve sağlık teknolojisi firmaları akademik çıktıların doğrudan paydaşı hâline gelir.</w:t>
             </w:r>
           </w:p>
         </w:tc>
@@ -11146,9 +11194,17 @@
             <w:r>
               <w:rPr>
                 <w:rFonts w:ascii="Arial" w:hAnsi="Arial" w:eastAsia="Arial"/>
-                <w:sz w:val="18"/>
-              </w:rPr>
-              <w:t>Yapay zekâ ve gıda bilimi kesişiminde eğitim almış 4 bursiyer; ikisi yüksek lisans düzeyine geçerek tez üretir, ekipte disiplinler arası uzmanlık kazanılır.</w:t>
+                <w:b/>
+                <w:sz w:val="18"/>
+              </w:rPr>
+              <w:t>Araştırmacı niteliği:</w:t>
+            </w:r>
+            <w:r>
+              <w:rPr>
+                <w:rFonts w:ascii="Arial" w:hAnsi="Arial" w:eastAsia="Arial"/>
+                <w:sz w:val="18"/>
+              </w:rPr>
+              <w:t xml:space="preserve"> Yapay zekâ ve gıda bilimi kesişiminde eğitim almış 4 bursiyer; ikisi yüksek lisans düzeyine geçerek tez üretir, ekipte disiplinler arası uzmanlık kazanılır.</w:t>
             </w:r>
           </w:p>
         </w:tc>
@@ -11217,9 +11273,17 @@
             <w:r>
               <w:rPr>
                 <w:rFonts w:ascii="Arial" w:hAnsi="Arial" w:eastAsia="Arial"/>
-                <w:sz w:val="18"/>
-              </w:rPr>
-              <w:t>Gıda ihracatı, sağlık teknolojisi, diyetisyen uygulamaları, gıda üretim kalite kontrolü ve tarımsal ürün pazarlaması için veri altyapısı (potansiyel sektörel uygulama alanları).</w:t>
+                <w:b/>
+                <w:sz w:val="18"/>
+              </w:rPr>
+              <w:t>Sektörel uygulama alanları:</w:t>
+            </w:r>
+            <w:r>
+              <w:rPr>
+                <w:rFonts w:ascii="Arial" w:hAnsi="Arial" w:eastAsia="Arial"/>
+                <w:sz w:val="18"/>
+              </w:rPr>
+              <w:t xml:space="preserve"> Gıda ihracatı, sağlık teknolojisi, diyetisyen uygulamaları, gıda üretim kalite kontrolü ve tarımsal ürün pazarlaması için veri altyapısı.</w:t>
             </w:r>
           </w:p>
         </w:tc>
@@ -11288,9 +11352,17 @@
             <w:r>
               <w:rPr>
                 <w:rFonts w:ascii="Arial" w:hAnsi="Arial" w:eastAsia="Arial"/>
-                <w:sz w:val="18"/>
-              </w:rPr>
-              <w:t>Veri lisanslama, API aboneliği ve doğrulama motoru uyarlamasıyla çeşitlendirilmiş gelir kanalları; benzer açığı yaşayan ülkelere motor lisanslama fırsatı.</w:t>
+                <w:b/>
+                <w:sz w:val="18"/>
+              </w:rPr>
+              <w:t>Küresel pazar:</w:t>
+            </w:r>
+            <w:r>
+              <w:rPr>
+                <w:rFonts w:ascii="Arial" w:hAnsi="Arial" w:eastAsia="Arial"/>
+                <w:sz w:val="18"/>
+              </w:rPr>
+              <w:t xml:space="preserve"> Veri lisanslama, API aboneliği ve doğrulama motoru uyarlamasıyla çeşitlendirilmiş gelir kanalları; benzer açığı yaşayan ülkelere motor lisanslama fırsatı.</w:t>
             </w:r>
           </w:p>
         </w:tc>
@@ -11359,9 +11431,17 @@
             <w:r>
               <w:rPr>
                 <w:rFonts w:ascii="Arial" w:hAnsi="Arial" w:eastAsia="Arial"/>
-                <w:sz w:val="18"/>
-              </w:rPr>
-              <w:t>Proje sonrası 2 yıl içinde veri operasyonları, API mühendisliği ve iş geliştirme rollerini kapsayan 5-10 kişilik spin-off hedefi (gelir ve finansman kilometre taşlarına bağlı; muhafazakâr senaryoda daha düşük tutulur); ekosistemde 10-20 dolaylı istihdam potansiyeli.</w:t>
+                <w:b/>
+                <w:sz w:val="18"/>
+              </w:rPr>
+              <w:t>İstihdam:</w:t>
+            </w:r>
+            <w:r>
+              <w:rPr>
+                <w:rFonts w:ascii="Arial" w:hAnsi="Arial" w:eastAsia="Arial"/>
+                <w:sz w:val="18"/>
+              </w:rPr>
+              <w:t xml:space="preserve"> Proje sonrası 2 yıl içinde veri operasyonları, API mühendisliği ve iş geliştirme rollerini kapsayan 5-10 kişilik spin-off hedefi (gelir ve finansman kilometre taşlarına bağlı; muhafazakâr senaryoda daha düşük tutulur); ekosistemde 10-20 dolaylı istihdam potansiyeli.</w:t>
             </w:r>
           </w:p>
         </w:tc>
@@ -11430,9 +11510,17 @@
             <w:r>
               <w:rPr>
                 <w:rFonts w:ascii="Arial" w:hAnsi="Arial" w:eastAsia="Arial"/>
-                <w:sz w:val="18"/>
-              </w:rPr>
-              <w:t>Yabancı besin veri tabanlarına bağımlılığı azaltan, Türk gıdalarını kapsayan ulusal alternatif (ithal ikamesi); ihracat ve yerli sağlık teknolojileri için doğruluk avantajı; yeni yerli firmaların önünü açma.</w:t>
+                <w:b/>
+                <w:sz w:val="18"/>
+              </w:rPr>
+              <w:t>Rekabetçilik:</w:t>
+            </w:r>
+            <w:r>
+              <w:rPr>
+                <w:rFonts w:ascii="Arial" w:hAnsi="Arial" w:eastAsia="Arial"/>
+                <w:sz w:val="18"/>
+              </w:rPr>
+              <w:t xml:space="preserve"> Yabancı besin veri tabanlarına bağımlılığı azaltan, Türk gıdalarını kapsayan ulusal alternatif (ithal ikamesi); ihracat ve yerli sağlık teknolojileri için doğruluk avantajı; yeni yerli firmaların önünü açma.</w:t>
             </w:r>
           </w:p>
         </w:tc>
@@ -11501,9 +11589,17 @@
             <w:r>
               <w:rPr>
                 <w:rFonts w:ascii="Arial" w:hAnsi="Arial" w:eastAsia="Arial"/>
-                <w:sz w:val="18"/>
-              </w:rPr>
-              <w:t>Gıda bileşimi verisi üzerinde ulusal kontrol, yabancı veri tabanı fiyat/erişim değişikliklerine karşı dayanıklılık ve kriz dönemlerinde beslenme planlaması desteği.</w:t>
+                <w:b/>
+                <w:sz w:val="18"/>
+              </w:rPr>
+              <w:t>Ekonomik güvenlik:</w:t>
+            </w:r>
+            <w:r>
+              <w:rPr>
+                <w:rFonts w:ascii="Arial" w:hAnsi="Arial" w:eastAsia="Arial"/>
+                <w:sz w:val="18"/>
+              </w:rPr>
+              <w:t xml:space="preserve"> Gıda bileşimi verisi üzerinde ulusal kontrol, yabancı veri tabanı fiyat/erişim değişikliklerine karşı dayanıklılık ve kriz dönemlerinde beslenme planlaması desteği.</w:t>
             </w:r>
           </w:p>
         </w:tc>
@@ -11572,9 +11668,17 @@
             <w:r>
               <w:rPr>
                 <w:rFonts w:ascii="Arial" w:hAnsi="Arial" w:eastAsia="Arial"/>
-                <w:sz w:val="18"/>
-              </w:rPr>
-              <w:t>Çekirdek veri ve model altyapısının kurum/proje donanımı ve sözleşmeyle tahsis edilen TRUBA kaynakları üzerinde yürütülmesi, bulut kullanımının yedekleme ve dağıtımla sınırlandırılması ve açık kaynaklı yığın sayesinde verinin yurt içinde tutulması; yabancı bulut/tedarikçi bağımlılığının ve buna bağlı erişim/fiyat risklerinin azaltılması.</w:t>
+                <w:b/>
+                <w:sz w:val="18"/>
+              </w:rPr>
+              <w:t>Siber güvenlik / veri egemenliği:</w:t>
+            </w:r>
+            <w:r>
+              <w:rPr>
+                <w:rFonts w:ascii="Arial" w:hAnsi="Arial" w:eastAsia="Arial"/>
+                <w:sz w:val="18"/>
+              </w:rPr>
+              <w:t xml:space="preserve"> Çekirdek veri ve model altyapısının kurum/proje donanımı ve sözleşmeyle tahsis edilen TRUBA kaynakları üzerinde yürütülmesi, bulut kullanımının yedekleme ve dağıtımla sınırlandırılması ve açık kaynaklı yığın sayesinde verinin yurt içinde tutulması; yabancı bulut/tedarikçi bağımlılığının ve buna bağlı erişim/fiyat risklerinin azaltılması.</w:t>
             </w:r>
           </w:p>
         </w:tc>

</xml_diff>

<commit_message>
1005 main form: trim three pure restatements (zero-loss hygiene pass)
- Hedef 2: drop Google Scholar caveat (already in §4.2.1, source table, risk row)
- Hedef 4: drop verbatim re-listing of the four metrics (named ref + §4.7.1 cover it)
- §4.6 Ölçek fizibilitesi: drop API=L4 / workstation=backup clause (stated in §4.6 prose above, §4.7.2, §5.2, EK-2)

Holds at 22 pages; banks a small buffer.

Co-Authored-By: Claude Opus 4.8 <noreply@anthropic.com>
</commit_message>
<xml_diff>
--- a/docs/OpenNutri_1005_Application_Filled_Template.docx
+++ b/docs/OpenNutri_1005_Application_Filled_Template.docx
@@ -1389,7 +1389,7 @@
                 <w:rFonts w:ascii="Arial" w:hAnsi="Arial" w:eastAsia="Arial"/>
                 <w:sz w:val="18"/>
               </w:rPr>
-              <w:t>Europe PMC/PubMed Central, OpenAlex, Semantic Scholar, Crossref, DergiPark ve EKUAL kapsamındaki kurumsal erişim kaynakları kullanılarak İngilizce ve Türkçe gıda bileşimi literatürü keşfedilecek, filtrelenecek ve işlenecektir. Google Scholar yalnızca yasal/kurumsal arama ve doğrulama bağlamında yardımcı keşif kaynağı olarak değerlendirilecek; resmi API bulunmadığı için temel otomasyon kaynağı olarak konumlandırılmayacaktır.</w:t>
+              <w:t>Europe PMC/PubMed Central, OpenAlex, Semantic Scholar, Crossref, DergiPark ve EKUAL kapsamındaki kurumsal erişim kaynakları kullanılarak İngilizce ve Türkçe gıda bileşimi literatürü keşfedilecek, filtrelenecek ve işlenecektir.</w:t>
             </w:r>
           </w:p>
           <w:p>
@@ -1642,7 +1642,7 @@
                 <w:rFonts w:ascii="Arial" w:hAnsi="Arial" w:eastAsia="Arial"/>
                 <w:sz w:val="18"/>
               </w:rPr>
-              <w:t>Hedef 1'de tanımlanan dört ölçüt (otomatik onay doğruluğu ≥%99,5, otomatik onay oranı ≥%90, veri tabanı hata oranı &lt;%0,5, makale başına maliyet &lt;$0,01), uzman geri bildirimiyle eğitilen alt katmanların zaman içinde iyileşmesiyle hedeflenir. Maliyet hedefleri otomatik işleme maliyetini ifade eder; uzman doğrulama emeği WP4'te ayrıca bütçelenir. Ölçütlerin tam tanımları Bölüm 4.7.1'dedir. Katmanlar arası öğrenmenin etkisi ayrıca makale başına maliyetin düşmesi, otomatik onay oranının artması ve aynı hata kısıtı korunurken L4/L5'e yönlendirilmesi gereken makale payının değerlendirme döngüleri boyunca azalmasıyla izlenecektir; bu analiz Bölüm 4.7.3'teki öğrenme eğrileri ve yönlendirici pişmanlık ölçümleriyle raporlanacaktır.</w:t>
+              <w:t>Hedef 1'de tanımlanan dört ölçüt, uzman geri bildirimiyle eğitilen alt katmanların zaman içinde iyileşmesiyle hedeflenir. Maliyet hedefleri otomatik işleme maliyetini ifade eder; uzman doğrulama emeği WP4'te ayrıca bütçelenir. Ölçütlerin tam tanımları Bölüm 4.7.1'dedir. Katmanlar arası öğrenmenin etkisi ayrıca makale başına maliyetin düşmesi, otomatik onay oranının artması ve aynı hata kısıtı korunurken L4/L5'e yönlendirilmesi gereken makale payının değerlendirme döngüleri boyunca azalmasıyla izlenecektir; bu analiz Bölüm 4.7.3'teki öğrenme eğrileri ve yönlendirici pişmanlık ölçümleriyle raporlanacaktır.</w:t>
             </w:r>
           </w:p>
           <w:p>
@@ -5283,7 +5283,7 @@
                 <w:rFonts w:ascii="Arial" w:hAnsi="Arial" w:eastAsia="Arial"/>
                 <w:sz w:val="18"/>
               </w:rPr>
-              <w:t xml:space="preserve"> Prototipin günlük ~1.500 aday makale tarama kapasitesi, 18 aylık süre boyunca yüz binlerce adayın taranıp önceliklendirilmesine olanak tanır; bu nedenle Hedef 2'deki ≥100.000 ilgili makale işleme hedefi tarama tarafında bağlayıcı kısıt değildir. Asıl ölçek kısıtı çıkarım ve doğrulama hattıdır: çıkarım, ağırlıkları açık model kademesi ve toplu işleme ile yatay olarak ölçeklenir ve sözleşmeyle tahsis edilen TRUBA H100/H200 hesaplaması üzerinde haftalık toplu işlerle yürütülür; düşük gecikme gerekmediğinden bu toplu erişim modeli yeterlidir. Sınırlı ticari API yalnızca L4 yükseltmesi, yerel iş istasyonu ise geliştirme ve yedek yürütme için kullanılır. En pahalı kaynak olan uzman doğrulaması (Hedef 3'te ≥5.000 makale) aktif öğrenme kuyruğuyla en yüksek değerli makalelere yönlendirilerek verimli kullanılır.</w:t>
+              <w:t xml:space="preserve"> Prototipin günlük ~1.500 aday makale tarama kapasitesi, 18 aylık süre boyunca yüz binlerce adayın taranıp önceliklendirilmesine olanak tanır; bu nedenle Hedef 2'deki ≥100.000 ilgili makale işleme hedefi tarama tarafında bağlayıcı kısıt değildir. Asıl ölçek kısıtı çıkarım ve doğrulama hattıdır: çıkarım, ağırlıkları açık model kademesi ve toplu işleme ile yatay olarak ölçeklenir ve sözleşmeyle tahsis edilen TRUBA H100/H200 hesaplaması üzerinde haftalık toplu işlerle yürütülür; düşük gecikme gerekmediğinden bu toplu erişim modeli yeterlidir. En pahalı kaynak olan uzman doğrulaması (Hedef 3'te ≥5.000 makale) aktif öğrenme kuyruğuyla en yüksek değerli makalelere yönlendirilerek verimli kullanılır.</w:t>
             </w:r>
           </w:p>
           <w:p>

</xml_diff>

<commit_message>
1005: add cost-descent narrative (L1) + benchmark test-set anchor (L2/D6)
- §4.4: one sentence framing per-article cost as a mechanism-driven descent
  toward <$0.01 tracked by automation rate (not invented intermediate $ values)
- §4.7.3: locked benchmark test set = held-out gold-standard subset, compared
  against strongest commercial + open-weight models at evaluation date
  (keeps model comparison generic-by-class per D6; no stale single-model anchor)

Holds at 22 pages.

Co-Authored-By: Claude Opus 4.8 <noreply@anthropic.com>
</commit_message>
<xml_diff>
--- a/docs/OpenNutri_1005_Application_Filled_Template.docx
+++ b/docs/OpenNutri_1005_Application_Filled_Template.docx
@@ -4644,7 +4644,7 @@
                 <w:rFonts w:ascii="Arial" w:hAnsi="Arial" w:eastAsia="Arial"/>
                 <w:sz w:val="18"/>
               </w:rPr>
-              <w:t>Alt katmanların başarısız olduğu örneklere eğitimde daha yüksek ağırlık verilir (focal loss; Lin vd., 2017). Böylece uzman doğrulaması ve ticari model kullanımı yalnızca maliyet değil, daha düşük katmanların gelecekte aynı tür problemi çözmesini sağlayan eğitim yatırımı haline gelir. Bu etkinin ölçeği bütçe açısından belirleyicidir: hedef hacimde otomatik onay oranındaki görece küçük bir artış bile (ör. ~%60'tan ~%90'a) on binlerce L4/L5 çağrısını ortadan kaldırır; eğitim bir defalık maliyet olduğundan bu birikimli tasarruf, eğitim için harcanan hesaplama bütçesini belirgin biçimde aşar.</w:t>
+              <w:t>Alt katmanların başarısız olduğu örneklere eğitimde daha yüksek ağırlık verilir (focal loss; Lin vd., 2017). Böylece uzman doğrulaması ve ticari model kullanımı yalnızca maliyet değil, daha düşük katmanların gelecekte aynı tür problemi çözmesini sağlayan eğitim yatırımı haline gelir. Bu etkinin ölçeği bütçe açısından belirleyicidir: hedef hacimde otomatik onay oranındaki görece küçük bir artış bile (ör. ~%60'tan ~%90'a) on binlerce L4/L5 çağrısını ortadan kaldırır; eğitim bir defalık maliyet olduğundan bu birikimli tasarruf, eğitim için harcanan hesaplama bütçesini belirgin biçimde aşar. Bu nedenle makale başına ortalama maliyet sabit değildir; başlangıçta pahalı L4 katmanına uğrayan makalelerin giderek artan bir bölümü, alt katmanlar yeniden eğitildikçe ucuz L1-L3 katmanlarında çözülür ve ortalama maliyet, otomatik onay oranı yükseldikçe proje sonu hedefi &lt;$0,01'e doğru iner (iniş, ölçülmüş ara değerlerle değil bu oranla izlenir).</w:t>
             </w:r>
           </w:p>
           <w:p>
@@ -5740,7 +5740,7 @@
                 <w:rFonts w:ascii="Arial" w:hAnsi="Arial" w:eastAsia="Arial"/>
                 <w:sz w:val="18"/>
               </w:rPr>
-              <w:t xml:space="preserve"> Nihai kıyaslamalar, model eğitimi, istem ayarı ve yönlendirici optimizasyonunda kullanılmayan kilitli bir test kümesi üzerinde raporlanacaktır.</w:t>
+              <w:t xml:space="preserve"> Nihai kıyaslamalar; model eğitimi, istem ayarı ve yönlendirici optimizasyonunda kullanılmayan, uzman doğrulamalı altın standarttan ayrılan kilitli bir test kümesi üzerinde, değerlendirme tarihinde erişilebilen en güçlü ticari ve ağırlıkları açık modellerle karşılaştırmalı olarak raporlanacaktır.</w:t>
             </w:r>
           </w:p>
           <w:p>

</xml_diff>

<commit_message>
1005: defensible quantitative posture (D13/14)
- WP2 cost gate: 'en az %30 maliyet düşüşü' -> '>=%50 maliyet düşüşü hedefi'
  (open-weight on owned/TRUBA hardware vs commercial API supports it; framed as target)
- §2.2: make the system-level ambition explicit — <$0.01 = order-of-magnitude
  (~10x+) reduction vs full commercial processing, the enabler of a sustainable
  national-scale database
- §5.1: add one central note — performance/cost criteria are benchmark-measured;
  the <%0,5 quality floor holds regardless via L5 fallback (shortfall = more human
  review, never bad data). Keeps >=%99,5 as-is.
- §3.3 unit-economics: de-hedge (drop duplicate 'gösterge niteliğinde')
- §2.2: drop benchmark-vs-strongest-models dup (now lives in §4.7.3)

Holds at 22 pages.

Co-Authored-By: Claude Opus 4.8 <noreply@anthropic.com>
</commit_message>
<xml_diff>
--- a/docs/OpenNutri_1005_Application_Filled_Template.docx
+++ b/docs/OpenNutri_1005_Application_Filled_Template.docx
@@ -1364,7 +1364,7 @@
                 <w:rFonts w:ascii="Arial" w:hAnsi="Arial" w:eastAsia="Arial"/>
                 <w:sz w:val="18"/>
               </w:rPr>
-              <w:t>Hedef sütunundaki değerler ölçülmüş prototip sonuçları değil, WP4 doğrulama döngülerinde kalibre edilip ölçülecek proje sonu hedefleridir; referans sütunu, doğrulama hattı olmadan tek bir güçlü ticari LLM'nin kullanıldığı temel yaklaşımı temsil eder. Mevcut prototipten elde edilen ön iç gözlemler bu hedeflerin yönünü desteklemektedir: yaklaşık 5.000 makalede ağırlıkları açık çıkarım modeli, kullanılabilir veri içeren makaleleri içermeyenlerden ortalama 0,91'e karşı 0,17 güven puanıyla ayırmakta; işlenen makalelerin yaklaşık %42'si kullanılabilir bileşim verisi vermekte ve bugüne kadar 14.231 ham besin kaydı çıkarılmıştır. Bu sayılar çıkarımın kendi içindeki kalibrasyonunu gösterir; gerçek otomatik onay doğruluğu, henüz uzman referansı (altın standart) oluşmadığından ölçülmemiştir ve WP4'te ölçülecektir. Nihai kıyaslama, değerlendirme tarihinde mevcut en güçlü ticari ve ağırlıkları açık modellerle yapılacaktır.</w:t>
+              <w:t>Hedef sütunundaki değerler ölçülmüş prototip sonuçları değil, WP4 doğrulama döngülerinde kalibre edilip ölçülecek proje sonu hedefleridir; referans sütunu, doğrulama hattı olmadan tek bir güçlü ticari LLM'nin kullanıldığı temel yaklaşımı temsil eder. Mevcut prototipten elde edilen ön iç gözlemler bu hedeflerin yönünü desteklemektedir: yaklaşık 5.000 makalede ağırlıkları açık çıkarım modeli, kullanılabilir veri içeren makaleleri içermeyenlerden ortalama 0,91'e karşı 0,17 güven puanıyla ayırmakta; işlenen makalelerin yaklaşık %42'si kullanılabilir bileşim verisi vermekte ve bugüne kadar 14.231 ham besin kaydı çıkarılmıştır. Bu sayılar çıkarımın kendi içindeki kalibrasyonunu gösterir; gerçek otomatik onay doğruluğu, henüz uzman referansı (altın standart) oluşmadığından ölçülmemiştir ve WP4'te ölçülecektir. Hedeflenen &lt;$0,01 maliyet, bir makaleyi tek başına güçlü bir ticari modelle işlemeye kıyasla bir büyüklük mertebesi (≈10 kat veya daha fazla) daha düşüktür; sürekli güncellenen ulusal ölçekli bir veri tabanını ekonomik olarak sürdürülebilir kılan da bu düşüştür.</w:t>
             </w:r>
           </w:p>
           <w:p>
@@ -2698,7 +2698,7 @@
                 <w:rFonts w:ascii="Arial" w:hAnsi="Arial" w:eastAsia="Arial"/>
                 <w:sz w:val="18"/>
               </w:rPr>
-              <w:t xml:space="preserve"> Ticarileşmenin maliyet temeli iki kalemdir: makale başına bir defalık otomatik işleme maliyeti (Hedef 1'de proje sonunda &lt;$0,01) ve API'yi ayakta tutan tekrarlayan altyapı maliyeti (Bölüm 3.4'te ~12.500 TL/yıl). Çıkarım maliyeti her kayıt için yalnızca bir kez oluşur; üretilen kayıt çok sayıda API çağrısına neredeyse maliyetsiz biçimde yeniden sunulduğundan çağrı başına marjinal maliyet çok düşüktür. Bu yapı kademeli bir gelir modeline olanak tanır: ücretsiz akademik erişim, hacme göre fiyatlanan ticari API abonelikleri ve toplu veri/lisans anlaşmaları. Gösterge niteliğinde, yıllık tekrarlayan işletme maliyetinin karşılanması yalnızca birkaç orta ölçekli kurumsal abonelik gerektirir; bu nedenle başabaş düşük bir müşteri sayısında ulaşılabilir görünmektedir. Personel, satış, destek ve donanım amortismanı ticari fiyatlandırmada ayrıca dikkate alınacak; kesin fiyat kademeleri ve ayrıntılı başabaş analizi pilot sonuçlarına ve güncel fiyatlara göre Bölüm 6.3'te nihaileştirilecektir.</w:t>
+              <w:t xml:space="preserve"> Ticarileşmenin maliyet temeli iki kalemdir: makale başına bir defalık otomatik işleme maliyeti (Hedef 1'de proje sonunda &lt;$0,01) ve API'yi ayakta tutan tekrarlayan altyapı maliyeti (Bölüm 3.4'te ~12.500 TL/yıl). Çıkarım maliyeti her kayıt için yalnızca bir kez oluşur; üretilen kayıt çok sayıda API çağrısına neredeyse maliyetsiz biçimde yeniden sunulduğundan çağrı başına marjinal maliyet çok düşüktür. Bu yapı kademeli bir gelir modeline olanak tanır (ücretsiz akademik erişim, hacme göre ticari API aboneliği, toplu veri/lisans) ve yıllık tekrarlayan işletme maliyetini karşılamak yalnızca birkaç orta ölçekli kurumsal abonelik gerektirdiğinden başabaş düşük bir müşteri sayısında ulaşılır. Personel, satış, destek ve donanım amortismanını içeren kesin fiyat kademeleri ve ayrıntılı başabaş analizi, pilot sonuçlarına ve güncel fiyatlara göre Bölüm 6.3'te nihaileştirilecektir.</w:t>
             </w:r>
           </w:p>
           <w:p>
@@ -6811,7 +6811,7 @@
                 <w:rFonts w:ascii="Arial" w:hAnsi="Arial" w:eastAsia="Arial"/>
                 <w:sz w:val="18"/>
               </w:rPr>
-              <w:t>L3 alt görevleri entegre; ≥10 doğrulama kuralı aktif; ticari API tabanlı referansa göre en az %30 maliyet düşüşü; düşük güvenli kayıtların L4/L5'e güvenli yönlendirilmesi.</w:t>
+              <w:t>L3 alt görevleri entegre; ≥10 doğrulama kuralı aktif; ticari API tabanlı referansa göre ≥%50 maliyet düşüşü hedefi; düşük güvenli kayıtların L4/L5'e güvenli yönlendirilmesi.</w:t>
             </w:r>
           </w:p>
         </w:tc>

</xml_diff>

<commit_message>
§6.2: calibrate KPI projections (D-KPI)
- 'birden çok' yerli uygulama -> 'en az 2' (makes it measurable, per form's
  doğrulanabilir/ölçülebilir requirement)
- drop speculative '10-20 dolaylı istihdam' guess; keep the grounded 5-10
  direct spin-off figure (consistent with §6.3 roadmap)

Holds at 22 pages.

Co-Authored-By: Claude Opus 4.8 <noreply@anthropic.com>
</commit_message>
<xml_diff>
--- a/docs/OpenNutri_1005_Application_Filled_Template.docx
+++ b/docs/OpenNutri_1005_Application_Filled_Template.docx
@@ -10730,7 +10730,7 @@
                 <w:rFonts w:ascii="Arial" w:hAnsi="Arial" w:eastAsia="Arial"/>
                 <w:sz w:val="18"/>
               </w:rPr>
-              <w:t xml:space="preserve"> Türk yemek kültürüne uyarlanmış kanıta dayalı beslenme rehberliği; yerel gıdalar için daha doğru beslenme takibi ve diyet uygulamaları (öngörü: proje sonrası 2 yıl içinde birden çok yerli beslenme/diyet uygulamasının OpenNutri verisini kullanması).</w:t>
+              <w:t xml:space="preserve"> Türk yemek kültürüne uyarlanmış kanıta dayalı beslenme rehberliği; yerel gıdalar için daha doğru beslenme takibi ve diyet uygulamaları (öngörü: proje sonrası 2 yıl içinde en az 2 yerli beslenme/diyet uygulamasının OpenNutri verisini kullanması).</w:t>
             </w:r>
           </w:p>
         </w:tc>
@@ -11441,7 +11441,7 @@
                 <w:rFonts w:ascii="Arial" w:hAnsi="Arial" w:eastAsia="Arial"/>
                 <w:sz w:val="18"/>
               </w:rPr>
-              <w:t xml:space="preserve"> Proje sonrası 2 yıl içinde veri operasyonları, API mühendisliği ve iş geliştirme rollerini kapsayan 5-10 kişilik spin-off hedefi (gelir ve finansman kilometre taşlarına bağlı; muhafazakâr senaryoda daha düşük tutulur); ekosistemde 10-20 dolaylı istihdam potansiyeli.</w:t>
+              <w:t xml:space="preserve"> Proje sonrası 2 yıl içinde veri operasyonları, API mühendisliği ve iş geliştirme rollerini kapsayan 5-10 kişilik spin-off hedefi (gelir ve finansman kilometre taşlarına bağlı; muhafazakâr senaryoda daha düşük tutulur).</w:t>
             </w:r>
           </w:p>
         </w:tc>

</xml_diff>

<commit_message>
Tighten 1005: rename WP1 to avoid 'literatür taraması' rule; make gold-record pre-filter explicit
- WP1 renamed "Akıllı Tarama Motoru ve Sınıflandırma Hattı (L1-L2)" so the
  work-package name no longer collides with the template rule forbidding a
  standalone "literatür taraması" İP. Substance unchanged: it is the crawler
  engine (L1) + classifier (L2), a core deliverable, not a prior-art review.
- §2.2: state that the expert-review queue is fed by L2/L3-classified
  data-bearing papers, so the ~6,8 records/useful-paper density applies and the
  ≥25.000 gold-record target is conservative (closes the 5.000→25.000 seam a
  reviewer would otherwise question). Trimmed redundant wording to hold 22 pages.

Co-Authored-By: Claude Opus 4.8 <noreply@anthropic.com>
</commit_message>
<xml_diff>
--- a/docs/OpenNutri_1005_Application_Filled_Template.docx
+++ b/docs/OpenNutri_1005_Application_Filled_Template.docx
@@ -1474,7 +1474,7 @@
                 <w:rFonts w:ascii="Arial" w:hAnsi="Arial" w:eastAsia="Arial"/>
                 <w:sz w:val="18"/>
               </w:rPr>
-              <w:t>Bu ölçek hedefleri aynı doğrulama düzeyini ifade etmez: ≥100.000 ilgili makale işlenerek aday/çıkarım havuzuna alınacak; ≥250.000 kayıt, faydalı bileşim verisi içeren alt kümeden otomatik üretilecek; ≥5.000 makale ve ≥25.000 kayıt ise uzman doğrulamalı altın standart bölümünü oluşturacaktır. Veri içeren makale başına ~6,8 kayıt yoğunluğunda, 5.000 makalelik uzman doğrulamalı bölüm rahatlıkla ≥25.000 kayıt verir.</w:t>
+              <w:t>Bu ölçek hedefleri aynı doğrulama düzeyini ifade etmez: ≥100.000 ilgili makale aday/çıkarım havuzuna alınacak; ≥250.000 kayıt faydalı alt kümeden otomatik üretilecek; ≥5.000 makale ve ≥25.000 kayıt ise uzman doğrulamalı altın standart bölümünü oluşturacaktır. İnceleme kuyruğu L2/L3'ün veri içerdiğini belirlediği makalelerle beslendiğinden, ~6,8 kayıt/makale yoğunluğunda 5.000 makale ≥25.000 kaydı verir.</w:t>
             </w:r>
           </w:p>
           <w:p>
@@ -6610,7 +6610,7 @@
                 <w:b/>
                 <w:sz w:val="18"/>
               </w:rPr>
-              <w:t>Akıllı Literatür Tarama ve L2 Sınıflandırma Hattı:</w:t>
+              <w:t>Akıllı Tarama Motoru ve Sınıflandırma Hattı (L1-L2):</w:t>
             </w:r>
             <w:r>
               <w:rPr>

</xml_diff>

<commit_message>
Set PI to Dr. Öğr. Üyesi Engin Eşme; host institution Konya Teknik Üniversitesi
- Proje Yürütücüsü: Prof. Dr. Murat Ceylan → Dr. Öğr. Üyesi Engin Eşme
  across header, WP1-WP5 task tables, team table, and §4.x team prose.
- Merge: Eşme was previously the ML/architecture researcher; that seat is
  folded into the PI role (router/RLHF leadership), Ceylan removed, the
  duplicate researcher row dropped. Senior team: PI Eşme + Araştırmacı
  Şumnu + 4 bursiyerler. PI FTE ~%20 → ~%30 to reflect the dual role.
- Fix spelling Esme → Eşme; host institution placeholder → Konya Teknik
  Üniversitesi. Same name/role changes mirrored in the Veri Yönetim Planı.
- Main form regenerated: 21 pages (≤22 limit holds).

Co-Authored-By: Claude Opus 4.8 <noreply@anthropic.com>
</commit_message>
<xml_diff>
--- a/docs/OpenNutri_1005_Application_Filled_Template.docx
+++ b/docs/OpenNutri_1005_Application_Filled_Template.docx
@@ -250,7 +250,7 @@
                 <w:rFonts w:ascii="Arial" w:hAnsi="Arial" w:eastAsia="Arial"/>
                 <w:sz w:val="18"/>
               </w:rPr>
-              <w:t>Prof. Dr. Murat Ceylan</w:t>
+              <w:t>Dr. Öğr. Üyesi Engin Eşme</w:t>
             </w:r>
           </w:p>
         </w:tc>
@@ -287,7 +287,7 @@
                 <w:rFonts w:ascii="Arial" w:hAnsi="Arial" w:eastAsia="Arial"/>
                 <w:sz w:val="18"/>
               </w:rPr>
-              <w:t>[KURUM: ev sahibi üniversite/kurum adı son aşamada eklenecektir]</w:t>
+              <w:t>Konya Teknik Üniversitesi</w:t>
             </w:r>
           </w:p>
         </w:tc>
@@ -5303,7 +5303,7 @@
                 <w:rFonts w:ascii="Arial" w:hAnsi="Arial" w:eastAsia="Arial"/>
                 <w:sz w:val="18"/>
               </w:rPr>
-              <w:t xml:space="preserve"> Proje ekibi, gıda bilimi doğrulama kural katmanını tasarlamak ve denetlemek için gereken gıda mühendisliği alan uzmanlığını (Prof. Dr. Servet Gülüm Şumnu ve gıda mühendisliği araştırmacıları) ve yazılım mühendisliği ve uygulamalı yapay zekâ yetkinliğini (Prof. Dr. Murat Ceylan, Dr. Engin Esme ve bursiyer ekibi) bir araya getiren disiplinler arası bir yapıdadır. Gıda mühendisliği bursiyerlerinden ikisi, proje süresince yüksek lisans düzeyine geçerek doğrulama ve tez çalışmalarını bu düzeyde sürdürür. [EKİP — son aşamada doldurulacak: ekibin bu projeye doğrudan kanıt oluşturan 1-2 somut yetkinliği/başarısı (örneğin çalışan OpenNutri prototipinin uçtan uca geliştirilmiş olması, ilgili yayın/ödül veya önceki LLM/veri mühendisliği çıktısı) buraya eklenecektir.]</w:t>
+              <w:t xml:space="preserve"> Proje ekibi, gıda bilimi doğrulama kural katmanını tasarlamak ve denetlemek için gereken gıda mühendisliği alan uzmanlığını (Prof. Dr. Servet Gülüm Şumnu ve gıda mühendisliği araştırmacıları) ve yazılım mühendisliği ve uygulamalı yapay zekâ yetkinliğini (Yürütücü Dr. Öğr. Üyesi Engin Eşme ve bursiyer ekibi) bir araya getiren disiplinler arası bir yapıdadır. Gıda mühendisliği bursiyerlerinden ikisi, proje süresince yüksek lisans düzeyine geçerek doğrulama ve tez çalışmalarını bu düzeyde sürdürür. [EKİP — son aşamada doldurulacak: ekibin bu projeye doğrudan kanıt oluşturan 1-2 somut yetkinliği/başarısı (örneğin çalışan OpenNutri prototipinin uçtan uca geliştirilmiş olması, ilgili yayın/ödül veya önceki LLM/veri mühendisliği çıktısı) buraya eklenecektir.]</w:t>
             </w:r>
           </w:p>
           <w:p>
@@ -6640,7 +6640,7 @@
                 <w:rFonts w:ascii="Arial" w:hAnsi="Arial" w:eastAsia="Arial"/>
                 <w:sz w:val="18"/>
               </w:rPr>
-              <w:t>Yürütücü: Prof. Dr. Murat Ceylan; Araştırmacı: Prof. Dr. Servet Gülüm Şumnu; Bursiyerler: Arciel Aliognis, Alijon Alimov</w:t>
+              <w:t>Yürütücü: Dr. Öğr. Üyesi Engin Eşme; Araştırmacı: Prof. Dr. Servet Gülüm Şumnu; Bursiyerler: Arciel Aliognis, Alijon Alimov</w:t>
             </w:r>
           </w:p>
         </w:tc>
@@ -6765,7 +6765,7 @@
                 <w:rFonts w:ascii="Arial" w:hAnsi="Arial" w:eastAsia="Arial"/>
                 <w:sz w:val="18"/>
               </w:rPr>
-              <w:t>Yürütücü: Prof. Dr. Murat Ceylan; Araştırmacılar: Dr. Engin Esme, Prof. Dr. Servet Gülüm Şumnu; Bursiyerler: Arciel Aliognis, Aleyna Özcan, Peri Açıkgöz</w:t>
+              <w:t>Yürütücü: Dr. Öğr. Üyesi Engin Eşme; Araştırmacı: Prof. Dr. Servet Gülüm Şumnu; Bursiyerler: Arciel Aliognis, Aleyna Özcan, Peri Açıkgöz</w:t>
             </w:r>
           </w:p>
         </w:tc>
@@ -6890,7 +6890,7 @@
                 <w:rFonts w:ascii="Arial" w:hAnsi="Arial" w:eastAsia="Arial"/>
                 <w:sz w:val="18"/>
               </w:rPr>
-              <w:t>Yürütücü: Prof. Dr. Murat Ceylan; Araştırmacı: Dr. Engin Esme; Bursiyerler: Arciel Aliognis, Alijon Alimov</w:t>
+              <w:t>Yürütücü: Dr. Öğr. Üyesi Engin Eşme; Bursiyerler: Arciel Aliognis, Alijon Alimov</w:t>
             </w:r>
           </w:p>
         </w:tc>
@@ -7015,7 +7015,7 @@
                 <w:rFonts w:ascii="Arial" w:hAnsi="Arial" w:eastAsia="Arial"/>
                 <w:sz w:val="18"/>
               </w:rPr>
-              <w:t>Yürütücü: Prof. Dr. Murat Ceylan; Araştırmacılar: Prof. Dr. Servet Gülüm Şumnu, Dr. Engin Esme; Bursiyerler: Alijon Alimov, Arciel Aliognis, Aleyna Özcan, Peri Açıkgöz</w:t>
+              <w:t>Yürütücü: Dr. Öğr. Üyesi Engin Eşme; Araştırmacı: Prof. Dr. Servet Gülüm Şumnu; Bursiyerler: Alijon Alimov, Arciel Aliognis, Aleyna Özcan, Peri Açıkgöz</w:t>
             </w:r>
           </w:p>
         </w:tc>
@@ -7140,7 +7140,7 @@
                 <w:rFonts w:ascii="Arial" w:hAnsi="Arial" w:eastAsia="Arial"/>
                 <w:sz w:val="18"/>
               </w:rPr>
-              <w:t>Yürütücü: Prof. Dr. Murat Ceylan; Araştırmacılar: Dr. Engin Esme, Prof. Dr. Servet Gülüm Şumnu; Bursiyerler: Alijon Alimov, Arciel Aliognis, Aleyna Özcan, Peri Açıkgöz</w:t>
+              <w:t>Yürütücü: Dr. Öğr. Üyesi Engin Eşme; Araştırmacı: Prof. Dr. Servet Gülüm Şumnu; Bursiyerler: Alijon Alimov, Arciel Aliognis, Aleyna Özcan, Peri Açıkgöz</w:t>
             </w:r>
           </w:p>
         </w:tc>
@@ -7310,19 +7310,19 @@
                 <w:rFonts w:ascii="Arial" w:hAnsi="Arial" w:eastAsia="Arial"/>
                 <w:sz w:val="18"/>
               </w:rPr>
-              <w:t>| Ekip Üyesi | Rol | WP1 | WP2 | WP3 | WP4 | WP5 | Yaklaşık FTE | | --- | --- | :-: | :-: | :-: | :-: | :-: | --- | | Prof. Dr. Murat Ceylan (Yürütücü) | Bilimsel/teknik koordinasyon, ileri bileşen liderliği | ✓ | ✓ | ✓ | ✓ | ✓ | ~%20 | | Prof. Dr. S. G. Şumnu (Araştırmacı) | Gıda bilimi doğrulama protokolü ve tahkim | ✓ | ✓ |  | ✓ | ✓ | ~%15 | | Dr. Engin Esme (Araştırmacı) | ML/sistem mimarisi; yönlendirici ve RLHF teknik liderliği |  | ✓ | ✓ | ✓ | ✓ | ~%20 | | Arciel Aliognis (Bursiyer, yazılım/YZ) | L1-L4, Öğrenilmiş Yönlendirici, API | ✓ | ✓ | ✓ | ✓ | ✓ | tam zamanlı | | Alijon Alimov (Bursiyer, yazılım/YZ) | Tarama, entegrasyon, RLHF/öğrenme döngüsü | ✓ |  | ✓ | ✓ | ✓ | tam zamanlı | | Aleyna Özcan (Bursiyer, gıda müh. → YL) | Uzman doğrulama, kural tasarımı, tez |  | ✓ |  | ✓ | ✓ | tam zamanlı | | Peri Açıkgöz (Bursiyer, gıda müh. → YL) | Uzman doğrulama, Türk gıda profili, tez |  | ✓ |  | ✓ | ✓ | tam zamanlı |</w:t>
-            </w:r>
-          </w:p>
-          <w:p>
-            <w:pPr>
-              <w:spacing w:after="40" w:before="0" w:line="240" w:lineRule="auto"/>
-            </w:pPr>
-            <w:r>
-              <w:rPr>
-                <w:rFonts w:ascii="Arial" w:hAnsi="Arial" w:eastAsia="Arial"/>
-                <w:sz w:val="18"/>
-              </w:rPr>
-              <w:t>İki gıda mühendisliği bursiyerinin asıl yükü, kapasitenin bağlayıcı olduğu WP4 doğrulama penceresindedir (4-16. aylar); iki yazılım bursiyeri WP1-WP3 mühendislik yükünü taşır. İleri araştırma bileşenleri (Öğrenilmiş Yönlendirici, RLHF/tercih temelli öğrenme ve katmanlar arası öğrenme), Dr. Engin Esme ve Yürütücü'nün doğrudan teknik liderliğinde, yazılım bursiyerlerinin uygulamasıyla geliştirilir; çalışan prototip bu yetkinliğin somut kanıtıdır.</w:t>
+              <w:t>| Ekip Üyesi | Rol | WP1 | WP2 | WP3 | WP4 | WP5 | Yaklaşık FTE | | --- | --- | :-: | :-: | :-: | :-: | :-: | --- | | Dr. Öğr. Üyesi Engin Eşme (Yürütücü) | Bilimsel/teknik koordinasyon; ML/sistem mimarisi, yönlendirici ve RLHF liderliği | ✓ | ✓ | ✓ | ✓ | ✓ | ~%30 | | Prof. Dr. S. G. Şumnu (Araştırmacı) | Gıda bilimi doğrulama protokolü ve tahkim | ✓ | ✓ |  | ✓ | ✓ | ~%15 | | Arciel Aliognis (Bursiyer, yazılım/YZ) | L1-L4, Öğrenilmiş Yönlendirici, API | ✓ | ✓ | ✓ | ✓ | ✓ | tam zamanlı | | Alijon Alimov (Bursiyer, yazılım/YZ) | Tarama, entegrasyon, RLHF/öğrenme döngüsü | ✓ |  | ✓ | ✓ | ✓ | tam zamanlı | | Aleyna Özcan (Bursiyer, gıda müh. → YL) | Uzman doğrulama, kural tasarımı, tez |  | ✓ |  | ✓ | ✓ | tam zamanlı | | Peri Açıkgöz (Bursiyer, gıda müh. → YL) | Uzman doğrulama, Türk gıda profili, tez |  | ✓ |  | ✓ | ✓ | tam zamanlı |</w:t>
+            </w:r>
+          </w:p>
+          <w:p>
+            <w:pPr>
+              <w:spacing w:after="40" w:before="0" w:line="240" w:lineRule="auto"/>
+            </w:pPr>
+            <w:r>
+              <w:rPr>
+                <w:rFonts w:ascii="Arial" w:hAnsi="Arial" w:eastAsia="Arial"/>
+                <w:sz w:val="18"/>
+              </w:rPr>
+              <w:t>İki gıda mühendisliği bursiyerinin asıl yükü, kapasitenin bağlayıcı olduğu WP4 doğrulama penceresindedir (4-16. aylar); iki yazılım bursiyeri WP1-WP3 mühendislik yükünü taşır. İleri araştırma bileşenleri (Öğrenilmiş Yönlendirici, RLHF/tercih temelli öğrenme ve katmanlar arası öğrenme), Yürütücü'nün doğrudan teknik liderliğinde, yazılım bursiyerlerinin uygulamasıyla geliştirilir; çalışan prototip bu yetkinliğin somut kanıtıdır.</w:t>
             </w:r>
           </w:p>
         </w:tc>

</xml_diff>